<commit_message>
Update pictures section of FLEx Word export docx
Pictures as of FW9.2.7

Change-Id: I7028ef1b50d66304ebab71198b19ff6f5a63b0df
</commit_message>
<xml_diff>
--- a/HelpResourcesSources/TechnicalNotes/Publishing FLEx Dictionaries Using Microsoft Word.docx
+++ b/HelpResourcesSources/TechnicalNotes/Publishing FLEx Dictionaries Using Microsoft Word.docx
@@ -6,7 +6,7 @@
       <w:pPr>
         <w:pStyle w:val="Title"/>
       </w:pPr>
-      <w:bookmarkStart w:id="0" w:name="_Toc187071175"/>
+      <w:bookmarkStart w:id="0" w:name="_Toc193439753"/>
       <w:r>
         <w:t>Publishing FLEx Dictionaries Using Microsoft Word</w:t>
       </w:r>
@@ -31,13 +31,13 @@
         <w:rPr>
           <w:szCs w:val="36"/>
         </w:rPr>
-        <w:t xml:space="preserve">January </w:t>
+        <w:t>March 2</w:t>
       </w:r>
       <w:r>
         <w:rPr>
           <w:szCs w:val="36"/>
         </w:rPr>
-        <w:t>6</w:t>
+        <w:t>1</w:t>
       </w:r>
       <w:r>
         <w:rPr>
@@ -80,7 +80,7 @@
           <w:lang w:eastAsia="en-US"/>
         </w:rPr>
       </w:pPr>
-      <w:hyperlink w:anchor="_Toc187071175" w:history="1">
+      <w:hyperlink w:anchor="_Toc193439753" w:history="1">
         <w:r>
           <w:rPr>
             <w:rStyle w:val="Hyperlink"/>
@@ -107,7 +107,7 @@
             <w:noProof/>
             <w:webHidden/>
           </w:rPr>
-          <w:instrText xml:space="preserve"> PAGEREF _Toc187071175 \h </w:instrText>
+          <w:instrText xml:space="preserve"> PAGEREF _Toc193439753 \h </w:instrText>
         </w:r>
         <w:r>
           <w:rPr>
@@ -153,7 +153,7 @@
           <w:lang w:eastAsia="en-US"/>
         </w:rPr>
       </w:pPr>
-      <w:hyperlink w:anchor="_Toc187071176" w:history="1">
+      <w:hyperlink w:anchor="_Toc193439754" w:history="1">
         <w:r>
           <w:rPr>
             <w:rStyle w:val="Hyperlink"/>
@@ -197,7 +197,7 @@
             <w:noProof/>
             <w:webHidden/>
           </w:rPr>
-          <w:instrText xml:space="preserve"> PAGEREF _Toc187071176 \h </w:instrText>
+          <w:instrText xml:space="preserve"> PAGEREF _Toc193439754 \h </w:instrText>
         </w:r>
         <w:r>
           <w:rPr>
@@ -243,7 +243,7 @@
           <w:lang w:eastAsia="en-US"/>
         </w:rPr>
       </w:pPr>
-      <w:hyperlink w:anchor="_Toc187071177" w:history="1">
+      <w:hyperlink w:anchor="_Toc193439755" w:history="1">
         <w:r>
           <w:rPr>
             <w:rStyle w:val="Hyperlink"/>
@@ -287,7 +287,7 @@
             <w:noProof/>
             <w:webHidden/>
           </w:rPr>
-          <w:instrText xml:space="preserve"> PAGEREF _Toc187071177 \h </w:instrText>
+          <w:instrText xml:space="preserve"> PAGEREF _Toc193439755 \h </w:instrText>
         </w:r>
         <w:r>
           <w:rPr>
@@ -332,7 +332,7 @@
           <w:szCs w:val="22"/>
         </w:rPr>
       </w:pPr>
-      <w:hyperlink w:anchor="_Toc187071178" w:history="1">
+      <w:hyperlink w:anchor="_Toc193439756" w:history="1">
         <w:r>
           <w:rPr>
             <w:rStyle w:val="Hyperlink"/>
@@ -377,7 +377,7 @@
             <w:noProof/>
             <w:webHidden/>
           </w:rPr>
-          <w:instrText xml:space="preserve"> PAGEREF _Toc187071178 \h </w:instrText>
+          <w:instrText xml:space="preserve"> PAGEREF _Toc193439756 \h </w:instrText>
         </w:r>
         <w:r>
           <w:rPr>
@@ -423,11 +423,18 @@
           <w:lang w:eastAsia="en-US"/>
         </w:rPr>
       </w:pPr>
-      <w:hyperlink w:anchor="_Toc187071179" w:history="1">
+      <w:hyperlink w:anchor="_Toc193439757" w:history="1">
         <w:r>
           <w:rPr>
             <w:rStyle w:val="Hyperlink"/>
             <w:noProof/>
+            <w:lang w:bidi="x-none"/>
+            <w14:scene3d>
+              <w14:camera w14:prst="orthographicFront"/>
+              <w14:lightRig w14:rig="threePt" w14:dir="t">
+                <w14:rot w14:lat="0" w14:lon="0" w14:rev="0"/>
+              </w14:lightRig>
+            </w14:scene3d>
           </w:rPr>
           <w:t>2.1.1</w:t>
         </w:r>
@@ -446,7 +453,16 @@
             <w:rStyle w:val="Hyperlink"/>
             <w:noProof/>
           </w:rPr>
-          <w:t>Saving list reference names in the Word document</w:t>
+          <w:t>Saving list reference name</w:t>
+        </w:r>
+        <w:bookmarkStart w:id="1" w:name="_GoBack"/>
+        <w:bookmarkEnd w:id="1"/>
+        <w:r>
+          <w:rPr>
+            <w:rStyle w:val="Hyperlink"/>
+            <w:noProof/>
+          </w:rPr>
+          <w:t>s in the Word document</w:t>
         </w:r>
         <w:r>
           <w:rPr>
@@ -467,7 +483,7 @@
             <w:noProof/>
             <w:webHidden/>
           </w:rPr>
-          <w:instrText xml:space="preserve"> PAGEREF _Toc187071179 \h </w:instrText>
+          <w:instrText xml:space="preserve"> PAGEREF _Toc193439757 \h </w:instrText>
         </w:r>
         <w:r>
           <w:rPr>
@@ -512,7 +528,7 @@
           <w:szCs w:val="22"/>
         </w:rPr>
       </w:pPr>
-      <w:hyperlink w:anchor="_Toc187071180" w:history="1">
+      <w:hyperlink w:anchor="_Toc193439758" w:history="1">
         <w:r>
           <w:rPr>
             <w:rStyle w:val="Hyperlink"/>
@@ -557,7 +573,7 @@
             <w:noProof/>
             <w:webHidden/>
           </w:rPr>
-          <w:instrText xml:space="preserve"> PAGEREF _Toc187071180 \h </w:instrText>
+          <w:instrText xml:space="preserve"> PAGEREF _Toc193439758 \h </w:instrText>
         </w:r>
         <w:r>
           <w:rPr>
@@ -602,7 +618,7 @@
           <w:szCs w:val="22"/>
         </w:rPr>
       </w:pPr>
-      <w:hyperlink w:anchor="_Toc187071181" w:history="1">
+      <w:hyperlink w:anchor="_Toc193439759" w:history="1">
         <w:r>
           <w:rPr>
             <w:rStyle w:val="Hyperlink"/>
@@ -647,7 +663,7 @@
             <w:noProof/>
             <w:webHidden/>
           </w:rPr>
-          <w:instrText xml:space="preserve"> PAGEREF _Toc187071181 \h </w:instrText>
+          <w:instrText xml:space="preserve"> PAGEREF _Toc193439759 \h </w:instrText>
         </w:r>
         <w:r>
           <w:rPr>
@@ -693,11 +709,18 @@
           <w:lang w:eastAsia="en-US"/>
         </w:rPr>
       </w:pPr>
-      <w:hyperlink w:anchor="_Toc187071182" w:history="1">
+      <w:hyperlink w:anchor="_Toc193439760" w:history="1">
         <w:r>
           <w:rPr>
             <w:rStyle w:val="Hyperlink"/>
             <w:noProof/>
+            <w:lang w:bidi="x-none"/>
+            <w14:scene3d>
+              <w14:camera w14:prst="orthographicFront"/>
+              <w14:lightRig w14:rig="threePt" w14:dir="t">
+                <w14:rot w14:lat="0" w14:lon="0" w14:rev="0"/>
+              </w14:lightRig>
+            </w14:scene3d>
           </w:rPr>
           <w:t>2.3.1</w:t>
         </w:r>
@@ -737,7 +760,7 @@
             <w:noProof/>
             <w:webHidden/>
           </w:rPr>
-          <w:instrText xml:space="preserve"> PAGEREF _Toc187071182 \h </w:instrText>
+          <w:instrText xml:space="preserve"> PAGEREF _Toc193439760 \h </w:instrText>
         </w:r>
         <w:r>
           <w:rPr>
@@ -783,11 +806,18 @@
           <w:lang w:eastAsia="en-US"/>
         </w:rPr>
       </w:pPr>
-      <w:hyperlink w:anchor="_Toc187071183" w:history="1">
+      <w:hyperlink w:anchor="_Toc193439761" w:history="1">
         <w:r>
           <w:rPr>
             <w:rStyle w:val="Hyperlink"/>
             <w:noProof/>
+            <w:lang w:bidi="x-none"/>
+            <w14:scene3d>
+              <w14:camera w14:prst="orthographicFront"/>
+              <w14:lightRig w14:rig="threePt" w14:dir="t">
+                <w14:rot w14:lat="0" w14:lon="0" w14:rev="0"/>
+              </w14:lightRig>
+            </w14:scene3d>
           </w:rPr>
           <w:t>2.3.2</w:t>
         </w:r>
@@ -827,7 +857,7 @@
             <w:noProof/>
             <w:webHidden/>
           </w:rPr>
-          <w:instrText xml:space="preserve"> PAGEREF _Toc187071183 \h </w:instrText>
+          <w:instrText xml:space="preserve"> PAGEREF _Toc193439761 \h </w:instrText>
         </w:r>
         <w:r>
           <w:rPr>
@@ -872,7 +902,7 @@
           <w:szCs w:val="22"/>
         </w:rPr>
       </w:pPr>
-      <w:hyperlink w:anchor="_Toc187071184" w:history="1">
+      <w:hyperlink w:anchor="_Toc193439762" w:history="1">
         <w:r>
           <w:rPr>
             <w:rStyle w:val="Hyperlink"/>
@@ -917,7 +947,7 @@
             <w:noProof/>
             <w:webHidden/>
           </w:rPr>
-          <w:instrText xml:space="preserve"> PAGEREF _Toc187071184 \h </w:instrText>
+          <w:instrText xml:space="preserve"> PAGEREF _Toc193439762 \h </w:instrText>
         </w:r>
         <w:r>
           <w:rPr>
@@ -963,11 +993,18 @@
           <w:lang w:eastAsia="en-US"/>
         </w:rPr>
       </w:pPr>
-      <w:hyperlink w:anchor="_Toc187071185" w:history="1">
+      <w:hyperlink w:anchor="_Toc193439763" w:history="1">
         <w:r>
           <w:rPr>
             <w:rStyle w:val="Hyperlink"/>
             <w:noProof/>
+            <w:lang w:bidi="x-none"/>
+            <w14:scene3d>
+              <w14:camera w14:prst="orthographicFront"/>
+              <w14:lightRig w14:rig="threePt" w14:dir="t">
+                <w14:rot w14:lat="0" w14:lon="0" w14:rev="0"/>
+              </w14:lightRig>
+            </w14:scene3d>
           </w:rPr>
           <w:t>2.3.3</w:t>
         </w:r>
@@ -1007,7 +1044,7 @@
             <w:noProof/>
             <w:webHidden/>
           </w:rPr>
-          <w:instrText xml:space="preserve"> PAGEREF _Toc187071185 \h </w:instrText>
+          <w:instrText xml:space="preserve"> PAGEREF _Toc193439763 \h </w:instrText>
         </w:r>
         <w:r>
           <w:rPr>
@@ -1053,11 +1090,18 @@
           <w:lang w:eastAsia="en-US"/>
         </w:rPr>
       </w:pPr>
-      <w:hyperlink w:anchor="_Toc187071186" w:history="1">
+      <w:hyperlink w:anchor="_Toc193439764" w:history="1">
         <w:r>
           <w:rPr>
             <w:rStyle w:val="Hyperlink"/>
             <w:noProof/>
+            <w:lang w:bidi="x-none"/>
+            <w14:scene3d>
+              <w14:camera w14:prst="orthographicFront"/>
+              <w14:lightRig w14:rig="threePt" w14:dir="t">
+                <w14:rot w14:lat="0" w14:lon="0" w14:rev="0"/>
+              </w14:lightRig>
+            </w14:scene3d>
           </w:rPr>
           <w:t>2.3.4</w:t>
         </w:r>
@@ -1097,7 +1141,7 @@
             <w:noProof/>
             <w:webHidden/>
           </w:rPr>
-          <w:instrText xml:space="preserve"> PAGEREF _Toc187071186 \h </w:instrText>
+          <w:instrText xml:space="preserve"> PAGEREF _Toc193439764 \h </w:instrText>
         </w:r>
         <w:r>
           <w:rPr>
@@ -1143,11 +1187,18 @@
           <w:lang w:eastAsia="en-US"/>
         </w:rPr>
       </w:pPr>
-      <w:hyperlink w:anchor="_Toc187071187" w:history="1">
+      <w:hyperlink w:anchor="_Toc193439765" w:history="1">
         <w:r>
           <w:rPr>
             <w:rStyle w:val="Hyperlink"/>
             <w:noProof/>
+            <w:lang w:bidi="x-none"/>
+            <w14:scene3d>
+              <w14:camera w14:prst="orthographicFront"/>
+              <w14:lightRig w14:rig="threePt" w14:dir="t">
+                <w14:rot w14:lat="0" w14:lon="0" w14:rev="0"/>
+              </w14:lightRig>
+            </w14:scene3d>
           </w:rPr>
           <w:t>2.3.5</w:t>
         </w:r>
@@ -1187,7 +1238,7 @@
             <w:noProof/>
             <w:webHidden/>
           </w:rPr>
-          <w:instrText xml:space="preserve"> PAGEREF _Toc187071187 \h </w:instrText>
+          <w:instrText xml:space="preserve"> PAGEREF _Toc193439765 \h </w:instrText>
         </w:r>
         <w:r>
           <w:rPr>
@@ -1233,11 +1284,18 @@
           <w:lang w:eastAsia="en-US"/>
         </w:rPr>
       </w:pPr>
-      <w:hyperlink w:anchor="_Toc187071188" w:history="1">
+      <w:hyperlink w:anchor="_Toc193439766" w:history="1">
         <w:r>
           <w:rPr>
             <w:rStyle w:val="Hyperlink"/>
             <w:noProof/>
+            <w:lang w:bidi="x-none"/>
+            <w14:scene3d>
+              <w14:camera w14:prst="orthographicFront"/>
+              <w14:lightRig w14:rig="threePt" w14:dir="t">
+                <w14:rot w14:lat="0" w14:lon="0" w14:rev="0"/>
+              </w14:lightRig>
+            </w14:scene3d>
           </w:rPr>
           <w:t>2.3.6</w:t>
         </w:r>
@@ -1256,7 +1314,21 @@
             <w:rStyle w:val="Hyperlink"/>
             <w:noProof/>
           </w:rPr>
-          <w:t>Pictures in Word</w:t>
+          <w:t>Picture</w:t>
+        </w:r>
+        <w:r>
+          <w:rPr>
+            <w:rStyle w:val="Hyperlink"/>
+            <w:noProof/>
+          </w:rPr>
+          <w:t>s</w:t>
+        </w:r>
+        <w:r>
+          <w:rPr>
+            <w:rStyle w:val="Hyperlink"/>
+            <w:noProof/>
+          </w:rPr>
+          <w:t xml:space="preserve"> in Word</w:t>
         </w:r>
         <w:r>
           <w:rPr>
@@ -1277,7 +1349,7 @@
             <w:noProof/>
             <w:webHidden/>
           </w:rPr>
-          <w:instrText xml:space="preserve"> PAGEREF _Toc187071188 \h </w:instrText>
+          <w:instrText xml:space="preserve"> PAGEREF _Toc193439766 \h </w:instrText>
         </w:r>
         <w:r>
           <w:rPr>
@@ -1323,11 +1395,18 @@
           <w:lang w:eastAsia="en-US"/>
         </w:rPr>
       </w:pPr>
-      <w:hyperlink w:anchor="_Toc187071189" w:history="1">
+      <w:hyperlink w:anchor="_Toc193439767" w:history="1">
         <w:r>
           <w:rPr>
             <w:rStyle w:val="Hyperlink"/>
             <w:noProof/>
+            <w:lang w:bidi="x-none"/>
+            <w14:scene3d>
+              <w14:camera w14:prst="orthographicFront"/>
+              <w14:lightRig w14:rig="threePt" w14:dir="t">
+                <w14:rot w14:lat="0" w14:lon="0" w14:rev="0"/>
+              </w14:lightRig>
+            </w14:scene3d>
           </w:rPr>
           <w:t>2.3.7</w:t>
         </w:r>
@@ -1367,7 +1446,7 @@
             <w:noProof/>
             <w:webHidden/>
           </w:rPr>
-          <w:instrText xml:space="preserve"> PAGEREF _Toc187071189 \h </w:instrText>
+          <w:instrText xml:space="preserve"> PAGEREF _Toc193439767 \h </w:instrText>
         </w:r>
         <w:r>
           <w:rPr>
@@ -1387,7 +1466,7 @@
             <w:noProof/>
             <w:webHidden/>
           </w:rPr>
-          <w:t>11</w:t>
+          <w:t>12</w:t>
         </w:r>
         <w:r>
           <w:rPr>
@@ -1413,11 +1492,18 @@
           <w:lang w:eastAsia="en-US"/>
         </w:rPr>
       </w:pPr>
-      <w:hyperlink w:anchor="_Toc187071190" w:history="1">
+      <w:hyperlink w:anchor="_Toc193439768" w:history="1">
         <w:r>
           <w:rPr>
             <w:rStyle w:val="Hyperlink"/>
             <w:noProof/>
+            <w:lang w:bidi="x-none"/>
+            <w14:scene3d>
+              <w14:camera w14:prst="orthographicFront"/>
+              <w14:lightRig w14:rig="threePt" w14:dir="t">
+                <w14:rot w14:lat="0" w14:lon="0" w14:rev="0"/>
+              </w14:lightRig>
+            </w14:scene3d>
           </w:rPr>
           <w:t>2.3.8</w:t>
         </w:r>
@@ -1457,7 +1543,7 @@
             <w:noProof/>
             <w:webHidden/>
           </w:rPr>
-          <w:instrText xml:space="preserve"> PAGEREF _Toc187071190 \h </w:instrText>
+          <w:instrText xml:space="preserve"> PAGEREF _Toc193439768 \h </w:instrText>
         </w:r>
         <w:r>
           <w:rPr>
@@ -1503,7 +1589,7 @@
           <w:lang w:eastAsia="en-US"/>
         </w:rPr>
       </w:pPr>
-      <w:hyperlink w:anchor="_Toc187071191" w:history="1">
+      <w:hyperlink w:anchor="_Toc193439769" w:history="1">
         <w:r>
           <w:rPr>
             <w:rStyle w:val="Hyperlink"/>
@@ -1547,7 +1633,7 @@
             <w:noProof/>
             <w:webHidden/>
           </w:rPr>
-          <w:instrText xml:space="preserve"> PAGEREF _Toc187071191 \h </w:instrText>
+          <w:instrText xml:space="preserve"> PAGEREF _Toc193439769 \h </w:instrText>
         </w:r>
         <w:r>
           <w:rPr>
@@ -1592,7 +1678,7 @@
           <w:szCs w:val="22"/>
         </w:rPr>
       </w:pPr>
-      <w:hyperlink w:anchor="_Toc187071192" w:history="1">
+      <w:hyperlink w:anchor="_Toc193439770" w:history="1">
         <w:r>
           <w:rPr>
             <w:rStyle w:val="Hyperlink"/>
@@ -1637,7 +1723,7 @@
             <w:noProof/>
             <w:webHidden/>
           </w:rPr>
-          <w:instrText xml:space="preserve"> PAGEREF _Toc187071192 \h </w:instrText>
+          <w:instrText xml:space="preserve"> PAGEREF _Toc193439770 \h </w:instrText>
         </w:r>
         <w:r>
           <w:rPr>
@@ -1682,7 +1768,7 @@
           <w:szCs w:val="22"/>
         </w:rPr>
       </w:pPr>
-      <w:hyperlink w:anchor="_Toc187071193" w:history="1">
+      <w:hyperlink w:anchor="_Toc193439771" w:history="1">
         <w:r>
           <w:rPr>
             <w:rStyle w:val="Hyperlink"/>
@@ -1727,7 +1813,7 @@
             <w:noProof/>
             <w:webHidden/>
           </w:rPr>
-          <w:instrText xml:space="preserve"> PAGEREF _Toc187071193 \h </w:instrText>
+          <w:instrText xml:space="preserve"> PAGEREF _Toc193439771 \h </w:instrText>
         </w:r>
         <w:r>
           <w:rPr>
@@ -1772,7 +1858,7 @@
           <w:szCs w:val="22"/>
         </w:rPr>
       </w:pPr>
-      <w:hyperlink w:anchor="_Toc187071194" w:history="1">
+      <w:hyperlink w:anchor="_Toc193439772" w:history="1">
         <w:r>
           <w:rPr>
             <w:rStyle w:val="Hyperlink"/>
@@ -1817,7 +1903,7 @@
             <w:noProof/>
             <w:webHidden/>
           </w:rPr>
-          <w:instrText xml:space="preserve"> PAGEREF _Toc187071194 \h </w:instrText>
+          <w:instrText xml:space="preserve"> PAGEREF _Toc193439772 \h </w:instrText>
         </w:r>
         <w:r>
           <w:rPr>
@@ -1837,7 +1923,7 @@
             <w:noProof/>
             <w:webHidden/>
           </w:rPr>
-          <w:t>13</w:t>
+          <w:t>14</w:t>
         </w:r>
         <w:r>
           <w:rPr>
@@ -1863,11 +1949,18 @@
           <w:lang w:eastAsia="en-US"/>
         </w:rPr>
       </w:pPr>
-      <w:hyperlink w:anchor="_Toc187071195" w:history="1">
+      <w:hyperlink w:anchor="_Toc193439773" w:history="1">
         <w:r>
           <w:rPr>
             <w:rStyle w:val="Hyperlink"/>
             <w:noProof/>
+            <w:lang w:bidi="x-none"/>
+            <w14:scene3d>
+              <w14:camera w14:prst="orthographicFront"/>
+              <w14:lightRig w14:rig="threePt" w14:dir="t">
+                <w14:rot w14:lat="0" w14:lon="0" w14:rev="0"/>
+              </w14:lightRig>
+            </w14:scene3d>
           </w:rPr>
           <w:t>3.3.1</w:t>
         </w:r>
@@ -1915,7 +2008,7 @@
             <w:noProof/>
             <w:webHidden/>
           </w:rPr>
-          <w:instrText xml:space="preserve"> PAGEREF _Toc187071195 \h </w:instrText>
+          <w:instrText xml:space="preserve"> PAGEREF _Toc193439773 \h </w:instrText>
         </w:r>
         <w:r>
           <w:rPr>
@@ -1935,7 +2028,7 @@
             <w:noProof/>
             <w:webHidden/>
           </w:rPr>
-          <w:t>13</w:t>
+          <w:t>14</w:t>
         </w:r>
         <w:r>
           <w:rPr>
@@ -1961,11 +2054,18 @@
           <w:lang w:eastAsia="en-US"/>
         </w:rPr>
       </w:pPr>
-      <w:hyperlink w:anchor="_Toc187071196" w:history="1">
+      <w:hyperlink w:anchor="_Toc193439774" w:history="1">
         <w:r>
           <w:rPr>
             <w:rStyle w:val="Hyperlink"/>
             <w:noProof/>
+            <w:lang w:bidi="x-none"/>
+            <w14:scene3d>
+              <w14:camera w14:prst="orthographicFront"/>
+              <w14:lightRig w14:rig="threePt" w14:dir="t">
+                <w14:rot w14:lat="0" w14:lon="0" w14:rev="0"/>
+              </w14:lightRig>
+            </w14:scene3d>
           </w:rPr>
           <w:t>3.3.2</w:t>
         </w:r>
@@ -2005,7 +2105,7 @@
             <w:noProof/>
             <w:webHidden/>
           </w:rPr>
-          <w:instrText xml:space="preserve"> PAGEREF _Toc187071196 \h </w:instrText>
+          <w:instrText xml:space="preserve"> PAGEREF _Toc193439774 \h </w:instrText>
         </w:r>
         <w:r>
           <w:rPr>
@@ -2051,11 +2151,18 @@
           <w:lang w:eastAsia="en-US"/>
         </w:rPr>
       </w:pPr>
-      <w:hyperlink w:anchor="_Toc187071197" w:history="1">
+      <w:hyperlink w:anchor="_Toc193439775" w:history="1">
         <w:r>
           <w:rPr>
             <w:rStyle w:val="Hyperlink"/>
             <w:noProof/>
+            <w:lang w:bidi="x-none"/>
+            <w14:scene3d>
+              <w14:camera w14:prst="orthographicFront"/>
+              <w14:lightRig w14:rig="threePt" w14:dir="t">
+                <w14:rot w14:lat="0" w14:lon="0" w14:rev="0"/>
+              </w14:lightRig>
+            </w14:scene3d>
           </w:rPr>
           <w:t>3.3.3</w:t>
         </w:r>
@@ -2095,7 +2202,7 @@
             <w:noProof/>
             <w:webHidden/>
           </w:rPr>
-          <w:instrText xml:space="preserve"> PAGEREF _Toc187071197 \h </w:instrText>
+          <w:instrText xml:space="preserve"> PAGEREF _Toc193439775 \h </w:instrText>
         </w:r>
         <w:r>
           <w:rPr>
@@ -2141,11 +2248,18 @@
           <w:lang w:eastAsia="en-US"/>
         </w:rPr>
       </w:pPr>
-      <w:hyperlink w:anchor="_Toc187071198" w:history="1">
+      <w:hyperlink w:anchor="_Toc193439776" w:history="1">
         <w:r>
           <w:rPr>
             <w:rStyle w:val="Hyperlink"/>
             <w:noProof/>
+            <w:lang w:bidi="x-none"/>
+            <w14:scene3d>
+              <w14:camera w14:prst="orthographicFront"/>
+              <w14:lightRig w14:rig="threePt" w14:dir="t">
+                <w14:rot w14:lat="0" w14:lon="0" w14:rev="0"/>
+              </w14:lightRig>
+            </w14:scene3d>
           </w:rPr>
           <w:t>3.3.4</w:t>
         </w:r>
@@ -2185,7 +2299,7 @@
             <w:noProof/>
             <w:webHidden/>
           </w:rPr>
-          <w:instrText xml:space="preserve"> PAGEREF _Toc187071198 \h </w:instrText>
+          <w:instrText xml:space="preserve"> PAGEREF _Toc193439776 \h </w:instrText>
         </w:r>
         <w:r>
           <w:rPr>
@@ -2231,11 +2345,18 @@
           <w:lang w:eastAsia="en-US"/>
         </w:rPr>
       </w:pPr>
-      <w:hyperlink w:anchor="_Toc187071199" w:history="1">
+      <w:hyperlink w:anchor="_Toc193439777" w:history="1">
         <w:r>
           <w:rPr>
             <w:rStyle w:val="Hyperlink"/>
             <w:noProof/>
+            <w:lang w:bidi="x-none"/>
+            <w14:scene3d>
+              <w14:camera w14:prst="orthographicFront"/>
+              <w14:lightRig w14:rig="threePt" w14:dir="t">
+                <w14:rot w14:lat="0" w14:lon="0" w14:rev="0"/>
+              </w14:lightRig>
+            </w14:scene3d>
           </w:rPr>
           <w:t>3.3.5</w:t>
         </w:r>
@@ -2275,7 +2396,7 @@
             <w:noProof/>
             <w:webHidden/>
           </w:rPr>
-          <w:instrText xml:space="preserve"> PAGEREF _Toc187071199 \h </w:instrText>
+          <w:instrText xml:space="preserve"> PAGEREF _Toc193439777 \h </w:instrText>
         </w:r>
         <w:r>
           <w:rPr>
@@ -2320,7 +2441,7 @@
           <w:szCs w:val="22"/>
         </w:rPr>
       </w:pPr>
-      <w:hyperlink w:anchor="_Toc187071200" w:history="1">
+      <w:hyperlink w:anchor="_Toc193439778" w:history="1">
         <w:r>
           <w:rPr>
             <w:rStyle w:val="Hyperlink"/>
@@ -2365,7 +2486,7 @@
             <w:noProof/>
             <w:webHidden/>
           </w:rPr>
-          <w:instrText xml:space="preserve"> PAGEREF _Toc187071200 \h </w:instrText>
+          <w:instrText xml:space="preserve"> PAGEREF _Toc193439778 \h </w:instrText>
         </w:r>
         <w:r>
           <w:rPr>
@@ -2385,7 +2506,7 @@
             <w:noProof/>
             <w:webHidden/>
           </w:rPr>
-          <w:t>17</w:t>
+          <w:t>18</w:t>
         </w:r>
         <w:r>
           <w:rPr>
@@ -2410,7 +2531,7 @@
           <w:szCs w:val="22"/>
         </w:rPr>
       </w:pPr>
-      <w:hyperlink w:anchor="_Toc187071201" w:history="1">
+      <w:hyperlink w:anchor="_Toc193439779" w:history="1">
         <w:r>
           <w:rPr>
             <w:rStyle w:val="Hyperlink"/>
@@ -2455,7 +2576,7 @@
             <w:noProof/>
             <w:webHidden/>
           </w:rPr>
-          <w:instrText xml:space="preserve"> PAGEREF _Toc187071201 \h </w:instrText>
+          <w:instrText xml:space="preserve"> PAGEREF _Toc193439779 \h </w:instrText>
         </w:r>
         <w:r>
           <w:rPr>
@@ -2501,11 +2622,18 @@
           <w:lang w:eastAsia="en-US"/>
         </w:rPr>
       </w:pPr>
-      <w:hyperlink w:anchor="_Toc187071202" w:history="1">
+      <w:hyperlink w:anchor="_Toc193439780" w:history="1">
         <w:r>
           <w:rPr>
             <w:rStyle w:val="Hyperlink"/>
             <w:noProof/>
+            <w:lang w:bidi="x-none"/>
+            <w14:scene3d>
+              <w14:camera w14:prst="orthographicFront"/>
+              <w14:lightRig w14:rig="threePt" w14:dir="t">
+                <w14:rot w14:lat="0" w14:lon="0" w14:rev="0"/>
+              </w14:lightRig>
+            </w14:scene3d>
           </w:rPr>
           <w:t>3.5.1</w:t>
         </w:r>
@@ -2545,7 +2673,7 @@
             <w:noProof/>
             <w:webHidden/>
           </w:rPr>
-          <w:instrText xml:space="preserve"> PAGEREF _Toc187071202 \h </w:instrText>
+          <w:instrText xml:space="preserve"> PAGEREF _Toc193439780 \h </w:instrText>
         </w:r>
         <w:r>
           <w:rPr>
@@ -2565,7 +2693,7 @@
             <w:noProof/>
             <w:webHidden/>
           </w:rPr>
-          <w:t>18</w:t>
+          <w:t>19</w:t>
         </w:r>
         <w:r>
           <w:rPr>
@@ -2590,7 +2718,7 @@
           <w:szCs w:val="22"/>
         </w:rPr>
       </w:pPr>
-      <w:hyperlink w:anchor="_Toc187071203" w:history="1">
+      <w:hyperlink w:anchor="_Toc193439781" w:history="1">
         <w:r>
           <w:rPr>
             <w:rStyle w:val="Hyperlink"/>
@@ -2635,7 +2763,7 @@
             <w:noProof/>
             <w:webHidden/>
           </w:rPr>
-          <w:instrText xml:space="preserve"> PAGEREF _Toc187071203 \h </w:instrText>
+          <w:instrText xml:space="preserve"> PAGEREF _Toc193439781 \h </w:instrText>
         </w:r>
         <w:r>
           <w:rPr>
@@ -2681,7 +2809,7 @@
           <w:lang w:eastAsia="en-US"/>
         </w:rPr>
       </w:pPr>
-      <w:hyperlink w:anchor="_Toc187071204" w:history="1">
+      <w:hyperlink w:anchor="_Toc193439782" w:history="1">
         <w:r>
           <w:rPr>
             <w:rStyle w:val="Hyperlink"/>
@@ -2725,7 +2853,7 @@
             <w:noProof/>
             <w:webHidden/>
           </w:rPr>
-          <w:instrText xml:space="preserve"> PAGEREF _Toc187071204 \h </w:instrText>
+          <w:instrText xml:space="preserve"> PAGEREF _Toc193439782 \h </w:instrText>
         </w:r>
         <w:r>
           <w:rPr>
@@ -2745,7 +2873,7 @@
             <w:noProof/>
             <w:webHidden/>
           </w:rPr>
-          <w:t>20</w:t>
+          <w:t>21</w:t>
         </w:r>
         <w:r>
           <w:rPr>
@@ -2770,7 +2898,7 @@
           <w:szCs w:val="22"/>
         </w:rPr>
       </w:pPr>
-      <w:hyperlink w:anchor="_Toc187071205" w:history="1">
+      <w:hyperlink w:anchor="_Toc193439783" w:history="1">
         <w:r>
           <w:rPr>
             <w:rStyle w:val="Hyperlink"/>
@@ -2815,7 +2943,7 @@
             <w:noProof/>
             <w:webHidden/>
           </w:rPr>
-          <w:instrText xml:space="preserve"> PAGEREF _Toc187071205 \h </w:instrText>
+          <w:instrText xml:space="preserve"> PAGEREF _Toc193439783 \h </w:instrText>
         </w:r>
         <w:r>
           <w:rPr>
@@ -2860,7 +2988,7 @@
           <w:szCs w:val="22"/>
         </w:rPr>
       </w:pPr>
-      <w:hyperlink w:anchor="_Toc187071206" w:history="1">
+      <w:hyperlink w:anchor="_Toc193439784" w:history="1">
         <w:r>
           <w:rPr>
             <w:rStyle w:val="Hyperlink"/>
@@ -2905,7 +3033,7 @@
             <w:noProof/>
             <w:webHidden/>
           </w:rPr>
-          <w:instrText xml:space="preserve"> PAGEREF _Toc187071206 \h </w:instrText>
+          <w:instrText xml:space="preserve"> PAGEREF _Toc193439784 \h </w:instrText>
         </w:r>
         <w:r>
           <w:rPr>
@@ -2925,7 +3053,7 @@
             <w:noProof/>
             <w:webHidden/>
           </w:rPr>
-          <w:t>21</w:t>
+          <w:t>22</w:t>
         </w:r>
         <w:r>
           <w:rPr>
@@ -2951,11 +3079,18 @@
           <w:lang w:eastAsia="en-US"/>
         </w:rPr>
       </w:pPr>
-      <w:hyperlink w:anchor="_Toc187071207" w:history="1">
+      <w:hyperlink w:anchor="_Toc193439785" w:history="1">
         <w:r>
           <w:rPr>
             <w:rStyle w:val="Hyperlink"/>
             <w:noProof/>
+            <w:lang w:bidi="x-none"/>
+            <w14:scene3d>
+              <w14:camera w14:prst="orthographicFront"/>
+              <w14:lightRig w14:rig="threePt" w14:dir="t">
+                <w14:rot w14:lat="0" w14:lon="0" w14:rev="0"/>
+              </w14:lightRig>
+            </w14:scene3d>
           </w:rPr>
           <w:t>4.2.1</w:t>
         </w:r>
@@ -2995,7 +3130,7 @@
             <w:noProof/>
             <w:webHidden/>
           </w:rPr>
-          <w:instrText xml:space="preserve"> PAGEREF _Toc187071207 \h </w:instrText>
+          <w:instrText xml:space="preserve"> PAGEREF _Toc193439785 \h </w:instrText>
         </w:r>
         <w:r>
           <w:rPr>
@@ -3015,7 +3150,7 @@
             <w:noProof/>
             <w:webHidden/>
           </w:rPr>
-          <w:t>21</w:t>
+          <w:t>22</w:t>
         </w:r>
         <w:r>
           <w:rPr>
@@ -3041,11 +3176,18 @@
           <w:lang w:eastAsia="en-US"/>
         </w:rPr>
       </w:pPr>
-      <w:hyperlink w:anchor="_Toc187071208" w:history="1">
+      <w:hyperlink w:anchor="_Toc193439786" w:history="1">
         <w:r>
           <w:rPr>
             <w:rStyle w:val="Hyperlink"/>
             <w:noProof/>
+            <w:lang w:bidi="x-none"/>
+            <w14:scene3d>
+              <w14:camera w14:prst="orthographicFront"/>
+              <w14:lightRig w14:rig="threePt" w14:dir="t">
+                <w14:rot w14:lat="0" w14:lon="0" w14:rev="0"/>
+              </w14:lightRig>
+            </w14:scene3d>
           </w:rPr>
           <w:t>4.2.2</w:t>
         </w:r>
@@ -3085,7 +3227,7 @@
             <w:noProof/>
             <w:webHidden/>
           </w:rPr>
-          <w:instrText xml:space="preserve"> PAGEREF _Toc187071208 \h </w:instrText>
+          <w:instrText xml:space="preserve"> PAGEREF _Toc193439786 \h </w:instrText>
         </w:r>
         <w:r>
           <w:rPr>
@@ -3105,7 +3247,7 @@
             <w:noProof/>
             <w:webHidden/>
           </w:rPr>
-          <w:t>21</w:t>
+          <w:t>22</w:t>
         </w:r>
         <w:r>
           <w:rPr>
@@ -3130,7 +3272,7 @@
           <w:szCs w:val="22"/>
         </w:rPr>
       </w:pPr>
-      <w:hyperlink w:anchor="_Toc187071209" w:history="1">
+      <w:hyperlink w:anchor="_Toc193439787" w:history="1">
         <w:r>
           <w:rPr>
             <w:rStyle w:val="Hyperlink"/>
@@ -3175,7 +3317,7 @@
             <w:noProof/>
             <w:webHidden/>
           </w:rPr>
-          <w:instrText xml:space="preserve"> PAGEREF _Toc187071209 \h </w:instrText>
+          <w:instrText xml:space="preserve"> PAGEREF _Toc193439787 \h </w:instrText>
         </w:r>
         <w:r>
           <w:rPr>
@@ -3220,7 +3362,7 @@
           <w:szCs w:val="22"/>
         </w:rPr>
       </w:pPr>
-      <w:hyperlink w:anchor="_Toc187071210" w:history="1">
+      <w:hyperlink w:anchor="_Toc193439788" w:history="1">
         <w:r>
           <w:rPr>
             <w:rStyle w:val="Hyperlink"/>
@@ -3265,7 +3407,7 @@
             <w:noProof/>
             <w:webHidden/>
           </w:rPr>
-          <w:instrText xml:space="preserve"> PAGEREF _Toc187071210 \h </w:instrText>
+          <w:instrText xml:space="preserve"> PAGEREF _Toc193439788 \h </w:instrText>
         </w:r>
         <w:r>
           <w:rPr>
@@ -3304,14 +3446,14 @@
         <w:lastRenderedPageBreak/>
         <w:fldChar w:fldCharType="end"/>
       </w:r>
-      <w:bookmarkStart w:id="1" w:name="_Toc187071176"/>
+      <w:bookmarkStart w:id="2" w:name="_Toc193439754"/>
       <w:r>
         <w:t>I</w:t>
       </w:r>
       <w:r>
         <w:t>ntroduction</w:t>
       </w:r>
-      <w:bookmarkEnd w:id="1"/>
+      <w:bookmarkEnd w:id="2"/>
     </w:p>
     <w:p>
       <w:pPr>
@@ -3488,21 +3630,21 @@
       <w:pPr>
         <w:pStyle w:val="Heading1"/>
       </w:pPr>
-      <w:bookmarkStart w:id="2" w:name="_Toc187071177"/>
+      <w:bookmarkStart w:id="3" w:name="_Toc193439755"/>
       <w:r>
         <w:t>Exporting a dictionary to Word</w:t>
       </w:r>
-      <w:bookmarkEnd w:id="2"/>
+      <w:bookmarkEnd w:id="3"/>
     </w:p>
     <w:p>
       <w:pPr>
         <w:pStyle w:val="Heading2"/>
       </w:pPr>
-      <w:bookmarkStart w:id="3" w:name="_Toc187071178"/>
+      <w:bookmarkStart w:id="4" w:name="_Toc193439756"/>
       <w:r>
         <w:t>Preparation in FLEx prior to export</w:t>
       </w:r>
-      <w:bookmarkEnd w:id="3"/>
+      <w:bookmarkEnd w:id="4"/>
     </w:p>
     <w:p>
       <w:pPr>
@@ -3903,7 +4045,7 @@
       <w:pPr>
         <w:pStyle w:val="Heading3"/>
       </w:pPr>
-      <w:bookmarkStart w:id="4" w:name="_Toc187071179"/>
+      <w:bookmarkStart w:id="5" w:name="_Toc193439757"/>
       <w:r>
         <w:t xml:space="preserve">Saving list </w:t>
       </w:r>
@@ -3913,7 +4055,7 @@
       <w:r>
         <w:t>names in the Word document</w:t>
       </w:r>
-      <w:bookmarkEnd w:id="4"/>
+      <w:bookmarkEnd w:id="5"/>
     </w:p>
     <w:p>
       <w:pPr>
@@ -4149,13 +4291,13 @@
       <w:pPr>
         <w:pStyle w:val="Heading2"/>
       </w:pPr>
-      <w:bookmarkStart w:id="5" w:name="_Ref143614988"/>
-      <w:bookmarkStart w:id="6" w:name="_Toc187071180"/>
+      <w:bookmarkStart w:id="6" w:name="_Ref143614988"/>
+      <w:bookmarkStart w:id="7" w:name="_Toc193439758"/>
       <w:r>
         <w:t>Exporting a dictionary from FLEx to Word</w:t>
       </w:r>
-      <w:bookmarkEnd w:id="5"/>
       <w:bookmarkEnd w:id="6"/>
+      <w:bookmarkEnd w:id="7"/>
     </w:p>
     <w:p>
       <w:pPr>
@@ -4216,11 +4358,11 @@
       <w:pPr>
         <w:pStyle w:val="Heading2"/>
       </w:pPr>
-      <w:bookmarkStart w:id="7" w:name="_Toc187071181"/>
+      <w:bookmarkStart w:id="8" w:name="_Toc193439759"/>
       <w:r>
         <w:t>Preparing a Word dictionary for publication</w:t>
       </w:r>
-      <w:bookmarkEnd w:id="7"/>
+      <w:bookmarkEnd w:id="8"/>
     </w:p>
     <w:p>
       <w:pPr>
@@ -4383,14 +4525,14 @@
       <w:pPr>
         <w:pStyle w:val="Heading3"/>
       </w:pPr>
-      <w:bookmarkStart w:id="8" w:name="_Toc187071182"/>
+      <w:bookmarkStart w:id="9" w:name="_Toc193439760"/>
       <w:r>
         <w:t>Page</w:t>
       </w:r>
       <w:r>
         <w:t xml:space="preserve"> layout</w:t>
       </w:r>
-      <w:bookmarkEnd w:id="8"/>
+      <w:bookmarkEnd w:id="9"/>
     </w:p>
     <w:p>
       <w:pPr>
@@ -4481,25 +4623,20 @@
       <w:pPr>
         <w:pStyle w:val="Heading3"/>
       </w:pPr>
-      <w:bookmarkStart w:id="9" w:name="_Ref143267723"/>
-      <w:bookmarkStart w:id="10" w:name="_Toc187071183"/>
+      <w:bookmarkStart w:id="10" w:name="_Ref143267723"/>
+      <w:bookmarkStart w:id="11" w:name="_Toc193439761"/>
       <w:r>
         <w:t>Adjusting styles</w:t>
       </w:r>
-      <w:bookmarkEnd w:id="9"/>
       <w:bookmarkEnd w:id="10"/>
+      <w:bookmarkEnd w:id="11"/>
     </w:p>
     <w:p>
       <w:pPr>
         <w:pStyle w:val="BodyText"/>
       </w:pPr>
       <w:r>
-        <w:t>The FLEx Word export assigns character and paragraph styles to the exported data to provide formatting that will look similar in Word to the appear</w:t>
-      </w:r>
-      <w:bookmarkStart w:id="11" w:name="_GoBack"/>
-      <w:bookmarkEnd w:id="11"/>
-      <w:r>
-        <w:t xml:space="preserve">ance in the FLEx Dictionary view. An attempt is made to limit the number of styles as much as possible without losing information. If a definition field is formatted the same way in multiple places in the FLEx configuration, a single </w:t>
+        <w:t xml:space="preserve">The FLEx Word export assigns character and paragraph styles to the exported data to provide formatting that will look similar in Word to the appearance in the FLEx Dictionary view. An attempt is made to limit the number of styles as much as possible without losing information. If a definition field is formatted the same way in multiple places in the FLEx configuration, a single </w:t>
       </w:r>
       <w:r>
         <w:t>“</w:t>
@@ -4834,7 +4971,7 @@
       <w:pPr>
         <w:pStyle w:val="Heading4"/>
       </w:pPr>
-      <w:bookmarkStart w:id="12" w:name="_Toc187071184"/>
+      <w:bookmarkStart w:id="12" w:name="_Toc193439762"/>
       <w:r>
         <w:t>Context s</w:t>
       </w:r>
@@ -5171,7 +5308,7 @@
         <w:pStyle w:val="Heading3"/>
       </w:pPr>
       <w:bookmarkStart w:id="13" w:name="_Ref186791558"/>
-      <w:bookmarkStart w:id="14" w:name="_Toc187071185"/>
+      <w:bookmarkStart w:id="14" w:name="_Toc193439763"/>
       <w:r>
         <w:t>Add page headers with guidewords</w:t>
       </w:r>
@@ -5793,8 +5930,8 @@
       <w:pPr>
         <w:pStyle w:val="Heading3"/>
       </w:pPr>
-      <w:bookmarkStart w:id="15" w:name="_Toc187071186"/>
-      <w:bookmarkStart w:id="16" w:name="_Ref176788241"/>
+      <w:bookmarkStart w:id="15" w:name="_Ref176788241"/>
+      <w:bookmarkStart w:id="16" w:name="_Toc193439764"/>
       <w:r>
         <w:lastRenderedPageBreak/>
         <w:t xml:space="preserve">How to fix incorrect guidewords on </w:t>
@@ -5805,130 +5942,130 @@
       <w:r>
         <w:t xml:space="preserve"> pages</w:t>
       </w:r>
+      <w:bookmarkEnd w:id="16"/>
+    </w:p>
+    <w:p>
+      <w:pPr>
+        <w:pStyle w:val="BodyText"/>
+      </w:pPr>
+      <w:r>
+        <w:t>After you have made all of the changes to your document, if you find a few page headers where the guidewords were incorrect, there is a way you can correct this. It would not be wise to make these changes until all other editing is done because you are forcing new page breaks that would be incorrect if you make changes to previous pages that would alter the location of the default page breaks.</w:t>
+      </w:r>
+      <w:r>
+        <w:t xml:space="preserve"> Follow these steps to alter </w:t>
+      </w:r>
+      <w:proofErr w:type="gramStart"/>
+      <w:r>
+        <w:t>one page</w:t>
+      </w:r>
+      <w:proofErr w:type="gramEnd"/>
+      <w:r>
+        <w:t xml:space="preserve"> header without affecting other headers.</w:t>
+      </w:r>
+    </w:p>
+    <w:p>
+      <w:pPr>
+        <w:pStyle w:val="ListNumber"/>
+      </w:pPr>
+      <w:r>
+        <w:t>Place your curser after the last character on the last line of the page before the page header you want to change.</w:t>
+      </w:r>
+    </w:p>
+    <w:p>
+      <w:pPr>
+        <w:pStyle w:val="ListNumber"/>
+      </w:pPr>
+      <w:r>
+        <w:t xml:space="preserve">In the Layout tab, choose Breaks &gt; Next Page. This will </w:t>
+      </w:r>
+      <w:r>
+        <w:t xml:space="preserve">force a page break at this </w:t>
+      </w:r>
+      <w:proofErr w:type="gramStart"/>
+      <w:r>
+        <w:t>point.</w:t>
+      </w:r>
+      <w:r>
+        <w:t>.</w:t>
+      </w:r>
+      <w:proofErr w:type="gramEnd"/>
+    </w:p>
+    <w:p>
+      <w:pPr>
+        <w:pStyle w:val="ListNumber"/>
+      </w:pPr>
+      <w:r>
+        <w:t>Right-click the pager header</w:t>
+      </w:r>
+      <w:r>
+        <w:t xml:space="preserve"> you want to change</w:t>
+      </w:r>
+      <w:r>
+        <w:t xml:space="preserve"> and choose Edit Header.</w:t>
+      </w:r>
+    </w:p>
+    <w:p>
+      <w:pPr>
+        <w:pStyle w:val="ListNumber"/>
+      </w:pPr>
+      <w:r>
+        <w:t>In the Options section of the Design tab under Header &amp; Footer Tools, check the “Different First Page” option.</w:t>
+      </w:r>
+      <w:r>
+        <w:t xml:space="preserve"> This will remove the content of the header you want to change.</w:t>
+      </w:r>
+    </w:p>
+    <w:p>
+      <w:pPr>
+        <w:pStyle w:val="ListNumber"/>
+      </w:pPr>
+      <w:r>
+        <w:t>Add the correct guidewords, page header, etc. for this page header.</w:t>
+      </w:r>
+    </w:p>
+    <w:p>
+      <w:pPr>
+        <w:pStyle w:val="ListNumber"/>
+      </w:pPr>
+      <w:r>
+        <w:t>Click “Close Header and Footer” from the Close section of the toolbar.</w:t>
+      </w:r>
+    </w:p>
+    <w:p>
+      <w:pPr>
+        <w:pStyle w:val="ListNumber"/>
+      </w:pPr>
+      <w:r>
+        <w:t>The remaining pages should continue with the normal page headers.</w:t>
+      </w:r>
+    </w:p>
+    <w:p>
+      <w:pPr>
+        <w:pStyle w:val="BodyText"/>
+      </w:pPr>
+      <w:r>
+        <w:t>If you need to remove an inserted page break, place the curser at the end of the text on the previous page, then press Delete.</w:t>
+      </w:r>
+      <w:r>
+        <w:t xml:space="preserve"> Then assuming you started out without “Different First Page” checked, go to Edit Header and uncheck “Different First Page”.</w:t>
+      </w:r>
+    </w:p>
+    <w:p>
+      <w:pPr>
+        <w:pStyle w:val="Heading3"/>
+      </w:pPr>
+      <w:bookmarkStart w:id="17" w:name="_Ref186791937"/>
+      <w:bookmarkStart w:id="18" w:name="_Toc193439765"/>
+      <w:r>
+        <w:t xml:space="preserve">Convert letter </w:t>
+      </w:r>
+      <w:r>
+        <w:t>headings</w:t>
+      </w:r>
+      <w:r>
+        <w:t xml:space="preserve"> to single column</w:t>
+      </w:r>
       <w:bookmarkEnd w:id="15"/>
-    </w:p>
-    <w:p>
-      <w:pPr>
-        <w:pStyle w:val="BodyText"/>
-      </w:pPr>
-      <w:r>
-        <w:t>After you have made all of the changes to your document, if you find a few page headers where the guidewords were incorrect, there is a way you can correct this. It would not be wise to make these changes until all other editing is done because you are forcing new page breaks that would be incorrect if you make changes to previous pages that would alter the location of the default page breaks.</w:t>
-      </w:r>
-      <w:r>
-        <w:t xml:space="preserve"> Follow these steps to alter </w:t>
-      </w:r>
-      <w:proofErr w:type="gramStart"/>
-      <w:r>
-        <w:t>one page</w:t>
-      </w:r>
-      <w:proofErr w:type="gramEnd"/>
-      <w:r>
-        <w:t xml:space="preserve"> header without affecting other headers.</w:t>
-      </w:r>
-    </w:p>
-    <w:p>
-      <w:pPr>
-        <w:pStyle w:val="ListNumber"/>
-      </w:pPr>
-      <w:r>
-        <w:t>Place your curser after the last character on the last line of the page before the page header you want to change.</w:t>
-      </w:r>
-    </w:p>
-    <w:p>
-      <w:pPr>
-        <w:pStyle w:val="ListNumber"/>
-      </w:pPr>
-      <w:r>
-        <w:t xml:space="preserve">In the Layout tab, choose Breaks &gt; Next Page. This will </w:t>
-      </w:r>
-      <w:r>
-        <w:t xml:space="preserve">force a page break at this </w:t>
-      </w:r>
-      <w:proofErr w:type="gramStart"/>
-      <w:r>
-        <w:t>point.</w:t>
-      </w:r>
-      <w:r>
-        <w:t>.</w:t>
-      </w:r>
-      <w:proofErr w:type="gramEnd"/>
-    </w:p>
-    <w:p>
-      <w:pPr>
-        <w:pStyle w:val="ListNumber"/>
-      </w:pPr>
-      <w:r>
-        <w:t>Right-click the pager header</w:t>
-      </w:r>
-      <w:r>
-        <w:t xml:space="preserve"> you want to change</w:t>
-      </w:r>
-      <w:r>
-        <w:t xml:space="preserve"> and choose Edit Header.</w:t>
-      </w:r>
-    </w:p>
-    <w:p>
-      <w:pPr>
-        <w:pStyle w:val="ListNumber"/>
-      </w:pPr>
-      <w:r>
-        <w:t>In the Options section of the Design tab under Header &amp; Footer Tools, check the “Different First Page” option.</w:t>
-      </w:r>
-      <w:r>
-        <w:t xml:space="preserve"> This will remove the content of the header you want to change.</w:t>
-      </w:r>
-    </w:p>
-    <w:p>
-      <w:pPr>
-        <w:pStyle w:val="ListNumber"/>
-      </w:pPr>
-      <w:r>
-        <w:t>Add the correct guidewords, page header, etc. for this page header.</w:t>
-      </w:r>
-    </w:p>
-    <w:p>
-      <w:pPr>
-        <w:pStyle w:val="ListNumber"/>
-      </w:pPr>
-      <w:r>
-        <w:t>Click “Close Header and Footer” from the Close section of the toolbar.</w:t>
-      </w:r>
-    </w:p>
-    <w:p>
-      <w:pPr>
-        <w:pStyle w:val="ListNumber"/>
-      </w:pPr>
-      <w:r>
-        <w:t>The remaining pages should continue with the normal page headers.</w:t>
-      </w:r>
-    </w:p>
-    <w:p>
-      <w:pPr>
-        <w:pStyle w:val="BodyText"/>
-      </w:pPr>
-      <w:r>
-        <w:t>If you need to remove an inserted page break, place the curser at the end of the text on the previous page, then press Delete.</w:t>
-      </w:r>
-      <w:r>
-        <w:t xml:space="preserve"> Then assuming you started out without “Different First Page” checked, go to Edit Header and uncheck “Different First Page”.</w:t>
-      </w:r>
-    </w:p>
-    <w:p>
-      <w:pPr>
-        <w:pStyle w:val="Heading3"/>
-      </w:pPr>
-      <w:bookmarkStart w:id="17" w:name="_Ref186791937"/>
-      <w:bookmarkStart w:id="18" w:name="_Toc187071187"/>
-      <w:r>
-        <w:t xml:space="preserve">Convert letter </w:t>
-      </w:r>
-      <w:r>
-        <w:t>headings</w:t>
-      </w:r>
-      <w:r>
-        <w:t xml:space="preserve"> to single column</w:t>
-      </w:r>
-      <w:bookmarkEnd w:id="16"/>
       <w:bookmarkEnd w:id="17"/>
       <w:bookmarkEnd w:id="18"/>
     </w:p>
@@ -6239,19 +6376,108 @@
       <w:pPr>
         <w:pStyle w:val="Heading3"/>
       </w:pPr>
-      <w:bookmarkStart w:id="19" w:name="_Toc187071188"/>
-      <w:bookmarkStart w:id="20" w:name="_Ref143764487"/>
+      <w:bookmarkStart w:id="19" w:name="_Ref143764487"/>
+      <w:bookmarkStart w:id="20" w:name="_Toc193439766"/>
       <w:r>
         <w:lastRenderedPageBreak/>
         <w:t>Pictures in Word</w:t>
       </w:r>
-      <w:bookmarkEnd w:id="19"/>
+      <w:bookmarkEnd w:id="20"/>
     </w:p>
     <w:p>
       <w:pPr>
         <w:pStyle w:val="BodyText"/>
       </w:pPr>
       <w:r>
+        <w:t xml:space="preserve">This </w:t>
+      </w:r>
+      <w:r>
+        <w:t xml:space="preserve">section documents </w:t>
+      </w:r>
+      <w:r>
+        <w:t>processing pictures</w:t>
+      </w:r>
+      <w:r>
+        <w:t xml:space="preserve"> in Word starting with </w:t>
+      </w:r>
+      <w:r>
+        <w:t xml:space="preserve">FieldWorks </w:t>
+      </w:r>
+      <w:r>
+        <w:t>9.2.7</w:t>
+      </w:r>
+      <w:r>
+        <w:t xml:space="preserve"> which provide</w:t>
+      </w:r>
+      <w:r>
+        <w:t>d</w:t>
+      </w:r>
+      <w:r>
+        <w:t xml:space="preserve"> improved support for printing pictures</w:t>
+      </w:r>
+      <w:r>
+        <w:t>.</w:t>
+      </w:r>
+      <w:r>
+        <w:t xml:space="preserve"> </w:t>
+      </w:r>
+      <w:r>
+        <w:t xml:space="preserve">The Pictures nodes under FLEx </w:t>
+      </w:r>
+      <w:r>
+        <w:t xml:space="preserve">Dictionary Configuration </w:t>
+      </w:r>
+      <w:r>
+        <w:t xml:space="preserve">now provide options </w:t>
+      </w:r>
+      <w:r>
+        <w:t>to specify</w:t>
+      </w:r>
+      <w:r>
+        <w:t xml:space="preserve"> picture location (left, center, right) with the caption always centered under it, and maximum width and height for pictures. </w:t>
+      </w:r>
+      <w:r>
+        <w:t xml:space="preserve">The defaults are </w:t>
+      </w:r>
+      <w:r>
+        <w:t>right aligned with</w:t>
+      </w:r>
+      <w:r>
+        <w:t xml:space="preserve"> 1” maximum width and height. </w:t>
+      </w:r>
+      <w:r>
+        <w:t xml:space="preserve">Any Pictures node will affect all pictures in the dictionary for this view. </w:t>
+      </w:r>
+      <w:r>
+        <w:t>Pictures will not be enlarged beyond their resolution, but if they are too big, they will be reduced, maintaining aspect ratio, until they do not exceed the two maximum values.</w:t>
+      </w:r>
+      <w:r>
+        <w:t xml:space="preserve"> These settings will be applied to all of the pictures in the dictionary. In Word, you can make </w:t>
+      </w:r>
+      <w:r>
+        <w:t>individual</w:t>
+      </w:r>
+      <w:r>
+        <w:t xml:space="preserve"> adjustments to location and size</w:t>
+      </w:r>
+      <w:r>
+        <w:t>,</w:t>
+      </w:r>
+      <w:r>
+        <w:t xml:space="preserve"> if </w:t>
+      </w:r>
+      <w:r>
+        <w:t>needed</w:t>
+      </w:r>
+      <w:r>
+        <w:t>.</w:t>
+      </w:r>
+    </w:p>
+    <w:p>
+      <w:pPr>
+        <w:pStyle w:val="BodyText"/>
+      </w:pPr>
+      <w:r>
         <w:t>Pictures or illustrations in a Word document exported from FLEx normally have two paragraphs.</w:t>
       </w:r>
     </w:p>
@@ -6260,7 +6486,16 @@
         <w:pStyle w:val="BodyText"/>
       </w:pPr>
       <w:r>
-        <w:t>If you click the picture, you’ll see it’s in an Image-</w:t>
+        <w:t>The picture is in a paragraph with</w:t>
+      </w:r>
+      <w:r>
+        <w:t xml:space="preserve"> an </w:t>
+      </w:r>
+      <w:r>
+        <w:t>“</w:t>
+      </w:r>
+      <w:r>
+        <w:t>Image-</w:t>
       </w:r>
       <w:proofErr w:type="spellStart"/>
       <w:r>
@@ -6268,7 +6503,13 @@
       </w:r>
       <w:proofErr w:type="spellEnd"/>
       <w:r>
-        <w:t>-Style paragraph style.</w:t>
+        <w:t>-Style</w:t>
+      </w:r>
+      <w:r>
+        <w:t>”</w:t>
+      </w:r>
+      <w:r>
+        <w:t xml:space="preserve"> paragraph style.</w:t>
       </w:r>
     </w:p>
     <w:p>
@@ -6280,10 +6521,10 @@
           <w:noProof/>
         </w:rPr>
         <w:drawing>
-          <wp:inline distT="0" distB="0" distL="0" distR="0" wp14:anchorId="75D64A57" wp14:editId="38EEDB53">
-            <wp:extent cx="621475" cy="843148"/>
-            <wp:effectExtent l="0" t="0" r="7620" b="0"/>
-            <wp:docPr id="21" name="Picture 21"/>
+          <wp:inline distT="0" distB="0" distL="0" distR="0" wp14:anchorId="0C513380" wp14:editId="22317FFB">
+            <wp:extent cx="1095528" cy="924054"/>
+            <wp:effectExtent l="0" t="0" r="9525" b="9525"/>
+            <wp:docPr id="29" name="Picture 29"/>
             <wp:cNvGraphicFramePr>
               <a:graphicFrameLocks xmlns:a="http://schemas.openxmlformats.org/drawingml/2006/main" noChangeAspect="1"/>
             </wp:cNvGraphicFramePr>
@@ -6303,7 +6544,7 @@
                   <pic:spPr>
                     <a:xfrm>
                       <a:off x="0" y="0"/>
-                      <a:ext cx="676501" cy="917802"/>
+                      <a:ext cx="1095528" cy="924054"/>
                     </a:xfrm>
                     <a:prstGeom prst="rect">
                       <a:avLst/>
@@ -6321,7 +6562,19 @@
         <w:pStyle w:val="BodyText"/>
       </w:pPr>
       <w:r>
-        <w:t>If you click slightly outside this picture frame, you’ll see a dotted line around the picture and the caption, and the style of the second paragraph is also Image-</w:t>
+        <w:t>The picture is inside a textbox, with the caption occurring as a second paragraph</w:t>
+      </w:r>
+      <w:r>
+        <w:t xml:space="preserve">, also </w:t>
+      </w:r>
+      <w:r>
+        <w:t xml:space="preserve">with an </w:t>
+      </w:r>
+      <w:r>
+        <w:t>“</w:t>
+      </w:r>
+      <w:r>
+        <w:t>Image-</w:t>
       </w:r>
       <w:proofErr w:type="spellStart"/>
       <w:r>
@@ -6329,7 +6582,42 @@
       </w:r>
       <w:proofErr w:type="spellEnd"/>
       <w:r>
-        <w:t>-Style.</w:t>
+        <w:t>-Style</w:t>
+      </w:r>
+      <w:r>
+        <w:t>”</w:t>
+      </w:r>
+      <w:r>
+        <w:t xml:space="preserve"> paragraph style.</w:t>
+      </w:r>
+      <w:r>
+        <w:t xml:space="preserve"> The parts of the caption have </w:t>
+      </w:r>
+      <w:r>
+        <w:t xml:space="preserve">character </w:t>
+      </w:r>
+      <w:r>
+        <w:t xml:space="preserve">styles for </w:t>
+      </w:r>
+      <w:r>
+        <w:t xml:space="preserve">Caption, Creator, Copyright &amp; License, </w:t>
+      </w:r>
+      <w:proofErr w:type="spellStart"/>
+      <w:r>
+        <w:t>etc</w:t>
+      </w:r>
+      <w:proofErr w:type="spellEnd"/>
+      <w:r>
+        <w:t xml:space="preserve"> that can be specified in FLEx</w:t>
+      </w:r>
+      <w:r>
+        <w:t>, and altered in Word</w:t>
+      </w:r>
+      <w:r>
+        <w:t>.</w:t>
+      </w:r>
+      <w:r>
+        <w:t xml:space="preserve"> When you click the caption, the textbox border will appear around the picture and caption.</w:t>
       </w:r>
     </w:p>
     <w:p>
@@ -6341,10 +6629,10 @@
           <w:noProof/>
         </w:rPr>
         <w:drawing>
-          <wp:inline distT="0" distB="0" distL="0" distR="0" wp14:anchorId="3E60D266" wp14:editId="23746554">
-            <wp:extent cx="795647" cy="1078843"/>
-            <wp:effectExtent l="0" t="0" r="5080" b="7620"/>
-            <wp:docPr id="22" name="Picture 22"/>
+          <wp:inline distT="0" distB="0" distL="0" distR="0" wp14:anchorId="04B5FFF8" wp14:editId="0D663430">
+            <wp:extent cx="1290098" cy="1343025"/>
+            <wp:effectExtent l="0" t="0" r="5715" b="0"/>
+            <wp:docPr id="21" name="Picture 21"/>
             <wp:cNvGraphicFramePr>
               <a:graphicFrameLocks xmlns:a="http://schemas.openxmlformats.org/drawingml/2006/main" noChangeAspect="1"/>
             </wp:cNvGraphicFramePr>
@@ -6364,7 +6652,7 @@
                   <pic:spPr>
                     <a:xfrm>
                       <a:off x="0" y="0"/>
-                      <a:ext cx="813648" cy="1103251"/>
+                      <a:ext cx="1290098" cy="1343025"/>
                     </a:xfrm>
                     <a:prstGeom prst="rect">
                       <a:avLst/>
@@ -6382,23 +6670,7 @@
         <w:pStyle w:val="BodyText"/>
       </w:pPr>
       <w:r>
-        <w:t xml:space="preserve">If you need to move the picture and caption, you can highlight both paragraphs. Dragging sometimes leaves the caption unmoved, but if you use </w:t>
-      </w:r>
-      <w:proofErr w:type="spellStart"/>
-      <w:r>
-        <w:t>Ctrl+X</w:t>
-      </w:r>
-      <w:proofErr w:type="spellEnd"/>
-      <w:r>
-        <w:t xml:space="preserve"> and then </w:t>
-      </w:r>
-      <w:proofErr w:type="spellStart"/>
-      <w:r>
-        <w:t>Ctrl+V</w:t>
-      </w:r>
-      <w:proofErr w:type="spellEnd"/>
-      <w:r>
-        <w:t xml:space="preserve"> in the new location, both parts are moved.</w:t>
+        <w:t>When the textbox is highlighted, you can click the border and drag the textbox to a new location if desired. The picture and caption will move together inside the textbox.</w:t>
       </w:r>
     </w:p>
     <w:p>
@@ -6406,7 +6678,22 @@
         <w:pStyle w:val="BodyText"/>
       </w:pPr>
       <w:r>
-        <w:t>The maximum height and width of an image is capped at 1 inch during export from FLEx, so each image is scaled down to maintain its height/width ratio subject to the size cap. This was intended to mimic what we see in FieldWorks, because it defaults to 1”x1” images.</w:t>
+        <w:t xml:space="preserve">If you want to change the layout, you can right-click the textbox border and choose </w:t>
+      </w:r>
+      <w:r>
+        <w:t>“</w:t>
+      </w:r>
+      <w:r>
+        <w:t>More Layout Options</w:t>
+      </w:r>
+      <w:r>
+        <w:t>”</w:t>
+      </w:r>
+      <w:r>
+        <w:t xml:space="preserve">. </w:t>
+      </w:r>
+      <w:r>
+        <w:t>The Horizontal Alignment is set to Left, Centered, or Right based on the configuration set in FLEx. Once in Word, you can change any of these settings on individual textboxes.</w:t>
       </w:r>
     </w:p>
     <w:p>
@@ -6414,7 +6701,22 @@
         <w:pStyle w:val="BodyText"/>
       </w:pPr>
       <w:r>
-        <w:t>Image size is not something that can be part of a style, so there isn't a way to make all images bigger after the export. There also isn't currently a way for users to specify a preferred size for images in Flex, so there is no way currently to make them all bigger before the export.</w:t>
+        <w:t xml:space="preserve">In a double-column section, Word will wrap the paragraphs to roughly equalize the text in both columns within the section. As a result, if a picture </w:t>
+      </w:r>
+      <w:r>
+        <w:t xml:space="preserve">is </w:t>
+      </w:r>
+      <w:r>
+        <w:t xml:space="preserve">in a single entry in a letter section, the picture will go to the right column instead of staying in the left column. </w:t>
+      </w:r>
+      <w:r>
+        <w:t xml:space="preserve">If you want to force the picture to be under the entry paragraph, you can drag the picture to position it in the </w:t>
+      </w:r>
+      <w:r>
+        <w:t>first</w:t>
+      </w:r>
+      <w:r>
+        <w:t xml:space="preserve"> column.</w:t>
       </w:r>
     </w:p>
     <w:p>
@@ -6422,18 +6724,42 @@
         <w:pStyle w:val="BodyText"/>
       </w:pPr>
       <w:r>
-        <w:t xml:space="preserve">It is possible to manually shrink or expand a picture by dragging a corner of the picture rectangle. </w:t>
+        <w:t xml:space="preserve">You can increase or decrease the size of an individual picture by clicking the picture so that it displays the frame around the picture, then drag one of the </w:t>
+      </w:r>
+      <w:r>
+        <w:t xml:space="preserve">frame </w:t>
+      </w:r>
+      <w:r>
+        <w:t xml:space="preserve">circles to change the size. If you drag a corner circle, the picture will </w:t>
+      </w:r>
+      <w:r>
+        <w:t>maintain</w:t>
+      </w:r>
+      <w:r>
+        <w:t xml:space="preserve"> the aspect ratio of the picture. If you drag a </w:t>
+      </w:r>
+      <w:r>
+        <w:lastRenderedPageBreak/>
+        <w:t>circle in the middle of the line, you can change the aspect ratio. After changing the size of a picture, you may also need to change the size of the textbox. This is especially important if you try to expand the picture beyond the current textbox size.</w:t>
+      </w:r>
+    </w:p>
+    <w:p>
+      <w:pPr>
+        <w:pStyle w:val="BodyText"/>
+      </w:pPr>
+      <w:r>
+        <w:t>In order to get a pleasing page layout with pictures, you may need to change the size, or drag the picture to a new location, or force an entry to a new column, etc.</w:t>
       </w:r>
     </w:p>
     <w:p>
       <w:pPr>
         <w:pStyle w:val="Heading3"/>
       </w:pPr>
-      <w:bookmarkStart w:id="21" w:name="_Toc187071189"/>
+      <w:bookmarkStart w:id="21" w:name="_Toc193439767"/>
       <w:r>
         <w:t>Editing the internal Word docx file</w:t>
       </w:r>
-      <w:bookmarkEnd w:id="20"/>
+      <w:bookmarkEnd w:id="19"/>
       <w:bookmarkEnd w:id="21"/>
     </w:p>
     <w:p>
@@ -6594,7 +6920,6 @@
         <w:rPr>
           <w:rStyle w:val="Boldphrase"/>
         </w:rPr>
-        <w:lastRenderedPageBreak/>
         <w:t>Note</w:t>
       </w:r>
       <w:r>
@@ -6650,7 +6975,7 @@
       <w:pPr>
         <w:pStyle w:val="Heading3"/>
       </w:pPr>
-      <w:bookmarkStart w:id="22" w:name="_Toc187071190"/>
+      <w:bookmarkStart w:id="22" w:name="_Toc193439768"/>
       <w:r>
         <w:t>Dictionary f</w:t>
       </w:r>
@@ -6671,7 +6996,7 @@
       <w:pPr>
         <w:pStyle w:val="Heading1"/>
       </w:pPr>
-      <w:bookmarkStart w:id="23" w:name="_Toc187071191"/>
+      <w:bookmarkStart w:id="23" w:name="_Toc193439769"/>
       <w:r>
         <w:t>Useful features in Word</w:t>
       </w:r>
@@ -6683,7 +7008,7 @@
       </w:pPr>
       <w:bookmarkStart w:id="24" w:name="_Ref143252041"/>
       <w:bookmarkStart w:id="25" w:name="_Ref143252047"/>
-      <w:bookmarkStart w:id="26" w:name="_Toc187071192"/>
+      <w:bookmarkStart w:id="26" w:name="_Toc193439770"/>
       <w:r>
         <w:t xml:space="preserve">Basics of </w:t>
       </w:r>
@@ -6720,7 +7045,11 @@
         <w:t xml:space="preserve">font size, color, background color, </w:t>
       </w:r>
       <w:r>
-        <w:t>subscript, superscript, underlines, etc. The advantage of using styles is consistency and ease of use. By modifying a style, you will affect all of the places that style is used.</w:t>
+        <w:t xml:space="preserve">subscript, superscript, underlines, etc. The advantage of using </w:t>
+      </w:r>
+      <w:r>
+        <w:lastRenderedPageBreak/>
+        <w:t>styles is consistency and ease of use. By modifying a style, you will affect all of the places that style is used.</w:t>
       </w:r>
       <w:r>
         <w:t xml:space="preserve"> </w:t>
@@ -6810,7 +7139,6 @@
         <w:t xml:space="preserve">Alternately, you can move the mouse to the right of the style in the stylesheet and click the triangle menu button. </w:t>
       </w:r>
       <w:r>
-        <w:lastRenderedPageBreak/>
         <w:t>This brings up the Modify Style dialog where you can change the name and basic characteristics of the style. For more complete cont</w:t>
       </w:r>
       <w:r>
@@ -6861,7 +7189,7 @@
       <w:pPr>
         <w:pStyle w:val="Heading2"/>
       </w:pPr>
-      <w:bookmarkStart w:id="27" w:name="_Toc187071193"/>
+      <w:bookmarkStart w:id="27" w:name="_Toc193439771"/>
       <w:r>
         <w:t>Preventing styles from changing: dynamic updating</w:t>
       </w:r>
@@ -6994,8 +7322,9 @@
         <w:pStyle w:val="Heading2"/>
       </w:pPr>
       <w:bookmarkStart w:id="28" w:name="_Ref143252360"/>
-      <w:bookmarkStart w:id="29" w:name="_Toc187071194"/>
-      <w:r>
+      <w:bookmarkStart w:id="29" w:name="_Toc193439772"/>
+      <w:r>
+        <w:lastRenderedPageBreak/>
         <w:t>Advanced Find and Replace</w:t>
       </w:r>
       <w:bookmarkEnd w:id="28"/>
@@ -7093,7 +7422,7 @@
       <w:r>
         <w:fldChar w:fldCharType="separate"/>
       </w:r>
-      <w:bookmarkStart w:id="31" w:name="_Toc187071195"/>
+      <w:bookmarkStart w:id="31" w:name="_Toc193439773"/>
       <w:r>
         <w:rPr>
           <w:cs/>
@@ -7150,11 +7479,7 @@
         <w:t>.</w:t>
       </w:r>
       <w:r>
-        <w:t xml:space="preserve"> You can </w:t>
-      </w:r>
-      <w:r>
-        <w:lastRenderedPageBreak/>
-        <w:t>remove the style from the Find or Replace box by choosing Format</w:t>
+        <w:t xml:space="preserve"> You can remove the style from the Find or Replace box by choosing Format</w:t>
       </w:r>
       <w:r>
         <w:t xml:space="preserve"> &gt; </w:t>
@@ -7174,7 +7499,7 @@
         <w:pStyle w:val="Heading3"/>
       </w:pPr>
       <w:bookmarkStart w:id="32" w:name="_Ref143765894"/>
-      <w:bookmarkStart w:id="33" w:name="_Toc187071196"/>
+      <w:bookmarkStart w:id="33" w:name="_Toc193439774"/>
       <w:r>
         <w:t>Replacing styles</w:t>
       </w:r>
@@ -7270,7 +7595,7 @@
       <w:pPr>
         <w:pStyle w:val="Heading3"/>
       </w:pPr>
-      <w:bookmarkStart w:id="34" w:name="_Toc187071197"/>
+      <w:bookmarkStart w:id="34" w:name="_Toc193439775"/>
       <w:r>
         <w:t>Special codes</w:t>
       </w:r>
@@ -7381,6 +7706,7 @@
                 <w:b/>
                 <w:bCs/>
               </w:rPr>
+              <w:lastRenderedPageBreak/>
               <w:t>^t</w:t>
             </w:r>
           </w:p>
@@ -8481,7 +8807,6 @@
                 <w:b/>
                 <w:bCs/>
               </w:rPr>
-              <w:lastRenderedPageBreak/>
               <w:t>^r</w:t>
             </w:r>
           </w:p>
@@ -8816,7 +9141,7 @@
       <w:pPr>
         <w:pStyle w:val="Heading3"/>
       </w:pPr>
-      <w:bookmarkStart w:id="35" w:name="_Toc187071198"/>
+      <w:bookmarkStart w:id="35" w:name="_Toc193439776"/>
       <w:r>
         <w:t>Wild cards</w:t>
       </w:r>
@@ -9141,6 +9466,7 @@
                 <w:b/>
                 <w:bCs/>
               </w:rPr>
+              <w:lastRenderedPageBreak/>
               <w:t>[!]</w:t>
             </w:r>
           </w:p>
@@ -10001,7 +10327,6 @@
                 <w:b/>
                 <w:bCs/>
               </w:rPr>
-              <w:lastRenderedPageBreak/>
               <w:t>^</w:t>
             </w:r>
             <w:r>
@@ -10972,6 +11297,7 @@
         <w:pStyle w:val="BodyText"/>
       </w:pPr>
       <w:r>
+        <w:lastRenderedPageBreak/>
         <w:t>Here is an</w:t>
       </w:r>
       <w:r>
@@ -11254,9 +11580,8 @@
         <w:pStyle w:val="Heading3"/>
       </w:pPr>
       <w:bookmarkStart w:id="36" w:name="_Ref143765840"/>
-      <w:bookmarkStart w:id="37" w:name="_Toc187071199"/>
-      <w:r>
-        <w:lastRenderedPageBreak/>
+      <w:bookmarkStart w:id="37" w:name="_Toc193439777"/>
+      <w:r>
         <w:t>Adding text before or after a style</w:t>
       </w:r>
       <w:bookmarkEnd w:id="36"/>
@@ -11458,7 +11783,11 @@
       </w:r>
       <w:proofErr w:type="spellEnd"/>
       <w:r>
-        <w:t>, Word removes the style as desired. When you check the style after that, it will be the entry paragraph style.</w:t>
+        <w:t xml:space="preserve">, Word removes the style as desired. When you </w:t>
+      </w:r>
+      <w:r>
+        <w:lastRenderedPageBreak/>
+        <w:t>check the style after that, it will be the entry paragraph style.</w:t>
       </w:r>
       <w:r>
         <w:t xml:space="preserve"> Y</w:t>
@@ -11535,7 +11864,7 @@
         <w:pStyle w:val="Heading2"/>
       </w:pPr>
       <w:bookmarkStart w:id="39" w:name="_Ref143785624"/>
-      <w:bookmarkStart w:id="40" w:name="_Toc187071200"/>
+      <w:bookmarkStart w:id="40" w:name="_Toc193439778"/>
       <w:r>
         <w:t>Removing unused styles in Word</w:t>
       </w:r>
@@ -11695,9 +12024,6 @@
       </w:r>
       <w:r>
         <w:br/>
-      </w:r>
-      <w:r>
-        <w:lastRenderedPageBreak/>
         <w:t xml:space="preserve">                If .Found = False Then </w:t>
       </w:r>
       <w:proofErr w:type="spellStart"/>
@@ -11732,7 +12058,7 @@
         <w:pStyle w:val="Heading2"/>
       </w:pPr>
       <w:bookmarkStart w:id="41" w:name="_Ref144458109"/>
-      <w:bookmarkStart w:id="42" w:name="_Toc187071201"/>
+      <w:bookmarkStart w:id="42" w:name="_Toc193439779"/>
       <w:r>
         <w:t>Word</w:t>
       </w:r>
@@ -11880,8 +12206,9 @@
       </w:pPr>
       <w:bookmarkStart w:id="43" w:name="_Ref181708018"/>
       <w:bookmarkStart w:id="44" w:name="_Ref181711580"/>
-      <w:bookmarkStart w:id="45" w:name="_Toc187071202"/>
-      <w:r>
+      <w:bookmarkStart w:id="45" w:name="_Toc193439780"/>
+      <w:r>
+        <w:lastRenderedPageBreak/>
         <w:t>Example recording a macro and running it through your document</w:t>
       </w:r>
       <w:bookmarkEnd w:id="43"/>
@@ -12069,7 +12396,6 @@
         <w:pStyle w:val="BodyText"/>
       </w:pPr>
       <w:r>
-        <w:lastRenderedPageBreak/>
         <w:t>After</w:t>
       </w:r>
       <w:r>
@@ -12303,7 +12629,11 @@
         <w:t>next</w:t>
       </w:r>
       <w:r>
-        <w:t xml:space="preserve"> is a way to run the macro repeatedly through the entire document. To do this, we need to edit the macro. You can open the macro in a Word macro editor by choosing View &gt; Macros &gt; View Macros, then select the </w:t>
+        <w:t xml:space="preserve"> is a way to run the macro repeatedly through the entire document. To do this, we need to edit the macro. You can open the macro in a Word macro editor by choosing View &gt; Macros </w:t>
+      </w:r>
+      <w:r>
+        <w:lastRenderedPageBreak/>
+        <w:t xml:space="preserve">&gt; View Macros, then select the </w:t>
       </w:r>
       <w:proofErr w:type="spellStart"/>
       <w:r>
@@ -12749,11 +13079,7 @@
         <w:t xml:space="preserve">Before executing this macro, make sure the Advanced Find dialog is set to search for the Emphasis style. Assuming your file still has the first occurrence changed from recording the macro, place your cursor after that occurrence, then use </w:t>
       </w:r>
       <w:r>
-        <w:t xml:space="preserve">View &gt; Macros &gt; View Macros, and </w:t>
-      </w:r>
-      <w:r>
-        <w:lastRenderedPageBreak/>
-        <w:t xml:space="preserve">click </w:t>
+        <w:t xml:space="preserve">View &gt; Macros &gt; View Macros, and click </w:t>
       </w:r>
       <w:proofErr w:type="spellStart"/>
       <w:r>
@@ -12769,7 +13095,7 @@
         <w:pStyle w:val="Heading2"/>
       </w:pPr>
       <w:bookmarkStart w:id="47" w:name="_Ref143767417"/>
-      <w:bookmarkStart w:id="48" w:name="_Toc187071203"/>
+      <w:bookmarkStart w:id="48" w:name="_Toc193439781"/>
       <w:r>
         <w:t>Editing the internal Word docx file</w:t>
       </w:r>
@@ -12842,8 +13168,9 @@
       <w:pPr>
         <w:pStyle w:val="Heading1"/>
       </w:pPr>
-      <w:bookmarkStart w:id="49" w:name="_Toc187071204"/>
-      <w:r>
+      <w:bookmarkStart w:id="49" w:name="_Toc193439782"/>
+      <w:r>
+        <w:lastRenderedPageBreak/>
         <w:t>Bidirectional dictionaries in Word</w:t>
       </w:r>
       <w:bookmarkEnd w:id="49"/>
@@ -13017,9 +13344,8 @@
         <w:pStyle w:val="Heading2"/>
       </w:pPr>
       <w:bookmarkStart w:id="50" w:name="_Ref143851345"/>
-      <w:bookmarkStart w:id="51" w:name="_Toc187071205"/>
-      <w:r>
-        <w:lastRenderedPageBreak/>
+      <w:bookmarkStart w:id="51" w:name="_Toc193439783"/>
+      <w:r>
         <w:t>Enabling right-to-left publications in Word</w:t>
       </w:r>
       <w:bookmarkEnd w:id="50"/>
@@ -13127,7 +13453,11 @@
         <w:t xml:space="preserve"> </w:t>
       </w:r>
       <w:r>
-        <w:t>You do not need to install the other options such as speech recognition and proofing options. You can then click OK to c</w:t>
+        <w:t xml:space="preserve">You do not need to install the other options such as speech recognition and proofing options. You can then click OK to </w:t>
+      </w:r>
+      <w:r>
+        <w:lastRenderedPageBreak/>
+        <w:t>c</w:t>
       </w:r>
       <w:r>
         <w:t>l</w:t>
@@ -13169,7 +13499,7 @@
       <w:pPr>
         <w:pStyle w:val="Heading2"/>
       </w:pPr>
-      <w:bookmarkStart w:id="52" w:name="_Toc187071206"/>
+      <w:bookmarkStart w:id="52" w:name="_Toc193439784"/>
       <w:r>
         <w:t xml:space="preserve">Basic </w:t>
       </w:r>
@@ -13199,7 +13529,7 @@
       <w:pPr>
         <w:pStyle w:val="Heading3"/>
       </w:pPr>
-      <w:bookmarkStart w:id="53" w:name="_Toc187071207"/>
+      <w:bookmarkStart w:id="53" w:name="_Toc193439785"/>
       <w:r>
         <w:t>Settings in FLEx</w:t>
       </w:r>
@@ -13284,7 +13614,7 @@
       <w:pPr>
         <w:pStyle w:val="Heading3"/>
       </w:pPr>
-      <w:bookmarkStart w:id="54" w:name="_Toc187071208"/>
+      <w:bookmarkStart w:id="54" w:name="_Toc193439786"/>
       <w:r>
         <w:t>Setting</w:t>
       </w:r>
@@ -13392,11 +13722,7 @@
         <w:t>.</w:t>
       </w:r>
       <w:r>
-        <w:t xml:space="preserve"> This is critical for </w:t>
-      </w:r>
-      <w:r>
-        <w:lastRenderedPageBreak/>
-        <w:t>RTL documents so that the first column on the page is on the right side.</w:t>
+        <w:t xml:space="preserve"> This is critical for RTL documents so that the first column on the page is on the right side.</w:t>
       </w:r>
       <w:r>
         <w:t xml:space="preserve"> FLEx sets this automatically during export of RTL documents, so this step is not necessary for Word exports.</w:t>
@@ -13415,7 +13741,7 @@
         <w:pStyle w:val="Heading2"/>
       </w:pPr>
       <w:bookmarkStart w:id="55" w:name="_Ref143870637"/>
-      <w:bookmarkStart w:id="56" w:name="_Toc187071209"/>
+      <w:bookmarkStart w:id="56" w:name="_Toc193439787"/>
       <w:r>
         <w:t xml:space="preserve">Bidirectional </w:t>
       </w:r>
@@ -13483,6 +13809,7 @@
         <w:rPr>
           <w:noProof/>
         </w:rPr>
+        <w:lastRenderedPageBreak/>
         <w:drawing>
           <wp:inline distT="0" distB="0" distL="0" distR="0" wp14:anchorId="123F01ED" wp14:editId="16399314">
             <wp:extent cx="4153480" cy="924054"/>
@@ -13678,7 +14005,6 @@
         <w:rPr>
           <w:noProof/>
         </w:rPr>
-        <w:lastRenderedPageBreak/>
         <w:t xml:space="preserve"> </w:t>
       </w:r>
       <w:r>
@@ -13931,6 +14257,7 @@
               <w:pStyle w:val="BodyText"/>
             </w:pPr>
             <w:r>
+              <w:lastRenderedPageBreak/>
               <w:t>RLM</w:t>
             </w:r>
           </w:p>
@@ -14436,7 +14763,6 @@
               <w:pStyle w:val="BodyText"/>
             </w:pPr>
             <w:r>
-              <w:lastRenderedPageBreak/>
               <w:t>FSI</w:t>
             </w:r>
           </w:p>
@@ -14605,7 +14931,7 @@
       </w:pPr>
       <w:bookmarkStart w:id="58" w:name="_Ref143865236"/>
       <w:bookmarkStart w:id="59" w:name="_Ref144371733"/>
-      <w:bookmarkStart w:id="60" w:name="_Toc187071210"/>
+      <w:bookmarkStart w:id="60" w:name="_Toc193439788"/>
       <w:r>
         <w:t xml:space="preserve">Formatting </w:t>
       </w:r>
@@ -14663,7 +14989,11 @@
         <w:t xml:space="preserve"> to</w:t>
       </w:r>
       <w:r>
-        <w:t xml:space="preserve"> export to Word, they cannot be used. </w:t>
+        <w:t xml:space="preserve"> export to </w:t>
+      </w:r>
+      <w:r>
+        <w:lastRenderedPageBreak/>
+        <w:t xml:space="preserve">Word, they cannot be used. </w:t>
       </w:r>
       <w:r>
         <w:t>E</w:t>
@@ -14929,11 +15259,7 @@
         <w:t>s</w:t>
       </w:r>
       <w:r>
-        <w:t xml:space="preserve"> out the pieces going right-to-left, we have the headword, then the open square bracket, the pronunciation, the closing square bracket, the </w:t>
-      </w:r>
-      <w:r>
-        <w:lastRenderedPageBreak/>
-        <w:t xml:space="preserve">category, the period, and then the definition. We could get the desired output by putting </w:t>
+        <w:t xml:space="preserve"> out the pieces going right-to-left, we have the headword, then the open square bracket, the pronunciation, the closing square bracket, the category, the period, and then the definition. We could get the desired output by putting </w:t>
       </w:r>
       <w:r>
         <w:t>the period in Before text and putting in backward square brackets in the Before and After. But this is technically not correct, and will cause other problems along the way.</w:t>
@@ -15268,7 +15594,11 @@
         <w:t>FLEx</w:t>
       </w:r>
       <w:r>
-        <w:t>, but now there is a positioning problem. The pronunciation is an entry field and should follow the headword. But in this case the category is following the headword. The bidi algorithm sees the headword and category as one LTR string, which ends up with the wrong order.</w:t>
+        <w:t xml:space="preserve">, but now there is a positioning problem. The pronunciation is an entry field and should follow the headword. But in </w:t>
+      </w:r>
+      <w:r>
+        <w:lastRenderedPageBreak/>
+        <w:t>this case the category is following the headword. The bidi algorithm sees the headword and category as one LTR string, which ends up with the wrong order.</w:t>
       </w:r>
     </w:p>
     <w:p>
@@ -15623,11 +15953,7 @@
         <w:t xml:space="preserve"> </w:t>
       </w:r>
       <w:r>
-        <w:t xml:space="preserve">that will likely be encountered when configuring Bidi dictionaries in FLEx, and some specific challenges when using Word. Any time you add Before and After fields, there is a good possibility you will need to use some </w:t>
-      </w:r>
-      <w:r>
-        <w:lastRenderedPageBreak/>
-        <w:t xml:space="preserve">of the </w:t>
+        <w:t xml:space="preserve">that will likely be encountered when configuring Bidi dictionaries in FLEx, and some specific challenges when using Word. Any time you add Before and After fields, there is a good possibility you will need to use some of the </w:t>
       </w:r>
       <w:r>
         <w:t>B</w:t>
@@ -15884,7 +16210,7 @@
       <w:rPr>
         <w:noProof/>
       </w:rPr>
-      <w:t>1/6/2025</w:t>
+      <w:t>3/21/2025</w:t>
     </w:r>
     <w:r>
       <w:fldChar w:fldCharType="end"/>
@@ -15931,7 +16257,7 @@
         <w:rStyle w:val="PageNumber"/>
         <w:noProof/>
       </w:rPr>
-      <w:t>1/6/2025</w:t>
+      <w:t>3/21/2025</w:t>
     </w:r>
     <w:r>
       <w:rPr>
@@ -16107,29 +16433,15 @@
       </w:rPr>
       <w:tab/>
     </w:r>
-    <w:r>
-      <w:fldChar w:fldCharType="begin"/>
-    </w:r>
-    <w:r>
-      <w:instrText xml:space="preserve"> STYLEREF "Heading 1" \* MERGEFORMAT </w:instrText>
-    </w:r>
-    <w:r>
-      <w:fldChar w:fldCharType="separate"/>
-    </w:r>
-    <w:r>
-      <w:rPr>
-        <w:rStyle w:val="PageNumber"/>
-        <w:noProof/>
-      </w:rPr>
-      <w:t>Introduction</w:t>
-    </w:r>
-    <w:r>
-      <w:rPr>
-        <w:rStyle w:val="PageNumber"/>
-        <w:noProof/>
-      </w:rPr>
-      <w:fldChar w:fldCharType="end"/>
-    </w:r>
+    <w:fldSimple w:instr=" STYLEREF &quot;Heading 1&quot; \* MERGEFORMAT ">
+      <w:r>
+        <w:rPr>
+          <w:rStyle w:val="PageNumber"/>
+          <w:noProof/>
+        </w:rPr>
+        <w:t>Introduction</w:t>
+      </w:r>
+    </w:fldSimple>
   </w:p>
 </w:hdr>
 </file>
@@ -19424,7 +19736,7 @@
 </file>
 
 <file path=customXml/itemProps1.xml><?xml version="1.0" encoding="utf-8"?>
-<ds:datastoreItem xmlns:ds="http://schemas.openxmlformats.org/officeDocument/2006/customXml" ds:itemID="{1AA31782-DFD4-427E-AD3E-FFE75FD79765}">
+<ds:datastoreItem xmlns:ds="http://schemas.openxmlformats.org/officeDocument/2006/customXml" ds:itemID="{95B8B7C3-248D-4852-8D1E-BC23F949D7AC}">
   <ds:schemaRefs>
     <ds:schemaRef ds:uri="http://schemas.openxmlformats.org/officeDocument/2006/bibliography"/>
   </ds:schemaRefs>

</xml_diff>

<commit_message>
Update to Technical notes on Word export doc
Added numerous updates mainly in picture and style areas

Change-Id: I687f3313d599f0b0b95018a7814b9fffd767c58d
</commit_message>
<xml_diff>
--- a/HelpResourcesSources/TechnicalNotes/Publishing FLEx Dictionaries Using Microsoft Word.docx
+++ b/HelpResourcesSources/TechnicalNotes/Publishing FLEx Dictionaries Using Microsoft Word.docx
@@ -6,7 +6,7 @@
       <w:pPr>
         <w:pStyle w:val="Title"/>
       </w:pPr>
-      <w:bookmarkStart w:id="0" w:name="_Toc193439753"/>
+      <w:bookmarkStart w:id="0" w:name="_Toc196376604"/>
       <w:r>
         <w:t>Publishing FLEx Dictionaries Using Microsoft Word</w:t>
       </w:r>
@@ -31,13 +31,19 @@
         <w:rPr>
           <w:szCs w:val="36"/>
         </w:rPr>
-        <w:t>March 2</w:t>
+        <w:t xml:space="preserve">April </w:t>
       </w:r>
       <w:r>
         <w:rPr>
           <w:szCs w:val="36"/>
         </w:rPr>
-        <w:t>1</w:t>
+        <w:t>2</w:t>
+      </w:r>
+      <w:r>
+        <w:rPr>
+          <w:szCs w:val="36"/>
+        </w:rPr>
+        <w:t>4</w:t>
       </w:r>
       <w:r>
         <w:rPr>
@@ -80,7 +86,7 @@
           <w:lang w:eastAsia="en-US"/>
         </w:rPr>
       </w:pPr>
-      <w:hyperlink w:anchor="_Toc193439753" w:history="1">
+      <w:hyperlink w:anchor="_Toc196376604" w:history="1">
         <w:r>
           <w:rPr>
             <w:rStyle w:val="Hyperlink"/>
@@ -107,7 +113,7 @@
             <w:noProof/>
             <w:webHidden/>
           </w:rPr>
-          <w:instrText xml:space="preserve"> PAGEREF _Toc193439753 \h </w:instrText>
+          <w:instrText xml:space="preserve"> PAGEREF _Toc196376604 \h </w:instrText>
         </w:r>
         <w:r>
           <w:rPr>
@@ -153,7 +159,7 @@
           <w:lang w:eastAsia="en-US"/>
         </w:rPr>
       </w:pPr>
-      <w:hyperlink w:anchor="_Toc193439754" w:history="1">
+      <w:hyperlink w:anchor="_Toc196376605" w:history="1">
         <w:r>
           <w:rPr>
             <w:rStyle w:val="Hyperlink"/>
@@ -197,7 +203,7 @@
             <w:noProof/>
             <w:webHidden/>
           </w:rPr>
-          <w:instrText xml:space="preserve"> PAGEREF _Toc193439754 \h </w:instrText>
+          <w:instrText xml:space="preserve"> PAGEREF _Toc196376605 \h </w:instrText>
         </w:r>
         <w:r>
           <w:rPr>
@@ -243,7 +249,7 @@
           <w:lang w:eastAsia="en-US"/>
         </w:rPr>
       </w:pPr>
-      <w:hyperlink w:anchor="_Toc193439755" w:history="1">
+      <w:hyperlink w:anchor="_Toc196376606" w:history="1">
         <w:r>
           <w:rPr>
             <w:rStyle w:val="Hyperlink"/>
@@ -287,7 +293,7 @@
             <w:noProof/>
             <w:webHidden/>
           </w:rPr>
-          <w:instrText xml:space="preserve"> PAGEREF _Toc193439755 \h </w:instrText>
+          <w:instrText xml:space="preserve"> PAGEREF _Toc196376606 \h </w:instrText>
         </w:r>
         <w:r>
           <w:rPr>
@@ -332,7 +338,7 @@
           <w:szCs w:val="22"/>
         </w:rPr>
       </w:pPr>
-      <w:hyperlink w:anchor="_Toc193439756" w:history="1">
+      <w:hyperlink w:anchor="_Toc196376607" w:history="1">
         <w:r>
           <w:rPr>
             <w:rStyle w:val="Hyperlink"/>
@@ -377,7 +383,7 @@
             <w:noProof/>
             <w:webHidden/>
           </w:rPr>
-          <w:instrText xml:space="preserve"> PAGEREF _Toc193439756 \h </w:instrText>
+          <w:instrText xml:space="preserve"> PAGEREF _Toc196376607 \h </w:instrText>
         </w:r>
         <w:r>
           <w:rPr>
@@ -423,7 +429,7 @@
           <w:lang w:eastAsia="en-US"/>
         </w:rPr>
       </w:pPr>
-      <w:hyperlink w:anchor="_Toc193439757" w:history="1">
+      <w:hyperlink w:anchor="_Toc196376608" w:history="1">
         <w:r>
           <w:rPr>
             <w:rStyle w:val="Hyperlink"/>
@@ -453,16 +459,7 @@
             <w:rStyle w:val="Hyperlink"/>
             <w:noProof/>
           </w:rPr>
-          <w:t>Saving list reference name</w:t>
-        </w:r>
-        <w:bookmarkStart w:id="1" w:name="_GoBack"/>
-        <w:bookmarkEnd w:id="1"/>
-        <w:r>
-          <w:rPr>
-            <w:rStyle w:val="Hyperlink"/>
-            <w:noProof/>
-          </w:rPr>
-          <w:t>s in the Word document</w:t>
+          <w:t>Saving list reference names in the Word document</w:t>
         </w:r>
         <w:r>
           <w:rPr>
@@ -483,7 +480,7 @@
             <w:noProof/>
             <w:webHidden/>
           </w:rPr>
-          <w:instrText xml:space="preserve"> PAGEREF _Toc193439757 \h </w:instrText>
+          <w:instrText xml:space="preserve"> PAGEREF _Toc196376608 \h </w:instrText>
         </w:r>
         <w:r>
           <w:rPr>
@@ -528,7 +525,7 @@
           <w:szCs w:val="22"/>
         </w:rPr>
       </w:pPr>
-      <w:hyperlink w:anchor="_Toc193439758" w:history="1">
+      <w:hyperlink w:anchor="_Toc196376609" w:history="1">
         <w:r>
           <w:rPr>
             <w:rStyle w:val="Hyperlink"/>
@@ -573,7 +570,7 @@
             <w:noProof/>
             <w:webHidden/>
           </w:rPr>
-          <w:instrText xml:space="preserve"> PAGEREF _Toc193439758 \h </w:instrText>
+          <w:instrText xml:space="preserve"> PAGEREF _Toc196376609 \h </w:instrText>
         </w:r>
         <w:r>
           <w:rPr>
@@ -618,7 +615,7 @@
           <w:szCs w:val="22"/>
         </w:rPr>
       </w:pPr>
-      <w:hyperlink w:anchor="_Toc193439759" w:history="1">
+      <w:hyperlink w:anchor="_Toc196376610" w:history="1">
         <w:r>
           <w:rPr>
             <w:rStyle w:val="Hyperlink"/>
@@ -663,7 +660,7 @@
             <w:noProof/>
             <w:webHidden/>
           </w:rPr>
-          <w:instrText xml:space="preserve"> PAGEREF _Toc193439759 \h </w:instrText>
+          <w:instrText xml:space="preserve"> PAGEREF _Toc196376610 \h </w:instrText>
         </w:r>
         <w:r>
           <w:rPr>
@@ -709,7 +706,7 @@
           <w:lang w:eastAsia="en-US"/>
         </w:rPr>
       </w:pPr>
-      <w:hyperlink w:anchor="_Toc193439760" w:history="1">
+      <w:hyperlink w:anchor="_Toc196376611" w:history="1">
         <w:r>
           <w:rPr>
             <w:rStyle w:val="Hyperlink"/>
@@ -722,7 +719,21 @@
               </w14:lightRig>
             </w14:scene3d>
           </w:rPr>
-          <w:t>2.3.1</w:t>
+          <w:t>2.3.</w:t>
+        </w:r>
+        <w:r>
+          <w:rPr>
+            <w:rStyle w:val="Hyperlink"/>
+            <w:noProof/>
+            <w:lang w:bidi="x-none"/>
+            <w14:scene3d>
+              <w14:camera w14:prst="orthographicFront"/>
+              <w14:lightRig w14:rig="threePt" w14:dir="t">
+                <w14:rot w14:lat="0" w14:lon="0" w14:rev="0"/>
+              </w14:lightRig>
+            </w14:scene3d>
+          </w:rPr>
+          <w:t>1</w:t>
         </w:r>
         <w:r>
           <w:rPr>
@@ -760,7 +771,7 @@
             <w:noProof/>
             <w:webHidden/>
           </w:rPr>
-          <w:instrText xml:space="preserve"> PAGEREF _Toc193439760 \h </w:instrText>
+          <w:instrText xml:space="preserve"> PAGEREF _Toc196376611 \h </w:instrText>
         </w:r>
         <w:r>
           <w:rPr>
@@ -806,7 +817,7 @@
           <w:lang w:eastAsia="en-US"/>
         </w:rPr>
       </w:pPr>
-      <w:hyperlink w:anchor="_Toc193439761" w:history="1">
+      <w:hyperlink w:anchor="_Toc196376612" w:history="1">
         <w:r>
           <w:rPr>
             <w:rStyle w:val="Hyperlink"/>
@@ -836,7 +847,7 @@
             <w:rStyle w:val="Hyperlink"/>
             <w:noProof/>
           </w:rPr>
-          <w:t>Adjusting styles</w:t>
+          <w:t>Exported styles in Word</w:t>
         </w:r>
         <w:r>
           <w:rPr>
@@ -857,7 +868,7 @@
             <w:noProof/>
             <w:webHidden/>
           </w:rPr>
-          <w:instrText xml:space="preserve"> PAGEREF _Toc193439761 \h </w:instrText>
+          <w:instrText xml:space="preserve"> PAGEREF _Toc196376612 \h </w:instrText>
         </w:r>
         <w:r>
           <w:rPr>
@@ -902,7 +913,7 @@
           <w:szCs w:val="22"/>
         </w:rPr>
       </w:pPr>
-      <w:hyperlink w:anchor="_Toc193439762" w:history="1">
+      <w:hyperlink w:anchor="_Toc196376613" w:history="1">
         <w:r>
           <w:rPr>
             <w:rStyle w:val="Hyperlink"/>
@@ -947,7 +958,7 @@
             <w:noProof/>
             <w:webHidden/>
           </w:rPr>
-          <w:instrText xml:space="preserve"> PAGEREF _Toc193439762 \h </w:instrText>
+          <w:instrText xml:space="preserve"> PAGEREF _Toc196376613 \h </w:instrText>
         </w:r>
         <w:r>
           <w:rPr>
@@ -993,7 +1004,7 @@
           <w:lang w:eastAsia="en-US"/>
         </w:rPr>
       </w:pPr>
-      <w:hyperlink w:anchor="_Toc193439763" w:history="1">
+      <w:hyperlink w:anchor="_Toc196376614" w:history="1">
         <w:r>
           <w:rPr>
             <w:rStyle w:val="Hyperlink"/>
@@ -1044,7 +1055,7 @@
             <w:noProof/>
             <w:webHidden/>
           </w:rPr>
-          <w:instrText xml:space="preserve"> PAGEREF _Toc193439763 \h </w:instrText>
+          <w:instrText xml:space="preserve"> PAGEREF _Toc196376614 \h </w:instrText>
         </w:r>
         <w:r>
           <w:rPr>
@@ -1064,7 +1075,7 @@
             <w:noProof/>
             <w:webHidden/>
           </w:rPr>
-          <w:t>8</w:t>
+          <w:t>9</w:t>
         </w:r>
         <w:r>
           <w:rPr>
@@ -1090,7 +1101,7 @@
           <w:lang w:eastAsia="en-US"/>
         </w:rPr>
       </w:pPr>
-      <w:hyperlink w:anchor="_Toc193439764" w:history="1">
+      <w:hyperlink w:anchor="_Toc196376615" w:history="1">
         <w:r>
           <w:rPr>
             <w:rStyle w:val="Hyperlink"/>
@@ -1141,7 +1152,7 @@
             <w:noProof/>
             <w:webHidden/>
           </w:rPr>
-          <w:instrText xml:space="preserve"> PAGEREF _Toc193439764 \h </w:instrText>
+          <w:instrText xml:space="preserve"> PAGEREF _Toc196376615 \h </w:instrText>
         </w:r>
         <w:r>
           <w:rPr>
@@ -1187,7 +1198,7 @@
           <w:lang w:eastAsia="en-US"/>
         </w:rPr>
       </w:pPr>
-      <w:hyperlink w:anchor="_Toc193439765" w:history="1">
+      <w:hyperlink w:anchor="_Toc196376616" w:history="1">
         <w:r>
           <w:rPr>
             <w:rStyle w:val="Hyperlink"/>
@@ -1238,7 +1249,7 @@
             <w:noProof/>
             <w:webHidden/>
           </w:rPr>
-          <w:instrText xml:space="preserve"> PAGEREF _Toc193439765 \h </w:instrText>
+          <w:instrText xml:space="preserve"> PAGEREF _Toc196376616 \h </w:instrText>
         </w:r>
         <w:r>
           <w:rPr>
@@ -1258,7 +1269,7 @@
             <w:noProof/>
             <w:webHidden/>
           </w:rPr>
-          <w:t>10</w:t>
+          <w:t>11</w:t>
         </w:r>
         <w:r>
           <w:rPr>
@@ -1284,7 +1295,7 @@
           <w:lang w:eastAsia="en-US"/>
         </w:rPr>
       </w:pPr>
-      <w:hyperlink w:anchor="_Toc193439766" w:history="1">
+      <w:hyperlink w:anchor="_Toc196376617" w:history="1">
         <w:r>
           <w:rPr>
             <w:rStyle w:val="Hyperlink"/>
@@ -1314,21 +1325,7 @@
             <w:rStyle w:val="Hyperlink"/>
             <w:noProof/>
           </w:rPr>
-          <w:t>Picture</w:t>
-        </w:r>
-        <w:r>
-          <w:rPr>
-            <w:rStyle w:val="Hyperlink"/>
-            <w:noProof/>
-          </w:rPr>
-          <w:t>s</w:t>
-        </w:r>
-        <w:r>
-          <w:rPr>
-            <w:rStyle w:val="Hyperlink"/>
-            <w:noProof/>
-          </w:rPr>
-          <w:t xml:space="preserve"> in Word</w:t>
+          <w:t>Pictures in Word</w:t>
         </w:r>
         <w:r>
           <w:rPr>
@@ -1349,7 +1346,7 @@
             <w:noProof/>
             <w:webHidden/>
           </w:rPr>
-          <w:instrText xml:space="preserve"> PAGEREF _Toc193439766 \h </w:instrText>
+          <w:instrText xml:space="preserve"> PAGEREF _Toc196376617 \h </w:instrText>
         </w:r>
         <w:r>
           <w:rPr>
@@ -1395,7 +1392,7 @@
           <w:lang w:eastAsia="en-US"/>
         </w:rPr>
       </w:pPr>
-      <w:hyperlink w:anchor="_Toc193439767" w:history="1">
+      <w:hyperlink w:anchor="_Toc196376618" w:history="1">
         <w:r>
           <w:rPr>
             <w:rStyle w:val="Hyperlink"/>
@@ -1446,7 +1443,7 @@
             <w:noProof/>
             <w:webHidden/>
           </w:rPr>
-          <w:instrText xml:space="preserve"> PAGEREF _Toc193439767 \h </w:instrText>
+          <w:instrText xml:space="preserve"> PAGEREF _Toc196376618 \h </w:instrText>
         </w:r>
         <w:r>
           <w:rPr>
@@ -1466,7 +1463,7 @@
             <w:noProof/>
             <w:webHidden/>
           </w:rPr>
-          <w:t>12</w:t>
+          <w:t>13</w:t>
         </w:r>
         <w:r>
           <w:rPr>
@@ -1492,7 +1489,7 @@
           <w:lang w:eastAsia="en-US"/>
         </w:rPr>
       </w:pPr>
-      <w:hyperlink w:anchor="_Toc193439768" w:history="1">
+      <w:hyperlink w:anchor="_Toc196376619" w:history="1">
         <w:r>
           <w:rPr>
             <w:rStyle w:val="Hyperlink"/>
@@ -1543,7 +1540,7 @@
             <w:noProof/>
             <w:webHidden/>
           </w:rPr>
-          <w:instrText xml:space="preserve"> PAGEREF _Toc193439768 \h </w:instrText>
+          <w:instrText xml:space="preserve"> PAGEREF _Toc196376619 \h </w:instrText>
         </w:r>
         <w:r>
           <w:rPr>
@@ -1563,7 +1560,7 @@
             <w:noProof/>
             <w:webHidden/>
           </w:rPr>
-          <w:t>12</w:t>
+          <w:t>13</w:t>
         </w:r>
         <w:r>
           <w:rPr>
@@ -1589,7 +1586,7 @@
           <w:lang w:eastAsia="en-US"/>
         </w:rPr>
       </w:pPr>
-      <w:hyperlink w:anchor="_Toc193439769" w:history="1">
+      <w:hyperlink w:anchor="_Toc196376620" w:history="1">
         <w:r>
           <w:rPr>
             <w:rStyle w:val="Hyperlink"/>
@@ -1633,7 +1630,7 @@
             <w:noProof/>
             <w:webHidden/>
           </w:rPr>
-          <w:instrText xml:space="preserve"> PAGEREF _Toc193439769 \h </w:instrText>
+          <w:instrText xml:space="preserve"> PAGEREF _Toc196376620 \h </w:instrText>
         </w:r>
         <w:r>
           <w:rPr>
@@ -1653,7 +1650,7 @@
             <w:noProof/>
             <w:webHidden/>
           </w:rPr>
-          <w:t>12</w:t>
+          <w:t>13</w:t>
         </w:r>
         <w:r>
           <w:rPr>
@@ -1678,7 +1675,7 @@
           <w:szCs w:val="22"/>
         </w:rPr>
       </w:pPr>
-      <w:hyperlink w:anchor="_Toc193439770" w:history="1">
+      <w:hyperlink w:anchor="_Toc196376621" w:history="1">
         <w:r>
           <w:rPr>
             <w:rStyle w:val="Hyperlink"/>
@@ -1723,7 +1720,7 @@
             <w:noProof/>
             <w:webHidden/>
           </w:rPr>
-          <w:instrText xml:space="preserve"> PAGEREF _Toc193439770 \h </w:instrText>
+          <w:instrText xml:space="preserve"> PAGEREF _Toc196376621 \h </w:instrText>
         </w:r>
         <w:r>
           <w:rPr>
@@ -1743,7 +1740,7 @@
             <w:noProof/>
             <w:webHidden/>
           </w:rPr>
-          <w:t>12</w:t>
+          <w:t>13</w:t>
         </w:r>
         <w:r>
           <w:rPr>
@@ -1768,7 +1765,7 @@
           <w:szCs w:val="22"/>
         </w:rPr>
       </w:pPr>
-      <w:hyperlink w:anchor="_Toc193439771" w:history="1">
+      <w:hyperlink w:anchor="_Toc196376622" w:history="1">
         <w:r>
           <w:rPr>
             <w:rStyle w:val="Hyperlink"/>
@@ -1813,7 +1810,7 @@
             <w:noProof/>
             <w:webHidden/>
           </w:rPr>
-          <w:instrText xml:space="preserve"> PAGEREF _Toc193439771 \h </w:instrText>
+          <w:instrText xml:space="preserve"> PAGEREF _Toc196376622 \h </w:instrText>
         </w:r>
         <w:r>
           <w:rPr>
@@ -1833,7 +1830,7 @@
             <w:noProof/>
             <w:webHidden/>
           </w:rPr>
-          <w:t>13</w:t>
+          <w:t>14</w:t>
         </w:r>
         <w:r>
           <w:rPr>
@@ -1858,7 +1855,7 @@
           <w:szCs w:val="22"/>
         </w:rPr>
       </w:pPr>
-      <w:hyperlink w:anchor="_Toc193439772" w:history="1">
+      <w:hyperlink w:anchor="_Toc196376623" w:history="1">
         <w:r>
           <w:rPr>
             <w:rStyle w:val="Hyperlink"/>
@@ -1903,7 +1900,7 @@
             <w:noProof/>
             <w:webHidden/>
           </w:rPr>
-          <w:instrText xml:space="preserve"> PAGEREF _Toc193439772 \h </w:instrText>
+          <w:instrText xml:space="preserve"> PAGEREF _Toc196376623 \h </w:instrText>
         </w:r>
         <w:r>
           <w:rPr>
@@ -1923,7 +1920,7 @@
             <w:noProof/>
             <w:webHidden/>
           </w:rPr>
-          <w:t>14</w:t>
+          <w:t>15</w:t>
         </w:r>
         <w:r>
           <w:rPr>
@@ -1949,7 +1946,7 @@
           <w:lang w:eastAsia="en-US"/>
         </w:rPr>
       </w:pPr>
-      <w:hyperlink w:anchor="_Toc193439773" w:history="1">
+      <w:hyperlink w:anchor="_Toc196376624" w:history="1">
         <w:r>
           <w:rPr>
             <w:rStyle w:val="Hyperlink"/>
@@ -2008,7 +2005,7 @@
             <w:noProof/>
             <w:webHidden/>
           </w:rPr>
-          <w:instrText xml:space="preserve"> PAGEREF _Toc193439773 \h </w:instrText>
+          <w:instrText xml:space="preserve"> PAGEREF _Toc196376624 \h </w:instrText>
         </w:r>
         <w:r>
           <w:rPr>
@@ -2028,7 +2025,7 @@
             <w:noProof/>
             <w:webHidden/>
           </w:rPr>
-          <w:t>14</w:t>
+          <w:t>15</w:t>
         </w:r>
         <w:r>
           <w:rPr>
@@ -2054,7 +2051,7 @@
           <w:lang w:eastAsia="en-US"/>
         </w:rPr>
       </w:pPr>
-      <w:hyperlink w:anchor="_Toc193439774" w:history="1">
+      <w:hyperlink w:anchor="_Toc196376625" w:history="1">
         <w:r>
           <w:rPr>
             <w:rStyle w:val="Hyperlink"/>
@@ -2105,7 +2102,7 @@
             <w:noProof/>
             <w:webHidden/>
           </w:rPr>
-          <w:instrText xml:space="preserve"> PAGEREF _Toc193439774 \h </w:instrText>
+          <w:instrText xml:space="preserve"> PAGEREF _Toc196376625 \h </w:instrText>
         </w:r>
         <w:r>
           <w:rPr>
@@ -2125,7 +2122,7 @@
             <w:noProof/>
             <w:webHidden/>
           </w:rPr>
-          <w:t>14</w:t>
+          <w:t>15</w:t>
         </w:r>
         <w:r>
           <w:rPr>
@@ -2151,7 +2148,7 @@
           <w:lang w:eastAsia="en-US"/>
         </w:rPr>
       </w:pPr>
-      <w:hyperlink w:anchor="_Toc193439775" w:history="1">
+      <w:hyperlink w:anchor="_Toc196376626" w:history="1">
         <w:r>
           <w:rPr>
             <w:rStyle w:val="Hyperlink"/>
@@ -2202,7 +2199,7 @@
             <w:noProof/>
             <w:webHidden/>
           </w:rPr>
-          <w:instrText xml:space="preserve"> PAGEREF _Toc193439775 \h </w:instrText>
+          <w:instrText xml:space="preserve"> PAGEREF _Toc196376626 \h </w:instrText>
         </w:r>
         <w:r>
           <w:rPr>
@@ -2222,7 +2219,7 @@
             <w:noProof/>
             <w:webHidden/>
           </w:rPr>
-          <w:t>14</w:t>
+          <w:t>15</w:t>
         </w:r>
         <w:r>
           <w:rPr>
@@ -2248,7 +2245,7 @@
           <w:lang w:eastAsia="en-US"/>
         </w:rPr>
       </w:pPr>
-      <w:hyperlink w:anchor="_Toc193439776" w:history="1">
+      <w:hyperlink w:anchor="_Toc196376627" w:history="1">
         <w:r>
           <w:rPr>
             <w:rStyle w:val="Hyperlink"/>
@@ -2299,7 +2296,7 @@
             <w:noProof/>
             <w:webHidden/>
           </w:rPr>
-          <w:instrText xml:space="preserve"> PAGEREF _Toc193439776 \h </w:instrText>
+          <w:instrText xml:space="preserve"> PAGEREF _Toc196376627 \h </w:instrText>
         </w:r>
         <w:r>
           <w:rPr>
@@ -2319,7 +2316,7 @@
             <w:noProof/>
             <w:webHidden/>
           </w:rPr>
-          <w:t>15</w:t>
+          <w:t>16</w:t>
         </w:r>
         <w:r>
           <w:rPr>
@@ -2345,7 +2342,7 @@
           <w:lang w:eastAsia="en-US"/>
         </w:rPr>
       </w:pPr>
-      <w:hyperlink w:anchor="_Toc193439777" w:history="1">
+      <w:hyperlink w:anchor="_Toc196376628" w:history="1">
         <w:r>
           <w:rPr>
             <w:rStyle w:val="Hyperlink"/>
@@ -2396,7 +2393,7 @@
             <w:noProof/>
             <w:webHidden/>
           </w:rPr>
-          <w:instrText xml:space="preserve"> PAGEREF _Toc193439777 \h </w:instrText>
+          <w:instrText xml:space="preserve"> PAGEREF _Toc196376628 \h </w:instrText>
         </w:r>
         <w:r>
           <w:rPr>
@@ -2416,7 +2413,7 @@
             <w:noProof/>
             <w:webHidden/>
           </w:rPr>
-          <w:t>17</w:t>
+          <w:t>18</w:t>
         </w:r>
         <w:r>
           <w:rPr>
@@ -2441,7 +2438,7 @@
           <w:szCs w:val="22"/>
         </w:rPr>
       </w:pPr>
-      <w:hyperlink w:anchor="_Toc193439778" w:history="1">
+      <w:hyperlink w:anchor="_Toc196376629" w:history="1">
         <w:r>
           <w:rPr>
             <w:rStyle w:val="Hyperlink"/>
@@ -2486,7 +2483,7 @@
             <w:noProof/>
             <w:webHidden/>
           </w:rPr>
-          <w:instrText xml:space="preserve"> PAGEREF _Toc193439778 \h </w:instrText>
+          <w:instrText xml:space="preserve"> PAGEREF _Toc196376629 \h </w:instrText>
         </w:r>
         <w:r>
           <w:rPr>
@@ -2506,7 +2503,7 @@
             <w:noProof/>
             <w:webHidden/>
           </w:rPr>
-          <w:t>18</w:t>
+          <w:t>19</w:t>
         </w:r>
         <w:r>
           <w:rPr>
@@ -2531,7 +2528,7 @@
           <w:szCs w:val="22"/>
         </w:rPr>
       </w:pPr>
-      <w:hyperlink w:anchor="_Toc193439779" w:history="1">
+      <w:hyperlink w:anchor="_Toc196376630" w:history="1">
         <w:r>
           <w:rPr>
             <w:rStyle w:val="Hyperlink"/>
@@ -2576,7 +2573,7 @@
             <w:noProof/>
             <w:webHidden/>
           </w:rPr>
-          <w:instrText xml:space="preserve"> PAGEREF _Toc193439779 \h </w:instrText>
+          <w:instrText xml:space="preserve"> PAGEREF _Toc196376630 \h </w:instrText>
         </w:r>
         <w:r>
           <w:rPr>
@@ -2596,7 +2593,7 @@
             <w:noProof/>
             <w:webHidden/>
           </w:rPr>
-          <w:t>18</w:t>
+          <w:t>19</w:t>
         </w:r>
         <w:r>
           <w:rPr>
@@ -2622,7 +2619,7 @@
           <w:lang w:eastAsia="en-US"/>
         </w:rPr>
       </w:pPr>
-      <w:hyperlink w:anchor="_Toc193439780" w:history="1">
+      <w:hyperlink w:anchor="_Toc196376631" w:history="1">
         <w:r>
           <w:rPr>
             <w:rStyle w:val="Hyperlink"/>
@@ -2673,7 +2670,7 @@
             <w:noProof/>
             <w:webHidden/>
           </w:rPr>
-          <w:instrText xml:space="preserve"> PAGEREF _Toc193439780 \h </w:instrText>
+          <w:instrText xml:space="preserve"> PAGEREF _Toc196376631 \h </w:instrText>
         </w:r>
         <w:r>
           <w:rPr>
@@ -2693,7 +2690,7 @@
             <w:noProof/>
             <w:webHidden/>
           </w:rPr>
-          <w:t>19</w:t>
+          <w:t>20</w:t>
         </w:r>
         <w:r>
           <w:rPr>
@@ -2718,7 +2715,7 @@
           <w:szCs w:val="22"/>
         </w:rPr>
       </w:pPr>
-      <w:hyperlink w:anchor="_Toc193439781" w:history="1">
+      <w:hyperlink w:anchor="_Toc196376632" w:history="1">
         <w:r>
           <w:rPr>
             <w:rStyle w:val="Hyperlink"/>
@@ -2763,7 +2760,7 @@
             <w:noProof/>
             <w:webHidden/>
           </w:rPr>
-          <w:instrText xml:space="preserve"> PAGEREF _Toc193439781 \h </w:instrText>
+          <w:instrText xml:space="preserve"> PAGEREF _Toc196376632 \h </w:instrText>
         </w:r>
         <w:r>
           <w:rPr>
@@ -2783,7 +2780,7 @@
             <w:noProof/>
             <w:webHidden/>
           </w:rPr>
-          <w:t>20</w:t>
+          <w:t>21</w:t>
         </w:r>
         <w:r>
           <w:rPr>
@@ -2809,7 +2806,7 @@
           <w:lang w:eastAsia="en-US"/>
         </w:rPr>
       </w:pPr>
-      <w:hyperlink w:anchor="_Toc193439782" w:history="1">
+      <w:hyperlink w:anchor="_Toc196376633" w:history="1">
         <w:r>
           <w:rPr>
             <w:rStyle w:val="Hyperlink"/>
@@ -2853,7 +2850,7 @@
             <w:noProof/>
             <w:webHidden/>
           </w:rPr>
-          <w:instrText xml:space="preserve"> PAGEREF _Toc193439782 \h </w:instrText>
+          <w:instrText xml:space="preserve"> PAGEREF _Toc196376633 \h </w:instrText>
         </w:r>
         <w:r>
           <w:rPr>
@@ -2873,7 +2870,7 @@
             <w:noProof/>
             <w:webHidden/>
           </w:rPr>
-          <w:t>21</w:t>
+          <w:t>22</w:t>
         </w:r>
         <w:r>
           <w:rPr>
@@ -2898,7 +2895,7 @@
           <w:szCs w:val="22"/>
         </w:rPr>
       </w:pPr>
-      <w:hyperlink w:anchor="_Toc193439783" w:history="1">
+      <w:hyperlink w:anchor="_Toc196376634" w:history="1">
         <w:r>
           <w:rPr>
             <w:rStyle w:val="Hyperlink"/>
@@ -2943,7 +2940,7 @@
             <w:noProof/>
             <w:webHidden/>
           </w:rPr>
-          <w:instrText xml:space="preserve"> PAGEREF _Toc193439783 \h </w:instrText>
+          <w:instrText xml:space="preserve"> PAGEREF _Toc196376634 \h </w:instrText>
         </w:r>
         <w:r>
           <w:rPr>
@@ -2963,7 +2960,7 @@
             <w:noProof/>
             <w:webHidden/>
           </w:rPr>
-          <w:t>21</w:t>
+          <w:t>22</w:t>
         </w:r>
         <w:r>
           <w:rPr>
@@ -2988,7 +2985,7 @@
           <w:szCs w:val="22"/>
         </w:rPr>
       </w:pPr>
-      <w:hyperlink w:anchor="_Toc193439784" w:history="1">
+      <w:hyperlink w:anchor="_Toc196376635" w:history="1">
         <w:r>
           <w:rPr>
             <w:rStyle w:val="Hyperlink"/>
@@ -3033,7 +3030,7 @@
             <w:noProof/>
             <w:webHidden/>
           </w:rPr>
-          <w:instrText xml:space="preserve"> PAGEREF _Toc193439784 \h </w:instrText>
+          <w:instrText xml:space="preserve"> PAGEREF _Toc196376635 \h </w:instrText>
         </w:r>
         <w:r>
           <w:rPr>
@@ -3053,7 +3050,7 @@
             <w:noProof/>
             <w:webHidden/>
           </w:rPr>
-          <w:t>22</w:t>
+          <w:t>23</w:t>
         </w:r>
         <w:r>
           <w:rPr>
@@ -3079,7 +3076,7 @@
           <w:lang w:eastAsia="en-US"/>
         </w:rPr>
       </w:pPr>
-      <w:hyperlink w:anchor="_Toc193439785" w:history="1">
+      <w:hyperlink w:anchor="_Toc196376636" w:history="1">
         <w:r>
           <w:rPr>
             <w:rStyle w:val="Hyperlink"/>
@@ -3130,7 +3127,7 @@
             <w:noProof/>
             <w:webHidden/>
           </w:rPr>
-          <w:instrText xml:space="preserve"> PAGEREF _Toc193439785 \h </w:instrText>
+          <w:instrText xml:space="preserve"> PAGEREF _Toc196376636 \h </w:instrText>
         </w:r>
         <w:r>
           <w:rPr>
@@ -3150,7 +3147,7 @@
             <w:noProof/>
             <w:webHidden/>
           </w:rPr>
-          <w:t>22</w:t>
+          <w:t>23</w:t>
         </w:r>
         <w:r>
           <w:rPr>
@@ -3176,7 +3173,7 @@
           <w:lang w:eastAsia="en-US"/>
         </w:rPr>
       </w:pPr>
-      <w:hyperlink w:anchor="_Toc193439786" w:history="1">
+      <w:hyperlink w:anchor="_Toc196376637" w:history="1">
         <w:r>
           <w:rPr>
             <w:rStyle w:val="Hyperlink"/>
@@ -3227,7 +3224,7 @@
             <w:noProof/>
             <w:webHidden/>
           </w:rPr>
-          <w:instrText xml:space="preserve"> PAGEREF _Toc193439786 \h </w:instrText>
+          <w:instrText xml:space="preserve"> PAGEREF _Toc196376637 \h </w:instrText>
         </w:r>
         <w:r>
           <w:rPr>
@@ -3247,7 +3244,7 @@
             <w:noProof/>
             <w:webHidden/>
           </w:rPr>
-          <w:t>22</w:t>
+          <w:t>23</w:t>
         </w:r>
         <w:r>
           <w:rPr>
@@ -3272,7 +3269,7 @@
           <w:szCs w:val="22"/>
         </w:rPr>
       </w:pPr>
-      <w:hyperlink w:anchor="_Toc193439787" w:history="1">
+      <w:hyperlink w:anchor="_Toc196376638" w:history="1">
         <w:r>
           <w:rPr>
             <w:rStyle w:val="Hyperlink"/>
@@ -3317,7 +3314,7 @@
             <w:noProof/>
             <w:webHidden/>
           </w:rPr>
-          <w:instrText xml:space="preserve"> PAGEREF _Toc193439787 \h </w:instrText>
+          <w:instrText xml:space="preserve"> PAGEREF _Toc196376638 \h </w:instrText>
         </w:r>
         <w:r>
           <w:rPr>
@@ -3337,7 +3334,7 @@
             <w:noProof/>
             <w:webHidden/>
           </w:rPr>
-          <w:t>22</w:t>
+          <w:t>23</w:t>
         </w:r>
         <w:r>
           <w:rPr>
@@ -3362,7 +3359,7 @@
           <w:szCs w:val="22"/>
         </w:rPr>
       </w:pPr>
-      <w:hyperlink w:anchor="_Toc193439788" w:history="1">
+      <w:hyperlink w:anchor="_Toc196376639" w:history="1">
         <w:r>
           <w:rPr>
             <w:rStyle w:val="Hyperlink"/>
@@ -3407,7 +3404,7 @@
             <w:noProof/>
             <w:webHidden/>
           </w:rPr>
-          <w:instrText xml:space="preserve"> PAGEREF _Toc193439788 \h </w:instrText>
+          <w:instrText xml:space="preserve"> PAGEREF _Toc196376639 \h </w:instrText>
         </w:r>
         <w:r>
           <w:rPr>
@@ -3427,7 +3424,7 @@
             <w:noProof/>
             <w:webHidden/>
           </w:rPr>
-          <w:t>24</w:t>
+          <w:t>25</w:t>
         </w:r>
         <w:r>
           <w:rPr>
@@ -3446,205 +3443,203 @@
         <w:lastRenderedPageBreak/>
         <w:fldChar w:fldCharType="end"/>
       </w:r>
-      <w:bookmarkStart w:id="2" w:name="_Toc193439754"/>
+      <w:bookmarkStart w:id="1" w:name="_Toc196376605"/>
       <w:r>
         <w:t>I</w:t>
       </w:r>
       <w:r>
         <w:t>ntroduction</w:t>
       </w:r>
+      <w:bookmarkEnd w:id="1"/>
+    </w:p>
+    <w:p>
+      <w:pPr>
+        <w:pStyle w:val="BodyText"/>
+      </w:pPr>
+      <w:r>
+        <w:t xml:space="preserve">Microsoft Word is not the ideal publishing software, but it does provide enough capability to provide a reasonably good </w:t>
+      </w:r>
+      <w:r>
+        <w:t>publication</w:t>
+      </w:r>
+      <w:r>
+        <w:t xml:space="preserve"> of a dictionary from FLEx. In Word you can add dictionary introductory sections, </w:t>
+      </w:r>
+      <w:r>
+        <w:t>reversal indexes, and appendi</w:t>
+      </w:r>
+      <w:r>
+        <w:t>c</w:t>
+      </w:r>
+      <w:r>
+        <w:t xml:space="preserve">es. </w:t>
+      </w:r>
+      <w:r>
+        <w:t xml:space="preserve">It also allows the user to make changes to the FLEx </w:t>
+      </w:r>
+      <w:r>
+        <w:t>dictionary</w:t>
+      </w:r>
+      <w:r>
+        <w:t xml:space="preserve"> that might </w:t>
+      </w:r>
+      <w:r>
+        <w:t>not be possible to do with the FLEx configuration options.</w:t>
+      </w:r>
+      <w:r>
+        <w:t xml:space="preserve"> </w:t>
+      </w:r>
+      <w:r>
+        <w:t>Once a dictionary is in Microsoft Word, it can easily be exported to PDF. For more sophisticated publications, one possibility is importing the Word document into Adobe InDesign which provides more powerful publication capabilities.</w:t>
+      </w:r>
+    </w:p>
+    <w:p>
+      <w:pPr>
+        <w:pStyle w:val="BodyText"/>
+      </w:pPr>
+      <w:r>
+        <w:t>As of FLEx 9.2, FLEx provides a direct export to Microsoft Word, including the dictionary body</w:t>
+      </w:r>
+      <w:r>
+        <w:t xml:space="preserve"> in one file,</w:t>
+      </w:r>
+      <w:r>
+        <w:t xml:space="preserve"> and </w:t>
+      </w:r>
+      <w:r>
+        <w:t xml:space="preserve">all </w:t>
+      </w:r>
+      <w:r>
+        <w:t>reversal indexes</w:t>
+      </w:r>
+      <w:r>
+        <w:t xml:space="preserve"> that have at least one entry</w:t>
+      </w:r>
+      <w:r>
+        <w:t xml:space="preserve"> in additional files</w:t>
+      </w:r>
+      <w:r>
+        <w:t xml:space="preserve">. This document describes </w:t>
+      </w:r>
+      <w:r>
+        <w:t>some useful features in Word for working on dictionaries.</w:t>
+      </w:r>
+      <w:r>
+        <w:t xml:space="preserve"> It also describes special features related to bidirectional dictionaries in Word.</w:t>
+      </w:r>
+      <w:r>
+        <w:t xml:space="preserve"> This document is based on Microsoft Word which comes with Microsoft Office 2019.</w:t>
+      </w:r>
+      <w:r>
+        <w:t xml:space="preserve"> There may be minor changes for other versions.</w:t>
+      </w:r>
+    </w:p>
+    <w:p>
+      <w:pPr>
+        <w:pStyle w:val="BodyText"/>
+      </w:pPr>
+      <w:r>
+        <w:t>The Word document exported from FLEx will be double-column with letter headings spanning both columns, and page headers with guidewords. Adjustments to this default layout can be made using Word document features after export.</w:t>
+      </w:r>
+    </w:p>
+    <w:p>
+      <w:pPr>
+        <w:pStyle w:val="BodyText"/>
+      </w:pPr>
+      <w:r>
+        <w:t xml:space="preserve">The exported files are .docx files </w:t>
+      </w:r>
+      <w:r>
+        <w:t>that will open in</w:t>
+      </w:r>
+      <w:r>
+        <w:t xml:space="preserve"> current versions of Word as well as older versions</w:t>
+      </w:r>
+      <w:r>
+        <w:t>,</w:t>
+      </w:r>
+      <w:r>
+        <w:t xml:space="preserve"> at least back to Office 2010. </w:t>
+      </w:r>
+      <w:r>
+        <w:t xml:space="preserve">If a Word export is being made to </w:t>
+      </w:r>
+      <w:r>
+        <w:t>import into InDesign</w:t>
+      </w:r>
+      <w:r>
+        <w:t>, you will need to use File &gt; Save As in Word to resave the file. Something about this process allows InDesign to import the file</w:t>
+      </w:r>
+      <w:r>
+        <w:t>.</w:t>
+      </w:r>
+    </w:p>
+    <w:p>
+      <w:pPr>
+        <w:pStyle w:val="BodyText"/>
+      </w:pPr>
+      <w:r>
+        <w:t xml:space="preserve">The Microsoft Word export uses </w:t>
+      </w:r>
+      <w:proofErr w:type="spellStart"/>
+      <w:r>
+        <w:t>OpenXml</w:t>
+      </w:r>
+      <w:proofErr w:type="spellEnd"/>
+      <w:r>
+        <w:t xml:space="preserve"> data structure. LibreOffice also supports </w:t>
+      </w:r>
+      <w:proofErr w:type="spellStart"/>
+      <w:r>
+        <w:t>OpenXml</w:t>
+      </w:r>
+      <w:proofErr w:type="spellEnd"/>
+      <w:r>
+        <w:t>, so a Word export from FLEx can also be opened in LibreOffice. There are differences between the two programs, so all features may not work as well in LibreOffice. But if you want to use LibreOffice, see if it handles your dictionary adequately via the FLEx Word export.</w:t>
+      </w:r>
+    </w:p>
+    <w:p>
+      <w:pPr>
+        <w:pStyle w:val="BodyText"/>
+      </w:pPr>
+      <w:r>
+        <w:t xml:space="preserve">There are </w:t>
+      </w:r>
+      <w:r>
+        <w:t xml:space="preserve">conceptual </w:t>
+      </w:r>
+      <w:r>
+        <w:t xml:space="preserve">differences in the way FLEx formats data via styles, and the way Word formats data via styles. The FLEx export attempts to provide output in Word that closely follows how it looks in the FLEx dictionary view. </w:t>
+      </w:r>
+      <w:r>
+        <w:t>There are some situations where this cannot be handled automatically. So</w:t>
+      </w:r>
+      <w:r>
+        <w:t>,</w:t>
+      </w:r>
+      <w:r>
+        <w:t xml:space="preserve"> you may need to make some adjustments after export to get the desired results.</w:t>
+      </w:r>
+    </w:p>
+    <w:p>
+      <w:pPr>
+        <w:pStyle w:val="Heading1"/>
+      </w:pPr>
+      <w:bookmarkStart w:id="2" w:name="_Toc196376606"/>
+      <w:r>
+        <w:t>Exporting a dictionary to Word</w:t>
+      </w:r>
       <w:bookmarkEnd w:id="2"/>
     </w:p>
     <w:p>
       <w:pPr>
-        <w:pStyle w:val="BodyText"/>
-      </w:pPr>
-      <w:r>
-        <w:t xml:space="preserve">Microsoft Word is not the ideal publishing software, but it does provide enough capability to provide a reasonably good </w:t>
-      </w:r>
-      <w:r>
-        <w:t>publication</w:t>
-      </w:r>
-      <w:r>
-        <w:t xml:space="preserve"> of a dictionary from FLEx. In Word you can add dictionary introductory sections, </w:t>
-      </w:r>
-      <w:r>
-        <w:t>reversal indexes, and appendi</w:t>
-      </w:r>
-      <w:r>
-        <w:t>c</w:t>
-      </w:r>
-      <w:r>
-        <w:t xml:space="preserve">es. </w:t>
-      </w:r>
-      <w:r>
-        <w:t xml:space="preserve">It also allows the user to make changes to the FLEx </w:t>
-      </w:r>
-      <w:r>
-        <w:t>dictionary</w:t>
-      </w:r>
-      <w:r>
-        <w:t xml:space="preserve"> that might </w:t>
-      </w:r>
-      <w:r>
-        <w:t>not be possible to do with the FLEx configuration options.</w:t>
-      </w:r>
-      <w:r>
-        <w:t xml:space="preserve"> </w:t>
-      </w:r>
-      <w:r>
-        <w:t>Once a dictionary is in Microsoft Word, it can easily be exported to PDF. For more sophisticated publications, one possibility is importing the Word document into Adobe InDesign which provides more powerful publication capabilities.</w:t>
-      </w:r>
-    </w:p>
-    <w:p>
-      <w:pPr>
-        <w:pStyle w:val="BodyText"/>
-      </w:pPr>
-      <w:r>
-        <w:t>As of FLEx 9.2, FLEx provides a direct export to Microsoft Word, including the dictionary body</w:t>
-      </w:r>
-      <w:r>
-        <w:t xml:space="preserve"> in one file,</w:t>
-      </w:r>
-      <w:r>
-        <w:t xml:space="preserve"> and </w:t>
-      </w:r>
-      <w:r>
-        <w:t xml:space="preserve">all </w:t>
-      </w:r>
-      <w:r>
-        <w:t>reversal indexes</w:t>
-      </w:r>
-      <w:r>
-        <w:t xml:space="preserve"> that have at least one entry</w:t>
-      </w:r>
-      <w:r>
-        <w:t xml:space="preserve"> in additional files</w:t>
-      </w:r>
-      <w:r>
-        <w:t xml:space="preserve">. This document describes </w:t>
-      </w:r>
-      <w:r>
-        <w:t>some useful features in Word for working on dictionaries.</w:t>
-      </w:r>
-      <w:r>
-        <w:t xml:space="preserve"> It also describes special features related to bidirectional dictionaries in Word.</w:t>
-      </w:r>
-      <w:r>
-        <w:t xml:space="preserve"> This document is based on Microsoft Word which comes with Microsoft Office 2019.</w:t>
-      </w:r>
-      <w:r>
-        <w:t xml:space="preserve"> There may be minor changes for other versions.</w:t>
-      </w:r>
-    </w:p>
-    <w:p>
-      <w:pPr>
-        <w:pStyle w:val="BodyText"/>
-      </w:pPr>
-      <w:r>
-        <w:t>The Word document exported from FLEx will be double-column with letter headings spanning both columns, and page headers with guidewords. Adjustments to this default layout can be made using Word document features after export.</w:t>
-      </w:r>
-    </w:p>
-    <w:p>
-      <w:pPr>
-        <w:pStyle w:val="BodyText"/>
-      </w:pPr>
-      <w:r>
-        <w:t xml:space="preserve">The exported files are .docx files </w:t>
-      </w:r>
-      <w:r>
-        <w:t>that will open in</w:t>
-      </w:r>
-      <w:r>
-        <w:t xml:space="preserve"> current versions of Word as well as older versions</w:t>
-      </w:r>
-      <w:r>
-        <w:t>,</w:t>
-      </w:r>
-      <w:r>
-        <w:t xml:space="preserve"> at least back to Office 2010. </w:t>
-      </w:r>
-      <w:r>
-        <w:t xml:space="preserve">If a Word export is being made to </w:t>
-      </w:r>
-      <w:r>
-        <w:t>import into InDesign</w:t>
-      </w:r>
-      <w:r>
-        <w:t>, you will need to use File &gt; Save As in Word to resave the file. Something about this process allows InDesign to import the file</w:t>
-      </w:r>
-      <w:r>
-        <w:t>.</w:t>
-      </w:r>
-    </w:p>
-    <w:p>
-      <w:pPr>
-        <w:pStyle w:val="BodyText"/>
-      </w:pPr>
-      <w:r>
-        <w:t xml:space="preserve">The Microsoft Word export uses </w:t>
-      </w:r>
-      <w:proofErr w:type="spellStart"/>
-      <w:r>
-        <w:t>OpenXml</w:t>
-      </w:r>
-      <w:proofErr w:type="spellEnd"/>
-      <w:r>
-        <w:t xml:space="preserve"> data structure. LibreOffice also supports </w:t>
-      </w:r>
-      <w:proofErr w:type="spellStart"/>
-      <w:r>
-        <w:t>OpenXml</w:t>
-      </w:r>
-      <w:proofErr w:type="spellEnd"/>
-      <w:r>
-        <w:t>, so a Word export from FLEx can also be opened in LibreOffice. There are differences between the two programs, so all features may not work as well in LibreOffice. But if you want to use LibreOffice, see if it handles your dictionary adequately via the FLEx Word export.</w:t>
-      </w:r>
-    </w:p>
-    <w:p>
-      <w:pPr>
-        <w:pStyle w:val="BodyText"/>
-      </w:pPr>
-      <w:r>
-        <w:t xml:space="preserve">There are </w:t>
-      </w:r>
-      <w:r>
-        <w:t xml:space="preserve">conceptual </w:t>
-      </w:r>
-      <w:r>
-        <w:t xml:space="preserve">differences in the way FLEx formats data via styles, and the way Word formats data via styles. The FLEx export attempts to provide output in Word that closely follows how it looks in the FLEx dictionary view. </w:t>
-      </w:r>
-      <w:r>
-        <w:t xml:space="preserve">There are some situations where this cannot be handled automatically. </w:t>
-      </w:r>
-      <w:proofErr w:type="gramStart"/>
-      <w:r>
-        <w:t>So</w:t>
-      </w:r>
-      <w:proofErr w:type="gramEnd"/>
-      <w:r>
-        <w:t xml:space="preserve"> you may need to make some adjustments after export to get the desired results.</w:t>
-      </w:r>
-    </w:p>
-    <w:p>
-      <w:pPr>
-        <w:pStyle w:val="Heading1"/>
-      </w:pPr>
-      <w:bookmarkStart w:id="3" w:name="_Toc193439755"/>
-      <w:r>
-        <w:t>Exporting a dictionary to Word</w:t>
+        <w:pStyle w:val="Heading2"/>
+      </w:pPr>
+      <w:bookmarkStart w:id="3" w:name="_Toc196376607"/>
+      <w:r>
+        <w:t>Preparation in FLEx prior to export</w:t>
       </w:r>
       <w:bookmarkEnd w:id="3"/>
-    </w:p>
-    <w:p>
-      <w:pPr>
-        <w:pStyle w:val="Heading2"/>
-      </w:pPr>
-      <w:bookmarkStart w:id="4" w:name="_Toc193439756"/>
-      <w:r>
-        <w:t>Preparation in FLEx prior to export</w:t>
-      </w:r>
-      <w:bookmarkEnd w:id="4"/>
     </w:p>
     <w:p>
       <w:pPr>
@@ -3951,18 +3946,16 @@
       </w:r>
       <w:r>
         <w:br/>
-        <w:t xml:space="preserve">To avoid this, make sure the After box is empty. For further vertical spacing issues with pictures in Word, you can modify the paragraph settings for the </w:t>
-      </w:r>
-      <w:r>
-        <w:t>Image-</w:t>
-      </w:r>
-      <w:proofErr w:type="spellStart"/>
-      <w:r>
-        <w:t>Textframe</w:t>
-      </w:r>
-      <w:proofErr w:type="spellEnd"/>
-      <w:r>
-        <w:t>-Style</w:t>
+        <w:t xml:space="preserve">To avoid this, make sure the After box is empty. </w:t>
+      </w:r>
+      <w:r>
+        <w:t xml:space="preserve">Older FLEx projects had a space in this location by default. Current versions do not have the space, but for earlier projects you’ll need to delete it in configuration. </w:t>
+      </w:r>
+      <w:r>
+        <w:t xml:space="preserve">For further vertical spacing issues with pictures in Word, you can modify the paragraph settings for the </w:t>
+      </w:r>
+      <w:r>
+        <w:t>Pictures</w:t>
       </w:r>
       <w:r>
         <w:t xml:space="preserve"> paragraph style in Word.</w:t>
@@ -3991,11 +3984,11 @@
         <w:t xml:space="preserve"> and sorting set for each reversal language in Bulk Edit Reversal Entries, and configurations for each reversal language set in Tools &gt; Configure &gt; Reversal Index. </w:t>
       </w:r>
       <w:r>
-        <w:t xml:space="preserve">Collation and letter headings for reversal entries are determined by the Sorting tab of the reversal language in </w:t>
+        <w:t xml:space="preserve">Collation and letter </w:t>
       </w:r>
       <w:r>
         <w:lastRenderedPageBreak/>
-        <w:t xml:space="preserve">Format &gt; Set up Analysis Writing Systems. </w:t>
+        <w:t xml:space="preserve">headings for reversal entries are determined by the Sorting tab of the reversal language in Format &gt; Set up Analysis Writing Systems. </w:t>
       </w:r>
       <w:r>
         <w:t>Make sure these are all set to what you want to export to Word. Each reversal will be in a separate .docx file.</w:t>
@@ -4045,7 +4038,7 @@
       <w:pPr>
         <w:pStyle w:val="Heading3"/>
       </w:pPr>
-      <w:bookmarkStart w:id="5" w:name="_Toc193439757"/>
+      <w:bookmarkStart w:id="4" w:name="_Toc196376608"/>
       <w:r>
         <w:t xml:space="preserve">Saving list </w:t>
       </w:r>
@@ -4055,7 +4048,7 @@
       <w:r>
         <w:t>names in the Word document</w:t>
       </w:r>
-      <w:bookmarkEnd w:id="5"/>
+      <w:bookmarkEnd w:id="4"/>
     </w:p>
     <w:p>
       <w:pPr>
@@ -4077,7 +4070,7 @@
         <w:t xml:space="preserve">. All list items </w:t>
       </w:r>
       <w:r>
-        <w:t>use the Name[] or Abbreviation[] style</w:t>
+        <w:t>use the Name or Abbreviation style</w:t>
       </w:r>
       <w:r>
         <w:t>, regardless of which list is being referenced.</w:t>
@@ -4272,16 +4265,24 @@
         <w:t>document</w:t>
       </w:r>
       <w:r>
-        <w:t>, you will see that the style is “Semantic Domains : Name[]”</w:t>
-      </w:r>
-      <w:r>
-        <w:t xml:space="preserve"> instead of just Name[]</w:t>
+        <w:t xml:space="preserve">, you will see that the style is “Semantic </w:t>
+      </w:r>
+      <w:proofErr w:type="gramStart"/>
+      <w:r>
+        <w:t>Domains :</w:t>
+      </w:r>
+      <w:proofErr w:type="gramEnd"/>
+      <w:r>
+        <w:t xml:space="preserve"> Name”</w:t>
+      </w:r>
+      <w:r>
+        <w:t xml:space="preserve"> instead of just Name</w:t>
       </w:r>
       <w:r>
         <w:t xml:space="preserve">, or </w:t>
       </w:r>
       <w:r>
-        <w:t>“Semantic Domains : Abbreviation[]” if you click on the semantic domain number</w:t>
+        <w:t>“Semantic Domains : Abbreviation” if you click on the semantic domain number</w:t>
       </w:r>
       <w:r>
         <w:t>.</w:t>
@@ -4291,12 +4292,88 @@
       <w:pPr>
         <w:pStyle w:val="Heading2"/>
       </w:pPr>
-      <w:bookmarkStart w:id="6" w:name="_Ref143614988"/>
-      <w:bookmarkStart w:id="7" w:name="_Toc193439758"/>
+      <w:bookmarkStart w:id="5" w:name="_Ref143614988"/>
+      <w:bookmarkStart w:id="6" w:name="_Toc196376609"/>
       <w:r>
         <w:t>Exporting a dictionary from FLEx to Word</w:t>
       </w:r>
+      <w:bookmarkEnd w:id="5"/>
       <w:bookmarkEnd w:id="6"/>
+    </w:p>
+    <w:p>
+      <w:pPr>
+        <w:pStyle w:val="BodyText"/>
+      </w:pPr>
+      <w:r>
+        <w:t xml:space="preserve">The actual export to Word is very simple in FW9.2.0 or later. Once you have the dictionary looking the way you want in the Dictionary </w:t>
+      </w:r>
+      <w:r>
+        <w:t xml:space="preserve">and Reversal Index </w:t>
+      </w:r>
+      <w:r>
+        <w:t>view</w:t>
+      </w:r>
+      <w:r>
+        <w:t>s</w:t>
+      </w:r>
+      <w:r>
+        <w:t xml:space="preserve">, choose File &gt; Export &gt; Dictionary, Reversal </w:t>
+      </w:r>
+      <w:proofErr w:type="gramStart"/>
+      <w:r>
+        <w:t>Index  Word</w:t>
+      </w:r>
+      <w:proofErr w:type="gramEnd"/>
+      <w:r>
+        <w:t xml:space="preserve"> (DOCX). Specify the file name and directory. FLEx will create a .docx file for the dictionary body, and one for each reversal index </w:t>
+      </w:r>
+      <w:r>
+        <w:t xml:space="preserve">with at least one reversal entry </w:t>
+      </w:r>
+      <w:r>
+        <w:t>in the specified directory.</w:t>
+      </w:r>
+      <w:r>
+        <w:t xml:space="preserve"> If the file already exists, you will be asked if you want to overwrite it. It only asks once for the set of exported files.</w:t>
+      </w:r>
+      <w:r>
+        <w:t xml:space="preserve"> </w:t>
+      </w:r>
+      <w:r>
+        <w:t xml:space="preserve">Reversal files use the name you </w:t>
+      </w:r>
+      <w:r>
+        <w:lastRenderedPageBreak/>
+        <w:t>specify, appending “-reversal-</w:t>
+      </w:r>
+      <w:proofErr w:type="spellStart"/>
+      <w:r>
+        <w:t>en</w:t>
+      </w:r>
+      <w:proofErr w:type="spellEnd"/>
+      <w:r>
+        <w:t>” to the file name, with an appropriate language code for each reversal.</w:t>
+      </w:r>
+    </w:p>
+    <w:p>
+      <w:pPr>
+        <w:pStyle w:val="BodyText"/>
+      </w:pPr>
+      <w:r>
+        <w:t>Pictures are embedded in the docx file</w:t>
+      </w:r>
+      <w:r>
+        <w:t>, so copying the file to some other machine will still include the pictures.</w:t>
+      </w:r>
+    </w:p>
+    <w:p>
+      <w:pPr>
+        <w:pStyle w:val="Heading2"/>
+      </w:pPr>
+      <w:bookmarkStart w:id="7" w:name="_Toc196376610"/>
+      <w:r>
+        <w:t>Preparing a Word dictionary for publication</w:t>
+      </w:r>
       <w:bookmarkEnd w:id="7"/>
     </w:p>
     <w:p>
@@ -4304,42 +4381,7 @@
         <w:pStyle w:val="BodyText"/>
       </w:pPr>
       <w:r>
-        <w:t xml:space="preserve">The actual export to Word is very simple in FW9.2.0 or later. Once you have the dictionary looking the way you want in the Dictionary </w:t>
-      </w:r>
-      <w:r>
-        <w:t xml:space="preserve">and Reversal Index </w:t>
-      </w:r>
-      <w:r>
-        <w:t>view</w:t>
-      </w:r>
-      <w:r>
-        <w:t>s</w:t>
-      </w:r>
-      <w:r>
-        <w:t xml:space="preserve">, choose File &gt; Export &gt; Dictionary, Reversal Index  Word (DOCX). Specify the file name and directory. FLEx will create a .docx file for the dictionary body, and one for each reversal index </w:t>
-      </w:r>
-      <w:r>
-        <w:t xml:space="preserve">with at least one reversal entry </w:t>
-      </w:r>
-      <w:r>
-        <w:t>in the specified directory.</w:t>
-      </w:r>
-      <w:r>
-        <w:t xml:space="preserve"> If the file already exists, you will be asked if you want to overwrite it. It only asks once for the set of exported files.</w:t>
-      </w:r>
-      <w:r>
-        <w:t xml:space="preserve"> </w:t>
-      </w:r>
-      <w:r>
-        <w:t>Reversal files use the name you specify, appending “-reversal-</w:t>
-      </w:r>
-      <w:proofErr w:type="spellStart"/>
-      <w:r>
-        <w:t>en</w:t>
-      </w:r>
-      <w:proofErr w:type="spellEnd"/>
-      <w:r>
-        <w:t>” to the file name, with an appropriate language code for each reversal.</w:t>
+        <w:t>As you begin making changes to the .docx file in Word, keep in mind that these steps will all need to be repeated if you need to change things in FLEx and do another export. So before making extensive changes outside of FLEx, try to make sure you will not need to make any further changes in FLEx that would require a new export. The best way to do this is to set a filter in FLEx for a small set of entries that demonstrate all of the features in the dictionary, export those entries, and see whether you can solve any remaining issues in Word. Take good notes in all of the steps you are making after exporting from Word in case you need to start over with a new export. Once you feel confident you can handle your small sample, then you can do a full export and go through the remaining steps to produce the final Word document.</w:t>
       </w:r>
     </w:p>
     <w:p>
@@ -4347,93 +4389,16 @@
         <w:pStyle w:val="BodyText"/>
       </w:pPr>
       <w:r>
-        <w:lastRenderedPageBreak/>
-        <w:t>Pictures are embedded in the docx file</w:t>
-      </w:r>
-      <w:r>
-        <w:t>, so copying the file to some other machine will still include the pictures.</w:t>
-      </w:r>
-    </w:p>
-    <w:p>
-      <w:pPr>
-        <w:pStyle w:val="Heading2"/>
-      </w:pPr>
-      <w:bookmarkStart w:id="8" w:name="_Toc193439759"/>
-      <w:r>
-        <w:t>Preparing a Word dictionary for publication</w:t>
-      </w:r>
-      <w:bookmarkEnd w:id="8"/>
-    </w:p>
-    <w:p>
-      <w:pPr>
-        <w:pStyle w:val="BodyText"/>
-      </w:pPr>
-      <w:r>
-        <w:t>As you begin making changes to the .docx file in Word, keep in mind that these steps will all need to be repeated if you need to change things in FLEx and do another export. So before making extensive changes outside of FLEx, try to make sure you will not need to make any further changes in FLEx that would require a new export. The best way to do this is to set a filter in FLEx for a small set of entries that demonstrate all of the features in the dictionary, export those entries, and see whether you can solve any remaining issues in Word. Take good notes in all of the steps you are making after exporting from Word in case you need to start over with a new export. Once you feel confident you can handle your small sample, then you can do a full export and go through the remaining steps to produce the final Word document.</w:t>
-      </w:r>
-    </w:p>
-    <w:p>
-      <w:pPr>
-        <w:pStyle w:val="BodyText"/>
-      </w:pPr>
-      <w:r>
-        <w:t>The person producing the Word publication will likely need to experiment to determine how to address any problem areas. Some issues can be handled using the powerful Find and Replace function in Word that can insert text before and after styled data. Word can find any occurrence of a style, and can change that style to some other style if needed. The exported entries have styles for each field. These styles can be changed in Word to alter appearance of specific fields.</w:t>
-      </w:r>
-    </w:p>
-    <w:p>
-      <w:pPr>
-        <w:pStyle w:val="BodyText"/>
-      </w:pPr>
-      <w:r>
-        <w:t xml:space="preserve">The FLEx export will produce two columns with letter headings spanning both columns, and </w:t>
-      </w:r>
-      <w:r>
-        <w:t xml:space="preserve">page header </w:t>
-      </w:r>
-      <w:r>
-        <w:t xml:space="preserve">guidewords with the first entry </w:t>
-      </w:r>
-      <w:r>
-        <w:t xml:space="preserve">headword </w:t>
-      </w:r>
-      <w:r>
-        <w:t xml:space="preserve">on </w:t>
-      </w:r>
-      <w:r>
-        <w:t xml:space="preserve">the </w:t>
-      </w:r>
-      <w:r>
-        <w:t xml:space="preserve">left (verso) page and the last entry </w:t>
-      </w:r>
-      <w:r>
-        <w:t xml:space="preserve">headword </w:t>
-      </w:r>
-      <w:r>
-        <w:t xml:space="preserve">on the right (recto) page, which switches for right-to-left publications. </w:t>
-      </w:r>
-      <w:r>
-        <w:t xml:space="preserve">Inside of Word, it’s easy to change the page size and number of columns. It’s relatively easy to </w:t>
-      </w:r>
-      <w:r>
-        <w:t>alter</w:t>
-      </w:r>
-      <w:r>
-        <w:t xml:space="preserve"> </w:t>
-      </w:r>
-      <w:r>
-        <w:t xml:space="preserve">the default </w:t>
-      </w:r>
-      <w:r>
-        <w:t xml:space="preserve">page headers with guidewords </w:t>
-      </w:r>
-      <w:r>
-        <w:t xml:space="preserve">(see section </w:t>
+        <w:t>The person producing the Word publication will likely need to experiment to determine how to address any problem areas. Some issues can be handled using the powerful Find and Replace function in Word that can insert text before and after styled data. Word can find any occurrence of a style, and can change that style to some other style if needed. The exported entries have styles for each field. These styles can be changed in Word to alter appearance of specific fields</w:t>
+      </w:r>
+      <w:r>
+        <w:t xml:space="preserve"> (see section </w:t>
       </w:r>
       <w:r>
         <w:fldChar w:fldCharType="begin"/>
       </w:r>
       <w:r>
-        <w:instrText xml:space="preserve"> REF _Ref186791558 \r \h </w:instrText>
+        <w:instrText xml:space="preserve"> REF _Ref143252360 \r \h </w:instrText>
       </w:r>
       <w:r>
         <w:fldChar w:fldCharType="separate"/>
@@ -4445,37 +4410,69 @@
         <w:t>‎</w:t>
       </w:r>
       <w:r>
-        <w:t>2.3.3</w:t>
+        <w:t>3.3</w:t>
       </w:r>
       <w:r>
         <w:fldChar w:fldCharType="end"/>
       </w:r>
       <w:r>
-        <w:t>)</w:t>
-      </w:r>
-      <w:r>
-        <w:t xml:space="preserve">. However, it may not be possible to have guidewords show the current partial entry headword. It’s also fairly easy to </w:t>
-      </w:r>
-      <w:r>
-        <w:t>alter the default letter</w:t>
+        <w:t>).</w:t>
+      </w:r>
+    </w:p>
+    <w:p>
+      <w:pPr>
+        <w:pStyle w:val="BodyText"/>
+      </w:pPr>
+      <w:r>
+        <w:t xml:space="preserve">The FLEx export will produce two columns with letter headings spanning both columns, and </w:t>
+      </w:r>
+      <w:r>
+        <w:t xml:space="preserve">page header </w:t>
+      </w:r>
+      <w:r>
+        <w:t xml:space="preserve">guidewords with the first entry </w:t>
+      </w:r>
+      <w:r>
+        <w:t xml:space="preserve">headword </w:t>
+      </w:r>
+      <w:r>
+        <w:t xml:space="preserve">on </w:t>
+      </w:r>
+      <w:r>
+        <w:t xml:space="preserve">the </w:t>
+      </w:r>
+      <w:r>
+        <w:t xml:space="preserve">left (verso) page and the last entry </w:t>
+      </w:r>
+      <w:r>
+        <w:t xml:space="preserve">headword </w:t>
+      </w:r>
+      <w:r>
+        <w:t xml:space="preserve">on the right (recto) page, which switches for right-to-left publications. </w:t>
+      </w:r>
+      <w:r>
+        <w:t xml:space="preserve">Inside of Word, it’s easy to change the page size and number of columns. It’s relatively easy to </w:t>
+      </w:r>
+      <w:r>
+        <w:t>alter</w:t>
       </w:r>
       <w:r>
         <w:t xml:space="preserve"> </w:t>
       </w:r>
       <w:r>
-        <w:t>headings</w:t>
-      </w:r>
-      <w:r>
-        <w:t xml:space="preserve"> </w:t>
-      </w:r>
-      <w:r>
-        <w:t xml:space="preserve">if needed (see section </w:t>
+        <w:t xml:space="preserve">the default </w:t>
+      </w:r>
+      <w:r>
+        <w:t xml:space="preserve">page headers with guidewords </w:t>
+      </w:r>
+      <w:r>
+        <w:t xml:space="preserve">(see section </w:t>
       </w:r>
       <w:r>
         <w:fldChar w:fldCharType="begin"/>
       </w:r>
       <w:r>
-        <w:instrText xml:space="preserve"> REF _Ref186791937 \r \h </w:instrText>
+        <w:instrText xml:space="preserve"> REF _Ref186791558 \r \h </w:instrText>
       </w:r>
       <w:r>
         <w:fldChar w:fldCharType="separate"/>
@@ -4487,7 +4484,7 @@
         <w:t>‎</w:t>
       </w:r>
       <w:r>
-        <w:t>2.3.5</w:t>
+        <w:t>2.3.3</w:t>
       </w:r>
       <w:r>
         <w:fldChar w:fldCharType="end"/>
@@ -4496,244 +4493,28 @@
         <w:t>)</w:t>
       </w:r>
       <w:r>
-        <w:t xml:space="preserve">. As in any program, placement of pictures, and dealing with location of letter </w:t>
+        <w:t xml:space="preserve">. However, it may not be possible to have guidewords show the current partial entry headword. It’s also fairly easy to </w:t>
+      </w:r>
+      <w:r>
+        <w:t>alter the default letter</w:t>
+      </w:r>
+      <w:r>
+        <w:t xml:space="preserve"> </w:t>
       </w:r>
       <w:r>
         <w:t>headings</w:t>
       </w:r>
       <w:r>
-        <w:t xml:space="preserve"> that occur at the bottom of a page requires manual work.</w:t>
-      </w:r>
-    </w:p>
-    <w:p>
-      <w:pPr>
-        <w:pStyle w:val="BodyText"/>
-      </w:pPr>
-      <w:r>
-        <w:t xml:space="preserve">There may be rare cases where it would be helpful to make changes internally in the .docx file. Changes in a .docx file requires knowledge of XML and the way word uses XML in their internal files. For information on this format, look for </w:t>
-      </w:r>
-      <w:proofErr w:type="spellStart"/>
-      <w:r>
-        <w:t>OpenXml</w:t>
-      </w:r>
-      <w:proofErr w:type="spellEnd"/>
-      <w:r>
-        <w:t xml:space="preserve"> documentation. Word also provides a powerful programming macro language that can be useful to those who understand that.</w:t>
-      </w:r>
-    </w:p>
-    <w:p>
-      <w:pPr>
-        <w:pStyle w:val="Heading3"/>
-      </w:pPr>
-      <w:bookmarkStart w:id="9" w:name="_Toc193439760"/>
-      <w:r>
-        <w:t>Page</w:t>
-      </w:r>
-      <w:r>
-        <w:t xml:space="preserve"> layout</w:t>
-      </w:r>
-      <w:bookmarkEnd w:id="9"/>
-    </w:p>
-    <w:p>
-      <w:pPr>
-        <w:pStyle w:val="BodyText"/>
-      </w:pPr>
-      <w:r>
-        <w:t xml:space="preserve">FLEx does not provide a way to specify </w:t>
-      </w:r>
-      <w:r>
-        <w:t xml:space="preserve">page layout information. It just contains the dictionary entries and letter </w:t>
-      </w:r>
-      <w:r>
-        <w:t>headings</w:t>
-      </w:r>
-      <w:r>
-        <w:t xml:space="preserve">. </w:t>
-      </w:r>
-      <w:r>
-        <w:t>The Word export provides a default double-column page layout including size</w:t>
-      </w:r>
-      <w:r>
-        <w:t xml:space="preserve"> (Letter 8.5” x 11”)</w:t>
-      </w:r>
-      <w:r>
-        <w:t xml:space="preserve">, page headers with guidewords, and letter headers spanning both columns. After exporting, you will need to make any adjustments to the default settings as needed. Adjustments to </w:t>
-      </w:r>
-      <w:r>
-        <w:t xml:space="preserve">page size, orientation, margins, and any other page or book type settings </w:t>
-      </w:r>
-      <w:r>
-        <w:t xml:space="preserve">can be made </w:t>
-      </w:r>
-      <w:r>
-        <w:t xml:space="preserve">from the Layout </w:t>
-      </w:r>
-      <w:r>
-        <w:t>tab</w:t>
-      </w:r>
-      <w:r>
-        <w:t xml:space="preserve">. If </w:t>
-      </w:r>
-      <w:r>
-        <w:t>you need a different number of columns</w:t>
-      </w:r>
-      <w:r>
-        <w:t xml:space="preserve">, use </w:t>
-      </w:r>
-      <w:proofErr w:type="spellStart"/>
-      <w:r>
-        <w:t>Ctrl+A</w:t>
-      </w:r>
-      <w:proofErr w:type="spellEnd"/>
-      <w:r>
-        <w:t xml:space="preserve"> to highlight the entire document, then </w:t>
-      </w:r>
-      <w:r>
-        <w:t xml:space="preserve">select the desired number of columns and column settings </w:t>
-      </w:r>
-      <w:r>
-        <w:t>in Layout</w:t>
-      </w:r>
-      <w:r>
-        <w:t xml:space="preserve"> &gt; </w:t>
-      </w:r>
-      <w:r>
-        <w:t>Columns.</w:t>
-      </w:r>
-    </w:p>
-    <w:p>
-      <w:pPr>
-        <w:pStyle w:val="BodyText"/>
-      </w:pPr>
-      <w:r>
-        <w:rPr>
-          <w:rStyle w:val="Boldphrase"/>
-        </w:rPr>
-        <w:t>Note</w:t>
-      </w:r>
-      <w:r>
-        <w:t xml:space="preserve"> with double-columns, it’s possible to set up paragraph hanging indents that will cause clipping in the second column because the paragraph indent is too wide for the inter-column space. If you encounter this situation, you can adjust column widths and indents in Layout &gt; </w:t>
-      </w:r>
-      <w:r>
-        <w:lastRenderedPageBreak/>
-        <w:t>Columns &gt; More Columns where you can specify size of columns and spacing between columns, or you can decrease the paragraph hanging indent to avoid the problem.</w:t>
-      </w:r>
-    </w:p>
-    <w:p>
-      <w:pPr>
-        <w:pStyle w:val="Heading3"/>
-      </w:pPr>
-      <w:bookmarkStart w:id="10" w:name="_Ref143267723"/>
-      <w:bookmarkStart w:id="11" w:name="_Toc193439761"/>
-      <w:r>
-        <w:t>Adjusting styles</w:t>
-      </w:r>
-      <w:bookmarkEnd w:id="10"/>
-      <w:bookmarkEnd w:id="11"/>
-    </w:p>
-    <w:p>
-      <w:pPr>
-        <w:pStyle w:val="BodyText"/>
-      </w:pPr>
-      <w:r>
-        <w:t xml:space="preserve">The FLEx Word export assigns character and paragraph styles to the exported data to provide formatting that will look similar in Word to the appearance in the FLEx Dictionary view. An attempt is made to limit the number of styles as much as possible without losing information. If a definition field is formatted the same way in multiple places in the FLEx configuration, a single </w:t>
-      </w:r>
-      <w:r>
-        <w:t>“</w:t>
-      </w:r>
-      <w:r>
-        <w:t>Definition</w:t>
-      </w:r>
-      <w:r>
-        <w:t xml:space="preserve"> (or Gloss)”</w:t>
-      </w:r>
-      <w:r>
-        <w:t xml:space="preserve"> style will be used. However, if definitions are formatted differently in different contexts, then additional Definition styles will be created to maintain that distinction. Also, since most fields in FLEx offer multiple writing systems, when exported, the style names will </w:t>
-      </w:r>
-      <w:r>
-        <w:t>have</w:t>
-      </w:r>
-      <w:r>
-        <w:t xml:space="preserve"> [</w:t>
-      </w:r>
-      <w:proofErr w:type="spellStart"/>
-      <w:r>
-        <w:t>lang</w:t>
-      </w:r>
-      <w:proofErr w:type="spellEnd"/>
-      <w:r>
-        <w:t>=</w:t>
-      </w:r>
-      <w:r>
-        <w:t>'</w:t>
-      </w:r>
-      <w:proofErr w:type="spellStart"/>
-      <w:r>
-        <w:t>en</w:t>
-      </w:r>
-      <w:proofErr w:type="spellEnd"/>
-      <w:r>
-        <w:t>'</w:t>
-      </w:r>
-      <w:r>
-        <w:t xml:space="preserve">] </w:t>
-      </w:r>
-      <w:r>
-        <w:t xml:space="preserve">appended </w:t>
-      </w:r>
-      <w:r>
-        <w:t>to the style name to indicate the writing system</w:t>
-      </w:r>
-      <w:r>
-        <w:t xml:space="preserve"> for that style</w:t>
-      </w:r>
-      <w:r>
-        <w:t>. For example, Headword[</w:t>
-      </w:r>
-      <w:proofErr w:type="spellStart"/>
-      <w:r>
-        <w:t>lang</w:t>
-      </w:r>
-      <w:proofErr w:type="spellEnd"/>
-      <w:r>
-        <w:t>=</w:t>
-      </w:r>
-      <w:r>
-        <w:t>'</w:t>
-      </w:r>
-      <w:proofErr w:type="spellStart"/>
-      <w:r>
-        <w:t>seh</w:t>
-      </w:r>
-      <w:proofErr w:type="spellEnd"/>
-      <w:r>
-        <w:t>'</w:t>
-      </w:r>
-      <w:r>
-        <w:t xml:space="preserve">] is a character style for the headword when exporting the </w:t>
-      </w:r>
-      <w:proofErr w:type="spellStart"/>
-      <w:r>
-        <w:t>Sena</w:t>
-      </w:r>
-      <w:proofErr w:type="spellEnd"/>
-      <w:r>
-        <w:t xml:space="preserve"> 3 dictionary. </w:t>
-      </w:r>
-      <w:r>
-        <w:t xml:space="preserve">By altering the styles in a Word export, you can change the appearance of data in those styles throughout the dictionary by changing the style definition. </w:t>
-      </w:r>
-      <w:r>
-        <w:t>Word provides good support for styles.</w:t>
-      </w:r>
-      <w:r>
-        <w:t xml:space="preserve"> See section </w:t>
+        <w:t xml:space="preserve"> </w:t>
+      </w:r>
+      <w:r>
+        <w:t xml:space="preserve">if needed (see section </w:t>
       </w:r>
       <w:r>
         <w:fldChar w:fldCharType="begin"/>
       </w:r>
       <w:r>
-        <w:instrText xml:space="preserve"> REF _Ref143252041 \r \h </w:instrText>
+        <w:instrText xml:space="preserve"> REF _Ref186791937 \r \h </w:instrText>
       </w:r>
       <w:r>
         <w:fldChar w:fldCharType="separate"/>
@@ -4745,13 +4526,355 @@
         <w:t>‎</w:t>
       </w:r>
       <w:r>
-        <w:t>3.1</w:t>
+        <w:t>2.3.5</w:t>
       </w:r>
       <w:r>
         <w:fldChar w:fldCharType="end"/>
       </w:r>
       <w:r>
-        <w:t xml:space="preserve"> for basic information on working with styles in Word.</w:t>
+        <w:t>)</w:t>
+      </w:r>
+      <w:r>
+        <w:t xml:space="preserve">. As in any program, placement of pictures, and dealing with location of letter </w:t>
+      </w:r>
+      <w:r>
+        <w:t>headings</w:t>
+      </w:r>
+      <w:r>
+        <w:t xml:space="preserve"> that occur at the bottom of a page requires manual work.</w:t>
+      </w:r>
+    </w:p>
+    <w:p>
+      <w:pPr>
+        <w:pStyle w:val="BodyText"/>
+      </w:pPr>
+      <w:r>
+        <w:t xml:space="preserve">There may be rare cases where it would be helpful to make changes internally in the .docx file. Changes in a .docx file requires knowledge of XML and the way word uses XML in their internal files. For information on this format, look for </w:t>
+      </w:r>
+      <w:proofErr w:type="spellStart"/>
+      <w:r>
+        <w:t>OpenXml</w:t>
+      </w:r>
+      <w:proofErr w:type="spellEnd"/>
+      <w:r>
+        <w:t xml:space="preserve"> documentation</w:t>
+      </w:r>
+      <w:r>
+        <w:t xml:space="preserve"> on the Internet</w:t>
+      </w:r>
+      <w:r>
+        <w:t>. Word also provides a powerful programming macro language that can be useful to those who understand that.</w:t>
+      </w:r>
+    </w:p>
+    <w:p>
+      <w:pPr>
+        <w:pStyle w:val="Heading3"/>
+      </w:pPr>
+      <w:bookmarkStart w:id="8" w:name="_Toc196376611"/>
+      <w:bookmarkStart w:id="9" w:name="_GoBack"/>
+      <w:bookmarkEnd w:id="9"/>
+      <w:r>
+        <w:t>Page</w:t>
+      </w:r>
+      <w:r>
+        <w:t xml:space="preserve"> layout</w:t>
+      </w:r>
+      <w:bookmarkEnd w:id="8"/>
+    </w:p>
+    <w:p>
+      <w:pPr>
+        <w:pStyle w:val="BodyText"/>
+      </w:pPr>
+      <w:r>
+        <w:t xml:space="preserve">FLEx does not provide a way to specify </w:t>
+      </w:r>
+      <w:r>
+        <w:t xml:space="preserve">page layout information. It just contains the dictionary entries and letter </w:t>
+      </w:r>
+      <w:r>
+        <w:t>headings</w:t>
+      </w:r>
+      <w:r>
+        <w:t xml:space="preserve">. </w:t>
+      </w:r>
+      <w:r>
+        <w:t>The Word export provides a default double-column page layout including size</w:t>
+      </w:r>
+      <w:r>
+        <w:t xml:space="preserve"> (Letter 8.5” x 11”)</w:t>
+      </w:r>
+      <w:r>
+        <w:t xml:space="preserve">, page headers with guidewords, and letter headers spanning both columns. After exporting, you will need to make any adjustments to the default settings as needed. Adjustments to </w:t>
+      </w:r>
+      <w:r>
+        <w:t xml:space="preserve">page size, orientation, margins, and any other page or book type settings </w:t>
+      </w:r>
+      <w:r>
+        <w:t xml:space="preserve">can be made </w:t>
+      </w:r>
+      <w:r>
+        <w:t xml:space="preserve">from the Layout </w:t>
+      </w:r>
+      <w:r>
+        <w:t>tab</w:t>
+      </w:r>
+      <w:r>
+        <w:t xml:space="preserve">. If </w:t>
+      </w:r>
+      <w:r>
+        <w:t>you need a different number of columns</w:t>
+      </w:r>
+      <w:r>
+        <w:t xml:space="preserve">, use </w:t>
+      </w:r>
+      <w:proofErr w:type="spellStart"/>
+      <w:r>
+        <w:t>Ctrl+A</w:t>
+      </w:r>
+      <w:proofErr w:type="spellEnd"/>
+      <w:r>
+        <w:t xml:space="preserve"> to highlight the entire document, then </w:t>
+      </w:r>
+      <w:r>
+        <w:t xml:space="preserve">select the desired number of columns and column settings </w:t>
+      </w:r>
+      <w:r>
+        <w:t>in Layout</w:t>
+      </w:r>
+      <w:r>
+        <w:t xml:space="preserve"> &gt; </w:t>
+      </w:r>
+      <w:r>
+        <w:t>Columns.</w:t>
+      </w:r>
+    </w:p>
+    <w:p>
+      <w:pPr>
+        <w:pStyle w:val="BodyText"/>
+      </w:pPr>
+      <w:r>
+        <w:rPr>
+          <w:rStyle w:val="Boldphrase"/>
+        </w:rPr>
+        <w:lastRenderedPageBreak/>
+        <w:t>Note</w:t>
+      </w:r>
+      <w:r>
+        <w:t xml:space="preserve"> with double-columns, it’s possible to set up paragraph hanging indents that will cause clipping in the second column because the paragraph indent is too wide for the inter-column space. If you encounter this situation, you can adjust column widths and indents in Layout &gt; Columns &gt; More Columns where you can specify size of columns and spacing between columns, or you can decrease the paragraph hanging indent to avoid the problem.</w:t>
+      </w:r>
+    </w:p>
+    <w:p>
+      <w:pPr>
+        <w:pStyle w:val="Heading3"/>
+      </w:pPr>
+      <w:bookmarkStart w:id="10" w:name="_Ref143267723"/>
+      <w:bookmarkStart w:id="11" w:name="_Toc196376612"/>
+      <w:r>
+        <w:t>Exported</w:t>
+      </w:r>
+      <w:r>
+        <w:t xml:space="preserve"> styles</w:t>
+      </w:r>
+      <w:bookmarkEnd w:id="10"/>
+      <w:r>
+        <w:t xml:space="preserve"> in Word</w:t>
+      </w:r>
+      <w:bookmarkEnd w:id="11"/>
+    </w:p>
+    <w:p>
+      <w:pPr>
+        <w:pStyle w:val="BodyText"/>
+      </w:pPr>
+      <w:r>
+        <w:t>This section documents processing styles in Word starting with FieldWorks 9.2.8 which provided improved support for styles.</w:t>
+      </w:r>
+    </w:p>
+    <w:p>
+      <w:pPr>
+        <w:pStyle w:val="BodyText"/>
+      </w:pPr>
+      <w:r>
+        <w:t xml:space="preserve">The FLEx Word export assigns character and paragraph styles to the exported data to provide formatting that will look similar in Word to the appearance in the FLEx Dictionary view. </w:t>
+      </w:r>
+      <w:r>
+        <w:t>Styles in FLEx and Word do not work exactly the same. The export goes through a complex process to pick up all of the style features in the FLEx style hierarchy, then writes similar styles to Word, merging any styles that have the same features, and removing any styles that are unused</w:t>
+      </w:r>
+      <w:r>
+        <w:t xml:space="preserve">. If a definition field is formatted the same way in multiple places in the FLEx configuration, a single </w:t>
+      </w:r>
+      <w:r>
+        <w:t>“</w:t>
+      </w:r>
+      <w:r>
+        <w:t>Definition</w:t>
+      </w:r>
+      <w:r>
+        <w:t>”</w:t>
+      </w:r>
+      <w:r>
+        <w:t xml:space="preserve"> style will be used. However, if definitions are formatted differently in different contexts, then additional Definition styles will be created to maintain that distinction.</w:t>
+      </w:r>
+      <w:r>
+        <w:t xml:space="preserve"> The additional styles will have numbers appended to the name (e.g., “Definition2”).</w:t>
+      </w:r>
+      <w:r>
+        <w:t xml:space="preserve"> The numbers </w:t>
+      </w:r>
+      <w:r>
+        <w:t>may not</w:t>
+      </w:r>
+      <w:r>
+        <w:t xml:space="preserve"> be contiguous.</w:t>
+      </w:r>
+    </w:p>
+    <w:p>
+      <w:pPr>
+        <w:pStyle w:val="BodyText"/>
+      </w:pPr>
+      <w:r>
+        <w:t xml:space="preserve">Usually there is only one writing system for a given field. In FLEx dictionary configuration, the field will have “Default Analysis” or “Default Vernacular” checked for the field. For these cases, the dictionary view will only show the first analysis or first vernacular writing system content. When exported to Word, the style name will </w:t>
+      </w:r>
+      <w:r>
+        <w:t xml:space="preserve">normally </w:t>
+      </w:r>
+      <w:r>
+        <w:t>not specify the writing system (e.g., Definition).</w:t>
+      </w:r>
+    </w:p>
+    <w:p>
+      <w:pPr>
+        <w:pStyle w:val="BodyText"/>
+      </w:pPr>
+      <w:r>
+        <w:t>If the user wants to show multiple writing systems for a field, they will uncheck the default option in dictionary configuration and check the desired writing systems.</w:t>
+      </w:r>
+      <w:r>
+        <w:t xml:space="preserve"> </w:t>
+      </w:r>
+      <w:r>
+        <w:t xml:space="preserve">Word does not have any concept of vernacular and analysis writing systems. </w:t>
+      </w:r>
+      <w:r>
+        <w:t>In order to maintain the font and other features of a style associated with a given writing system, the Word export creates additional styles by appending [</w:t>
+      </w:r>
+      <w:proofErr w:type="spellStart"/>
+      <w:r>
+        <w:t>lang</w:t>
+      </w:r>
+      <w:proofErr w:type="spellEnd"/>
+      <w:r>
+        <w:t xml:space="preserve">=xx] where xx is the writing system code. </w:t>
+      </w:r>
+      <w:r>
+        <w:t xml:space="preserve">FLEx has an initial concept of a Normal writing system style. </w:t>
+      </w:r>
+      <w:r>
+        <w:t xml:space="preserve">If the field writing system </w:t>
+      </w:r>
+      <w:r>
+        <w:t xml:space="preserve">features </w:t>
+      </w:r>
+      <w:r>
+        <w:t xml:space="preserve">match the normal style, then the </w:t>
+      </w:r>
+      <w:proofErr w:type="spellStart"/>
+      <w:r>
+        <w:t>lang</w:t>
+      </w:r>
+      <w:proofErr w:type="spellEnd"/>
+      <w:r>
+        <w:t xml:space="preserve"> tag is omitted. If there are any differences, then a </w:t>
+      </w:r>
+      <w:proofErr w:type="spellStart"/>
+      <w:r>
+        <w:t>lang</w:t>
+      </w:r>
+      <w:proofErr w:type="spellEnd"/>
+      <w:r>
+        <w:t xml:space="preserve"> tag is added</w:t>
+      </w:r>
+      <w:r>
+        <w:t xml:space="preserve">. </w:t>
+      </w:r>
+      <w:r>
+        <w:t xml:space="preserve">As a result, most styles will not have a </w:t>
+      </w:r>
+      <w:proofErr w:type="spellStart"/>
+      <w:r>
+        <w:t>lang</w:t>
+      </w:r>
+      <w:proofErr w:type="spellEnd"/>
+      <w:r>
+        <w:t xml:space="preserve"> tag, but some may have a tag, and understanding why may be a mystery. Even with </w:t>
+      </w:r>
+      <w:r>
+        <w:t xml:space="preserve">default styles in FLEx, if the main analysis and vernacular writing systems use a different font, the Headword field will normally have a </w:t>
+      </w:r>
+      <w:proofErr w:type="spellStart"/>
+      <w:r>
+        <w:t>lang</w:t>
+      </w:r>
+      <w:proofErr w:type="spellEnd"/>
+      <w:r>
+        <w:t xml:space="preserve"> tag added because the font is different from the Normal style. If</w:t>
+      </w:r>
+      <w:r>
+        <w:t xml:space="preserve"> FLEx is configured to show English, French, and Spanish analysis languages for a definition with English being the default. In Word there would </w:t>
+      </w:r>
+      <w:r>
+        <w:t xml:space="preserve">normally </w:t>
+      </w:r>
+      <w:r>
+        <w:t>be three styles: Definition for English, Definition[</w:t>
+      </w:r>
+      <w:proofErr w:type="spellStart"/>
+      <w:r>
+        <w:t>lang</w:t>
+      </w:r>
+      <w:proofErr w:type="spellEnd"/>
+      <w:r>
+        <w:t>=</w:t>
+      </w:r>
+      <w:proofErr w:type="spellStart"/>
+      <w:r>
+        <w:t>fr</w:t>
+      </w:r>
+      <w:proofErr w:type="spellEnd"/>
+      <w:r>
+        <w:t>] for French, and Definition[</w:t>
+      </w:r>
+      <w:proofErr w:type="spellStart"/>
+      <w:r>
+        <w:t>lang</w:t>
+      </w:r>
+      <w:proofErr w:type="spellEnd"/>
+      <w:r>
+        <w:t>=es] for Spanish.</w:t>
+      </w:r>
+    </w:p>
+    <w:p>
+      <w:pPr>
+        <w:pStyle w:val="BodyText"/>
+      </w:pPr>
+      <w:r>
+        <w:t>The styles for each writing system in the Normal &gt; Fonts tab in FLEx will go into a “Normal Font” style in Word; a separate one for each writing system.</w:t>
+      </w:r>
+    </w:p>
+    <w:p>
+      <w:pPr>
+        <w:pStyle w:val="BodyText"/>
+      </w:pPr>
+      <w:r>
+        <w:t xml:space="preserve">By altering the styles </w:t>
+      </w:r>
+      <w:r>
+        <w:t>in</w:t>
+      </w:r>
+      <w:r>
+        <w:t xml:space="preserve"> a Word export, you can change the appearance of data in those styles throughout the dictionary. </w:t>
+      </w:r>
+      <w:r>
+        <w:t>Word provides good support for styles.</w:t>
       </w:r>
       <w:r>
         <w:t xml:space="preserve"> See section </w:t>
@@ -4760,7 +4883,7 @@
         <w:fldChar w:fldCharType="begin"/>
       </w:r>
       <w:r>
-        <w:instrText xml:space="preserve"> REF _Ref143765791 \r \h </w:instrText>
+        <w:instrText xml:space="preserve"> REF _Ref143252041 \r \h </w:instrText>
       </w:r>
       <w:r>
         <w:fldChar w:fldCharType="separate"/>
@@ -4772,31 +4895,22 @@
         <w:t>‎</w:t>
       </w:r>
       <w:r>
-        <w:t>3.3.1</w:t>
+        <w:t>3.1</w:t>
       </w:r>
       <w:r>
         <w:fldChar w:fldCharType="end"/>
       </w:r>
       <w:r>
-        <w:t xml:space="preserve"> for ways to search for styles in </w:t>
-      </w:r>
-      <w:r>
-        <w:t>W</w:t>
-      </w:r>
-      <w:r>
-        <w:t xml:space="preserve">ord, </w:t>
-      </w:r>
-      <w:r>
-        <w:t>section</w:t>
-      </w:r>
-      <w:r>
-        <w:t xml:space="preserve"> </w:t>
+        <w:t xml:space="preserve"> for basic information on working with styles in Word.</w:t>
+      </w:r>
+      <w:r>
+        <w:t xml:space="preserve"> See section </w:t>
       </w:r>
       <w:r>
         <w:fldChar w:fldCharType="begin"/>
       </w:r>
       <w:r>
-        <w:instrText xml:space="preserve"> REF _Ref143765894 \r \h </w:instrText>
+        <w:instrText xml:space="preserve"> REF _Ref143765791 \r \h </w:instrText>
       </w:r>
       <w:r>
         <w:fldChar w:fldCharType="separate"/>
@@ -4808,19 +4922,31 @@
         <w:t>‎</w:t>
       </w:r>
       <w:r>
-        <w:t>3.3.2</w:t>
+        <w:t>3.3.1</w:t>
       </w:r>
       <w:r>
         <w:fldChar w:fldCharType="end"/>
       </w:r>
       <w:r>
-        <w:t xml:space="preserve"> for replacing styles, and section </w:t>
+        <w:t xml:space="preserve"> for ways to search for styles in </w:t>
+      </w:r>
+      <w:r>
+        <w:t>W</w:t>
+      </w:r>
+      <w:r>
+        <w:t xml:space="preserve">ord, </w:t>
+      </w:r>
+      <w:r>
+        <w:t>section</w:t>
+      </w:r>
+      <w:r>
+        <w:t xml:space="preserve"> </w:t>
       </w:r>
       <w:r>
         <w:fldChar w:fldCharType="begin"/>
       </w:r>
       <w:r>
-        <w:instrText xml:space="preserve"> REF _Ref143765840 \r \h </w:instrText>
+        <w:instrText xml:space="preserve"> REF _Ref143765894 \r \h </w:instrText>
       </w:r>
       <w:r>
         <w:fldChar w:fldCharType="separate"/>
@@ -4832,6 +4958,30 @@
         <w:t>‎</w:t>
       </w:r>
       <w:r>
+        <w:t>3.3.2</w:t>
+      </w:r>
+      <w:r>
+        <w:fldChar w:fldCharType="end"/>
+      </w:r>
+      <w:r>
+        <w:t xml:space="preserve"> for replacing styles, and section </w:t>
+      </w:r>
+      <w:r>
+        <w:fldChar w:fldCharType="begin"/>
+      </w:r>
+      <w:r>
+        <w:instrText xml:space="preserve"> REF _Ref143765840 \r \h </w:instrText>
+      </w:r>
+      <w:r>
+        <w:fldChar w:fldCharType="separate"/>
+      </w:r>
+      <w:r>
+        <w:rPr>
+          <w:cs/>
+        </w:rPr>
+        <w:t>‎</w:t>
+      </w:r>
+      <w:r>
         <w:t>3.3.5</w:t>
       </w:r>
       <w:r>
@@ -4849,7 +4999,20 @@
         <w:pStyle w:val="BodyText"/>
       </w:pPr>
       <w:r>
-        <w:t>Here’s a diagram that shows how this works for a case where default styles were used in FLEx.</w:t>
+        <w:lastRenderedPageBreak/>
+        <w:t>Here</w:t>
+      </w:r>
+      <w:r>
+        <w:t xml:space="preserve"> i</w:t>
+      </w:r>
+      <w:r>
+        <w:t xml:space="preserve">s a diagram that shows how </w:t>
+      </w:r>
+      <w:r>
+        <w:t>styles</w:t>
+      </w:r>
+      <w:r>
+        <w:t xml:space="preserve"> work for a case where default styles were used in FLEx.</w:t>
       </w:r>
     </w:p>
     <w:p>
@@ -4861,9 +5024,9 @@
           <w:noProof/>
         </w:rPr>
         <w:drawing>
-          <wp:inline distT="0" distB="0" distL="0" distR="0" wp14:anchorId="4AB5B4F9" wp14:editId="2C41B989">
-            <wp:extent cx="6221072" cy="2776220"/>
-            <wp:effectExtent l="0" t="0" r="8890" b="5080"/>
+          <wp:inline distT="0" distB="0" distL="0" distR="0" wp14:anchorId="516E7838" wp14:editId="56C9BEDD">
+            <wp:extent cx="5807122" cy="2383650"/>
+            <wp:effectExtent l="0" t="0" r="3175" b="0"/>
             <wp:docPr id="1" name="Picture 1"/>
             <wp:cNvGraphicFramePr>
               <a:graphicFrameLocks xmlns:a="http://schemas.openxmlformats.org/drawingml/2006/main" noChangeAspect="1"/>
@@ -4884,7 +5047,7 @@
                   <pic:spPr>
                     <a:xfrm>
                       <a:off x="0" y="0"/>
-                      <a:ext cx="6225038" cy="2777990"/>
+                      <a:ext cx="5817649" cy="2387971"/>
                     </a:xfrm>
                     <a:prstGeom prst="rect">
                       <a:avLst/>
@@ -4902,15 +5065,22 @@
         <w:pStyle w:val="BodyText"/>
       </w:pPr>
       <w:r>
-        <w:t>Paragraph styles are shown in red, while character styles are shown in blue. Note that ‘</w:t>
-      </w:r>
-      <w:proofErr w:type="gramStart"/>
-      <w:r>
-        <w:t>Headword[</w:t>
-      </w:r>
-      <w:proofErr w:type="gramEnd"/>
-      <w:r>
-        <w:t xml:space="preserve">]’ is used for main entries and minor entries. </w:t>
+        <w:t xml:space="preserve">Paragraph styles are shown in red, while character styles are shown in blue. Note </w:t>
+      </w:r>
+      <w:r>
+        <w:t>the</w:t>
+      </w:r>
+      <w:r>
+        <w:t xml:space="preserve"> Headword</w:t>
+      </w:r>
+      <w:r>
+        <w:t xml:space="preserve"> style</w:t>
+      </w:r>
+      <w:r>
+        <w:t xml:space="preserve"> is used for main entries and minor entries. </w:t>
+      </w:r>
+      <w:r>
+        <w:t xml:space="preserve">However, for subentries, a Subentries style is used in the export to prevent subentry headwords from being included in the page header guidewords. </w:t>
       </w:r>
       <w:r>
         <w:t xml:space="preserve">The same </w:t>
@@ -4928,13 +5098,16 @@
         <w:footnoteReference w:id="1"/>
       </w:r>
       <w:r>
-        <w:t xml:space="preserve">. There are different paragraph styles for main entries, subentries, and minor entries. Definition (or Gloss) are the same in all cases except ‘Definition in subsense’, which had a numbered style name since it was formatted to a different style in FLEx. Before and After text </w:t>
-      </w:r>
-      <w:r>
-        <w:t>are</w:t>
-      </w:r>
-      <w:r>
-        <w:t xml:space="preserve"> formatted with a single Context style as it is in FLEx.</w:t>
+        <w:t xml:space="preserve">. There are different paragraph styles for main entries, subentries, and minor entries. Definition </w:t>
+      </w:r>
+      <w:r>
+        <w:t>is</w:t>
+      </w:r>
+      <w:r>
+        <w:t xml:space="preserve"> the same in all cases except ‘Definition in subsense’, which had a numbered style name since it was formatted to a different style in FLEx.</w:t>
+      </w:r>
+      <w:r>
+        <w:t xml:space="preserve"> The styles for field context are described in the next section.</w:t>
       </w:r>
     </w:p>
     <w:p>
@@ -4942,7 +5115,6 @@
         <w:pStyle w:val="BodyText"/>
       </w:pPr>
       <w:r>
-        <w:lastRenderedPageBreak/>
         <w:t>If</w:t>
       </w:r>
       <w:r>
@@ -4971,7 +5143,7 @@
       <w:pPr>
         <w:pStyle w:val="Heading4"/>
       </w:pPr>
-      <w:bookmarkStart w:id="12" w:name="_Toc193439762"/>
+      <w:bookmarkStart w:id="12" w:name="_Toc196376613"/>
       <w:r>
         <w:t>Context s</w:t>
       </w:r>
@@ -5039,9 +5211,6 @@
         <w:t xml:space="preserve">; </w:t>
       </w:r>
       <w:r>
-        <w:t>“</w:t>
-      </w:r>
-      <w:r>
         <w:t>Lexeme Form[</w:t>
       </w:r>
       <w:proofErr w:type="spellStart"/>
@@ -5050,7 +5219,7 @@
       </w:r>
       <w:proofErr w:type="spellEnd"/>
       <w:r>
-        <w:t>='</w:t>
+        <w:t>=</w:t>
       </w:r>
       <w:proofErr w:type="spellStart"/>
       <w:r>
@@ -5058,10 +5227,10 @@
       </w:r>
       <w:proofErr w:type="spellEnd"/>
       <w:r>
-        <w:t>']</w:t>
-      </w:r>
-      <w:r>
-        <w:t>”</w:t>
+        <w:t>]</w:t>
+      </w:r>
+      <w:r>
+        <w:t>,</w:t>
       </w:r>
       <w:r>
         <w:t xml:space="preserve"> in </w:t>
@@ -5073,15 +5242,22 @@
         <w:t xml:space="preserve"> case.</w:t>
       </w:r>
       <w:r>
-        <w:t xml:space="preserve"> The before/between/after text for this field will use the “</w:t>
-      </w:r>
-      <w:proofErr w:type="gramStart"/>
-      <w:r>
-        <w:t>Context :</w:t>
-      </w:r>
-      <w:proofErr w:type="gramEnd"/>
-      <w:r>
-        <w:t xml:space="preserve"> Lexeme Form[</w:t>
+        <w:t xml:space="preserve"> The before/between/after text for this field will use </w:t>
+      </w:r>
+      <w:r>
+        <w:t>a separate style with “-Context” appended to the style name, thus</w:t>
+      </w:r>
+      <w:r>
+        <w:t xml:space="preserve"> </w:t>
+      </w:r>
+      <w:r>
+        <w:t>Lexeme Form</w:t>
+      </w:r>
+      <w:r>
+        <w:t>-Context</w:t>
+      </w:r>
+      <w:r>
+        <w:t>[</w:t>
       </w:r>
       <w:proofErr w:type="spellStart"/>
       <w:r>
@@ -5089,7 +5265,7 @@
       </w:r>
       <w:proofErr w:type="spellEnd"/>
       <w:r>
-        <w:t>='</w:t>
+        <w:t>=</w:t>
       </w:r>
       <w:proofErr w:type="spellStart"/>
       <w:r>
@@ -5097,13 +5273,13 @@
       </w:r>
       <w:proofErr w:type="spellEnd"/>
       <w:r>
-        <w:t>']</w:t>
-      </w:r>
-      <w:r>
-        <w:t xml:space="preserve">” style for this field. </w:t>
-      </w:r>
-      <w:r>
-        <w:t>This Context style is based on the style for the field, “Lexeme-Form[</w:t>
+        <w:t>]</w:t>
+      </w:r>
+      <w:r>
+        <w:t xml:space="preserve">. </w:t>
+      </w:r>
+      <w:r>
+        <w:t>This Context style is based on the style for the field, Lexeme-Form[</w:t>
       </w:r>
       <w:proofErr w:type="spellStart"/>
       <w:r>
@@ -5113,19 +5289,17 @@
       <w:r>
         <w:t>=</w:t>
       </w:r>
-      <w:r>
-        <w:t>'</w:t>
-      </w:r>
       <w:proofErr w:type="spellStart"/>
       <w:r>
         <w:t>trw-fonipa</w:t>
       </w:r>
       <w:proofErr w:type="spellEnd"/>
       <w:r>
-        <w:t>'</w:t>
-      </w:r>
-      <w:r>
-        <w:t xml:space="preserve">] in this case, thus it merges properties of both styles. </w:t>
+        <w:t xml:space="preserve">], thus it merges </w:t>
+      </w:r>
+      <w:r>
+        <w:lastRenderedPageBreak/>
+        <w:t xml:space="preserve">properties of both styles. </w:t>
       </w:r>
       <w:r>
         <w:t>The same style is used for all three contexts. The context style is set to match the style that was used in FLEx. So, in the above example, it would be set to red. Each field that has context assigned in FLEx, will have a different style in Word for that context. This provide</w:t>
@@ -5140,13 +5314,7 @@
         <w:t>x</w:t>
       </w:r>
       <w:r>
-        <w:t xml:space="preserve">t styles when needed. You will </w:t>
-      </w:r>
-      <w:r>
-        <w:t>normally</w:t>
-      </w:r>
-      <w:r>
-        <w:t xml:space="preserve"> see a lot of styles in Word starting with Context, each one associated with a single field.</w:t>
+        <w:t>t styles when needed.</w:t>
       </w:r>
     </w:p>
     <w:p>
@@ -5154,10 +5322,85 @@
         <w:pStyle w:val="BodyText"/>
       </w:pPr>
       <w:r>
-        <w:t xml:space="preserve">Here is an example demonstrating </w:t>
+        <w:t xml:space="preserve">Consider the following </w:t>
+      </w:r>
+      <w:r>
+        <w:t xml:space="preserve">example demonstrating </w:t>
       </w:r>
       <w:r>
         <w:t>styles for fields with embedding, and context on some fields.</w:t>
+      </w:r>
+      <w:r>
+        <w:t xml:space="preserve"> In FLEx, the configuration settings are as follows</w:t>
+      </w:r>
+      <w:r>
+        <w:br/>
+        <w:t>Headword After: space</w:t>
+      </w:r>
+      <w:r>
+        <w:br/>
+        <w:t>Senses Before: space</w:t>
+      </w:r>
+      <w:r>
+        <w:br/>
+        <w:t xml:space="preserve">Senses After: space </w:t>
+      </w:r>
+      <w:proofErr w:type="spellStart"/>
+      <w:r>
+        <w:t>space</w:t>
+      </w:r>
+      <w:proofErr w:type="spellEnd"/>
+      <w:r>
+        <w:br/>
+        <w:t xml:space="preserve">Grammatical Info. After space </w:t>
+      </w:r>
+      <w:proofErr w:type="spellStart"/>
+      <w:r>
+        <w:t>space</w:t>
+      </w:r>
+      <w:proofErr w:type="spellEnd"/>
+      <w:r>
+        <w:br/>
+        <w:t xml:space="preserve">Examples Before: space </w:t>
+      </w:r>
+      <w:proofErr w:type="spellStart"/>
+      <w:r>
+        <w:t>space</w:t>
+      </w:r>
+      <w:proofErr w:type="spellEnd"/>
+      <w:r>
+        <w:br/>
+        <w:t>Example Sentence Between: space</w:t>
+      </w:r>
+      <w:r>
+        <w:br/>
+        <w:t>Translations Before: space</w:t>
+      </w:r>
+      <w:r>
+        <w:br/>
+        <w:t xml:space="preserve">Translation Before: space </w:t>
+      </w:r>
+      <w:proofErr w:type="spellStart"/>
+      <w:r>
+        <w:t>space</w:t>
+      </w:r>
+      <w:proofErr w:type="spellEnd"/>
+    </w:p>
+    <w:p>
+      <w:pPr>
+        <w:pStyle w:val="BodyText"/>
+      </w:pPr>
+      <w:r>
+        <w:t xml:space="preserve">The styles </w:t>
+      </w:r>
+      <w:r>
+        <w:t>when exported to</w:t>
+      </w:r>
+      <w:r>
+        <w:t xml:space="preserve"> Word are shown here.</w:t>
+      </w:r>
+      <w:r>
+        <w:t>, but will po</w:t>
       </w:r>
     </w:p>
     <w:p>
@@ -5169,10 +5412,10 @@
           <w:noProof/>
         </w:rPr>
         <w:drawing>
-          <wp:inline distT="0" distB="0" distL="0" distR="0" wp14:anchorId="429F3944" wp14:editId="33B7AA71">
-            <wp:extent cx="5004855" cy="2101932"/>
-            <wp:effectExtent l="0" t="0" r="5715" b="0"/>
-            <wp:docPr id="20" name="Picture 20"/>
+          <wp:inline distT="0" distB="0" distL="0" distR="0" wp14:anchorId="71027B3D" wp14:editId="40370872">
+            <wp:extent cx="5111087" cy="2237193"/>
+            <wp:effectExtent l="0" t="0" r="0" b="0"/>
+            <wp:docPr id="25" name="Picture 25"/>
             <wp:cNvGraphicFramePr>
               <a:graphicFrameLocks xmlns:a="http://schemas.openxmlformats.org/drawingml/2006/main" noChangeAspect="1"/>
             </wp:cNvGraphicFramePr>
@@ -5192,7 +5435,7 @@
                   <pic:spPr>
                     <a:xfrm>
                       <a:off x="0" y="0"/>
-                      <a:ext cx="5062403" cy="2126101"/>
+                      <a:ext cx="5173281" cy="2264416"/>
                     </a:xfrm>
                     <a:prstGeom prst="rect">
                       <a:avLst/>
@@ -5210,11 +5453,32 @@
         <w:pStyle w:val="ListLetter"/>
       </w:pPr>
       <w:r>
+        <w:t>After text (space) on Headword</w:t>
+      </w:r>
+    </w:p>
+    <w:p>
+      <w:pPr>
+        <w:pStyle w:val="ListLetter"/>
+      </w:pPr>
+      <w:r>
+        <w:t>Before text (space) on Senses</w:t>
+      </w:r>
+    </w:p>
+    <w:p>
+      <w:pPr>
+        <w:pStyle w:val="ListLetter"/>
+      </w:pPr>
+      <w:r>
+        <w:t>After text (2 spaces) on Grammatical Info.</w:t>
+      </w:r>
+    </w:p>
+    <w:p>
+      <w:pPr>
+        <w:pStyle w:val="ListLetter"/>
+      </w:pPr>
+      <w:r>
         <w:t>Begin text (2 spaces) on Examples</w:t>
       </w:r>
-      <w:r>
-        <w:t xml:space="preserve"> node</w:t>
-      </w:r>
     </w:p>
     <w:p>
       <w:pPr>
@@ -5245,7 +5509,7 @@
         <w:pStyle w:val="ListLetter"/>
       </w:pPr>
       <w:r>
-        <w:t>Between text (1 space) on Example Sentence node (inserted between two different writing systems)</w:t>
+        <w:t>Between text (space) on Example Sentence (inserted between two different writing systems)</w:t>
       </w:r>
     </w:p>
     <w:p>
@@ -5253,54 +5517,82 @@
         <w:pStyle w:val="ListLetter"/>
       </w:pPr>
       <w:r>
+        <w:t>Text from Example Sentence in French IPA</w:t>
+      </w:r>
+    </w:p>
+    <w:p>
+      <w:pPr>
+        <w:pStyle w:val="ListLetter"/>
+      </w:pPr>
+      <w:r>
+        <w:t>Before text (space) on Translations</w:t>
+      </w:r>
+    </w:p>
+    <w:p>
+      <w:pPr>
+        <w:pStyle w:val="ListLetter"/>
+      </w:pPr>
+      <w:r>
+        <w:t>Before text (2 spaces) on Translation in Swahili</w:t>
+      </w:r>
+    </w:p>
+    <w:p>
+      <w:pPr>
+        <w:pStyle w:val="ListLetter"/>
+      </w:pPr>
+      <w:r>
+        <w:t xml:space="preserve">Text </w:t>
+      </w:r>
+      <w:r>
+        <w:t>from</w:t>
+      </w:r>
+      <w:r>
+        <w:t xml:space="preserve"> Translation in Swahili</w:t>
+      </w:r>
+    </w:p>
+    <w:p>
+      <w:pPr>
+        <w:pStyle w:val="ListLetter"/>
+      </w:pPr>
+      <w:r>
+        <w:t>Text using embedded Strong style in Translation in Swahili</w:t>
+      </w:r>
+    </w:p>
+    <w:p>
+      <w:pPr>
+        <w:pStyle w:val="ListLetter"/>
+      </w:pPr>
+      <w:r>
+        <w:t>Text from Translation in Swahili</w:t>
+      </w:r>
+    </w:p>
+    <w:p>
+      <w:pPr>
+        <w:pStyle w:val="ListLetter"/>
+      </w:pPr>
+      <w:r>
+        <w:t>After text (2 spaces) on Senses</w:t>
+      </w:r>
+    </w:p>
+    <w:p>
+      <w:pPr>
+        <w:pStyle w:val="BodyText"/>
+      </w:pPr>
+      <w:r>
         <w:lastRenderedPageBreak/>
-        <w:t>Text from Example Sentence in French IPA</w:t>
-      </w:r>
-    </w:p>
-    <w:p>
-      <w:pPr>
-        <w:pStyle w:val="ListLetter"/>
-      </w:pPr>
-      <w:r>
-        <w:t>Before text (1 space) on Translations node</w:t>
-      </w:r>
-    </w:p>
-    <w:p>
-      <w:pPr>
-        <w:pStyle w:val="ListLetter"/>
-      </w:pPr>
-      <w:r>
-        <w:t>Before text (2 spaces) on Translation in Swahili</w:t>
-      </w:r>
-    </w:p>
-    <w:p>
-      <w:pPr>
-        <w:pStyle w:val="ListLetter"/>
-      </w:pPr>
-      <w:r>
-        <w:t xml:space="preserve">Text </w:t>
-      </w:r>
-      <w:r>
-        <w:t>from</w:t>
-      </w:r>
-      <w:r>
-        <w:t xml:space="preserve"> Translation in Swahili</w:t>
-      </w:r>
-    </w:p>
-    <w:p>
-      <w:pPr>
-        <w:pStyle w:val="ListLetter"/>
-      </w:pPr>
-      <w:r>
-        <w:t>Text using embedded Strong style in Translation in Swahili</w:t>
-      </w:r>
-    </w:p>
-    <w:p>
-      <w:pPr>
-        <w:pStyle w:val="BodyText"/>
-      </w:pPr>
-      <w:r>
-        <w:t>Note how text between fields may come from multiple places as in g) and h) above. The Word context styles can be quite helpful in identifying where the context text is specified.</w:t>
+        <w:t xml:space="preserve">Note how text between fields may come from multiple places as in </w:t>
+      </w:r>
+      <w:r>
+        <w:t>j</w:t>
+      </w:r>
+      <w:r>
+        <w:t xml:space="preserve">) and </w:t>
+      </w:r>
+      <w:r>
+        <w:t>k</w:t>
+      </w:r>
+      <w:r>
+        <w:t>) above. The Word context styles can be quite helpful in identifying where the context text is specified.</w:t>
       </w:r>
     </w:p>
     <w:p>
@@ -5308,7 +5600,7 @@
         <w:pStyle w:val="Heading3"/>
       </w:pPr>
       <w:bookmarkStart w:id="13" w:name="_Ref186791558"/>
-      <w:bookmarkStart w:id="14" w:name="_Toc193439763"/>
+      <w:bookmarkStart w:id="14" w:name="_Toc196376614"/>
       <w:r>
         <w:t>Add page headers with guidewords</w:t>
       </w:r>
@@ -5517,143 +5809,124 @@
       <w:r>
         <w:t xml:space="preserve"> </w:t>
       </w:r>
+      <w:r>
+        <w:t>Headword</w:t>
+      </w:r>
+      <w:r>
+        <w:t xml:space="preserve"> for main entrie</w:t>
+      </w:r>
+      <w:r>
+        <w:t>s</w:t>
+      </w:r>
+      <w:r>
+        <w:t>. You can only include one style for guidewords. If you have formatted minor entries with a different style</w:t>
+      </w:r>
+      <w:r>
+        <w:t xml:space="preserve"> in Flex</w:t>
+      </w:r>
+      <w:r>
+        <w:t>, this will be a problem.</w:t>
+      </w:r>
+      <w:r>
+        <w:t xml:space="preserve"> </w:t>
+      </w:r>
+      <w:r>
+        <w:t xml:space="preserve">If </w:t>
+      </w:r>
+      <w:r>
+        <w:t xml:space="preserve">you want to allow minor entries in the guidewords, you’ll need to change those styles to </w:t>
+      </w:r>
+      <w:r>
+        <w:t>Headword</w:t>
+      </w:r>
+      <w:r>
+        <w:t>.</w:t>
+      </w:r>
+      <w:r>
+        <w:t xml:space="preserve"> </w:t>
+      </w:r>
+      <w:r>
+        <w:t xml:space="preserve">The other issue is what to do when a page begins with a continuation of a longer entry from the previous page. </w:t>
+      </w:r>
+      <w:r>
+        <w:t>Typically</w:t>
+      </w:r>
+      <w:r>
+        <w:t xml:space="preserve">, it would be nice to include the last headword from the previous page. </w:t>
+      </w:r>
+      <w:r>
+        <w:t xml:space="preserve">Unfortunately, </w:t>
+      </w:r>
+      <w:r>
+        <w:t xml:space="preserve">Word cannot handle this </w:t>
+      </w:r>
+      <w:r>
+        <w:t>in the normal page header settings</w:t>
+      </w:r>
+      <w:r>
+        <w:t>.</w:t>
+      </w:r>
+      <w:r>
+        <w:t xml:space="preserve"> </w:t>
+      </w:r>
+      <w:r>
+        <w:t>T</w:t>
+      </w:r>
+      <w:r>
+        <w:t>he only easy option is to include headwords from the current page.</w:t>
+      </w:r>
+      <w:r>
+        <w:t xml:space="preserve"> Using </w:t>
+      </w:r>
+      <w:r>
+        <w:t xml:space="preserve">a </w:t>
+      </w:r>
+      <w:r>
+        <w:t>Vi</w:t>
+      </w:r>
+      <w:r>
+        <w:t>s</w:t>
+      </w:r>
+      <w:r>
+        <w:t xml:space="preserve">ual Basic </w:t>
+      </w:r>
       <w:proofErr w:type="gramStart"/>
       <w:r>
-        <w:t>Headword[</w:t>
+        <w:t>For</w:t>
       </w:r>
       <w:proofErr w:type="gramEnd"/>
       <w:r>
-        <w:t>]</w:t>
-      </w:r>
-      <w:r>
-        <w:t xml:space="preserve"> for main entrie</w:t>
-      </w:r>
-      <w:r>
-        <w:t>s</w:t>
-      </w:r>
-      <w:r>
-        <w:t>. You can only include one style for guidewords. If you have formatted minor entries with a different style</w:t>
-      </w:r>
-      <w:r>
-        <w:t xml:space="preserve"> in Flex</w:t>
-      </w:r>
-      <w:r>
-        <w:t>, this will be a problem.</w:t>
-      </w:r>
-      <w:r>
-        <w:t xml:space="preserve"> </w:t>
-      </w:r>
-      <w:r>
-        <w:t xml:space="preserve">If </w:t>
-      </w:r>
-      <w:r>
-        <w:t xml:space="preserve">you want to allow minor entries in the guidewords, you’ll need to change those styles to </w:t>
-      </w:r>
-      <w:proofErr w:type="gramStart"/>
-      <w:r>
-        <w:t>Headword[</w:t>
-      </w:r>
-      <w:proofErr w:type="gramEnd"/>
-      <w:r>
-        <w:t>]</w:t>
+        <w:t xml:space="preserve"> Applications</w:t>
+      </w:r>
+      <w:r>
+        <w:t xml:space="preserve"> macro</w:t>
+      </w:r>
+      <w:r>
+        <w:t xml:space="preserve">, </w:t>
+      </w:r>
+      <w:r>
+        <w:t>it might be possible to do something better.</w:t>
+      </w:r>
+    </w:p>
+    <w:p>
+      <w:pPr>
+        <w:pStyle w:val="BodyText"/>
+      </w:pPr>
+      <w:r>
+        <w:t>Note that the default FLEx configuration uses Dictionary-Headword for the Headword style for subentries, which is identical to default settings for main and minor entry headwords. It is not desirable for subentry headwords to be in guidewords since they often do not follow the normal alphabetical order of main headwords. The FLEx Word export automatically switches subentry headwords to use a Subheadword style to avoid these undesirable guidewords. If you happen to change the subentry headword style in FLEx, it will still get changed to Subheadword during the export</w:t>
+      </w:r>
+      <w:r>
+        <w:t xml:space="preserve"> and keep your style’s properties</w:t>
       </w:r>
       <w:r>
         <w:t>.</w:t>
       </w:r>
-      <w:r>
-        <w:t xml:space="preserve"> </w:t>
-      </w:r>
-      <w:r>
-        <w:t xml:space="preserve">The other issue is what to do when a page begins with a continuation of a longer entry from the previous page. </w:t>
-      </w:r>
-      <w:r>
-        <w:t>Typically</w:t>
-      </w:r>
-      <w:r>
-        <w:t xml:space="preserve">, it would be nice to include the last headword from the previous page. </w:t>
-      </w:r>
-      <w:r>
-        <w:t xml:space="preserve">Unfortunately, </w:t>
-      </w:r>
-      <w:r>
-        <w:t xml:space="preserve">Word cannot handle this </w:t>
-      </w:r>
-      <w:r>
-        <w:t>in the normal page header settings</w:t>
-      </w:r>
-      <w:r>
-        <w:t>.</w:t>
-      </w:r>
-      <w:r>
-        <w:t xml:space="preserve"> </w:t>
-      </w:r>
-      <w:r>
-        <w:t>T</w:t>
-      </w:r>
-      <w:r>
-        <w:t>he only easy option is to include headwords from the current page.</w:t>
-      </w:r>
-      <w:r>
-        <w:t xml:space="preserve"> Using </w:t>
-      </w:r>
-      <w:r>
-        <w:t xml:space="preserve">a </w:t>
-      </w:r>
-      <w:r>
-        <w:t>Vi</w:t>
-      </w:r>
-      <w:r>
-        <w:t>s</w:t>
-      </w:r>
-      <w:r>
-        <w:t xml:space="preserve">ual Basic </w:t>
-      </w:r>
-      <w:proofErr w:type="gramStart"/>
-      <w:r>
-        <w:t>For</w:t>
-      </w:r>
-      <w:proofErr w:type="gramEnd"/>
-      <w:r>
-        <w:t xml:space="preserve"> Applications</w:t>
-      </w:r>
-      <w:r>
-        <w:t xml:space="preserve"> macro</w:t>
-      </w:r>
-      <w:r>
-        <w:t xml:space="preserve">, </w:t>
-      </w:r>
-      <w:r>
-        <w:t>it might be possible to do something better.</w:t>
-      </w:r>
     </w:p>
     <w:p>
       <w:pPr>
         <w:pStyle w:val="BodyText"/>
       </w:pPr>
       <w:r>
-        <w:t xml:space="preserve">An additional issue is that the default FLEx configuration uses Dictionary-Headword style for headwords in Subentries. This means that the exported Word file will also use </w:t>
-      </w:r>
-      <w:proofErr w:type="gramStart"/>
-      <w:r>
-        <w:t>Headword[</w:t>
-      </w:r>
-      <w:proofErr w:type="gramEnd"/>
-      <w:r>
-        <w:t>] for subentry headwords. It’s not desirable to use these in a guideword. One workaround before export is to add a Dictionary-Subheadword character style based on Dictionary-Headword in FLEx and assign this style to the Headword of subentries. Then the guid</w:t>
-      </w:r>
-      <w:r>
-        <w:t>e</w:t>
-      </w:r>
-      <w:r>
-        <w:t>words in Word will skip these subentry headwords.</w:t>
-      </w:r>
-    </w:p>
-    <w:p>
-      <w:pPr>
-        <w:pStyle w:val="BodyText"/>
-      </w:pPr>
-      <w:r>
-        <w:lastRenderedPageBreak/>
         <w:t xml:space="preserve">To </w:t>
       </w:r>
       <w:r>
@@ -5682,13 +5955,8 @@
       <w:r>
         <w:t xml:space="preserve">, and in the Field properties, choose the headword character style (e.g., </w:t>
       </w:r>
-      <w:proofErr w:type="gramStart"/>
-      <w:r>
-        <w:t>Headword[</w:t>
-      </w:r>
-      <w:proofErr w:type="gramEnd"/>
-      <w:r>
-        <w:t>]</w:t>
+      <w:r>
+        <w:t>Headword</w:t>
       </w:r>
       <w:r>
         <w:t>)</w:t>
@@ -5711,6 +5979,7 @@
         <w:rPr>
           <w:noProof/>
         </w:rPr>
+        <w:lastRenderedPageBreak/>
         <w:drawing>
           <wp:inline distT="0" distB="0" distL="0" distR="0" wp14:anchorId="4A74126C" wp14:editId="14F58193">
             <wp:extent cx="5943600" cy="3794760"/>
@@ -5829,13 +6098,8 @@
       <w:r>
         <w:t xml:space="preserve"> the Section Break (Continuous) is set to the </w:t>
       </w:r>
-      <w:proofErr w:type="gramStart"/>
-      <w:r>
-        <w:t>Headword[</w:t>
-      </w:r>
-      <w:proofErr w:type="gramEnd"/>
-      <w:r>
-        <w:t xml:space="preserve">] </w:t>
+      <w:r>
+        <w:t xml:space="preserve">Headword </w:t>
       </w:r>
       <w:r>
         <w:t>style, so it has no text, and it’s the first occurrence of the style on the page</w:t>
@@ -5905,11 +6169,15 @@
       <w:r>
         <w:t xml:space="preserve">When using guidewords, it’s </w:t>
       </w:r>
-      <w:proofErr w:type="spellStart"/>
-      <w:r>
-        <w:t>oten</w:t>
-      </w:r>
-      <w:proofErr w:type="spellEnd"/>
+      <w:r>
+        <w:t>o</w:t>
+      </w:r>
+      <w:r>
+        <w:t>f</w:t>
+      </w:r>
+      <w:r>
+        <w:t>ten</w:t>
+      </w:r>
       <w:r>
         <w:t xml:space="preserve"> best to not show them on the first page. </w:t>
       </w:r>
@@ -5931,119 +6199,122 @@
         <w:pStyle w:val="Heading3"/>
       </w:pPr>
       <w:bookmarkStart w:id="15" w:name="_Ref176788241"/>
-      <w:bookmarkStart w:id="16" w:name="_Toc193439764"/>
+      <w:bookmarkStart w:id="16" w:name="_Toc196376615"/>
+      <w:r>
+        <w:t xml:space="preserve">How to fix incorrect guidewords on </w:t>
+      </w:r>
+      <w:r>
+        <w:t>some</w:t>
+      </w:r>
+      <w:r>
+        <w:t xml:space="preserve"> pages</w:t>
+      </w:r>
+      <w:bookmarkEnd w:id="16"/>
+    </w:p>
+    <w:p>
+      <w:pPr>
+        <w:pStyle w:val="BodyText"/>
+      </w:pPr>
+      <w:r>
+        <w:t xml:space="preserve">After you have made all of the changes to your document, if you find a few page headers where the guidewords were incorrect, there is a way you can correct this. It would not be wise to make these changes until all other editing is done because you are forcing new page breaks that would </w:t>
+      </w:r>
       <w:r>
         <w:lastRenderedPageBreak/>
-        <w:t xml:space="preserve">How to fix incorrect guidewords on </w:t>
-      </w:r>
-      <w:r>
-        <w:t>some</w:t>
-      </w:r>
-      <w:r>
-        <w:t xml:space="preserve"> pages</w:t>
-      </w:r>
-      <w:bookmarkEnd w:id="16"/>
+        <w:t>be incorrect if you make changes to previous pages that would alter the location of the default page breaks.</w:t>
+      </w:r>
+      <w:r>
+        <w:t xml:space="preserve"> Follow these steps to alter </w:t>
+      </w:r>
+      <w:proofErr w:type="gramStart"/>
+      <w:r>
+        <w:t>one page</w:t>
+      </w:r>
+      <w:proofErr w:type="gramEnd"/>
+      <w:r>
+        <w:t xml:space="preserve"> header without affecting other headers.</w:t>
+      </w:r>
+    </w:p>
+    <w:p>
+      <w:pPr>
+        <w:pStyle w:val="ListNumber"/>
+      </w:pPr>
+      <w:r>
+        <w:t>Place your curser after the last character on the last line of the page before the page header you want to change.</w:t>
+      </w:r>
+    </w:p>
+    <w:p>
+      <w:pPr>
+        <w:pStyle w:val="ListNumber"/>
+      </w:pPr>
+      <w:r>
+        <w:t xml:space="preserve">In the Layout tab, choose Breaks &gt; Next Page. This will </w:t>
+      </w:r>
+      <w:r>
+        <w:t xml:space="preserve">force a page break at this </w:t>
+      </w:r>
+      <w:proofErr w:type="gramStart"/>
+      <w:r>
+        <w:t>point.</w:t>
+      </w:r>
+      <w:r>
+        <w:t>.</w:t>
+      </w:r>
+      <w:proofErr w:type="gramEnd"/>
+    </w:p>
+    <w:p>
+      <w:pPr>
+        <w:pStyle w:val="ListNumber"/>
+      </w:pPr>
+      <w:r>
+        <w:t>Right-click the pager header</w:t>
+      </w:r>
+      <w:r>
+        <w:t xml:space="preserve"> you want to change</w:t>
+      </w:r>
+      <w:r>
+        <w:t xml:space="preserve"> and choose Edit Header.</w:t>
+      </w:r>
+    </w:p>
+    <w:p>
+      <w:pPr>
+        <w:pStyle w:val="ListNumber"/>
+      </w:pPr>
+      <w:r>
+        <w:t>In the Options section of the Design tab under Header &amp; Footer Tools, check the “Different First Page” option.</w:t>
+      </w:r>
+      <w:r>
+        <w:t xml:space="preserve"> This will remove the content of the header you want to change.</w:t>
+      </w:r>
+    </w:p>
+    <w:p>
+      <w:pPr>
+        <w:pStyle w:val="ListNumber"/>
+      </w:pPr>
+      <w:r>
+        <w:t>Add the correct guidewords, page header, etc. for this page header.</w:t>
+      </w:r>
+    </w:p>
+    <w:p>
+      <w:pPr>
+        <w:pStyle w:val="ListNumber"/>
+      </w:pPr>
+      <w:r>
+        <w:t>Click “Close Header and Footer” from the Close section of the toolbar.</w:t>
+      </w:r>
+    </w:p>
+    <w:p>
+      <w:pPr>
+        <w:pStyle w:val="ListNumber"/>
+      </w:pPr>
+      <w:r>
+        <w:t>The remaining pages should continue with the normal page headers.</w:t>
+      </w:r>
     </w:p>
     <w:p>
       <w:pPr>
         <w:pStyle w:val="BodyText"/>
       </w:pPr>
       <w:r>
-        <w:t>After you have made all of the changes to your document, if you find a few page headers where the guidewords were incorrect, there is a way you can correct this. It would not be wise to make these changes until all other editing is done because you are forcing new page breaks that would be incorrect if you make changes to previous pages that would alter the location of the default page breaks.</w:t>
-      </w:r>
-      <w:r>
-        <w:t xml:space="preserve"> Follow these steps to alter </w:t>
-      </w:r>
-      <w:proofErr w:type="gramStart"/>
-      <w:r>
-        <w:t>one page</w:t>
-      </w:r>
-      <w:proofErr w:type="gramEnd"/>
-      <w:r>
-        <w:t xml:space="preserve"> header without affecting other headers.</w:t>
-      </w:r>
-    </w:p>
-    <w:p>
-      <w:pPr>
-        <w:pStyle w:val="ListNumber"/>
-      </w:pPr>
-      <w:r>
-        <w:t>Place your curser after the last character on the last line of the page before the page header you want to change.</w:t>
-      </w:r>
-    </w:p>
-    <w:p>
-      <w:pPr>
-        <w:pStyle w:val="ListNumber"/>
-      </w:pPr>
-      <w:r>
-        <w:t xml:space="preserve">In the Layout tab, choose Breaks &gt; Next Page. This will </w:t>
-      </w:r>
-      <w:r>
-        <w:t xml:space="preserve">force a page break at this </w:t>
-      </w:r>
-      <w:proofErr w:type="gramStart"/>
-      <w:r>
-        <w:t>point.</w:t>
-      </w:r>
-      <w:r>
-        <w:t>.</w:t>
-      </w:r>
-      <w:proofErr w:type="gramEnd"/>
-    </w:p>
-    <w:p>
-      <w:pPr>
-        <w:pStyle w:val="ListNumber"/>
-      </w:pPr>
-      <w:r>
-        <w:t>Right-click the pager header</w:t>
-      </w:r>
-      <w:r>
-        <w:t xml:space="preserve"> you want to change</w:t>
-      </w:r>
-      <w:r>
-        <w:t xml:space="preserve"> and choose Edit Header.</w:t>
-      </w:r>
-    </w:p>
-    <w:p>
-      <w:pPr>
-        <w:pStyle w:val="ListNumber"/>
-      </w:pPr>
-      <w:r>
-        <w:t>In the Options section of the Design tab under Header &amp; Footer Tools, check the “Different First Page” option.</w:t>
-      </w:r>
-      <w:r>
-        <w:t xml:space="preserve"> This will remove the content of the header you want to change.</w:t>
-      </w:r>
-    </w:p>
-    <w:p>
-      <w:pPr>
-        <w:pStyle w:val="ListNumber"/>
-      </w:pPr>
-      <w:r>
-        <w:t>Add the correct guidewords, page header, etc. for this page header.</w:t>
-      </w:r>
-    </w:p>
-    <w:p>
-      <w:pPr>
-        <w:pStyle w:val="ListNumber"/>
-      </w:pPr>
-      <w:r>
-        <w:t>Click “Close Header and Footer” from the Close section of the toolbar.</w:t>
-      </w:r>
-    </w:p>
-    <w:p>
-      <w:pPr>
-        <w:pStyle w:val="ListNumber"/>
-      </w:pPr>
-      <w:r>
-        <w:t>The remaining pages should continue with the normal page headers.</w:t>
-      </w:r>
-    </w:p>
-    <w:p>
-      <w:pPr>
-        <w:pStyle w:val="BodyText"/>
-      </w:pPr>
-      <w:r>
         <w:t>If you need to remove an inserted page break, place the curser at the end of the text on the previous page, then press Delete.</w:t>
       </w:r>
       <w:r>
@@ -6055,7 +6326,7 @@
         <w:pStyle w:val="Heading3"/>
       </w:pPr>
       <w:bookmarkStart w:id="17" w:name="_Ref186791937"/>
-      <w:bookmarkStart w:id="18" w:name="_Toc193439765"/>
+      <w:bookmarkStart w:id="18" w:name="_Toc196376616"/>
       <w:r>
         <w:t xml:space="preserve">Convert letter </w:t>
       </w:r>
@@ -6216,297 +6487,303 @@
       <w:r>
         <w:t xml:space="preserve">At this point the inserted Section Break will be set to the </w:t>
       </w:r>
+      <w:r>
+        <w:t>Headword</w:t>
+      </w:r>
+      <w:r>
+        <w:t xml:space="preserve"> style. This </w:t>
+      </w:r>
+      <w:r>
+        <w:t>will</w:t>
+      </w:r>
+      <w:r>
+        <w:t xml:space="preserve"> cause a problem with </w:t>
+      </w:r>
+      <w:r>
+        <w:t>guidewords in page headers when at the top of a page. To avoid this,</w:t>
+      </w:r>
+      <w:r>
+        <w:t xml:space="preserve"> </w:t>
+      </w:r>
+      <w:r>
+        <w:t xml:space="preserve">click </w:t>
+      </w:r>
+      <w:r>
+        <w:t xml:space="preserve">to the right of the Letter Heading </w:t>
+      </w:r>
+      <w:r>
+        <w:t>p</w:t>
+      </w:r>
+      <w:r>
+        <w:t>aragraph marker</w:t>
+      </w:r>
+      <w:r>
+        <w:t xml:space="preserve"> </w:t>
+      </w:r>
+      <w:r>
+        <w:t xml:space="preserve">(or left if RTL) </w:t>
+      </w:r>
+      <w:r>
+        <w:t xml:space="preserve">and use </w:t>
+      </w:r>
+      <w:proofErr w:type="spellStart"/>
+      <w:r>
+        <w:t>Ctrl+Space</w:t>
+      </w:r>
+      <w:proofErr w:type="spellEnd"/>
+      <w:r>
+        <w:t xml:space="preserve"> </w:t>
+      </w:r>
+      <w:r>
+        <w:t>to</w:t>
+      </w:r>
+      <w:r>
+        <w:t xml:space="preserve"> clear </w:t>
+      </w:r>
+      <w:r>
+        <w:t>the</w:t>
+      </w:r>
+      <w:r>
+        <w:t xml:space="preserve"> Headword</w:t>
+      </w:r>
+      <w:r>
+        <w:t xml:space="preserve"> </w:t>
+      </w:r>
+      <w:r>
+        <w:t>style, leaving it set to Main Entry.</w:t>
+      </w:r>
+    </w:p>
+    <w:p>
+      <w:pPr>
+        <w:pStyle w:val="BodyText"/>
+      </w:pPr>
+      <w:r>
+        <w:t xml:space="preserve">If </w:t>
+      </w:r>
+      <w:r>
+        <w:t>a</w:t>
+      </w:r>
+      <w:r>
+        <w:t xml:space="preserve"> letter </w:t>
+      </w:r>
+      <w:r>
+        <w:t>heading</w:t>
+      </w:r>
+      <w:r>
+        <w:t xml:space="preserve"> occur</w:t>
+      </w:r>
+      <w:r>
+        <w:t>s</w:t>
+      </w:r>
+      <w:r>
+        <w:t xml:space="preserve"> at the bottom of a page, you can insert </w:t>
+      </w:r>
+      <w:proofErr w:type="spellStart"/>
+      <w:r>
+        <w:t>Shift+Returns</w:t>
+      </w:r>
+      <w:proofErr w:type="spellEnd"/>
+      <w:r>
+        <w:t xml:space="preserve"> to push the letter </w:t>
+      </w:r>
+      <w:r>
+        <w:t xml:space="preserve">heading </w:t>
+      </w:r>
+      <w:r>
+        <w:t xml:space="preserve">to the top of the next page. Word does pretty well at repositioning letter </w:t>
+      </w:r>
+      <w:r>
+        <w:t>heading</w:t>
+      </w:r>
+      <w:r>
+        <w:t>s</w:t>
+      </w:r>
+      <w:r>
+        <w:t xml:space="preserve"> </w:t>
+      </w:r>
+      <w:r>
+        <w:t xml:space="preserve">when you make changes earlier in the document. If things get too bad, it may </w:t>
+      </w:r>
+      <w:r>
+        <w:t>be easiest</w:t>
+      </w:r>
+      <w:r>
+        <w:t xml:space="preserve"> to remove the </w:t>
+      </w:r>
+      <w:r>
+        <w:t>let</w:t>
+      </w:r>
+      <w:r>
+        <w:t>t</w:t>
+      </w:r>
+      <w:r>
+        <w:t xml:space="preserve">er </w:t>
+      </w:r>
+      <w:r>
+        <w:t xml:space="preserve">heading </w:t>
+      </w:r>
+      <w:r>
+        <w:t xml:space="preserve">section breaks and then go through the process of resetting the letter </w:t>
+      </w:r>
+      <w:r>
+        <w:t>heading</w:t>
+      </w:r>
+      <w:r>
+        <w:t>s</w:t>
+      </w:r>
+      <w:r>
+        <w:t xml:space="preserve"> </w:t>
+      </w:r>
+      <w:r>
+        <w:t xml:space="preserve">again. </w:t>
+      </w:r>
+      <w:r>
+        <w:t xml:space="preserve">To remove the section break, click to the right of the Letter Heading paragraph marker and press Delete. </w:t>
+      </w:r>
+      <w:r>
+        <w:t>Someone who does this a lot may benefit in setting up a Word macro to do it in one step.</w:t>
+      </w:r>
+    </w:p>
+    <w:p>
+      <w:pPr>
+        <w:pStyle w:val="Heading3"/>
+      </w:pPr>
+      <w:bookmarkStart w:id="19" w:name="_Ref143764487"/>
+      <w:bookmarkStart w:id="20" w:name="_Toc196376617"/>
+      <w:r>
+        <w:t>Pictures in Word</w:t>
+      </w:r>
+      <w:bookmarkEnd w:id="20"/>
+    </w:p>
+    <w:p>
+      <w:pPr>
+        <w:pStyle w:val="BodyText"/>
+      </w:pPr>
+      <w:r>
+        <w:t xml:space="preserve">This </w:t>
+      </w:r>
+      <w:r>
+        <w:t xml:space="preserve">section documents </w:t>
+      </w:r>
+      <w:r>
+        <w:t>processing pictures</w:t>
+      </w:r>
+      <w:r>
+        <w:t xml:space="preserve"> in Word starting with </w:t>
+      </w:r>
+      <w:r>
+        <w:t xml:space="preserve">FieldWorks </w:t>
+      </w:r>
+      <w:r>
+        <w:t>9.2.7</w:t>
+      </w:r>
+      <w:r>
+        <w:t xml:space="preserve"> which provide</w:t>
+      </w:r>
+      <w:r>
+        <w:t>d</w:t>
+      </w:r>
+      <w:r>
+        <w:t xml:space="preserve"> improved support for printing pictures</w:t>
+      </w:r>
+      <w:r>
+        <w:t>.</w:t>
+      </w:r>
+    </w:p>
+    <w:p>
+      <w:pPr>
+        <w:pStyle w:val="BodyText"/>
+      </w:pPr>
+      <w:r>
+        <w:t xml:space="preserve">The Pictures nodes under FLEx </w:t>
+      </w:r>
+      <w:r>
+        <w:t xml:space="preserve">Dictionary Configuration </w:t>
+      </w:r>
+      <w:r>
+        <w:t xml:space="preserve">now provide options </w:t>
+      </w:r>
+      <w:r>
+        <w:t>to specify</w:t>
+      </w:r>
+      <w:r>
+        <w:t xml:space="preserve"> picture location (left, center, right) with the caption always centered under it, and maximum width and height for pictures. </w:t>
+      </w:r>
+      <w:r>
+        <w:t xml:space="preserve">The defaults are </w:t>
+      </w:r>
+      <w:r>
+        <w:t>right aligned with</w:t>
+      </w:r>
+      <w:r>
+        <w:t xml:space="preserve"> 1” maximum width and height. </w:t>
+      </w:r>
+      <w:r>
+        <w:t xml:space="preserve">Any </w:t>
+      </w:r>
+      <w:r>
+        <w:lastRenderedPageBreak/>
+        <w:t xml:space="preserve">Pictures node will affect all pictures in the dictionary for this view. </w:t>
+      </w:r>
+      <w:r>
+        <w:t>Pictures will not be enlarged beyond their resolution, but if they are too big, they will be reduced, maintaining aspect ratio, until they do not exceed the two maximum values.</w:t>
+      </w:r>
+      <w:r>
+        <w:t xml:space="preserve"> These settings will be applied to all of the pictures in the dictionary. In Word, you can make </w:t>
+      </w:r>
+      <w:r>
+        <w:t>individual</w:t>
+      </w:r>
+      <w:r>
+        <w:t xml:space="preserve"> adjustments to location and size</w:t>
+      </w:r>
+      <w:r>
+        <w:t>,</w:t>
+      </w:r>
+      <w:r>
+        <w:t xml:space="preserve"> if </w:t>
+      </w:r>
+      <w:r>
+        <w:t>needed</w:t>
+      </w:r>
+      <w:r>
+        <w:t>.</w:t>
+      </w:r>
+    </w:p>
+    <w:p>
+      <w:pPr>
+        <w:pStyle w:val="BodyText"/>
+      </w:pPr>
+      <w:r>
+        <w:t>Pictures or illustrations in a Word document exported from FLEx normally have two paragraphs.</w:t>
+      </w:r>
+    </w:p>
+    <w:p>
+      <w:pPr>
+        <w:pStyle w:val="BodyText"/>
+      </w:pPr>
+      <w:r>
+        <w:t>The picture is in a paragraph with</w:t>
+      </w:r>
+      <w:r>
+        <w:t xml:space="preserve"> a </w:t>
+      </w:r>
+      <w:r>
+        <w:t>“</w:t>
+      </w:r>
+      <w:r>
+        <w:t>Picture</w:t>
+      </w:r>
+      <w:r>
+        <w:t xml:space="preserve"> </w:t>
+      </w:r>
       <w:proofErr w:type="gramStart"/>
       <w:r>
-        <w:t>Headword[</w:t>
+        <w:t>And</w:t>
       </w:r>
       <w:proofErr w:type="gramEnd"/>
       <w:r>
-        <w:t>]</w:t>
-      </w:r>
-      <w:r>
-        <w:t xml:space="preserve"> style. This </w:t>
-      </w:r>
-      <w:r>
-        <w:t>will</w:t>
-      </w:r>
-      <w:r>
-        <w:t xml:space="preserve"> cause a problem with </w:t>
-      </w:r>
-      <w:r>
-        <w:t>guidewords in page headers when at the top of a page. To avoid this,</w:t>
-      </w:r>
-      <w:r>
-        <w:t xml:space="preserve"> </w:t>
-      </w:r>
-      <w:r>
-        <w:t xml:space="preserve">click </w:t>
-      </w:r>
-      <w:r>
-        <w:t xml:space="preserve">to the right of the Letter Heading </w:t>
-      </w:r>
-      <w:r>
-        <w:t>p</w:t>
-      </w:r>
-      <w:r>
-        <w:t>aragraph marker</w:t>
-      </w:r>
-      <w:r>
-        <w:t xml:space="preserve"> </w:t>
-      </w:r>
-      <w:r>
-        <w:t xml:space="preserve">(or left if RTL) </w:t>
-      </w:r>
-      <w:r>
-        <w:t xml:space="preserve">and use </w:t>
-      </w:r>
-      <w:proofErr w:type="spellStart"/>
-      <w:r>
-        <w:t>Ctrl+Space</w:t>
-      </w:r>
-      <w:proofErr w:type="spellEnd"/>
-      <w:r>
-        <w:t xml:space="preserve"> </w:t>
-      </w:r>
-      <w:r>
-        <w:t>to</w:t>
-      </w:r>
-      <w:r>
-        <w:t xml:space="preserve"> clear </w:t>
-      </w:r>
-      <w:r>
-        <w:t>the</w:t>
-      </w:r>
-      <w:r>
-        <w:t xml:space="preserve"> Headword[]style, leaving it set to Main Entry.</w:t>
-      </w:r>
-    </w:p>
-    <w:p>
-      <w:pPr>
-        <w:pStyle w:val="BodyText"/>
-      </w:pPr>
-      <w:r>
-        <w:t xml:space="preserve">If </w:t>
-      </w:r>
-      <w:r>
-        <w:t>a</w:t>
-      </w:r>
-      <w:r>
-        <w:t xml:space="preserve"> letter </w:t>
-      </w:r>
-      <w:r>
-        <w:t>heading</w:t>
-      </w:r>
-      <w:r>
-        <w:t xml:space="preserve"> occur</w:t>
-      </w:r>
-      <w:r>
-        <w:t>s</w:t>
-      </w:r>
-      <w:r>
-        <w:t xml:space="preserve"> at the bottom of a page, you can insert </w:t>
-      </w:r>
-      <w:proofErr w:type="spellStart"/>
-      <w:r>
-        <w:t>Shift+Returns</w:t>
-      </w:r>
-      <w:proofErr w:type="spellEnd"/>
-      <w:r>
-        <w:t xml:space="preserve"> to push the letter </w:t>
-      </w:r>
-      <w:r>
-        <w:t xml:space="preserve">heading </w:t>
-      </w:r>
-      <w:r>
-        <w:t xml:space="preserve">to the top of the next page. Word does pretty well at repositioning letter </w:t>
-      </w:r>
-      <w:r>
-        <w:t>heading</w:t>
-      </w:r>
-      <w:r>
-        <w:t>s</w:t>
-      </w:r>
-      <w:r>
-        <w:t xml:space="preserve"> </w:t>
-      </w:r>
-      <w:r>
-        <w:t xml:space="preserve">when you make changes earlier in the document. If things get too bad, it may </w:t>
-      </w:r>
-      <w:r>
-        <w:t>be easiest</w:t>
-      </w:r>
-      <w:r>
-        <w:t xml:space="preserve"> to remove the </w:t>
-      </w:r>
-      <w:r>
-        <w:t>let</w:t>
-      </w:r>
-      <w:r>
-        <w:t>t</w:t>
-      </w:r>
-      <w:r>
-        <w:t xml:space="preserve">er </w:t>
-      </w:r>
-      <w:r>
-        <w:t xml:space="preserve">heading </w:t>
-      </w:r>
-      <w:r>
-        <w:t xml:space="preserve">section breaks and then go through the process of resetting the letter </w:t>
-      </w:r>
-      <w:r>
-        <w:t>heading</w:t>
-      </w:r>
-      <w:r>
-        <w:t>s</w:t>
-      </w:r>
-      <w:r>
-        <w:t xml:space="preserve"> </w:t>
-      </w:r>
-      <w:r>
-        <w:t xml:space="preserve">again. </w:t>
-      </w:r>
-      <w:r>
-        <w:t xml:space="preserve">To remove the section break, click to the right of the Letter Heading paragraph marker and press Delete. </w:t>
-      </w:r>
-      <w:r>
-        <w:t>Someone who does this a lot may benefit in setting up a Word macro to do it in one step.</w:t>
-      </w:r>
-    </w:p>
-    <w:p>
-      <w:pPr>
-        <w:pStyle w:val="Heading3"/>
-      </w:pPr>
-      <w:bookmarkStart w:id="19" w:name="_Ref143764487"/>
-      <w:bookmarkStart w:id="20" w:name="_Toc193439766"/>
-      <w:r>
-        <w:lastRenderedPageBreak/>
-        <w:t>Pictures in Word</w:t>
-      </w:r>
-      <w:bookmarkEnd w:id="20"/>
-    </w:p>
-    <w:p>
-      <w:pPr>
-        <w:pStyle w:val="BodyText"/>
-      </w:pPr>
-      <w:r>
-        <w:t xml:space="preserve">This </w:t>
-      </w:r>
-      <w:r>
-        <w:t xml:space="preserve">section documents </w:t>
-      </w:r>
-      <w:r>
-        <w:t>processing pictures</w:t>
-      </w:r>
-      <w:r>
-        <w:t xml:space="preserve"> in Word starting with </w:t>
-      </w:r>
-      <w:r>
-        <w:t xml:space="preserve">FieldWorks </w:t>
-      </w:r>
-      <w:r>
-        <w:t>9.2.7</w:t>
-      </w:r>
-      <w:r>
-        <w:t xml:space="preserve"> which provide</w:t>
-      </w:r>
-      <w:r>
-        <w:t>d</w:t>
-      </w:r>
-      <w:r>
-        <w:t xml:space="preserve"> improved support for printing pictures</w:t>
-      </w:r>
-      <w:r>
-        <w:t>.</w:t>
-      </w:r>
-      <w:r>
-        <w:t xml:space="preserve"> </w:t>
-      </w:r>
-      <w:r>
-        <w:t xml:space="preserve">The Pictures nodes under FLEx </w:t>
-      </w:r>
-      <w:r>
-        <w:t xml:space="preserve">Dictionary Configuration </w:t>
-      </w:r>
-      <w:r>
-        <w:t xml:space="preserve">now provide options </w:t>
-      </w:r>
-      <w:r>
-        <w:t>to specify</w:t>
-      </w:r>
-      <w:r>
-        <w:t xml:space="preserve"> picture location (left, center, right) with the caption always centered under it, and maximum width and height for pictures. </w:t>
-      </w:r>
-      <w:r>
-        <w:t xml:space="preserve">The defaults are </w:t>
-      </w:r>
-      <w:r>
-        <w:t>right aligned with</w:t>
-      </w:r>
-      <w:r>
-        <w:t xml:space="preserve"> 1” maximum width and height. </w:t>
-      </w:r>
-      <w:r>
-        <w:t xml:space="preserve">Any Pictures node will affect all pictures in the dictionary for this view. </w:t>
-      </w:r>
-      <w:r>
-        <w:t>Pictures will not be enlarged beyond their resolution, but if they are too big, they will be reduced, maintaining aspect ratio, until they do not exceed the two maximum values.</w:t>
-      </w:r>
-      <w:r>
-        <w:t xml:space="preserve"> These settings will be applied to all of the pictures in the dictionary. In Word, you can make </w:t>
-      </w:r>
-      <w:r>
-        <w:t>individual</w:t>
-      </w:r>
-      <w:r>
-        <w:t xml:space="preserve"> adjustments to location and size</w:t>
-      </w:r>
-      <w:r>
-        <w:t>,</w:t>
-      </w:r>
-      <w:r>
-        <w:t xml:space="preserve"> if </w:t>
-      </w:r>
-      <w:r>
-        <w:t>needed</w:t>
-      </w:r>
-      <w:r>
-        <w:t>.</w:t>
-      </w:r>
-    </w:p>
-    <w:p>
-      <w:pPr>
-        <w:pStyle w:val="BodyText"/>
-      </w:pPr>
-      <w:r>
-        <w:t>Pictures or illustrations in a Word document exported from FLEx normally have two paragraphs.</w:t>
-      </w:r>
-    </w:p>
-    <w:p>
-      <w:pPr>
-        <w:pStyle w:val="BodyText"/>
-      </w:pPr>
-      <w:r>
-        <w:t>The picture is in a paragraph with</w:t>
-      </w:r>
-      <w:r>
-        <w:t xml:space="preserve"> an </w:t>
-      </w:r>
-      <w:r>
-        <w:t>“</w:t>
-      </w:r>
-      <w:r>
-        <w:t>Image-</w:t>
-      </w:r>
-      <w:proofErr w:type="spellStart"/>
-      <w:r>
-        <w:t>Textframe</w:t>
-      </w:r>
-      <w:proofErr w:type="spellEnd"/>
-      <w:r>
-        <w:t>-Style</w:t>
-      </w:r>
-      <w:r>
-        <w:t>”</w:t>
+        <w:t xml:space="preserve"> Caption”</w:t>
       </w:r>
       <w:r>
         <w:t xml:space="preserve"> paragraph style.</w:t>
@@ -6568,27 +6845,24 @@
         <w:t xml:space="preserve">, also </w:t>
       </w:r>
       <w:r>
-        <w:t xml:space="preserve">with an </w:t>
-      </w:r>
-      <w:r>
-        <w:t>“</w:t>
-      </w:r>
-      <w:r>
-        <w:t>Image-</w:t>
-      </w:r>
-      <w:proofErr w:type="spellStart"/>
-      <w:r>
-        <w:t>Textframe</w:t>
-      </w:r>
-      <w:proofErr w:type="spellEnd"/>
-      <w:r>
-        <w:t>-Style</w:t>
-      </w:r>
-      <w:r>
-        <w:t>”</w:t>
-      </w:r>
-      <w:r>
-        <w:t xml:space="preserve"> paragraph style.</w:t>
+        <w:t xml:space="preserve">with a </w:t>
+      </w:r>
+      <w:r>
+        <w:t xml:space="preserve">“Picture </w:t>
+      </w:r>
+      <w:proofErr w:type="gramStart"/>
+      <w:r>
+        <w:t>And</w:t>
+      </w:r>
+      <w:proofErr w:type="gramEnd"/>
+      <w:r>
+        <w:t xml:space="preserve"> Caption”</w:t>
+      </w:r>
+      <w:r>
+        <w:t xml:space="preserve"> </w:t>
+      </w:r>
+      <w:r>
+        <w:t>paragraph style.</w:t>
       </w:r>
       <w:r>
         <w:t xml:space="preserve"> The parts of the caption have </w:t>
@@ -6600,13 +6874,11 @@
         <w:t xml:space="preserve">styles for </w:t>
       </w:r>
       <w:r>
-        <w:t xml:space="preserve">Caption, Creator, Copyright &amp; License, </w:t>
-      </w:r>
-      <w:proofErr w:type="spellStart"/>
-      <w:r>
-        <w:t>etc</w:t>
-      </w:r>
-      <w:proofErr w:type="spellEnd"/>
+        <w:t>Caption, Creator, Copyright &amp; License, etc</w:t>
+      </w:r>
+      <w:r>
+        <w:t>.</w:t>
+      </w:r>
       <w:r>
         <w:t xml:space="preserve"> that can be specified in FLEx</w:t>
       </w:r>
@@ -6629,8 +6901,8 @@
           <w:noProof/>
         </w:rPr>
         <w:drawing>
-          <wp:inline distT="0" distB="0" distL="0" distR="0" wp14:anchorId="04B5FFF8" wp14:editId="0D663430">
-            <wp:extent cx="1290098" cy="1343025"/>
+          <wp:inline distT="0" distB="0" distL="0" distR="0" wp14:anchorId="04B5FFF8" wp14:editId="46009866">
+            <wp:extent cx="1289685" cy="1342595"/>
             <wp:effectExtent l="0" t="0" r="5715" b="0"/>
             <wp:docPr id="21" name="Picture 21"/>
             <wp:cNvGraphicFramePr>
@@ -6652,7 +6924,7 @@
                   <pic:spPr>
                     <a:xfrm>
                       <a:off x="0" y="0"/>
-                      <a:ext cx="1290098" cy="1343025"/>
+                      <a:ext cx="1293903" cy="1346986"/>
                     </a:xfrm>
                     <a:prstGeom prst="rect">
                       <a:avLst/>
@@ -6670,7 +6942,19 @@
         <w:pStyle w:val="BodyText"/>
       </w:pPr>
       <w:r>
-        <w:t>When the textbox is highlighted, you can click the border and drag the textbox to a new location if desired. The picture and caption will move together inside the textbox.</w:t>
+        <w:t xml:space="preserve">If you want to </w:t>
+      </w:r>
+      <w:r>
+        <w:t>move</w:t>
+      </w:r>
+      <w:r>
+        <w:t xml:space="preserve"> </w:t>
+      </w:r>
+      <w:r>
+        <w:t>a</w:t>
+      </w:r>
+      <w:r>
+        <w:t xml:space="preserve"> picture, when the textbox is highlighted, you can click the border and drag the textbox to a new location. The picture and caption will move together inside the textbox.</w:t>
       </w:r>
     </w:p>
     <w:p>
@@ -6678,22 +6962,26 @@
         <w:pStyle w:val="BodyText"/>
       </w:pPr>
       <w:r>
-        <w:t xml:space="preserve">If you want to change the layout, you can right-click the textbox border and choose </w:t>
-      </w:r>
-      <w:r>
-        <w:t>“</w:t>
-      </w:r>
-      <w:r>
-        <w:t>More Layout Options</w:t>
-      </w:r>
-      <w:r>
-        <w:t>”</w:t>
-      </w:r>
-      <w:r>
-        <w:t xml:space="preserve">. </w:t>
-      </w:r>
-      <w:r>
-        <w:t>The Horizontal Alignment is set to Left, Centered, or Right based on the configuration set in FLEx. Once in Word, you can change any of these settings on individual textboxes.</w:t>
+        <w:t>The textbox has a “</w:t>
+      </w:r>
+      <w:proofErr w:type="spellStart"/>
+      <w:r>
+        <w:t>Pictureframe</w:t>
+      </w:r>
+      <w:proofErr w:type="spellEnd"/>
+      <w:r>
+        <w:t xml:space="preserve"> Textbox” paragraph style. In Word you can modify Frame property in various ways, such as Position, Text wrapping, etc. Changes to this style will affect all of the pictures in your dictionary.</w:t>
+      </w:r>
+      <w:r>
+        <w:t xml:space="preserve"> If you need to position some pictures left and others right, it should be possible to create a “</w:t>
+      </w:r>
+      <w:proofErr w:type="spellStart"/>
+      <w:r>
+        <w:t>Pictureframe</w:t>
+      </w:r>
+      <w:proofErr w:type="spellEnd"/>
+      <w:r>
+        <w:t xml:space="preserve"> Textbox2” style and format it differently.</w:t>
       </w:r>
     </w:p>
     <w:p>
@@ -6710,7 +6998,13 @@
         <w:t xml:space="preserve">in a single entry in a letter section, the picture will go to the right column instead of staying in the left column. </w:t>
       </w:r>
       <w:r>
-        <w:t xml:space="preserve">If you want to force the picture to be under the entry paragraph, you can drag the picture to position it in the </w:t>
+        <w:t xml:space="preserve">If you want to force the picture to be under the entry paragraph, you can drag the </w:t>
+      </w:r>
+      <w:r>
+        <w:t>textbox</w:t>
+      </w:r>
+      <w:r>
+        <w:t xml:space="preserve"> to position it in the </w:t>
       </w:r>
       <w:r>
         <w:t>first</w:t>
@@ -6736,18 +7030,15 @@
         <w:t>maintain</w:t>
       </w:r>
       <w:r>
-        <w:t xml:space="preserve"> the aspect ratio of the picture. If you drag a </w:t>
-      </w:r>
+        <w:t xml:space="preserve"> the aspect ratio of the picture. If you drag a circle in the middle of the line, you can change the aspect ratio. After changing the size of a picture, you may also need to change the size of the textbox. This is especially important if you try to expand the picture beyond the current textbox size.</w:t>
+      </w:r>
+    </w:p>
+    <w:p>
+      <w:pPr>
+        <w:pStyle w:val="BodyText"/>
+      </w:pPr>
       <w:r>
         <w:lastRenderedPageBreak/>
-        <w:t>circle in the middle of the line, you can change the aspect ratio. After changing the size of a picture, you may also need to change the size of the textbox. This is especially important if you try to expand the picture beyond the current textbox size.</w:t>
-      </w:r>
-    </w:p>
-    <w:p>
-      <w:pPr>
-        <w:pStyle w:val="BodyText"/>
-      </w:pPr>
-      <w:r>
         <w:t>In order to get a pleasing page layout with pictures, you may need to change the size, or drag the picture to a new location, or force an entry to a new column, etc.</w:t>
       </w:r>
     </w:p>
@@ -6755,7 +7046,7 @@
       <w:pPr>
         <w:pStyle w:val="Heading3"/>
       </w:pPr>
-      <w:bookmarkStart w:id="21" w:name="_Toc193439767"/>
+      <w:bookmarkStart w:id="21" w:name="_Toc196376618"/>
       <w:r>
         <w:t>Editing the internal Word docx file</w:t>
       </w:r>
@@ -6975,7 +7266,7 @@
       <w:pPr>
         <w:pStyle w:val="Heading3"/>
       </w:pPr>
-      <w:bookmarkStart w:id="22" w:name="_Toc193439768"/>
+      <w:bookmarkStart w:id="22" w:name="_Toc196376619"/>
       <w:r>
         <w:t>Dictionary f</w:t>
       </w:r>
@@ -6996,7 +7287,7 @@
       <w:pPr>
         <w:pStyle w:val="Heading1"/>
       </w:pPr>
-      <w:bookmarkStart w:id="23" w:name="_Toc193439769"/>
+      <w:bookmarkStart w:id="23" w:name="_Toc196376620"/>
       <w:r>
         <w:t>Useful features in Word</w:t>
       </w:r>
@@ -7008,7 +7299,7 @@
       </w:pPr>
       <w:bookmarkStart w:id="24" w:name="_Ref143252041"/>
       <w:bookmarkStart w:id="25" w:name="_Ref143252047"/>
-      <w:bookmarkStart w:id="26" w:name="_Toc193439770"/>
+      <w:bookmarkStart w:id="26" w:name="_Toc196376621"/>
       <w:r>
         <w:t xml:space="preserve">Basics of </w:t>
       </w:r>
@@ -7045,17 +7336,42 @@
         <w:t xml:space="preserve">font size, color, background color, </w:t>
       </w:r>
       <w:r>
-        <w:t xml:space="preserve">subscript, superscript, underlines, etc. The advantage of using </w:t>
-      </w:r>
+        <w:t>subscript, superscript, underlines, etc. The advantage of using styles is consistency and ease of use. By modifying a style, you will affect all of the places that style is used.</w:t>
+      </w:r>
+      <w:r>
+        <w:t xml:space="preserve"> </w:t>
+      </w:r>
+      <w:r>
+        <w:t>It’s generally much better making changes to styles than doing hard formatting in your document.</w:t>
+      </w:r>
+    </w:p>
+    <w:p>
+      <w:pPr>
+        <w:pStyle w:val="BodyText"/>
+      </w:pPr>
       <w:r>
         <w:lastRenderedPageBreak/>
-        <w:t>styles is consistency and ease of use. By modifying a style, you will affect all of the places that style is used.</w:t>
-      </w:r>
-      <w:r>
-        <w:t xml:space="preserve"> </w:t>
-      </w:r>
-      <w:r>
-        <w:t>It’s generally much better making changes to styles than doing hard formatting in your document.</w:t>
+        <w:t xml:space="preserve">When working on the dictionary in Word, it’s very helpful to have the stylesheet open beside the document. If you don’t have the stylesheet open, you can open it with </w:t>
+      </w:r>
+      <w:proofErr w:type="spellStart"/>
+      <w:r>
+        <w:t>Alt+Ctrl+Shift+S</w:t>
+      </w:r>
+      <w:proofErr w:type="spellEnd"/>
+      <w:r>
+        <w:t xml:space="preserve">, or by clicking the button in the lower right of the Styles pane in the Home </w:t>
+      </w:r>
+      <w:r>
+        <w:t>tab</w:t>
+      </w:r>
+      <w:r>
+        <w:t xml:space="preserve">. Once open, when you click </w:t>
+      </w:r>
+      <w:r>
+        <w:t xml:space="preserve">in </w:t>
+      </w:r>
+      <w:r>
+        <w:t>a word in the dictionary, the associated style is selected in the style sheet.</w:t>
       </w:r>
     </w:p>
     <w:p>
@@ -7063,27 +7379,7 @@
         <w:pStyle w:val="BodyText"/>
       </w:pPr>
       <w:r>
-        <w:t xml:space="preserve">When working on the dictionary in Word, it’s very helpful to have the stylesheet open beside the document. If you don’t have the stylesheet open, you can open it with </w:t>
-      </w:r>
-      <w:proofErr w:type="spellStart"/>
-      <w:r>
-        <w:t>Alt+Ctrl+Shift+S</w:t>
-      </w:r>
-      <w:proofErr w:type="spellEnd"/>
-      <w:r>
-        <w:t xml:space="preserve">, or by clicking the button in the lower right of the Styles pane in the Home </w:t>
-      </w:r>
-      <w:r>
-        <w:t>tab</w:t>
-      </w:r>
-      <w:r>
-        <w:t xml:space="preserve">. Once open, when you click </w:t>
-      </w:r>
-      <w:r>
-        <w:t xml:space="preserve">in </w:t>
-      </w:r>
-      <w:r>
-        <w:t>a word in the dictionary, the associated style is selected in the style sheet.</w:t>
+        <w:t>Word offers a Reveal Formatting pane by using Shift+F1. In addition to showing the style sheet with names, this shows details of the formatting of the selected style.</w:t>
       </w:r>
     </w:p>
     <w:p>
@@ -7091,7 +7387,19 @@
         <w:pStyle w:val="BodyText"/>
       </w:pPr>
       <w:r>
-        <w:t>Word offers a Reveal Formatting pane by using Shift+F1. In addition to showing the style sheet with names, this shows details of the formatting of the selected style.</w:t>
+        <w:t>If you are interested in Paragraph styles instead of character styles, it works best to have paragraph marks displayed in your document. This is controlled in File</w:t>
+      </w:r>
+      <w:r>
+        <w:t xml:space="preserve"> &gt; </w:t>
+      </w:r>
+      <w:r>
+        <w:t>Options</w:t>
+      </w:r>
+      <w:r>
+        <w:t xml:space="preserve"> &gt; </w:t>
+      </w:r>
+      <w:r>
+        <w:t>Display. With paragraph marks showing, you can select just the paragraph mark, and then the stylesheet will select that paragraph style.</w:t>
       </w:r>
     </w:p>
     <w:p>
@@ -7099,19 +7407,13 @@
         <w:pStyle w:val="BodyText"/>
       </w:pPr>
       <w:r>
-        <w:t>If you are interested in Paragraph styles instead of character styles, it works best to have paragraph marks displayed in your document. This is controlled in File</w:t>
-      </w:r>
-      <w:r>
-        <w:t xml:space="preserve"> &gt; </w:t>
-      </w:r>
-      <w:r>
-        <w:t>Options</w:t>
-      </w:r>
-      <w:r>
-        <w:t xml:space="preserve"> &gt; </w:t>
-      </w:r>
-      <w:r>
-        <w:t>Display. With paragraph marks showing, you can select just the paragraph mark, and then the stylesheet will select that paragraph style.</w:t>
+        <w:t xml:space="preserve">A style is applied by selecting the target text, then clicking the style in the style sheet. Paragraph styles can be applied by clicking the style from anywhere in the paragraph. Paragraph </w:t>
+      </w:r>
+      <w:r>
+        <w:t xml:space="preserve">styles </w:t>
+      </w:r>
+      <w:r>
+        <w:t>also contain character formatting that will be applied to any text in the paragraph that is not controlled by some other character style.</w:t>
       </w:r>
     </w:p>
     <w:p>
@@ -7119,13 +7421,31 @@
         <w:pStyle w:val="BodyText"/>
       </w:pPr>
       <w:r>
-        <w:t xml:space="preserve">A style is applied by selecting the target text, then clicking the style in the style sheet. Paragraph styles can be applied by clicking the style from anywhere in the paragraph. Paragraph </w:t>
-      </w:r>
-      <w:r>
-        <w:t xml:space="preserve">styles </w:t>
-      </w:r>
-      <w:r>
-        <w:t>also contain character formatting that will be applied to any text in the paragraph that is not controlled by some other character style.</w:t>
+        <w:t xml:space="preserve">To modify a style, from the stylesheet, right-click the style and choose Modify. </w:t>
+      </w:r>
+      <w:r>
+        <w:t xml:space="preserve">Alternately, you can move the mouse to the right of the style in the stylesheet and click the triangle menu button. </w:t>
+      </w:r>
+      <w:r>
+        <w:t>This brings up the Modify Style dialog where you can change the name and basic characteristics of the style. For more complete cont</w:t>
+      </w:r>
+      <w:r>
+        <w:t>r</w:t>
+      </w:r>
+      <w:r>
+        <w:t>ol, you can cli</w:t>
+      </w:r>
+      <w:r>
+        <w:t>c</w:t>
+      </w:r>
+      <w:r>
+        <w:t>k the Fo</w:t>
+      </w:r>
+      <w:r>
+        <w:t>r</w:t>
+      </w:r>
+      <w:r>
+        <w:t>mat menu in the lower left, then choose Font, Paragraph, Tabs, etc., to view and modify more specific features in the style. When you click OK to the Modify Style dialog, all text using that style will update to the new style.</w:t>
       </w:r>
     </w:p>
     <w:p>
@@ -7133,38 +7453,6 @@
         <w:pStyle w:val="BodyText"/>
       </w:pPr>
       <w:r>
-        <w:t xml:space="preserve">To modify a style, from the stylesheet, right-click the style and choose Modify. </w:t>
-      </w:r>
-      <w:r>
-        <w:t xml:space="preserve">Alternately, you can move the mouse to the right of the style in the stylesheet and click the triangle menu button. </w:t>
-      </w:r>
-      <w:r>
-        <w:t>This brings up the Modify Style dialog where you can change the name and basic characteristics of the style. For more complete cont</w:t>
-      </w:r>
-      <w:r>
-        <w:t>r</w:t>
-      </w:r>
-      <w:r>
-        <w:t>ol, you can cli</w:t>
-      </w:r>
-      <w:r>
-        <w:t>c</w:t>
-      </w:r>
-      <w:r>
-        <w:t>k the Fo</w:t>
-      </w:r>
-      <w:r>
-        <w:t>r</w:t>
-      </w:r>
-      <w:r>
-        <w:t>mat menu in the lower left, then choose Font, Paragraph, Tabs, etc., to view and modify more specific features in the style. When you click OK to the Modify Style dialog, all text using that style will update to the new style.</w:t>
-      </w:r>
-    </w:p>
-    <w:p>
-      <w:pPr>
-        <w:pStyle w:val="BodyText"/>
-      </w:pPr>
-      <w:r>
         <w:t xml:space="preserve">To Find out how many places a style is used in your document, right-click the style in the style sheet </w:t>
       </w:r>
       <w:proofErr w:type="gramStart"/>
@@ -7189,7 +7477,7 @@
       <w:pPr>
         <w:pStyle w:val="Heading2"/>
       </w:pPr>
-      <w:bookmarkStart w:id="27" w:name="_Toc193439771"/>
+      <w:bookmarkStart w:id="27" w:name="_Toc196376622"/>
       <w:r>
         <w:t>Preventing styles from changing: dynamic updating</w:t>
       </w:r>
@@ -7322,7 +7610,7 @@
         <w:pStyle w:val="Heading2"/>
       </w:pPr>
       <w:bookmarkStart w:id="28" w:name="_Ref143252360"/>
-      <w:bookmarkStart w:id="29" w:name="_Toc193439772"/>
+      <w:bookmarkStart w:id="29" w:name="_Toc196376623"/>
       <w:r>
         <w:lastRenderedPageBreak/>
         <w:t>Advanced Find and Replace</w:t>
@@ -7422,7 +7710,7 @@
       <w:r>
         <w:fldChar w:fldCharType="separate"/>
       </w:r>
-      <w:bookmarkStart w:id="31" w:name="_Toc193439773"/>
+      <w:bookmarkStart w:id="31" w:name="_Toc196376624"/>
       <w:r>
         <w:rPr>
           <w:cs/>
@@ -7499,7 +7787,7 @@
         <w:pStyle w:val="Heading3"/>
       </w:pPr>
       <w:bookmarkStart w:id="32" w:name="_Ref143765894"/>
-      <w:bookmarkStart w:id="33" w:name="_Toc193439774"/>
+      <w:bookmarkStart w:id="33" w:name="_Toc196376625"/>
       <w:r>
         <w:t>Replacing styles</w:t>
       </w:r>
@@ -7526,18 +7814,10 @@
         <w:t xml:space="preserve"> </w:t>
       </w:r>
       <w:r>
-        <w:t xml:space="preserve">if your file has minor entry headwords set to a style other than </w:t>
-      </w:r>
-      <w:proofErr w:type="gramStart"/>
-      <w:r>
-        <w:t>Headword[</w:t>
-      </w:r>
-      <w:proofErr w:type="gramEnd"/>
-      <w:r>
-        <w:t xml:space="preserve">], </w:t>
-      </w:r>
-      <w:r>
-        <w:t>and you want to use Headword[] as the style for page header guidewords, you will probably want to change the current style to Headword[].</w:t>
+        <w:t xml:space="preserve">if your file has minor entry headwords set to a style other than Headword, </w:t>
+      </w:r>
+      <w:r>
+        <w:t>and you want to use Headword as the style for page header guidewords, you will probably want to change the current style to Headword.</w:t>
       </w:r>
     </w:p>
     <w:p>
@@ -7595,7 +7875,7 @@
       <w:pPr>
         <w:pStyle w:val="Heading3"/>
       </w:pPr>
-      <w:bookmarkStart w:id="34" w:name="_Toc193439775"/>
+      <w:bookmarkStart w:id="34" w:name="_Toc196376626"/>
       <w:r>
         <w:t>Special codes</w:t>
       </w:r>
@@ -9141,7 +9421,7 @@
       <w:pPr>
         <w:pStyle w:val="Heading3"/>
       </w:pPr>
-      <w:bookmarkStart w:id="35" w:name="_Toc193439776"/>
+      <w:bookmarkStart w:id="35" w:name="_Toc196376627"/>
       <w:r>
         <w:t>Wild cards</w:t>
       </w:r>
@@ -11580,7 +11860,7 @@
         <w:pStyle w:val="Heading3"/>
       </w:pPr>
       <w:bookmarkStart w:id="36" w:name="_Ref143765840"/>
-      <w:bookmarkStart w:id="37" w:name="_Toc193439777"/>
+      <w:bookmarkStart w:id="37" w:name="_Toc196376628"/>
       <w:r>
         <w:t>Adding text before or after a style</w:t>
       </w:r>
@@ -11601,7 +11881,6 @@
         <w:t xml:space="preserve">Example </w:t>
       </w:r>
       <w:bookmarkStart w:id="38" w:name="_Hlk181692217"/>
-      <w:proofErr w:type="gramStart"/>
       <w:r>
         <w:t>Sentenc</w:t>
       </w:r>
@@ -11610,11 +11889,7 @@
       </w:r>
       <w:bookmarkEnd w:id="38"/>
       <w:r>
-        <w:t>[</w:t>
-      </w:r>
-      <w:proofErr w:type="gramEnd"/>
-      <w:r>
-        <w:t xml:space="preserve">] </w:t>
+        <w:t xml:space="preserve"> </w:t>
       </w:r>
       <w:r>
         <w:t xml:space="preserve">character style. Leave the Find box empty, and put </w:t>
@@ -11684,11 +11959,16 @@
       <w:r>
         <w:t xml:space="preserve">Example </w:t>
       </w:r>
-      <w:r>
-        <w:t xml:space="preserve">Sentence </w:t>
-      </w:r>
-      <w:r>
-        <w:t>[]</w:t>
+      <w:proofErr w:type="gramStart"/>
+      <w:r>
+        <w:t>Sentence</w:t>
+      </w:r>
+      <w:r>
+        <w:t>[</w:t>
+      </w:r>
+      <w:proofErr w:type="gramEnd"/>
+      <w:r>
+        <w:t>]</w:t>
       </w:r>
       <w:r>
         <w:t xml:space="preserve"> as the style, the Find operation will find and highlight the next example sentence text (everything in the </w:t>
@@ -11697,7 +11977,7 @@
         <w:t xml:space="preserve">Example </w:t>
       </w:r>
       <w:r>
-        <w:t xml:space="preserve">Sentence </w:t>
+        <w:t>Sentence</w:t>
       </w:r>
       <w:r>
         <w:t xml:space="preserve">[] </w:t>
@@ -11708,11 +11988,16 @@
       <w:r>
         <w:t xml:space="preserve">Example </w:t>
       </w:r>
-      <w:r>
-        <w:t xml:space="preserve">Sentence </w:t>
-      </w:r>
-      <w:r>
-        <w:t>[]</w:t>
+      <w:proofErr w:type="gramStart"/>
+      <w:r>
+        <w:t>Sentence</w:t>
+      </w:r>
+      <w:r>
+        <w:t>[</w:t>
+      </w:r>
+      <w:proofErr w:type="gramEnd"/>
+      <w:r>
+        <w:t>]</w:t>
       </w:r>
       <w:r>
         <w:t xml:space="preserve"> style for the output. The content will be a forced line break (</w:t>
@@ -11754,11 +12039,16 @@
       <w:r>
         <w:t xml:space="preserve">Example </w:t>
       </w:r>
-      <w:r>
-        <w:t xml:space="preserve">Sentence </w:t>
-      </w:r>
-      <w:r>
-        <w:t>[]</w:t>
+      <w:proofErr w:type="gramStart"/>
+      <w:r>
+        <w:t>Sentence</w:t>
+      </w:r>
+      <w:r>
+        <w:t>[</w:t>
+      </w:r>
+      <w:proofErr w:type="gramEnd"/>
+      <w:r>
+        <w:t>]</w:t>
       </w:r>
       <w:r>
         <w:t xml:space="preserve"> style. If that becomes a problem, it’s challenging getting rid of that. If you highlight the </w:t>
@@ -11807,11 +12097,16 @@
       <w:r>
         <w:t xml:space="preserve">Example </w:t>
       </w:r>
-      <w:r>
-        <w:t xml:space="preserve">Sentence </w:t>
-      </w:r>
-      <w:r>
-        <w:t>[]</w:t>
+      <w:proofErr w:type="gramStart"/>
+      <w:r>
+        <w:t>Sentence</w:t>
+      </w:r>
+      <w:r>
+        <w:t>[</w:t>
+      </w:r>
+      <w:proofErr w:type="gramEnd"/>
+      <w:r>
+        <w:t>]</w:t>
       </w:r>
       <w:r>
         <w:t xml:space="preserve"> style, and replace it with </w:t>
@@ -11864,7 +12159,7 @@
         <w:pStyle w:val="Heading2"/>
       </w:pPr>
       <w:bookmarkStart w:id="39" w:name="_Ref143785624"/>
-      <w:bookmarkStart w:id="40" w:name="_Toc193439778"/>
+      <w:bookmarkStart w:id="40" w:name="_Toc196376629"/>
       <w:r>
         <w:t>Removing unused styles in Word</w:t>
       </w:r>
@@ -12058,7 +12353,7 @@
         <w:pStyle w:val="Heading2"/>
       </w:pPr>
       <w:bookmarkStart w:id="41" w:name="_Ref144458109"/>
-      <w:bookmarkStart w:id="42" w:name="_Toc193439779"/>
+      <w:bookmarkStart w:id="42" w:name="_Toc196376630"/>
       <w:r>
         <w:t>Word</w:t>
       </w:r>
@@ -12206,7 +12501,7 @@
       </w:pPr>
       <w:bookmarkStart w:id="43" w:name="_Ref181708018"/>
       <w:bookmarkStart w:id="44" w:name="_Ref181711580"/>
-      <w:bookmarkStart w:id="45" w:name="_Toc193439780"/>
+      <w:bookmarkStart w:id="45" w:name="_Toc196376631"/>
       <w:r>
         <w:lastRenderedPageBreak/>
         <w:t>Example recording a macro and running it through your document</w:t>
@@ -13095,7 +13390,7 @@
         <w:pStyle w:val="Heading2"/>
       </w:pPr>
       <w:bookmarkStart w:id="47" w:name="_Ref143767417"/>
-      <w:bookmarkStart w:id="48" w:name="_Toc193439781"/>
+      <w:bookmarkStart w:id="48" w:name="_Toc196376632"/>
       <w:r>
         <w:t>Editing the internal Word docx file</w:t>
       </w:r>
@@ -13168,7 +13463,7 @@
       <w:pPr>
         <w:pStyle w:val="Heading1"/>
       </w:pPr>
-      <w:bookmarkStart w:id="49" w:name="_Toc193439782"/>
+      <w:bookmarkStart w:id="49" w:name="_Toc196376633"/>
       <w:r>
         <w:lastRenderedPageBreak/>
         <w:t>Bidirectional dictionaries in Word</w:t>
@@ -13344,7 +13639,7 @@
         <w:pStyle w:val="Heading2"/>
       </w:pPr>
       <w:bookmarkStart w:id="50" w:name="_Ref143851345"/>
-      <w:bookmarkStart w:id="51" w:name="_Toc193439783"/>
+      <w:bookmarkStart w:id="51" w:name="_Toc196376634"/>
       <w:r>
         <w:t>Enabling right-to-left publications in Word</w:t>
       </w:r>
@@ -13499,7 +13794,7 @@
       <w:pPr>
         <w:pStyle w:val="Heading2"/>
       </w:pPr>
-      <w:bookmarkStart w:id="52" w:name="_Toc193439784"/>
+      <w:bookmarkStart w:id="52" w:name="_Toc196376635"/>
       <w:r>
         <w:t xml:space="preserve">Basic </w:t>
       </w:r>
@@ -13529,7 +13824,7 @@
       <w:pPr>
         <w:pStyle w:val="Heading3"/>
       </w:pPr>
-      <w:bookmarkStart w:id="53" w:name="_Toc193439785"/>
+      <w:bookmarkStart w:id="53" w:name="_Toc196376636"/>
       <w:r>
         <w:t>Settings in FLEx</w:t>
       </w:r>
@@ -13614,7 +13909,7 @@
       <w:pPr>
         <w:pStyle w:val="Heading3"/>
       </w:pPr>
-      <w:bookmarkStart w:id="54" w:name="_Toc193439786"/>
+      <w:bookmarkStart w:id="54" w:name="_Toc196376637"/>
       <w:r>
         <w:t>Setting</w:t>
       </w:r>
@@ -13741,7 +14036,7 @@
         <w:pStyle w:val="Heading2"/>
       </w:pPr>
       <w:bookmarkStart w:id="55" w:name="_Ref143870637"/>
-      <w:bookmarkStart w:id="56" w:name="_Toc193439787"/>
+      <w:bookmarkStart w:id="56" w:name="_Toc196376638"/>
       <w:r>
         <w:t xml:space="preserve">Bidirectional </w:t>
       </w:r>
@@ -14931,7 +15226,7 @@
       </w:pPr>
       <w:bookmarkStart w:id="58" w:name="_Ref143865236"/>
       <w:bookmarkStart w:id="59" w:name="_Ref144371733"/>
-      <w:bookmarkStart w:id="60" w:name="_Toc193439788"/>
+      <w:bookmarkStart w:id="60" w:name="_Toc196376639"/>
       <w:r>
         <w:t xml:space="preserve">Formatting </w:t>
       </w:r>
@@ -16210,7 +16505,7 @@
       <w:rPr>
         <w:noProof/>
       </w:rPr>
-      <w:t>3/21/2025</w:t>
+      <w:t>4/23/2025</w:t>
     </w:r>
     <w:r>
       <w:fldChar w:fldCharType="end"/>
@@ -16257,7 +16552,7 @@
         <w:rStyle w:val="PageNumber"/>
         <w:noProof/>
       </w:rPr>
-      <w:t>3/21/2025</w:t>
+      <w:t>4/23/2025</w:t>
     </w:r>
     <w:r>
       <w:rPr>
@@ -19736,7 +20031,7 @@
 </file>
 
 <file path=customXml/itemProps1.xml><?xml version="1.0" encoding="utf-8"?>
-<ds:datastoreItem xmlns:ds="http://schemas.openxmlformats.org/officeDocument/2006/customXml" ds:itemID="{95B8B7C3-248D-4852-8D1E-BC23F949D7AC}">
+<ds:datastoreItem xmlns:ds="http://schemas.openxmlformats.org/officeDocument/2006/customXml" ds:itemID="{81B74683-400C-4525-A85B-89CBDC71A865}">
   <ds:schemaRefs>
     <ds:schemaRef ds:uri="http://schemas.openxmlformats.org/officeDocument/2006/bibliography"/>
   </ds:schemaRefs>

</xml_diff>

<commit_message>
Update Flex export to Word doc
Made a few updates for FW9.2.9

Change-Id: I2d8825178817f1b084d34e4fdf4c24acbc02f69a
</commit_message>
<xml_diff>
--- a/HelpResourcesSources/TechnicalNotes/Publishing FLEx Dictionaries Using Microsoft Word.docx
+++ b/HelpResourcesSources/TechnicalNotes/Publishing FLEx Dictionaries Using Microsoft Word.docx
@@ -31,19 +31,7 @@
         <w:rPr>
           <w:szCs w:val="36"/>
         </w:rPr>
-        <w:t xml:space="preserve">April </w:t>
-      </w:r>
-      <w:r>
-        <w:rPr>
-          <w:szCs w:val="36"/>
-        </w:rPr>
-        <w:t>2</w:t>
-      </w:r>
-      <w:r>
-        <w:rPr>
-          <w:szCs w:val="36"/>
-        </w:rPr>
-        <w:t>4</w:t>
+        <w:t>June 2</w:t>
       </w:r>
       <w:r>
         <w:rPr>
@@ -272,7 +260,16 @@
             <w:rStyle w:val="Hyperlink"/>
             <w:noProof/>
           </w:rPr>
-          <w:t>Exporting a dictionary to Word</w:t>
+          <w:t>Exp</w:t>
+        </w:r>
+        <w:bookmarkStart w:id="1" w:name="_GoBack"/>
+        <w:bookmarkEnd w:id="1"/>
+        <w:r>
+          <w:rPr>
+            <w:rStyle w:val="Hyperlink"/>
+            <w:noProof/>
+          </w:rPr>
+          <w:t>orting a dictionary to Word</w:t>
         </w:r>
         <w:r>
           <w:rPr>
@@ -442,7 +439,35 @@
               </w14:lightRig>
             </w14:scene3d>
           </w:rPr>
-          <w:t>2.1.1</w:t>
+          <w:t>2.</w:t>
+        </w:r>
+        <w:r>
+          <w:rPr>
+            <w:rStyle w:val="Hyperlink"/>
+            <w:noProof/>
+            <w:lang w:bidi="x-none"/>
+            <w14:scene3d>
+              <w14:camera w14:prst="orthographicFront"/>
+              <w14:lightRig w14:rig="threePt" w14:dir="t">
+                <w14:rot w14:lat="0" w14:lon="0" w14:rev="0"/>
+              </w14:lightRig>
+            </w14:scene3d>
+          </w:rPr>
+          <w:t>1</w:t>
+        </w:r>
+        <w:r>
+          <w:rPr>
+            <w:rStyle w:val="Hyperlink"/>
+            <w:noProof/>
+            <w:lang w:bidi="x-none"/>
+            <w14:scene3d>
+              <w14:camera w14:prst="orthographicFront"/>
+              <w14:lightRig w14:rig="threePt" w14:dir="t">
+                <w14:rot w14:lat="0" w14:lon="0" w14:rev="0"/>
+              </w14:lightRig>
+            </w14:scene3d>
+          </w:rPr>
+          <w:t>.1</w:t>
         </w:r>
         <w:r>
           <w:rPr>
@@ -590,7 +615,7 @@
             <w:noProof/>
             <w:webHidden/>
           </w:rPr>
-          <w:t>4</w:t>
+          <w:t>5</w:t>
         </w:r>
         <w:r>
           <w:rPr>
@@ -719,21 +744,7 @@
               </w14:lightRig>
             </w14:scene3d>
           </w:rPr>
-          <w:t>2.3.</w:t>
-        </w:r>
-        <w:r>
-          <w:rPr>
-            <w:rStyle w:val="Hyperlink"/>
-            <w:noProof/>
-            <w:lang w:bidi="x-none"/>
-            <w14:scene3d>
-              <w14:camera w14:prst="orthographicFront"/>
-              <w14:lightRig w14:rig="threePt" w14:dir="t">
-                <w14:rot w14:lat="0" w14:lon="0" w14:rev="0"/>
-              </w14:lightRig>
-            </w14:scene3d>
-          </w:rPr>
-          <w:t>1</w:t>
+          <w:t>2.3.1</w:t>
         </w:r>
         <w:r>
           <w:rPr>
@@ -791,7 +802,7 @@
             <w:noProof/>
             <w:webHidden/>
           </w:rPr>
-          <w:t>5</w:t>
+          <w:t>6</w:t>
         </w:r>
         <w:r>
           <w:rPr>
@@ -830,7 +841,35 @@
               </w14:lightRig>
             </w14:scene3d>
           </w:rPr>
-          <w:t>2.3.2</w:t>
+          <w:t>2.3</w:t>
+        </w:r>
+        <w:r>
+          <w:rPr>
+            <w:rStyle w:val="Hyperlink"/>
+            <w:noProof/>
+            <w:lang w:bidi="x-none"/>
+            <w14:scene3d>
+              <w14:camera w14:prst="orthographicFront"/>
+              <w14:lightRig w14:rig="threePt" w14:dir="t">
+                <w14:rot w14:lat="0" w14:lon="0" w14:rev="0"/>
+              </w14:lightRig>
+            </w14:scene3d>
+          </w:rPr>
+          <w:t>.</w:t>
+        </w:r>
+        <w:r>
+          <w:rPr>
+            <w:rStyle w:val="Hyperlink"/>
+            <w:noProof/>
+            <w:lang w:bidi="x-none"/>
+            <w14:scene3d>
+              <w14:camera w14:prst="orthographicFront"/>
+              <w14:lightRig w14:rig="threePt" w14:dir="t">
+                <w14:rot w14:lat="0" w14:lon="0" w14:rev="0"/>
+              </w14:lightRig>
+            </w14:scene3d>
+          </w:rPr>
+          <w:t>2</w:t>
         </w:r>
         <w:r>
           <w:rPr>
@@ -1172,7 +1211,7 @@
             <w:noProof/>
             <w:webHidden/>
           </w:rPr>
-          <w:t>10</w:t>
+          <w:t>11</w:t>
         </w:r>
         <w:r>
           <w:rPr>
@@ -1366,7 +1405,7 @@
             <w:noProof/>
             <w:webHidden/>
           </w:rPr>
-          <w:t>11</w:t>
+          <w:t>12</w:t>
         </w:r>
         <w:r>
           <w:rPr>
@@ -1650,7 +1689,7 @@
             <w:noProof/>
             <w:webHidden/>
           </w:rPr>
-          <w:t>13</w:t>
+          <w:t>14</w:t>
         </w:r>
         <w:r>
           <w:rPr>
@@ -1740,7 +1779,7 @@
             <w:noProof/>
             <w:webHidden/>
           </w:rPr>
-          <w:t>13</w:t>
+          <w:t>14</w:t>
         </w:r>
         <w:r>
           <w:rPr>
@@ -2219,7 +2258,7 @@
             <w:noProof/>
             <w:webHidden/>
           </w:rPr>
-          <w:t>15</w:t>
+          <w:t>16</w:t>
         </w:r>
         <w:r>
           <w:rPr>
@@ -3443,14 +3482,14 @@
         <w:lastRenderedPageBreak/>
         <w:fldChar w:fldCharType="end"/>
       </w:r>
-      <w:bookmarkStart w:id="1" w:name="_Toc196376605"/>
+      <w:bookmarkStart w:id="2" w:name="_Toc196376605"/>
       <w:r>
         <w:t>I</w:t>
       </w:r>
       <w:r>
         <w:t>ntroduction</w:t>
       </w:r>
-      <w:bookmarkEnd w:id="1"/>
+      <w:bookmarkEnd w:id="2"/>
     </w:p>
     <w:p>
       <w:pPr>
@@ -3579,6 +3618,22 @@
         <w:pStyle w:val="BodyText"/>
       </w:pPr>
       <w:r>
+        <w:t xml:space="preserve">If you have a large FLEx project with a lot of pictures, the process may use multiple Gb of memory. A well-developed dictionary with 29,000 entries took 8 minutes to export and used 4Gb of RAM during the export. With a lot of </w:t>
+      </w:r>
+      <w:proofErr w:type="gramStart"/>
+      <w:r>
+        <w:t>pictures</w:t>
+      </w:r>
+      <w:proofErr w:type="gramEnd"/>
+      <w:r>
+        <w:t xml:space="preserve"> it may double that. For these dictionaries, you should have at least 16Gb of RAM in your computer to avoid running out of memory.</w:t>
+      </w:r>
+    </w:p>
+    <w:p>
+      <w:pPr>
+        <w:pStyle w:val="BodyText"/>
+      </w:pPr>
+      <w:r>
         <w:t xml:space="preserve">The Microsoft Word export uses </w:t>
       </w:r>
       <w:proofErr w:type="spellStart"/>
@@ -3625,21 +3680,21 @@
       <w:pPr>
         <w:pStyle w:val="Heading1"/>
       </w:pPr>
-      <w:bookmarkStart w:id="2" w:name="_Toc196376606"/>
+      <w:bookmarkStart w:id="3" w:name="_Toc196376606"/>
       <w:r>
         <w:t>Exporting a dictionary to Word</w:t>
       </w:r>
-      <w:bookmarkEnd w:id="2"/>
+      <w:bookmarkEnd w:id="3"/>
     </w:p>
     <w:p>
       <w:pPr>
         <w:pStyle w:val="Heading2"/>
       </w:pPr>
-      <w:bookmarkStart w:id="3" w:name="_Toc196376607"/>
+      <w:bookmarkStart w:id="4" w:name="_Toc196376607"/>
       <w:r>
         <w:t>Preparation in FLEx prior to export</w:t>
       </w:r>
-      <w:bookmarkEnd w:id="3"/>
+      <w:bookmarkEnd w:id="4"/>
     </w:p>
     <w:p>
       <w:pPr>
@@ -3669,6 +3724,7 @@
         <w:pStyle w:val="ListBullet"/>
       </w:pPr>
       <w:r>
+        <w:lastRenderedPageBreak/>
         <w:t xml:space="preserve">Select the entries, </w:t>
       </w:r>
       <w:r>
@@ -3692,9 +3748,6 @@
       </w:r>
       <w:r>
         <w:br/>
-      </w:r>
-      <w:r>
-        <w:lastRenderedPageBreak/>
         <w:t>Publish Pronunciation In</w:t>
       </w:r>
       <w:r>
@@ -3949,7 +4002,11 @@
         <w:t xml:space="preserve">To avoid this, make sure the After box is empty. </w:t>
       </w:r>
       <w:r>
-        <w:t xml:space="preserve">Older FLEx projects had a space in this location by default. Current versions do not have the space, but for earlier projects you’ll need to delete it in configuration. </w:t>
+        <w:t xml:space="preserve">Older FLEx projects had a space in this </w:t>
+      </w:r>
+      <w:r>
+        <w:lastRenderedPageBreak/>
+        <w:t xml:space="preserve">location by default. Current versions do not have the space, but for earlier projects you’ll need to delete it in configuration. </w:t>
       </w:r>
       <w:r>
         <w:t xml:space="preserve">For further vertical spacing issues with pictures in Word, you can modify the paragraph settings for the </w:t>
@@ -3984,11 +4041,7 @@
         <w:t xml:space="preserve"> and sorting set for each reversal language in Bulk Edit Reversal Entries, and configurations for each reversal language set in Tools &gt; Configure &gt; Reversal Index. </w:t>
       </w:r>
       <w:r>
-        <w:t xml:space="preserve">Collation and letter </w:t>
-      </w:r>
-      <w:r>
-        <w:lastRenderedPageBreak/>
-        <w:t xml:space="preserve">headings for reversal entries are determined by the Sorting tab of the reversal language in Format &gt; Set up Analysis Writing Systems. </w:t>
+        <w:t xml:space="preserve">Collation and letter headings for reversal entries are determined by the Sorting tab of the reversal language in Format &gt; Set up Analysis Writing Systems. </w:t>
       </w:r>
       <w:r>
         <w:t>Make sure these are all set to what you want to export to Word. Each reversal will be in a separate .docx file.</w:t>
@@ -4038,7 +4091,7 @@
       <w:pPr>
         <w:pStyle w:val="Heading3"/>
       </w:pPr>
-      <w:bookmarkStart w:id="4" w:name="_Toc196376608"/>
+      <w:bookmarkStart w:id="5" w:name="_Toc196376608"/>
       <w:r>
         <w:t xml:space="preserve">Saving list </w:t>
       </w:r>
@@ -4048,7 +4101,37 @@
       <w:r>
         <w:t>names in the Word document</w:t>
       </w:r>
-      <w:bookmarkEnd w:id="4"/>
+      <w:bookmarkEnd w:id="5"/>
+    </w:p>
+    <w:p>
+      <w:pPr>
+        <w:pStyle w:val="BodyText"/>
+      </w:pPr>
+      <w:r>
+        <w:rPr>
+          <w:rStyle w:val="Boldphrase"/>
+        </w:rPr>
+        <w:t>Note</w:t>
+      </w:r>
+      <w:r>
+        <w:t>: This section only applies to versions of FLEx prior to FW9.2.9. In FW9.2.9, list references automatically use the property name as part of the style (e.g., Semantic Domains-Name[</w:t>
+      </w:r>
+      <w:proofErr w:type="spellStart"/>
+      <w:r>
+        <w:t>lang</w:t>
+      </w:r>
+      <w:proofErr w:type="spellEnd"/>
+      <w:r>
+        <w:t>=</w:t>
+      </w:r>
+      <w:proofErr w:type="spellStart"/>
+      <w:r>
+        <w:t>en</w:t>
+      </w:r>
+      <w:proofErr w:type="spellEnd"/>
+      <w:r>
+        <w:t>]) without specifying a special style in FLEx configuration.</w:t>
+      </w:r>
     </w:p>
     <w:p>
       <w:pPr>
@@ -4292,13 +4375,14 @@
       <w:pPr>
         <w:pStyle w:val="Heading2"/>
       </w:pPr>
-      <w:bookmarkStart w:id="5" w:name="_Ref143614988"/>
-      <w:bookmarkStart w:id="6" w:name="_Toc196376609"/>
-      <w:r>
+      <w:bookmarkStart w:id="6" w:name="_Ref143614988"/>
+      <w:bookmarkStart w:id="7" w:name="_Toc196376609"/>
+      <w:r>
+        <w:lastRenderedPageBreak/>
         <w:t>Exporting a dictionary from FLEx to Word</w:t>
       </w:r>
-      <w:bookmarkEnd w:id="5"/>
       <w:bookmarkEnd w:id="6"/>
+      <w:bookmarkEnd w:id="7"/>
     </w:p>
     <w:p>
       <w:pPr>
@@ -4340,11 +4424,7 @@
         <w:t xml:space="preserve"> </w:t>
       </w:r>
       <w:r>
-        <w:t xml:space="preserve">Reversal files use the name you </w:t>
-      </w:r>
-      <w:r>
-        <w:lastRenderedPageBreak/>
-        <w:t>specify, appending “-reversal-</w:t>
+        <w:t>Reversal files use the name you specify, appending “-reversal-</w:t>
       </w:r>
       <w:proofErr w:type="spellStart"/>
       <w:r>
@@ -4370,11 +4450,11 @@
       <w:pPr>
         <w:pStyle w:val="Heading2"/>
       </w:pPr>
-      <w:bookmarkStart w:id="7" w:name="_Toc196376610"/>
+      <w:bookmarkStart w:id="8" w:name="_Toc196376610"/>
       <w:r>
         <w:t>Preparing a Word dictionary for publication</w:t>
       </w:r>
-      <w:bookmarkEnd w:id="7"/>
+      <w:bookmarkEnd w:id="8"/>
     </w:p>
     <w:p>
       <w:pPr>
@@ -4570,16 +4650,15 @@
       <w:pPr>
         <w:pStyle w:val="Heading3"/>
       </w:pPr>
-      <w:bookmarkStart w:id="8" w:name="_Toc196376611"/>
-      <w:bookmarkStart w:id="9" w:name="_GoBack"/>
+      <w:bookmarkStart w:id="9" w:name="_Toc196376611"/>
+      <w:r>
+        <w:lastRenderedPageBreak/>
+        <w:t>Page</w:t>
+      </w:r>
+      <w:r>
+        <w:t xml:space="preserve"> layout</w:t>
+      </w:r>
       <w:bookmarkEnd w:id="9"/>
-      <w:r>
-        <w:t>Page</w:t>
-      </w:r>
-      <w:r>
-        <w:t xml:space="preserve"> layout</w:t>
-      </w:r>
-      <w:bookmarkEnd w:id="8"/>
     </w:p>
     <w:p>
       <w:pPr>
@@ -4656,7 +4735,6 @@
         <w:rPr>
           <w:rStyle w:val="Boldphrase"/>
         </w:rPr>
-        <w:lastRenderedPageBreak/>
         <w:t>Note</w:t>
       </w:r>
       <w:r>
@@ -4819,7 +4897,11 @@
         <w:t xml:space="preserve"> tag added because the font is different from the Normal style. If</w:t>
       </w:r>
       <w:r>
-        <w:t xml:space="preserve"> FLEx is configured to show English, French, and Spanish analysis languages for a definition with English being the default. In Word there would </w:t>
+        <w:t xml:space="preserve"> FLEx is configured to show English, French, and Spanish </w:t>
+      </w:r>
+      <w:r>
+        <w:lastRenderedPageBreak/>
+        <w:t xml:space="preserve">analysis languages for a definition with English being the default. In Word there would </w:t>
       </w:r>
       <w:r>
         <w:t xml:space="preserve">normally </w:t>
@@ -4999,7 +5081,6 @@
         <w:pStyle w:val="BodyText"/>
       </w:pPr>
       <w:r>
-        <w:lastRenderedPageBreak/>
         <w:t>Here</w:t>
       </w:r>
       <w:r>
@@ -5163,7 +5244,11 @@
         <w:t>where they occur</w:t>
       </w:r>
       <w:r>
-        <w:t xml:space="preserve">. However, if the context is for a single text field that is using a style, FLEx will use the style of the field for the before/after text. This generally gives better results than always using a single style regardless of the field. For example, if a </w:t>
+        <w:t xml:space="preserve">. However, if the context is for a single text </w:t>
+      </w:r>
+      <w:r>
+        <w:lastRenderedPageBreak/>
+        <w:t xml:space="preserve">field that is using a style, FLEx will use the style of the field for the before/after text. This generally gives better results than always using a single style regardless of the field. For example, if a </w:t>
       </w:r>
       <w:r>
         <w:t xml:space="preserve">Lexeme Form field in an IPA writing system is used, and that field is assigned the Dictionary-Pronunciation style which is set to red, and the field has square brackets in the before/after content, the result will be </w:t>
@@ -5295,11 +5380,7 @@
       </w:r>
       <w:proofErr w:type="spellEnd"/>
       <w:r>
-        <w:t xml:space="preserve">], thus it merges </w:t>
-      </w:r>
-      <w:r>
-        <w:lastRenderedPageBreak/>
-        <w:t xml:space="preserve">properties of both styles. </w:t>
+        <w:t xml:space="preserve">], thus it merges properties of both styles. </w:t>
       </w:r>
       <w:r>
         <w:t>The same style is used for all three contexts. The context style is set to match the style that was used in FLEx. So, in the above example, it would be set to red. Each field that has context assigned in FLEx, will have a different style in Word for that context. This provide</w:t>
@@ -5398,9 +5479,6 @@
       </w:r>
       <w:r>
         <w:t xml:space="preserve"> Word are shown here.</w:t>
-      </w:r>
-      <w:r>
-        <w:t>, but will po</w:t>
       </w:r>
     </w:p>
     <w:p>
@@ -5501,6 +5579,7 @@
         <w:pStyle w:val="ListLetter"/>
       </w:pPr>
       <w:r>
+        <w:lastRenderedPageBreak/>
         <w:t>Text from Example Sentence in French</w:t>
       </w:r>
     </w:p>
@@ -5579,7 +5658,6 @@
         <w:pStyle w:val="BodyText"/>
       </w:pPr>
       <w:r>
-        <w:lastRenderedPageBreak/>
         <w:t xml:space="preserve">Note how text between fields may come from multiple places as in </w:t>
       </w:r>
       <w:r>
@@ -5913,7 +5991,11 @@
         <w:pStyle w:val="BodyText"/>
       </w:pPr>
       <w:r>
-        <w:t>Note that the default FLEx configuration uses Dictionary-Headword for the Headword style for subentries, which is identical to default settings for main and minor entry headwords. It is not desirable for subentry headwords to be in guidewords since they often do not follow the normal alphabetical order of main headwords. The FLEx Word export automatically switches subentry headwords to use a Subheadword style to avoid these undesirable guidewords. If you happen to change the subentry headword style in FLEx, it will still get changed to Subheadword during the export</w:t>
+        <w:t xml:space="preserve">Note that the default FLEx configuration uses Dictionary-Headword for the Headword style for subentries, which is identical to default settings for main and minor entry headwords. It is not </w:t>
+      </w:r>
+      <w:r>
+        <w:lastRenderedPageBreak/>
+        <w:t>desirable for subentry headwords to be in guidewords since they often do not follow the normal alphabetical order of main headwords. The FLEx Word export automatically switches subentry headwords to use a Subheadword style to avoid these undesirable guidewords. If you happen to change the subentry headword style in FLEx, it will still get changed to Subheadword during the export</w:t>
       </w:r>
       <w:r>
         <w:t xml:space="preserve"> and keep your style’s properties</w:t>
@@ -5979,7 +6061,6 @@
         <w:rPr>
           <w:noProof/>
         </w:rPr>
-        <w:lastRenderedPageBreak/>
         <w:drawing>
           <wp:inline distT="0" distB="0" distL="0" distR="0" wp14:anchorId="4A74126C" wp14:editId="14F58193">
             <wp:extent cx="5943600" cy="3794760"/>
@@ -6111,7 +6192,11 @@
         <w:t xml:space="preserve"> it doesn’t show anything. </w:t>
       </w:r>
       <w:r>
-        <w:t xml:space="preserve">If you follow the steps in section </w:t>
+        <w:t xml:space="preserve">If you </w:t>
+      </w:r>
+      <w:r>
+        <w:lastRenderedPageBreak/>
+        <w:t xml:space="preserve">follow the steps in section </w:t>
       </w:r>
       <w:r>
         <w:fldChar w:fldCharType="begin"/>
@@ -6198,8 +6283,8 @@
       <w:pPr>
         <w:pStyle w:val="Heading3"/>
       </w:pPr>
-      <w:bookmarkStart w:id="15" w:name="_Ref176788241"/>
-      <w:bookmarkStart w:id="16" w:name="_Toc196376615"/>
+      <w:bookmarkStart w:id="15" w:name="_Toc196376615"/>
+      <w:bookmarkStart w:id="16" w:name="_Ref176788241"/>
       <w:r>
         <w:t xml:space="preserve">How to fix incorrect guidewords on </w:t>
       </w:r>
@@ -6209,18 +6294,14 @@
       <w:r>
         <w:t xml:space="preserve"> pages</w:t>
       </w:r>
-      <w:bookmarkEnd w:id="16"/>
+      <w:bookmarkEnd w:id="15"/>
     </w:p>
     <w:p>
       <w:pPr>
         <w:pStyle w:val="BodyText"/>
       </w:pPr>
       <w:r>
-        <w:t xml:space="preserve">After you have made all of the changes to your document, if you find a few page headers where the guidewords were incorrect, there is a way you can correct this. It would not be wise to make these changes until all other editing is done because you are forcing new page breaks that would </w:t>
-      </w:r>
-      <w:r>
-        <w:lastRenderedPageBreak/>
-        <w:t>be incorrect if you make changes to previous pages that would alter the location of the default page breaks.</w:t>
+        <w:t>After you have made all of the changes to your document, if you find a few page headers where the guidewords were incorrect, there is a way you can correct this. It would not be wise to make these changes until all other editing is done because you are forcing new page breaks that would be incorrect if you make changes to previous pages that would alter the location of the default page breaks.</w:t>
       </w:r>
       <w:r>
         <w:t xml:space="preserve"> Follow these steps to alter </w:t>
@@ -6336,7 +6417,7 @@
       <w:r>
         <w:t xml:space="preserve"> to single column</w:t>
       </w:r>
-      <w:bookmarkEnd w:id="15"/>
+      <w:bookmarkEnd w:id="16"/>
       <w:bookmarkEnd w:id="17"/>
       <w:bookmarkEnd w:id="18"/>
     </w:p>
@@ -6635,6 +6716,7 @@
         <w:t xml:space="preserve"> </w:t>
       </w:r>
       <w:r>
+        <w:lastRenderedPageBreak/>
         <w:t xml:space="preserve">again. </w:t>
       </w:r>
       <w:r>
@@ -6648,12 +6730,12 @@
       <w:pPr>
         <w:pStyle w:val="Heading3"/>
       </w:pPr>
-      <w:bookmarkStart w:id="19" w:name="_Ref143764487"/>
-      <w:bookmarkStart w:id="20" w:name="_Toc196376617"/>
+      <w:bookmarkStart w:id="19" w:name="_Toc196376617"/>
+      <w:bookmarkStart w:id="20" w:name="_Ref143764487"/>
       <w:r>
         <w:t>Pictures in Word</w:t>
       </w:r>
-      <w:bookmarkEnd w:id="20"/>
+      <w:bookmarkEnd w:id="19"/>
     </w:p>
     <w:p>
       <w:pPr>
@@ -6719,11 +6801,7 @@
         <w:t xml:space="preserve"> 1” maximum width and height. </w:t>
       </w:r>
       <w:r>
-        <w:t xml:space="preserve">Any </w:t>
-      </w:r>
-      <w:r>
-        <w:lastRenderedPageBreak/>
-        <w:t xml:space="preserve">Pictures node will affect all pictures in the dictionary for this view. </w:t>
+        <w:t xml:space="preserve">Any Pictures node will affect all pictures in the dictionary for this view. </w:t>
       </w:r>
       <w:r>
         <w:t>Pictures will not be enlarged beyond their resolution, but if they are too big, they will be reduced, maintaining aspect ratio, until they do not exceed the two maximum values.</w:t>
@@ -6856,10 +6934,7 @@
       </w:r>
       <w:proofErr w:type="gramEnd"/>
       <w:r>
-        <w:t xml:space="preserve"> Caption”</w:t>
-      </w:r>
-      <w:r>
-        <w:t xml:space="preserve"> </w:t>
+        <w:t xml:space="preserve"> Caption” </w:t>
       </w:r>
       <w:r>
         <w:t>paragraph style.</w:t>
@@ -6942,19 +7017,7 @@
         <w:pStyle w:val="BodyText"/>
       </w:pPr>
       <w:r>
-        <w:t xml:space="preserve">If you want to </w:t>
-      </w:r>
-      <w:r>
-        <w:t>move</w:t>
-      </w:r>
-      <w:r>
-        <w:t xml:space="preserve"> </w:t>
-      </w:r>
-      <w:r>
-        <w:t>a</w:t>
-      </w:r>
-      <w:r>
-        <w:t xml:space="preserve"> picture, when the textbox is highlighted, you can click the border and drag the textbox to a new location. The picture and caption will move together inside the textbox.</w:t>
+        <w:t>If you want to move a picture, when the textbox is highlighted, you can click the border and drag the textbox to a new location. The picture and caption will move together inside the textbox.</w:t>
       </w:r>
     </w:p>
     <w:p>
@@ -6995,7 +7058,11 @@
         <w:t xml:space="preserve">is </w:t>
       </w:r>
       <w:r>
-        <w:t xml:space="preserve">in a single entry in a letter section, the picture will go to the right column instead of staying in the left column. </w:t>
+        <w:t xml:space="preserve">in a single entry in a letter section, the </w:t>
+      </w:r>
+      <w:r>
+        <w:lastRenderedPageBreak/>
+        <w:t xml:space="preserve">picture will go to the right column instead of staying in the left column. </w:t>
       </w:r>
       <w:r>
         <w:t xml:space="preserve">If you want to force the picture to be under the entry paragraph, you can drag the </w:t>
@@ -7038,7 +7105,6 @@
         <w:pStyle w:val="BodyText"/>
       </w:pPr>
       <w:r>
-        <w:lastRenderedPageBreak/>
         <w:t>In order to get a pleasing page layout with pictures, you may need to change the size, or drag the picture to a new location, or force an entry to a new column, etc.</w:t>
       </w:r>
     </w:p>
@@ -7050,7 +7116,7 @@
       <w:r>
         <w:t>Editing the internal Word docx file</w:t>
       </w:r>
-      <w:bookmarkEnd w:id="19"/>
+      <w:bookmarkEnd w:id="20"/>
       <w:bookmarkEnd w:id="21"/>
     </w:p>
     <w:p>
@@ -7289,6 +7355,7 @@
       </w:pPr>
       <w:bookmarkStart w:id="23" w:name="_Toc196376620"/>
       <w:r>
+        <w:lastRenderedPageBreak/>
         <w:t>Useful features in Word</w:t>
       </w:r>
       <w:bookmarkEnd w:id="23"/>
@@ -7350,7 +7417,6 @@
         <w:pStyle w:val="BodyText"/>
       </w:pPr>
       <w:r>
-        <w:lastRenderedPageBreak/>
         <w:t xml:space="preserve">When working on the dictionary in Word, it’s very helpful to have the stylesheet open beside the document. If you don’t have the stylesheet open, you can open it with </w:t>
       </w:r>
       <w:proofErr w:type="spellStart"/>
@@ -7532,6 +7598,7 @@
         <w:pStyle w:val="Example"/>
       </w:pPr>
       <w:r>
+        <w:lastRenderedPageBreak/>
         <w:t xml:space="preserve">Sub </w:t>
       </w:r>
       <w:proofErr w:type="spellStart"/>
@@ -7612,7 +7679,6 @@
       <w:bookmarkStart w:id="28" w:name="_Ref143252360"/>
       <w:bookmarkStart w:id="29" w:name="_Toc196376623"/>
       <w:r>
-        <w:lastRenderedPageBreak/>
         <w:t>Advanced Find and Replace</w:t>
       </w:r>
       <w:bookmarkEnd w:id="28"/>
@@ -7877,6 +7943,7 @@
       </w:pPr>
       <w:bookmarkStart w:id="34" w:name="_Toc196376626"/>
       <w:r>
+        <w:lastRenderedPageBreak/>
         <w:t>Special codes</w:t>
       </w:r>
       <w:bookmarkEnd w:id="34"/>
@@ -7986,7 +8053,6 @@
                 <w:b/>
                 <w:bCs/>
               </w:rPr>
-              <w:lastRenderedPageBreak/>
               <w:t>^t</w:t>
             </w:r>
           </w:p>
@@ -9443,6 +9509,7 @@
         <w:pStyle w:val="BodyText"/>
       </w:pPr>
       <w:r>
+        <w:lastRenderedPageBreak/>
         <w:t>In the Find</w:t>
       </w:r>
       <w:r>
@@ -9746,7 +9813,6 @@
                 <w:b/>
                 <w:bCs/>
               </w:rPr>
-              <w:lastRenderedPageBreak/>
               <w:t>[!]</w:t>
             </w:r>
           </w:p>
@@ -11396,6 +11462,7 @@
                 <w:b/>
                 <w:bCs/>
               </w:rPr>
+              <w:lastRenderedPageBreak/>
               <w:t>^~</w:t>
             </w:r>
           </w:p>
@@ -11577,7 +11644,6 @@
         <w:pStyle w:val="BodyText"/>
       </w:pPr>
       <w:r>
-        <w:lastRenderedPageBreak/>
         <w:t>Here is an</w:t>
       </w:r>
       <w:r>
@@ -11983,7 +12049,11 @@
         <w:t xml:space="preserve">[] </w:t>
       </w:r>
       <w:r>
-        <w:t xml:space="preserve">style). The Replace operation will keep the </w:t>
+        <w:t xml:space="preserve">style). The </w:t>
+      </w:r>
+      <w:r>
+        <w:lastRenderedPageBreak/>
+        <w:t xml:space="preserve">Replace operation will keep the </w:t>
       </w:r>
       <w:r>
         <w:t xml:space="preserve">Example </w:t>
@@ -12073,11 +12143,7 @@
       </w:r>
       <w:proofErr w:type="spellEnd"/>
       <w:r>
-        <w:t xml:space="preserve">, Word removes the style as desired. When you </w:t>
-      </w:r>
-      <w:r>
-        <w:lastRenderedPageBreak/>
-        <w:t>check the style after that, it will be the entry paragraph style.</w:t>
+        <w:t>, Word removes the style as desired. When you check the style after that, it will be the entry paragraph style.</w:t>
       </w:r>
       <w:r>
         <w:t xml:space="preserve"> Y</w:t>
@@ -12456,6 +12522,7 @@
         <w:pStyle w:val="BodyText"/>
       </w:pPr>
       <w:r>
+        <w:lastRenderedPageBreak/>
         <w:t xml:space="preserve">Once </w:t>
       </w:r>
       <w:r>
@@ -12503,7 +12570,6 @@
       <w:bookmarkStart w:id="44" w:name="_Ref181711580"/>
       <w:bookmarkStart w:id="45" w:name="_Toc196376631"/>
       <w:r>
-        <w:lastRenderedPageBreak/>
         <w:t>Example recording a macro and running it through your document</w:t>
       </w:r>
       <w:bookmarkEnd w:id="43"/>
@@ -12918,17 +12984,14 @@
         <w:pStyle w:val="BodyText"/>
       </w:pPr>
       <w:r>
+        <w:lastRenderedPageBreak/>
         <w:t xml:space="preserve">We now have a macro that can be run to find the next occurrence and fix the brackets. What we need </w:t>
       </w:r>
       <w:r>
         <w:t>next</w:t>
       </w:r>
       <w:r>
-        <w:t xml:space="preserve"> is a way to run the macro repeatedly through the entire document. To do this, we need to edit the macro. You can open the macro in a Word macro editor by choosing View &gt; Macros </w:t>
-      </w:r>
-      <w:r>
-        <w:lastRenderedPageBreak/>
-        <w:t xml:space="preserve">&gt; View Macros, then select the </w:t>
+        <w:t xml:space="preserve"> is a way to run the macro repeatedly through the entire document. To do this, we need to edit the macro. You can open the macro in a Word macro editor by choosing View &gt; Macros &gt; View Macros, then select the </w:t>
       </w:r>
       <w:proofErr w:type="spellStart"/>
       <w:r>
@@ -16505,7 +16568,7 @@
       <w:rPr>
         <w:noProof/>
       </w:rPr>
-      <w:t>4/23/2025</w:t>
+      <w:t>6/2/2025</w:t>
     </w:r>
     <w:r>
       <w:fldChar w:fldCharType="end"/>
@@ -16552,7 +16615,7 @@
         <w:rStyle w:val="PageNumber"/>
         <w:noProof/>
       </w:rPr>
-      <w:t>4/23/2025</w:t>
+      <w:t>6/2/2025</w:t>
     </w:r>
     <w:r>
       <w:rPr>
@@ -16728,15 +16791,29 @@
       </w:rPr>
       <w:tab/>
     </w:r>
-    <w:fldSimple w:instr=" STYLEREF &quot;Heading 1&quot; \* MERGEFORMAT ">
-      <w:r>
-        <w:rPr>
-          <w:rStyle w:val="PageNumber"/>
-          <w:noProof/>
-        </w:rPr>
-        <w:t>Introduction</w:t>
-      </w:r>
-    </w:fldSimple>
+    <w:r>
+      <w:fldChar w:fldCharType="begin"/>
+    </w:r>
+    <w:r>
+      <w:instrText xml:space="preserve"> STYLEREF "Heading 1" \* MERGEFORMAT </w:instrText>
+    </w:r>
+    <w:r>
+      <w:fldChar w:fldCharType="separate"/>
+    </w:r>
+    <w:r>
+      <w:rPr>
+        <w:rStyle w:val="PageNumber"/>
+        <w:noProof/>
+      </w:rPr>
+      <w:t>Introduction</w:t>
+    </w:r>
+    <w:r>
+      <w:rPr>
+        <w:rStyle w:val="PageNumber"/>
+        <w:noProof/>
+      </w:rPr>
+      <w:fldChar w:fldCharType="end"/>
+    </w:r>
   </w:p>
 </w:hdr>
 </file>
@@ -20031,7 +20108,7 @@
 </file>
 
 <file path=customXml/itemProps1.xml><?xml version="1.0" encoding="utf-8"?>
-<ds:datastoreItem xmlns:ds="http://schemas.openxmlformats.org/officeDocument/2006/customXml" ds:itemID="{81B74683-400C-4525-A85B-89CBDC71A865}">
+<ds:datastoreItem xmlns:ds="http://schemas.openxmlformats.org/officeDocument/2006/customXml" ds:itemID="{6753B158-5866-4A4F-9B69-F5BDC447450E}">
   <ds:schemaRefs>
     <ds:schemaRef ds:uri="http://schemas.openxmlformats.org/officeDocument/2006/bibliography"/>
   </ds:schemaRefs>

</xml_diff>

<commit_message>
Update docs with view to layout
Change-Id: If32eb2c7c5d1f18d366b522d1316dab8eec15fb7
</commit_message>
<xml_diff>
--- a/HelpResourcesSources/TechnicalNotes/Publishing FLEx Dictionaries Using Microsoft Word.docx
+++ b/HelpResourcesSources/TechnicalNotes/Publishing FLEx Dictionaries Using Microsoft Word.docx
@@ -8,7 +8,12 @@
       </w:pPr>
       <w:bookmarkStart w:id="0" w:name="_Toc196376604"/>
       <w:r>
-        <w:t>Publishing FLEx Dictionaries Using Microsoft Word</w:t>
+        <w:t xml:space="preserve">Publishing FLEx Dictionaries Using </w:t>
+      </w:r>
+      <w:bookmarkStart w:id="1" w:name="_GoBack"/>
+      <w:bookmarkEnd w:id="1"/>
+      <w:r>
+        <w:t>Microsoft Word</w:t>
       </w:r>
       <w:bookmarkEnd w:id="0"/>
     </w:p>
@@ -31,13 +36,7 @@
         <w:rPr>
           <w:szCs w:val="36"/>
         </w:rPr>
-        <w:t>June 2</w:t>
-      </w:r>
-      <w:r>
-        <w:rPr>
-          <w:szCs w:val="36"/>
-        </w:rPr>
-        <w:t>, 2025</w:t>
+        <w:t>February 9, 2026</w:t>
       </w:r>
     </w:p>
     <w:p>
@@ -260,16 +259,7 @@
             <w:rStyle w:val="Hyperlink"/>
             <w:noProof/>
           </w:rPr>
-          <w:t>Exp</w:t>
-        </w:r>
-        <w:bookmarkStart w:id="1" w:name="_GoBack"/>
-        <w:bookmarkEnd w:id="1"/>
-        <w:r>
-          <w:rPr>
-            <w:rStyle w:val="Hyperlink"/>
-            <w:noProof/>
-          </w:rPr>
-          <w:t>orting a dictionary to Word</w:t>
+          <w:t>Exporting a dictionary to Word</w:t>
         </w:r>
         <w:r>
           <w:rPr>
@@ -439,35 +429,7 @@
               </w14:lightRig>
             </w14:scene3d>
           </w:rPr>
-          <w:t>2.</w:t>
-        </w:r>
-        <w:r>
-          <w:rPr>
-            <w:rStyle w:val="Hyperlink"/>
-            <w:noProof/>
-            <w:lang w:bidi="x-none"/>
-            <w14:scene3d>
-              <w14:camera w14:prst="orthographicFront"/>
-              <w14:lightRig w14:rig="threePt" w14:dir="t">
-                <w14:rot w14:lat="0" w14:lon="0" w14:rev="0"/>
-              </w14:lightRig>
-            </w14:scene3d>
-          </w:rPr>
-          <w:t>1</w:t>
-        </w:r>
-        <w:r>
-          <w:rPr>
-            <w:rStyle w:val="Hyperlink"/>
-            <w:noProof/>
-            <w:lang w:bidi="x-none"/>
-            <w14:scene3d>
-              <w14:camera w14:prst="orthographicFront"/>
-              <w14:lightRig w14:rig="threePt" w14:dir="t">
-                <w14:rot w14:lat="0" w14:lon="0" w14:rev="0"/>
-              </w14:lightRig>
-            </w14:scene3d>
-          </w:rPr>
-          <w:t>.1</w:t>
+          <w:t>2.1.1</w:t>
         </w:r>
         <w:r>
           <w:rPr>
@@ -841,35 +803,7 @@
               </w14:lightRig>
             </w14:scene3d>
           </w:rPr>
-          <w:t>2.3</w:t>
-        </w:r>
-        <w:r>
-          <w:rPr>
-            <w:rStyle w:val="Hyperlink"/>
-            <w:noProof/>
-            <w:lang w:bidi="x-none"/>
-            <w14:scene3d>
-              <w14:camera w14:prst="orthographicFront"/>
-              <w14:lightRig w14:rig="threePt" w14:dir="t">
-                <w14:rot w14:lat="0" w14:lon="0" w14:rev="0"/>
-              </w14:lightRig>
-            </w14:scene3d>
-          </w:rPr>
-          <w:t>.</w:t>
-        </w:r>
-        <w:r>
-          <w:rPr>
-            <w:rStyle w:val="Hyperlink"/>
-            <w:noProof/>
-            <w:lang w:bidi="x-none"/>
-            <w14:scene3d>
-              <w14:camera w14:prst="orthographicFront"/>
-              <w14:lightRig w14:rig="threePt" w14:dir="t">
-                <w14:rot w14:lat="0" w14:lon="0" w14:rev="0"/>
-              </w14:lightRig>
-            </w14:scene3d>
-          </w:rPr>
-          <w:t>2</w:t>
+          <w:t>2.3.2</w:t>
         </w:r>
         <w:r>
           <w:rPr>
@@ -1017,7 +951,7 @@
             <w:noProof/>
             <w:webHidden/>
           </w:rPr>
-          <w:t>7</w:t>
+          <w:t>8</w:t>
         </w:r>
         <w:r>
           <w:rPr>
@@ -1599,7 +1533,7 @@
             <w:noProof/>
             <w:webHidden/>
           </w:rPr>
-          <w:t>13</w:t>
+          <w:t>14</w:t>
         </w:r>
         <w:r>
           <w:rPr>
@@ -1869,7 +1803,7 @@
             <w:noProof/>
             <w:webHidden/>
           </w:rPr>
-          <w:t>14</w:t>
+          <w:t>15</w:t>
         </w:r>
         <w:r>
           <w:rPr>
@@ -2161,7 +2095,7 @@
             <w:noProof/>
             <w:webHidden/>
           </w:rPr>
-          <w:t>15</w:t>
+          <w:t>16</w:t>
         </w:r>
         <w:r>
           <w:rPr>
@@ -2355,7 +2289,7 @@
             <w:noProof/>
             <w:webHidden/>
           </w:rPr>
-          <w:t>16</w:t>
+          <w:t>17</w:t>
         </w:r>
         <w:r>
           <w:rPr>
@@ -2452,7 +2386,7 @@
             <w:noProof/>
             <w:webHidden/>
           </w:rPr>
-          <w:t>18</w:t>
+          <w:t>19</w:t>
         </w:r>
         <w:r>
           <w:rPr>
@@ -2632,7 +2566,7 @@
             <w:noProof/>
             <w:webHidden/>
           </w:rPr>
-          <w:t>19</w:t>
+          <w:t>20</w:t>
         </w:r>
         <w:r>
           <w:rPr>
@@ -2819,7 +2753,7 @@
             <w:noProof/>
             <w:webHidden/>
           </w:rPr>
-          <w:t>21</w:t>
+          <w:t>22</w:t>
         </w:r>
         <w:r>
           <w:rPr>
@@ -2999,7 +2933,7 @@
             <w:noProof/>
             <w:webHidden/>
           </w:rPr>
-          <w:t>22</w:t>
+          <w:t>23</w:t>
         </w:r>
         <w:r>
           <w:rPr>
@@ -3373,7 +3307,7 @@
             <w:noProof/>
             <w:webHidden/>
           </w:rPr>
-          <w:t>23</w:t>
+          <w:t>24</w:t>
         </w:r>
         <w:r>
           <w:rPr>
@@ -3463,7 +3397,7 @@
             <w:noProof/>
             <w:webHidden/>
           </w:rPr>
-          <w:t>25</w:t>
+          <w:t>26</w:t>
         </w:r>
         <w:r>
           <w:rPr>
@@ -3664,7 +3598,13 @@
         <w:t xml:space="preserve">conceptual </w:t>
       </w:r>
       <w:r>
-        <w:t xml:space="preserve">differences in the way FLEx formats data via styles, and the way Word formats data via styles. The FLEx export attempts to provide output in Word that closely follows how it looks in the FLEx dictionary view. </w:t>
+        <w:t xml:space="preserve">differences in the way FLEx formats data via styles, and the way Word formats data via styles. The FLEx export attempts to provide output in Word that closely follows how it looks in the FLEx dictionary </w:t>
+      </w:r>
+      <w:r>
+        <w:t>layout</w:t>
+      </w:r>
+      <w:r>
+        <w:t xml:space="preserve">. </w:t>
       </w:r>
       <w:r>
         <w:t>There are some situations where this cannot be handled automatically. So</w:t>
@@ -3707,7 +3647,13 @@
         <w:t>so that</w:t>
       </w:r>
       <w:r>
-        <w:t xml:space="preserve"> the Dictionary view in FLEx</w:t>
+        <w:t xml:space="preserve"> the Dictionary </w:t>
+      </w:r>
+      <w:r>
+        <w:t>layout</w:t>
+      </w:r>
+      <w:r>
+        <w:t xml:space="preserve"> in FLEx</w:t>
       </w:r>
       <w:r>
         <w:t xml:space="preserve"> shows the entries the way you want them</w:t>
@@ -3919,7 +3865,19 @@
         <w:t>c</w:t>
       </w:r>
       <w:r>
-        <w:t>an also be set for a unique publication by creating a custom view using the Manage Views button in the Configure Dictionary dialog.</w:t>
+        <w:t xml:space="preserve">an also be set for a unique publication by creating a custom </w:t>
+      </w:r>
+      <w:r>
+        <w:t>layout</w:t>
+      </w:r>
+      <w:r>
+        <w:t xml:space="preserve"> using the Manage </w:t>
+      </w:r>
+      <w:r>
+        <w:t>Layout</w:t>
+      </w:r>
+      <w:r>
+        <w:t>s button in the Configure Dictionary dialog.</w:t>
       </w:r>
       <w:r>
         <w:br/>
@@ -3999,14 +3957,13 @@
       </w:r>
       <w:r>
         <w:br/>
+      </w:r>
+      <w:r>
+        <w:lastRenderedPageBreak/>
         <w:t xml:space="preserve">To avoid this, make sure the After box is empty. </w:t>
       </w:r>
       <w:r>
-        <w:t xml:space="preserve">Older FLEx projects had a space in this </w:t>
-      </w:r>
-      <w:r>
-        <w:lastRenderedPageBreak/>
-        <w:t xml:space="preserve">location by default. Current versions do not have the space, but for earlier projects you’ll need to delete it in configuration. </w:t>
+        <w:t xml:space="preserve">Older FLEx projects had a space in this location by default. Current versions do not have the space, but for earlier projects you’ll need to delete it in configuration. </w:t>
       </w:r>
       <w:r>
         <w:t xml:space="preserve">For further vertical spacing issues with pictures in Word, you can modify the paragraph settings for the </w:t>
@@ -4052,7 +4009,13 @@
         <w:pStyle w:val="ListBullet"/>
       </w:pPr>
       <w:r>
-        <w:t>Make sure the correct view is chosen at the top of the Configure Dictionary dialog.</w:t>
+        <w:t xml:space="preserve">Make sure the correct </w:t>
+      </w:r>
+      <w:r>
+        <w:t>layout</w:t>
+      </w:r>
+      <w:r>
+        <w:t xml:space="preserve"> is chosen at the top of the Configure Dictionary dialog.</w:t>
       </w:r>
     </w:p>
     <w:p>
@@ -4333,6 +4296,7 @@
         <w:pStyle w:val="BodyText"/>
       </w:pPr>
       <w:r>
+        <w:lastRenderedPageBreak/>
         <w:t>If</w:t>
       </w:r>
       <w:r>
@@ -4378,7 +4342,6 @@
       <w:bookmarkStart w:id="6" w:name="_Ref143614988"/>
       <w:bookmarkStart w:id="7" w:name="_Toc196376609"/>
       <w:r>
-        <w:lastRenderedPageBreak/>
         <w:t>Exporting a dictionary from FLEx to Word</w:t>
       </w:r>
       <w:bookmarkEnd w:id="6"/>
@@ -4395,7 +4358,7 @@
         <w:t xml:space="preserve">and Reversal Index </w:t>
       </w:r>
       <w:r>
-        <w:t>view</w:t>
+        <w:t>layout</w:t>
       </w:r>
       <w:r>
         <w:t>s</w:t>
@@ -4643,7 +4606,11 @@
         <w:t xml:space="preserve"> on the Internet</w:t>
       </w:r>
       <w:r>
-        <w:t>. Word also provides a powerful programming macro language that can be useful to those who understand that.</w:t>
+        <w:t xml:space="preserve">. </w:t>
+      </w:r>
+      <w:r>
+        <w:lastRenderedPageBreak/>
+        <w:t>Word also provides a powerful programming macro language that can be useful to those who understand that.</w:t>
       </w:r>
     </w:p>
     <w:p>
@@ -4652,7 +4619,6 @@
       </w:pPr>
       <w:bookmarkStart w:id="9" w:name="_Toc196376611"/>
       <w:r>
-        <w:lastRenderedPageBreak/>
         <w:t>Page</w:t>
       </w:r>
       <w:r>
@@ -4772,7 +4738,13 @@
         <w:pStyle w:val="BodyText"/>
       </w:pPr>
       <w:r>
-        <w:t xml:space="preserve">The FLEx Word export assigns character and paragraph styles to the exported data to provide formatting that will look similar in Word to the appearance in the FLEx Dictionary view. </w:t>
+        <w:t xml:space="preserve">The FLEx Word export assigns character and paragraph styles to the exported data to provide formatting that will look similar in Word to the appearance in the FLEx Dictionary </w:t>
+      </w:r>
+      <w:r>
+        <w:t>layout</w:t>
+      </w:r>
+      <w:r>
+        <w:t xml:space="preserve">. </w:t>
       </w:r>
       <w:r>
         <w:t>Styles in FLEx and Word do not work exactly the same. The export goes through a complex process to pick up all of the style features in the FLEx style hierarchy, then writes similar styles to Word, merging any styles that have the same features, and removing any styles that are unused</w:t>
@@ -4810,7 +4782,13 @@
         <w:pStyle w:val="BodyText"/>
       </w:pPr>
       <w:r>
-        <w:t xml:space="preserve">Usually there is only one writing system for a given field. In FLEx dictionary configuration, the field will have “Default Analysis” or “Default Vernacular” checked for the field. For these cases, the dictionary view will only show the first analysis or first vernacular writing system content. When exported to Word, the style name will </w:t>
+        <w:t xml:space="preserve">Usually there is only one writing system for a given field. In FLEx dictionary configuration, the field will have “Default Analysis” or “Default Vernacular” checked for the field. For these cases, the dictionary </w:t>
+      </w:r>
+      <w:r>
+        <w:t>layout</w:t>
+      </w:r>
+      <w:r>
+        <w:t xml:space="preserve"> will only show the first analysis or first vernacular writing system content. When exported to Word, the style name will </w:t>
       </w:r>
       <w:r>
         <w:t xml:space="preserve">normally </w:t>
@@ -4883,7 +4861,11 @@
       </w:r>
       <w:proofErr w:type="spellEnd"/>
       <w:r>
-        <w:t xml:space="preserve"> tag, but some may have a tag, and understanding why may be a mystery. Even with </w:t>
+        <w:t xml:space="preserve"> tag, but some may have a tag, and understanding why may be a </w:t>
+      </w:r>
+      <w:r>
+        <w:lastRenderedPageBreak/>
+        <w:t xml:space="preserve">mystery. Even with </w:t>
       </w:r>
       <w:r>
         <w:t xml:space="preserve">default styles in FLEx, if the main analysis and vernacular writing systems use a different font, the Headword field will normally have a </w:t>
@@ -4897,11 +4879,7 @@
         <w:t xml:space="preserve"> tag added because the font is different from the Normal style. If</w:t>
       </w:r>
       <w:r>
-        <w:t xml:space="preserve"> FLEx is configured to show English, French, and Spanish </w:t>
-      </w:r>
-      <w:r>
-        <w:lastRenderedPageBreak/>
-        <w:t xml:space="preserve">analysis languages for a definition with English being the default. In Word there would </w:t>
+        <w:t xml:space="preserve"> FLEx is configured to show English, French, and Spanish analysis languages for a definition with English being the default. In Word there would </w:t>
       </w:r>
       <w:r>
         <w:t xml:space="preserve">normally </w:t>
@@ -5226,6 +5204,7 @@
       </w:pPr>
       <w:bookmarkStart w:id="12" w:name="_Toc196376613"/>
       <w:r>
+        <w:lastRenderedPageBreak/>
         <w:t>Context s</w:t>
       </w:r>
       <w:r>
@@ -5244,11 +5223,7 @@
         <w:t>where they occur</w:t>
       </w:r>
       <w:r>
-        <w:t xml:space="preserve">. However, if the context is for a single text </w:t>
-      </w:r>
-      <w:r>
-        <w:lastRenderedPageBreak/>
-        <w:t xml:space="preserve">field that is using a style, FLEx will use the style of the field for the before/after text. This generally gives better results than always using a single style regardless of the field. For example, if a </w:t>
+        <w:t xml:space="preserve">. However, if the context is for a single text field that is using a style, FLEx will use the style of the field for the before/after text. This generally gives better results than always using a single style regardless of the field. For example, if a </w:t>
       </w:r>
       <w:r>
         <w:t xml:space="preserve">Lexeme Form field in an IPA writing system is used, and that field is assigned the Dictionary-Pronunciation style which is set to red, and the field has square brackets in the before/after content, the result will be </w:t>
@@ -5539,6 +5514,7 @@
         <w:pStyle w:val="ListLetter"/>
       </w:pPr>
       <w:r>
+        <w:lastRenderedPageBreak/>
         <w:t>Before text (space) on Senses</w:t>
       </w:r>
     </w:p>
@@ -5579,7 +5555,6 @@
         <w:pStyle w:val="ListLetter"/>
       </w:pPr>
       <w:r>
-        <w:lastRenderedPageBreak/>
         <w:t>Text from Example Sentence in French</w:t>
       </w:r>
     </w:p>
@@ -5930,7 +5905,11 @@
         <w:t>Typically</w:t>
       </w:r>
       <w:r>
-        <w:t xml:space="preserve">, it would be nice to include the last headword from the previous page. </w:t>
+        <w:t xml:space="preserve">, it would be nice to include the last headword from the </w:t>
+      </w:r>
+      <w:r>
+        <w:lastRenderedPageBreak/>
+        <w:t xml:space="preserve">previous page. </w:t>
       </w:r>
       <w:r>
         <w:t xml:space="preserve">Unfortunately, </w:t>
@@ -5991,11 +5970,7 @@
         <w:pStyle w:val="BodyText"/>
       </w:pPr>
       <w:r>
-        <w:t xml:space="preserve">Note that the default FLEx configuration uses Dictionary-Headword for the Headword style for subentries, which is identical to default settings for main and minor entry headwords. It is not </w:t>
-      </w:r>
-      <w:r>
-        <w:lastRenderedPageBreak/>
-        <w:t>desirable for subentry headwords to be in guidewords since they often do not follow the normal alphabetical order of main headwords. The FLEx Word export automatically switches subentry headwords to use a Subheadword style to avoid these undesirable guidewords. If you happen to change the subentry headword style in FLEx, it will still get changed to Subheadword during the export</w:t>
+        <w:t>Note that the default FLEx configuration uses Dictionary-Headword for the Headword style for subentries, which is identical to default settings for main and minor entry headwords. It is not desirable for subentry headwords to be in guidewords since they often do not follow the normal alphabetical order of main headwords. The FLEx Word export automatically switches subentry headwords to use a Subheadword style to avoid these undesirable guidewords. If you happen to change the subentry headword style in FLEx, it will still get changed to Subheadword during the export</w:t>
       </w:r>
       <w:r>
         <w:t xml:space="preserve"> and keep your style’s properties</w:t>
@@ -6129,6 +6104,7 @@
         <w:rPr>
           <w:noProof/>
         </w:rPr>
+        <w:lastRenderedPageBreak/>
         <w:drawing>
           <wp:inline distT="0" distB="0" distL="0" distR="0" wp14:anchorId="16EC069F" wp14:editId="77C6BAB4">
             <wp:extent cx="4496427" cy="1400370"/>
@@ -6192,11 +6168,7 @@
         <w:t xml:space="preserve"> it doesn’t show anything. </w:t>
       </w:r>
       <w:r>
-        <w:t xml:space="preserve">If you </w:t>
-      </w:r>
-      <w:r>
-        <w:lastRenderedPageBreak/>
-        <w:t xml:space="preserve">follow the steps in section </w:t>
+        <w:t xml:space="preserve">If you follow the steps in section </w:t>
       </w:r>
       <w:r>
         <w:fldChar w:fldCharType="begin"/>
@@ -6235,6 +6207,9 @@
         <w:t>‎</w:t>
       </w:r>
       <w:r>
+        <w:t>2.3.4</w:t>
+      </w:r>
+      <w:r>
         <w:fldChar w:fldCharType="end"/>
       </w:r>
       <w:r>
@@ -6513,6 +6488,9 @@
         <w:t>‎</w:t>
       </w:r>
       <w:r>
+        <w:t>3.3.1</w:t>
+      </w:r>
+      <w:r>
         <w:fldChar w:fldCharType="end"/>
       </w:r>
       <w:r>
@@ -6536,6 +6514,7 @@
         <w:pStyle w:val="BodyText"/>
       </w:pPr>
       <w:r>
+        <w:lastRenderedPageBreak/>
         <w:t xml:space="preserve">When the letter </w:t>
       </w:r>
       <w:r>
@@ -6716,7 +6695,6 @@
         <w:t xml:space="preserve"> </w:t>
       </w:r>
       <w:r>
-        <w:lastRenderedPageBreak/>
         <w:t xml:space="preserve">again. </w:t>
       </w:r>
       <w:r>
@@ -6801,7 +6779,13 @@
         <w:t xml:space="preserve"> 1” maximum width and height. </w:t>
       </w:r>
       <w:r>
-        <w:t xml:space="preserve">Any Pictures node will affect all pictures in the dictionary for this view. </w:t>
+        <w:t xml:space="preserve">Any Pictures node will affect all pictures in the dictionary for this </w:t>
+      </w:r>
+      <w:r>
+        <w:t>layout</w:t>
+      </w:r>
+      <w:r>
+        <w:t xml:space="preserve">. </w:t>
       </w:r>
       <w:r>
         <w:t>Pictures will not be enlarged beyond their resolution, but if they are too big, they will be reduced, maintaining aspect ratio, until they do not exceed the two maximum values.</w:t>
@@ -6975,6 +6959,7 @@
         <w:rPr>
           <w:noProof/>
         </w:rPr>
+        <w:lastRenderedPageBreak/>
         <w:drawing>
           <wp:inline distT="0" distB="0" distL="0" distR="0" wp14:anchorId="04B5FFF8" wp14:editId="46009866">
             <wp:extent cx="1289685" cy="1342595"/>
@@ -7058,11 +7043,7 @@
         <w:t xml:space="preserve">is </w:t>
       </w:r>
       <w:r>
-        <w:t xml:space="preserve">in a single entry in a letter section, the </w:t>
-      </w:r>
-      <w:r>
-        <w:lastRenderedPageBreak/>
-        <w:t xml:space="preserve">picture will go to the right column instead of staying in the left column. </w:t>
+        <w:t xml:space="preserve">in a single entry in a letter section, the picture will go to the right column instead of staying in the left column. </w:t>
       </w:r>
       <w:r>
         <w:t xml:space="preserve">If you want to force the picture to be under the entry paragraph, you can drag the </w:t>
@@ -7280,7 +7261,11 @@
         <w:t>Note</w:t>
       </w:r>
       <w:r>
-        <w:t xml:space="preserve">, however, if you are using subentry reversal items, it’s common to have the main items without references. These should not be deleted! </w:t>
+        <w:t xml:space="preserve">, however, if you are using subentry reversal items, it’s common to have the main items </w:t>
+      </w:r>
+      <w:r>
+        <w:lastRenderedPageBreak/>
+        <w:t xml:space="preserve">without references. These should not be deleted! </w:t>
       </w:r>
       <w:r>
         <w:t xml:space="preserve">When done, clear the filter. This process needs to be done </w:t>
@@ -7355,7 +7340,6 @@
       </w:pPr>
       <w:bookmarkStart w:id="23" w:name="_Toc196376620"/>
       <w:r>
-        <w:lastRenderedPageBreak/>
         <w:t>Useful features in Word</w:t>
       </w:r>
       <w:bookmarkEnd w:id="23"/>
@@ -7493,7 +7477,11 @@
         <w:t xml:space="preserve">Alternately, you can move the mouse to the right of the style in the stylesheet and click the triangle menu button. </w:t>
       </w:r>
       <w:r>
-        <w:t>This brings up the Modify Style dialog where you can change the name and basic characteristics of the style. For more complete cont</w:t>
+        <w:t xml:space="preserve">This brings up the Modify Style dialog where you can change the name and basic characteristics </w:t>
+      </w:r>
+      <w:r>
+        <w:lastRenderedPageBreak/>
+        <w:t>of the style. For more complete cont</w:t>
       </w:r>
       <w:r>
         <w:t>r</w:t>
@@ -7598,7 +7586,6 @@
         <w:pStyle w:val="Example"/>
       </w:pPr>
       <w:r>
-        <w:lastRenderedPageBreak/>
         <w:t xml:space="preserve">Sub </w:t>
       </w:r>
       <w:proofErr w:type="spellStart"/>
@@ -7784,6 +7771,9 @@
         <w:t>‎</w:t>
       </w:r>
       <w:r>
+        <w:t>3.3.1</w:t>
+      </w:r>
+      <w:r>
         <w:fldChar w:fldCharType="end"/>
       </w:r>
       <w:r>
@@ -7855,6 +7845,7 @@
       <w:bookmarkStart w:id="32" w:name="_Ref143765894"/>
       <w:bookmarkStart w:id="33" w:name="_Toc196376625"/>
       <w:r>
+        <w:lastRenderedPageBreak/>
         <w:t>Replacing styles</w:t>
       </w:r>
       <w:bookmarkEnd w:id="32"/>
@@ -7943,7 +7934,6 @@
       </w:pPr>
       <w:bookmarkStart w:id="34" w:name="_Toc196376626"/>
       <w:r>
-        <w:lastRenderedPageBreak/>
         <w:t>Special codes</w:t>
       </w:r>
       <w:bookmarkEnd w:id="34"/>
@@ -9249,6 +9239,7 @@
                 <w:b/>
                 <w:bCs/>
               </w:rPr>
+              <w:lastRenderedPageBreak/>
               <w:t>^y</w:t>
             </w:r>
           </w:p>
@@ -9509,7 +9500,6 @@
         <w:pStyle w:val="BodyText"/>
       </w:pPr>
       <w:r>
-        <w:lastRenderedPageBreak/>
         <w:t>In the Find</w:t>
       </w:r>
       <w:r>
@@ -10673,6 +10663,7 @@
                 <w:b/>
                 <w:bCs/>
               </w:rPr>
+              <w:lastRenderedPageBreak/>
               <w:t>^</w:t>
             </w:r>
             <w:r>
@@ -11462,7 +11453,6 @@
                 <w:b/>
                 <w:bCs/>
               </w:rPr>
-              <w:lastRenderedPageBreak/>
               <w:t>^~</w:t>
             </w:r>
           </w:p>
@@ -11928,6 +11918,7 @@
       <w:bookmarkStart w:id="36" w:name="_Ref143765840"/>
       <w:bookmarkStart w:id="37" w:name="_Toc196376628"/>
       <w:r>
+        <w:lastRenderedPageBreak/>
         <w:t>Adding text before or after a style</w:t>
       </w:r>
       <w:bookmarkEnd w:id="36"/>
@@ -12049,11 +12040,7 @@
         <w:t xml:space="preserve">[] </w:t>
       </w:r>
       <w:r>
-        <w:t xml:space="preserve">style). The </w:t>
-      </w:r>
-      <w:r>
-        <w:lastRenderedPageBreak/>
-        <w:t xml:space="preserve">Replace operation will keep the </w:t>
+        <w:t xml:space="preserve">style). The Replace operation will keep the </w:t>
       </w:r>
       <w:r>
         <w:t xml:space="preserve">Example </w:t>
@@ -12385,6 +12372,9 @@
       </w:r>
       <w:r>
         <w:br/>
+      </w:r>
+      <w:r>
+        <w:lastRenderedPageBreak/>
         <w:t xml:space="preserve">                If .Found = False Then </w:t>
       </w:r>
       <w:proofErr w:type="spellStart"/>
@@ -12522,7 +12512,6 @@
         <w:pStyle w:val="BodyText"/>
       </w:pPr>
       <w:r>
-        <w:lastRenderedPageBreak/>
         <w:t xml:space="preserve">Once </w:t>
       </w:r>
       <w:r>
@@ -12757,6 +12746,7 @@
         <w:pStyle w:val="BodyText"/>
       </w:pPr>
       <w:r>
+        <w:lastRenderedPageBreak/>
         <w:t>After</w:t>
       </w:r>
       <w:r>
@@ -12984,7 +12974,6 @@
         <w:pStyle w:val="BodyText"/>
       </w:pPr>
       <w:r>
-        <w:lastRenderedPageBreak/>
         <w:t xml:space="preserve">We now have a macro that can be run to find the next occurrence and fix the brackets. What we need </w:t>
       </w:r>
       <w:r>
@@ -13437,7 +13426,11 @@
         <w:t xml:space="preserve">Before executing this macro, make sure the Advanced Find dialog is set to search for the Emphasis style. Assuming your file still has the first occurrence changed from recording the macro, place your cursor after that occurrence, then use </w:t>
       </w:r>
       <w:r>
-        <w:t xml:space="preserve">View &gt; Macros &gt; View Macros, and click </w:t>
+        <w:t xml:space="preserve">View &gt; Macros &gt; View Macros, and </w:t>
+      </w:r>
+      <w:r>
+        <w:lastRenderedPageBreak/>
+        <w:t xml:space="preserve">click </w:t>
       </w:r>
       <w:proofErr w:type="spellStart"/>
       <w:r>
@@ -13528,7 +13521,6 @@
       </w:pPr>
       <w:bookmarkStart w:id="49" w:name="_Toc196376633"/>
       <w:r>
-        <w:lastRenderedPageBreak/>
         <w:t>Bidirectional dictionaries in Word</w:t>
       </w:r>
       <w:bookmarkEnd w:id="49"/>
@@ -13704,6 +13696,7 @@
       <w:bookmarkStart w:id="50" w:name="_Ref143851345"/>
       <w:bookmarkStart w:id="51" w:name="_Toc196376634"/>
       <w:r>
+        <w:lastRenderedPageBreak/>
         <w:t>Enabling right-to-left publications in Word</w:t>
       </w:r>
       <w:bookmarkEnd w:id="50"/>
@@ -13811,11 +13804,7 @@
         <w:t xml:space="preserve"> </w:t>
       </w:r>
       <w:r>
-        <w:t xml:space="preserve">You do not need to install the other options such as speech recognition and proofing options. You can then click OK to </w:t>
-      </w:r>
-      <w:r>
-        <w:lastRenderedPageBreak/>
-        <w:t>c</w:t>
+        <w:t>You do not need to install the other options such as speech recognition and proofing options. You can then click OK to c</w:t>
       </w:r>
       <w:r>
         <w:t>l</w:t>
@@ -14080,7 +14069,11 @@
         <w:t>.</w:t>
       </w:r>
       <w:r>
-        <w:t xml:space="preserve"> This is critical for RTL documents so that the first column on the page is on the right side.</w:t>
+        <w:t xml:space="preserve"> This is critical for </w:t>
+      </w:r>
+      <w:r>
+        <w:lastRenderedPageBreak/>
+        <w:t>RTL documents so that the first column on the page is on the right side.</w:t>
       </w:r>
       <w:r>
         <w:t xml:space="preserve"> FLEx sets this automatically during export of RTL documents, so this step is not necessary for Word exports.</w:t>
@@ -14167,7 +14160,6 @@
         <w:rPr>
           <w:noProof/>
         </w:rPr>
-        <w:lastRenderedPageBreak/>
         <w:drawing>
           <wp:inline distT="0" distB="0" distL="0" distR="0" wp14:anchorId="123F01ED" wp14:editId="16399314">
             <wp:extent cx="4153480" cy="924054"/>
@@ -14363,6 +14355,7 @@
         <w:rPr>
           <w:noProof/>
         </w:rPr>
+        <w:lastRenderedPageBreak/>
         <w:t xml:space="preserve"> </w:t>
       </w:r>
       <w:r>
@@ -14615,7 +14608,6 @@
               <w:pStyle w:val="BodyText"/>
             </w:pPr>
             <w:r>
-              <w:lastRenderedPageBreak/>
               <w:t>RLM</w:t>
             </w:r>
           </w:p>
@@ -15121,6 +15113,7 @@
               <w:pStyle w:val="BodyText"/>
             </w:pPr>
             <w:r>
+              <w:lastRenderedPageBreak/>
               <w:t>FSI</w:t>
             </w:r>
           </w:p>
@@ -15347,11 +15340,7 @@
         <w:t xml:space="preserve"> to</w:t>
       </w:r>
       <w:r>
-        <w:t xml:space="preserve"> export to </w:t>
-      </w:r>
-      <w:r>
-        <w:lastRenderedPageBreak/>
-        <w:t xml:space="preserve">Word, they cannot be used. </w:t>
+        <w:t xml:space="preserve"> export to Word, they cannot be used. </w:t>
       </w:r>
       <w:r>
         <w:t>E</w:t>
@@ -15617,7 +15606,11 @@
         <w:t>s</w:t>
       </w:r>
       <w:r>
-        <w:t xml:space="preserve"> out the pieces going right-to-left, we have the headword, then the open square bracket, the pronunciation, the closing square bracket, the category, the period, and then the definition. We could get the desired output by putting </w:t>
+        <w:t xml:space="preserve"> out the pieces going right-to-left, we have the headword, then the open square bracket, the pronunciation, the closing square bracket, the </w:t>
+      </w:r>
+      <w:r>
+        <w:lastRenderedPageBreak/>
+        <w:t xml:space="preserve">category, the period, and then the definition. We could get the desired output by putting </w:t>
       </w:r>
       <w:r>
         <w:t>the period in Before text and putting in backward square brackets in the Before and After. But this is technically not correct, and will cause other problems along the way.</w:t>
@@ -15952,11 +15945,7 @@
         <w:t>FLEx</w:t>
       </w:r>
       <w:r>
-        <w:t xml:space="preserve">, but now there is a positioning problem. The pronunciation is an entry field and should follow the headword. But in </w:t>
-      </w:r>
-      <w:r>
-        <w:lastRenderedPageBreak/>
-        <w:t>this case the category is following the headword. The bidi algorithm sees the headword and category as one LTR string, which ends up with the wrong order.</w:t>
+        <w:t>, but now there is a positioning problem. The pronunciation is an entry field and should follow the headword. But in this case the category is following the headword. The bidi algorithm sees the headword and category as one LTR string, which ends up with the wrong order.</w:t>
       </w:r>
     </w:p>
     <w:p>
@@ -16311,7 +16300,11 @@
         <w:t xml:space="preserve"> </w:t>
       </w:r>
       <w:r>
-        <w:t xml:space="preserve">that will likely be encountered when configuring Bidi dictionaries in FLEx, and some specific challenges when using Word. Any time you add Before and After fields, there is a good possibility you will need to use some of the </w:t>
+        <w:t xml:space="preserve">that will likely be encountered when configuring Bidi dictionaries in FLEx, and some specific challenges when using Word. Any time you add Before and After fields, there is a good possibility you will need to use some </w:t>
+      </w:r>
+      <w:r>
+        <w:lastRenderedPageBreak/>
+        <w:t xml:space="preserve">of the </w:t>
       </w:r>
       <w:r>
         <w:t>B</w:t>
@@ -16568,7 +16561,7 @@
       <w:rPr>
         <w:noProof/>
       </w:rPr>
-      <w:t>6/2/2025</w:t>
+      <w:t>2/9/2026</w:t>
     </w:r>
     <w:r>
       <w:fldChar w:fldCharType="end"/>
@@ -16615,7 +16608,7 @@
         <w:rStyle w:val="PageNumber"/>
         <w:noProof/>
       </w:rPr>
-      <w:t>6/2/2025</w:t>
+      <w:t>2/9/2026</w:t>
     </w:r>
     <w:r>
       <w:rPr>
@@ -16791,29 +16784,15 @@
       </w:rPr>
       <w:tab/>
     </w:r>
-    <w:r>
-      <w:fldChar w:fldCharType="begin"/>
-    </w:r>
-    <w:r>
-      <w:instrText xml:space="preserve"> STYLEREF "Heading 1" \* MERGEFORMAT </w:instrText>
-    </w:r>
-    <w:r>
-      <w:fldChar w:fldCharType="separate"/>
-    </w:r>
-    <w:r>
-      <w:rPr>
-        <w:rStyle w:val="PageNumber"/>
-        <w:noProof/>
-      </w:rPr>
-      <w:t>Introduction</w:t>
-    </w:r>
-    <w:r>
-      <w:rPr>
-        <w:rStyle w:val="PageNumber"/>
-        <w:noProof/>
-      </w:rPr>
-      <w:fldChar w:fldCharType="end"/>
-    </w:r>
+    <w:fldSimple w:instr=" STYLEREF &quot;Heading 1&quot; \* MERGEFORMAT ">
+      <w:r>
+        <w:rPr>
+          <w:rStyle w:val="PageNumber"/>
+          <w:noProof/>
+        </w:rPr>
+        <w:t>Introduction</w:t>
+      </w:r>
+    </w:fldSimple>
   </w:p>
 </w:hdr>
 </file>
@@ -20108,7 +20087,7 @@
 </file>
 
 <file path=customXml/itemProps1.xml><?xml version="1.0" encoding="utf-8"?>
-<ds:datastoreItem xmlns:ds="http://schemas.openxmlformats.org/officeDocument/2006/customXml" ds:itemID="{6753B158-5866-4A4F-9B69-F5BDC447450E}">
+<ds:datastoreItem xmlns:ds="http://schemas.openxmlformats.org/officeDocument/2006/customXml" ds:itemID="{3370B469-71A8-43CE-8B33-87E32034176E}">
   <ds:schemaRefs>
     <ds:schemaRef ds:uri="http://schemas.openxmlformats.org/officeDocument/2006/bibliography"/>
   </ds:schemaRefs>

</xml_diff>

<commit_message>
Updated S/R and Word Export technical documents
Added some new sections to each document.

Change-Id: I4ba340e1c2464b912679ec91ff97c9f853a20c64
</commit_message>
<xml_diff>
--- a/HelpResourcesSources/TechnicalNotes/Publishing FLEx Dictionaries Using Microsoft Word.docx
+++ b/HelpResourcesSources/TechnicalNotes/Publishing FLEx Dictionaries Using Microsoft Word.docx
@@ -6,14 +6,9 @@
       <w:pPr>
         <w:pStyle w:val="Title"/>
       </w:pPr>
-      <w:bookmarkStart w:id="0" w:name="_Toc196376604"/>
-      <w:r>
-        <w:t xml:space="preserve">Publishing FLEx Dictionaries Using </w:t>
-      </w:r>
-      <w:bookmarkStart w:id="1" w:name="_GoBack"/>
-      <w:bookmarkEnd w:id="1"/>
-      <w:r>
-        <w:t>Microsoft Word</w:t>
+      <w:bookmarkStart w:id="0" w:name="_Toc237520916"/>
+      <w:r>
+        <w:t>Publishing FLEx Dictionaries Using Microsoft Word</w:t>
       </w:r>
       <w:bookmarkEnd w:id="0"/>
     </w:p>
@@ -36,7 +31,19 @@
         <w:rPr>
           <w:szCs w:val="36"/>
         </w:rPr>
-        <w:t>February 9, 2026</w:t>
+        <w:t>August 1</w:t>
+      </w:r>
+      <w:r>
+        <w:rPr>
+          <w:szCs w:val="36"/>
+        </w:rPr>
+        <w:t>3</w:t>
+      </w:r>
+      <w:r>
+        <w:rPr>
+          <w:szCs w:val="36"/>
+        </w:rPr>
+        <w:t>, 2026</w:t>
       </w:r>
     </w:p>
     <w:p>
@@ -59,6 +66,8 @@
         <w:fldChar w:fldCharType="separate"/>
       </w:r>
     </w:p>
+    <w:bookmarkStart w:id="1" w:name="_GoBack"/>
+    <w:bookmarkEnd w:id="1"/>
     <w:p>
       <w:pPr>
         <w:pStyle w:val="TOC1"/>
@@ -70,66 +79,110 @@
           <w:noProof/>
           <w:sz w:val="22"/>
           <w:szCs w:val="22"/>
-          <w:lang w:eastAsia="en-US"/>
         </w:rPr>
       </w:pPr>
-      <w:hyperlink w:anchor="_Toc196376604" w:history="1">
-        <w:r>
-          <w:rPr>
-            <w:rStyle w:val="Hyperlink"/>
-            <w:noProof/>
-          </w:rPr>
-          <w:t>Publishing FLEx Dictionaries Using Microsoft Word</w:t>
-        </w:r>
-        <w:r>
-          <w:rPr>
-            <w:noProof/>
-            <w:webHidden/>
-          </w:rPr>
-          <w:tab/>
-        </w:r>
-        <w:r>
-          <w:rPr>
-            <w:noProof/>
-            <w:webHidden/>
-          </w:rPr>
-          <w:fldChar w:fldCharType="begin"/>
-        </w:r>
-        <w:r>
-          <w:rPr>
-            <w:noProof/>
-            <w:webHidden/>
-          </w:rPr>
-          <w:instrText xml:space="preserve"> PAGEREF _Toc196376604 \h </w:instrText>
-        </w:r>
-        <w:r>
-          <w:rPr>
-            <w:noProof/>
-            <w:webHidden/>
-          </w:rPr>
-        </w:r>
-        <w:r>
-          <w:rPr>
-            <w:noProof/>
-            <w:webHidden/>
-          </w:rPr>
-          <w:fldChar w:fldCharType="separate"/>
-        </w:r>
-        <w:r>
-          <w:rPr>
-            <w:noProof/>
-            <w:webHidden/>
-          </w:rPr>
-          <w:t>1</w:t>
-        </w:r>
-        <w:r>
-          <w:rPr>
-            <w:noProof/>
-            <w:webHidden/>
-          </w:rPr>
-          <w:fldChar w:fldCharType="end"/>
-        </w:r>
-      </w:hyperlink>
+      <w:r>
+        <w:rPr>
+          <w:rStyle w:val="Hyperlink"/>
+          <w:noProof/>
+        </w:rPr>
+        <w:fldChar w:fldCharType="begin"/>
+      </w:r>
+      <w:r>
+        <w:rPr>
+          <w:rStyle w:val="Hyperlink"/>
+          <w:noProof/>
+        </w:rPr>
+        <w:instrText xml:space="preserve"> </w:instrText>
+      </w:r>
+      <w:r>
+        <w:rPr>
+          <w:noProof/>
+        </w:rPr>
+        <w:instrText>HYPERLINK \l "_Toc237520916"</w:instrText>
+      </w:r>
+      <w:r>
+        <w:rPr>
+          <w:rStyle w:val="Hyperlink"/>
+          <w:noProof/>
+        </w:rPr>
+        <w:instrText xml:space="preserve"> </w:instrText>
+      </w:r>
+      <w:r>
+        <w:rPr>
+          <w:rStyle w:val="Hyperlink"/>
+          <w:noProof/>
+        </w:rPr>
+      </w:r>
+      <w:r>
+        <w:rPr>
+          <w:rStyle w:val="Hyperlink"/>
+          <w:noProof/>
+        </w:rPr>
+        <w:fldChar w:fldCharType="separate"/>
+      </w:r>
+      <w:r>
+        <w:rPr>
+          <w:rStyle w:val="Hyperlink"/>
+          <w:noProof/>
+        </w:rPr>
+        <w:t>Publishing FLEx Dictionaries Using Microsoft Word</w:t>
+      </w:r>
+      <w:r>
+        <w:rPr>
+          <w:noProof/>
+          <w:webHidden/>
+        </w:rPr>
+        <w:tab/>
+      </w:r>
+      <w:r>
+        <w:rPr>
+          <w:noProof/>
+          <w:webHidden/>
+        </w:rPr>
+        <w:fldChar w:fldCharType="begin"/>
+      </w:r>
+      <w:r>
+        <w:rPr>
+          <w:noProof/>
+          <w:webHidden/>
+        </w:rPr>
+        <w:instrText xml:space="preserve"> PAGEREF _Toc237520916 \h </w:instrText>
+      </w:r>
+      <w:r>
+        <w:rPr>
+          <w:noProof/>
+          <w:webHidden/>
+        </w:rPr>
+      </w:r>
+      <w:r>
+        <w:rPr>
+          <w:noProof/>
+          <w:webHidden/>
+        </w:rPr>
+        <w:fldChar w:fldCharType="separate"/>
+      </w:r>
+      <w:r>
+        <w:rPr>
+          <w:noProof/>
+          <w:webHidden/>
+        </w:rPr>
+        <w:t>1</w:t>
+      </w:r>
+      <w:r>
+        <w:rPr>
+          <w:noProof/>
+          <w:webHidden/>
+        </w:rPr>
+        <w:fldChar w:fldCharType="end"/>
+      </w:r>
+      <w:r>
+        <w:rPr>
+          <w:rStyle w:val="Hyperlink"/>
+          <w:noProof/>
+        </w:rPr>
+        <w:fldChar w:fldCharType="end"/>
+      </w:r>
     </w:p>
     <w:p>
       <w:pPr>
@@ -143,10 +196,9 @@
           <w:noProof/>
           <w:sz w:val="22"/>
           <w:szCs w:val="22"/>
-          <w:lang w:eastAsia="en-US"/>
         </w:rPr>
       </w:pPr>
-      <w:hyperlink w:anchor="_Toc196376605" w:history="1">
+      <w:hyperlink w:anchor="_Toc237520917" w:history="1">
         <w:r>
           <w:rPr>
             <w:rStyle w:val="Hyperlink"/>
@@ -160,7 +212,6 @@
             <w:noProof/>
             <w:sz w:val="22"/>
             <w:szCs w:val="22"/>
-            <w:lang w:eastAsia="en-US"/>
           </w:rPr>
           <w:tab/>
         </w:r>
@@ -190,7 +241,7 @@
             <w:noProof/>
             <w:webHidden/>
           </w:rPr>
-          <w:instrText xml:space="preserve"> PAGEREF _Toc196376605 \h </w:instrText>
+          <w:instrText xml:space="preserve"> PAGEREF _Toc237520917 \h </w:instrText>
         </w:r>
         <w:r>
           <w:rPr>
@@ -233,10 +284,9 @@
           <w:noProof/>
           <w:sz w:val="22"/>
           <w:szCs w:val="22"/>
-          <w:lang w:eastAsia="en-US"/>
         </w:rPr>
       </w:pPr>
-      <w:hyperlink w:anchor="_Toc196376606" w:history="1">
+      <w:hyperlink w:anchor="_Toc237520918" w:history="1">
         <w:r>
           <w:rPr>
             <w:rStyle w:val="Hyperlink"/>
@@ -250,7 +300,6 @@
             <w:noProof/>
             <w:sz w:val="22"/>
             <w:szCs w:val="22"/>
-            <w:lang w:eastAsia="en-US"/>
           </w:rPr>
           <w:tab/>
         </w:r>
@@ -280,7 +329,7 @@
             <w:noProof/>
             <w:webHidden/>
           </w:rPr>
-          <w:instrText xml:space="preserve"> PAGEREF _Toc196376606 \h </w:instrText>
+          <w:instrText xml:space="preserve"> PAGEREF _Toc237520918 \h </w:instrText>
         </w:r>
         <w:r>
           <w:rPr>
@@ -323,9 +372,10 @@
           <w:noProof/>
           <w:sz w:val="22"/>
           <w:szCs w:val="22"/>
+          <w:lang w:eastAsia="zh-CN"/>
         </w:rPr>
       </w:pPr>
-      <w:hyperlink w:anchor="_Toc196376607" w:history="1">
+      <w:hyperlink w:anchor="_Toc237520919" w:history="1">
         <w:r>
           <w:rPr>
             <w:rStyle w:val="Hyperlink"/>
@@ -340,6 +390,7 @@
             <w:noProof/>
             <w:sz w:val="22"/>
             <w:szCs w:val="22"/>
+            <w:lang w:eastAsia="zh-CN"/>
           </w:rPr>
           <w:tab/>
         </w:r>
@@ -370,7 +421,7 @@
             <w:noProof/>
             <w:webHidden/>
           </w:rPr>
-          <w:instrText xml:space="preserve"> PAGEREF _Toc196376607 \h </w:instrText>
+          <w:instrText xml:space="preserve"> PAGEREF _Toc237520919 \h </w:instrText>
         </w:r>
         <w:r>
           <w:rPr>
@@ -413,10 +464,9 @@
           <w:noProof/>
           <w:sz w:val="22"/>
           <w:szCs w:val="22"/>
-          <w:lang w:eastAsia="en-US"/>
         </w:rPr>
       </w:pPr>
-      <w:hyperlink w:anchor="_Toc196376608" w:history="1">
+      <w:hyperlink w:anchor="_Toc237520920" w:history="1">
         <w:r>
           <w:rPr>
             <w:rStyle w:val="Hyperlink"/>
@@ -437,7 +487,6 @@
             <w:noProof/>
             <w:sz w:val="22"/>
             <w:szCs w:val="22"/>
-            <w:lang w:eastAsia="en-US"/>
           </w:rPr>
           <w:tab/>
         </w:r>
@@ -467,7 +516,7 @@
             <w:noProof/>
             <w:webHidden/>
           </w:rPr>
-          <w:instrText xml:space="preserve"> PAGEREF _Toc196376608 \h </w:instrText>
+          <w:instrText xml:space="preserve"> PAGEREF _Toc237520920 \h </w:instrText>
         </w:r>
         <w:r>
           <w:rPr>
@@ -510,9 +559,10 @@
           <w:noProof/>
           <w:sz w:val="22"/>
           <w:szCs w:val="22"/>
+          <w:lang w:eastAsia="zh-CN"/>
         </w:rPr>
       </w:pPr>
-      <w:hyperlink w:anchor="_Toc196376609" w:history="1">
+      <w:hyperlink w:anchor="_Toc237520921" w:history="1">
         <w:r>
           <w:rPr>
             <w:rStyle w:val="Hyperlink"/>
@@ -527,6 +577,7 @@
             <w:noProof/>
             <w:sz w:val="22"/>
             <w:szCs w:val="22"/>
+            <w:lang w:eastAsia="zh-CN"/>
           </w:rPr>
           <w:tab/>
         </w:r>
@@ -557,7 +608,7 @@
             <w:noProof/>
             <w:webHidden/>
           </w:rPr>
-          <w:instrText xml:space="preserve"> PAGEREF _Toc196376609 \h </w:instrText>
+          <w:instrText xml:space="preserve"> PAGEREF _Toc237520921 \h </w:instrText>
         </w:r>
         <w:r>
           <w:rPr>
@@ -600,9 +651,10 @@
           <w:noProof/>
           <w:sz w:val="22"/>
           <w:szCs w:val="22"/>
+          <w:lang w:eastAsia="zh-CN"/>
         </w:rPr>
       </w:pPr>
-      <w:hyperlink w:anchor="_Toc196376610" w:history="1">
+      <w:hyperlink w:anchor="_Toc237520922" w:history="1">
         <w:r>
           <w:rPr>
             <w:rStyle w:val="Hyperlink"/>
@@ -617,6 +669,7 @@
             <w:noProof/>
             <w:sz w:val="22"/>
             <w:szCs w:val="22"/>
+            <w:lang w:eastAsia="zh-CN"/>
           </w:rPr>
           <w:tab/>
         </w:r>
@@ -647,7 +700,7 @@
             <w:noProof/>
             <w:webHidden/>
           </w:rPr>
-          <w:instrText xml:space="preserve"> PAGEREF _Toc196376610 \h </w:instrText>
+          <w:instrText xml:space="preserve"> PAGEREF _Toc237520922 \h </w:instrText>
         </w:r>
         <w:r>
           <w:rPr>
@@ -690,10 +743,9 @@
           <w:noProof/>
           <w:sz w:val="22"/>
           <w:szCs w:val="22"/>
-          <w:lang w:eastAsia="en-US"/>
         </w:rPr>
       </w:pPr>
-      <w:hyperlink w:anchor="_Toc196376611" w:history="1">
+      <w:hyperlink w:anchor="_Toc237520923" w:history="1">
         <w:r>
           <w:rPr>
             <w:rStyle w:val="Hyperlink"/>
@@ -714,7 +766,6 @@
             <w:noProof/>
             <w:sz w:val="22"/>
             <w:szCs w:val="22"/>
-            <w:lang w:eastAsia="en-US"/>
           </w:rPr>
           <w:tab/>
         </w:r>
@@ -744,7 +795,7 @@
             <w:noProof/>
             <w:webHidden/>
           </w:rPr>
-          <w:instrText xml:space="preserve"> PAGEREF _Toc196376611 \h </w:instrText>
+          <w:instrText xml:space="preserve"> PAGEREF _Toc237520923 \h </w:instrText>
         </w:r>
         <w:r>
           <w:rPr>
@@ -787,10 +838,9 @@
           <w:noProof/>
           <w:sz w:val="22"/>
           <w:szCs w:val="22"/>
-          <w:lang w:eastAsia="en-US"/>
         </w:rPr>
       </w:pPr>
-      <w:hyperlink w:anchor="_Toc196376612" w:history="1">
+      <w:hyperlink w:anchor="_Toc237520924" w:history="1">
         <w:r>
           <w:rPr>
             <w:rStyle w:val="Hyperlink"/>
@@ -811,7 +861,6 @@
             <w:noProof/>
             <w:sz w:val="22"/>
             <w:szCs w:val="22"/>
-            <w:lang w:eastAsia="en-US"/>
           </w:rPr>
           <w:tab/>
         </w:r>
@@ -841,7 +890,7 @@
             <w:noProof/>
             <w:webHidden/>
           </w:rPr>
-          <w:instrText xml:space="preserve"> PAGEREF _Toc196376612 \h </w:instrText>
+          <w:instrText xml:space="preserve"> PAGEREF _Toc237520924 \h </w:instrText>
         </w:r>
         <w:r>
           <w:rPr>
@@ -884,9 +933,10 @@
           <w:noProof/>
           <w:sz w:val="22"/>
           <w:szCs w:val="22"/>
+          <w:lang w:eastAsia="zh-CN"/>
         </w:rPr>
       </w:pPr>
-      <w:hyperlink w:anchor="_Toc196376613" w:history="1">
+      <w:hyperlink w:anchor="_Toc237520925" w:history="1">
         <w:r>
           <w:rPr>
             <w:rStyle w:val="Hyperlink"/>
@@ -901,6 +951,7 @@
             <w:noProof/>
             <w:sz w:val="22"/>
             <w:szCs w:val="22"/>
+            <w:lang w:eastAsia="zh-CN"/>
           </w:rPr>
           <w:tab/>
         </w:r>
@@ -931,7 +982,7 @@
             <w:noProof/>
             <w:webHidden/>
           </w:rPr>
-          <w:instrText xml:space="preserve"> PAGEREF _Toc196376613 \h </w:instrText>
+          <w:instrText xml:space="preserve"> PAGEREF _Toc237520925 \h </w:instrText>
         </w:r>
         <w:r>
           <w:rPr>
@@ -974,10 +1025,9 @@
           <w:noProof/>
           <w:sz w:val="22"/>
           <w:szCs w:val="22"/>
-          <w:lang w:eastAsia="en-US"/>
         </w:rPr>
       </w:pPr>
-      <w:hyperlink w:anchor="_Toc196376614" w:history="1">
+      <w:hyperlink w:anchor="_Toc237520926" w:history="1">
         <w:r>
           <w:rPr>
             <w:rStyle w:val="Hyperlink"/>
@@ -998,7 +1048,6 @@
             <w:noProof/>
             <w:sz w:val="22"/>
             <w:szCs w:val="22"/>
-            <w:lang w:eastAsia="en-US"/>
           </w:rPr>
           <w:tab/>
         </w:r>
@@ -1028,7 +1077,7 @@
             <w:noProof/>
             <w:webHidden/>
           </w:rPr>
-          <w:instrText xml:space="preserve"> PAGEREF _Toc196376614 \h </w:instrText>
+          <w:instrText xml:space="preserve"> PAGEREF _Toc237520926 \h </w:instrText>
         </w:r>
         <w:r>
           <w:rPr>
@@ -1049,6 +1098,98 @@
             <w:webHidden/>
           </w:rPr>
           <w:t>9</w:t>
+        </w:r>
+        <w:r>
+          <w:rPr>
+            <w:noProof/>
+            <w:webHidden/>
+          </w:rPr>
+          <w:fldChar w:fldCharType="end"/>
+        </w:r>
+      </w:hyperlink>
+    </w:p>
+    <w:p>
+      <w:pPr>
+        <w:pStyle w:val="TOC4"/>
+        <w:tabs>
+          <w:tab w:val="left" w:pos="1760"/>
+          <w:tab w:val="right" w:leader="dot" w:pos="9350"/>
+        </w:tabs>
+        <w:rPr>
+          <w:rFonts w:asciiTheme="minorHAnsi" w:eastAsiaTheme="minorEastAsia" w:hAnsiTheme="minorHAnsi" w:cstheme="minorBidi"/>
+          <w:noProof/>
+          <w:sz w:val="22"/>
+          <w:szCs w:val="22"/>
+          <w:lang w:eastAsia="zh-CN"/>
+        </w:rPr>
+      </w:pPr>
+      <w:hyperlink w:anchor="_Toc237520927" w:history="1">
+        <w:r>
+          <w:rPr>
+            <w:rStyle w:val="Hyperlink"/>
+            <w:rFonts w:eastAsia="SimSun"/>
+            <w:noProof/>
+          </w:rPr>
+          <w:t>2.3.3.1</w:t>
+        </w:r>
+        <w:r>
+          <w:rPr>
+            <w:rFonts w:asciiTheme="minorHAnsi" w:eastAsiaTheme="minorEastAsia" w:hAnsiTheme="minorHAnsi" w:cstheme="minorBidi"/>
+            <w:noProof/>
+            <w:sz w:val="22"/>
+            <w:szCs w:val="22"/>
+            <w:lang w:eastAsia="zh-CN"/>
+          </w:rPr>
+          <w:tab/>
+        </w:r>
+        <w:r>
+          <w:rPr>
+            <w:rStyle w:val="Hyperlink"/>
+            <w:rFonts w:eastAsia="SimSun"/>
+            <w:noProof/>
+          </w:rPr>
+          <w:t>Changing Headers and Footers</w:t>
+        </w:r>
+        <w:r>
+          <w:rPr>
+            <w:noProof/>
+            <w:webHidden/>
+          </w:rPr>
+          <w:tab/>
+        </w:r>
+        <w:r>
+          <w:rPr>
+            <w:noProof/>
+            <w:webHidden/>
+          </w:rPr>
+          <w:fldChar w:fldCharType="begin"/>
+        </w:r>
+        <w:r>
+          <w:rPr>
+            <w:noProof/>
+            <w:webHidden/>
+          </w:rPr>
+          <w:instrText xml:space="preserve"> PAGEREF _Toc237520927 \h </w:instrText>
+        </w:r>
+        <w:r>
+          <w:rPr>
+            <w:noProof/>
+            <w:webHidden/>
+          </w:rPr>
+        </w:r>
+        <w:r>
+          <w:rPr>
+            <w:noProof/>
+            <w:webHidden/>
+          </w:rPr>
+          <w:fldChar w:fldCharType="separate"/>
+        </w:r>
+        <w:r>
+          <w:rPr>
+            <w:noProof/>
+            <w:webHidden/>
+          </w:rPr>
+          <w:t>11</w:t>
         </w:r>
         <w:r>
           <w:rPr>
@@ -1071,10 +1212,9 @@
           <w:noProof/>
           <w:sz w:val="22"/>
           <w:szCs w:val="22"/>
-          <w:lang w:eastAsia="en-US"/>
         </w:rPr>
       </w:pPr>
-      <w:hyperlink w:anchor="_Toc196376615" w:history="1">
+      <w:hyperlink w:anchor="_Toc237520928" w:history="1">
         <w:r>
           <w:rPr>
             <w:rStyle w:val="Hyperlink"/>
@@ -1095,7 +1235,6 @@
             <w:noProof/>
             <w:sz w:val="22"/>
             <w:szCs w:val="22"/>
-            <w:lang w:eastAsia="en-US"/>
           </w:rPr>
           <w:tab/>
         </w:r>
@@ -1125,7 +1264,7 @@
             <w:noProof/>
             <w:webHidden/>
           </w:rPr>
-          <w:instrText xml:space="preserve"> PAGEREF _Toc196376615 \h </w:instrText>
+          <w:instrText xml:space="preserve"> PAGEREF _Toc237520928 \h </w:instrText>
         </w:r>
         <w:r>
           <w:rPr>
@@ -1168,10 +1307,9 @@
           <w:noProof/>
           <w:sz w:val="22"/>
           <w:szCs w:val="22"/>
-          <w:lang w:eastAsia="en-US"/>
         </w:rPr>
       </w:pPr>
-      <w:hyperlink w:anchor="_Toc196376616" w:history="1">
+      <w:hyperlink w:anchor="_Toc237520929" w:history="1">
         <w:r>
           <w:rPr>
             <w:rStyle w:val="Hyperlink"/>
@@ -1192,7 +1330,6 @@
             <w:noProof/>
             <w:sz w:val="22"/>
             <w:szCs w:val="22"/>
-            <w:lang w:eastAsia="en-US"/>
           </w:rPr>
           <w:tab/>
         </w:r>
@@ -1222,7 +1359,7 @@
             <w:noProof/>
             <w:webHidden/>
           </w:rPr>
-          <w:instrText xml:space="preserve"> PAGEREF _Toc196376616 \h </w:instrText>
+          <w:instrText xml:space="preserve"> PAGEREF _Toc237520929 \h </w:instrText>
         </w:r>
         <w:r>
           <w:rPr>
@@ -1242,7 +1379,7 @@
             <w:noProof/>
             <w:webHidden/>
           </w:rPr>
-          <w:t>11</w:t>
+          <w:t>12</w:t>
         </w:r>
         <w:r>
           <w:rPr>
@@ -1265,10 +1402,9 @@
           <w:noProof/>
           <w:sz w:val="22"/>
           <w:szCs w:val="22"/>
-          <w:lang w:eastAsia="en-US"/>
         </w:rPr>
       </w:pPr>
-      <w:hyperlink w:anchor="_Toc196376617" w:history="1">
+      <w:hyperlink w:anchor="_Toc237520930" w:history="1">
         <w:r>
           <w:rPr>
             <w:rStyle w:val="Hyperlink"/>
@@ -1289,7 +1425,6 @@
             <w:noProof/>
             <w:sz w:val="22"/>
             <w:szCs w:val="22"/>
-            <w:lang w:eastAsia="en-US"/>
           </w:rPr>
           <w:tab/>
         </w:r>
@@ -1319,7 +1454,7 @@
             <w:noProof/>
             <w:webHidden/>
           </w:rPr>
-          <w:instrText xml:space="preserve"> PAGEREF _Toc196376617 \h </w:instrText>
+          <w:instrText xml:space="preserve"> PAGEREF _Toc237520930 \h </w:instrText>
         </w:r>
         <w:r>
           <w:rPr>
@@ -1362,10 +1497,9 @@
           <w:noProof/>
           <w:sz w:val="22"/>
           <w:szCs w:val="22"/>
-          <w:lang w:eastAsia="en-US"/>
         </w:rPr>
       </w:pPr>
-      <w:hyperlink w:anchor="_Toc196376618" w:history="1">
+      <w:hyperlink w:anchor="_Toc237520931" w:history="1">
         <w:r>
           <w:rPr>
             <w:rStyle w:val="Hyperlink"/>
@@ -1386,7 +1520,6 @@
             <w:noProof/>
             <w:sz w:val="22"/>
             <w:szCs w:val="22"/>
-            <w:lang w:eastAsia="en-US"/>
           </w:rPr>
           <w:tab/>
         </w:r>
@@ -1416,7 +1549,7 @@
             <w:noProof/>
             <w:webHidden/>
           </w:rPr>
-          <w:instrText xml:space="preserve"> PAGEREF _Toc196376618 \h </w:instrText>
+          <w:instrText xml:space="preserve"> PAGEREF _Toc237520931 \h </w:instrText>
         </w:r>
         <w:r>
           <w:rPr>
@@ -1459,10 +1592,9 @@
           <w:noProof/>
           <w:sz w:val="22"/>
           <w:szCs w:val="22"/>
-          <w:lang w:eastAsia="en-US"/>
         </w:rPr>
       </w:pPr>
-      <w:hyperlink w:anchor="_Toc196376619" w:history="1">
+      <w:hyperlink w:anchor="_Toc237520932" w:history="1">
         <w:r>
           <w:rPr>
             <w:rStyle w:val="Hyperlink"/>
@@ -1483,7 +1615,6 @@
             <w:noProof/>
             <w:sz w:val="22"/>
             <w:szCs w:val="22"/>
-            <w:lang w:eastAsia="en-US"/>
           </w:rPr>
           <w:tab/>
         </w:r>
@@ -1513,7 +1644,7 @@
             <w:noProof/>
             <w:webHidden/>
           </w:rPr>
-          <w:instrText xml:space="preserve"> PAGEREF _Toc196376619 \h </w:instrText>
+          <w:instrText xml:space="preserve"> PAGEREF _Toc237520932 \h </w:instrText>
         </w:r>
         <w:r>
           <w:rPr>
@@ -1556,10 +1687,9 @@
           <w:noProof/>
           <w:sz w:val="22"/>
           <w:szCs w:val="22"/>
-          <w:lang w:eastAsia="en-US"/>
         </w:rPr>
       </w:pPr>
-      <w:hyperlink w:anchor="_Toc196376620" w:history="1">
+      <w:hyperlink w:anchor="_Toc237520933" w:history="1">
         <w:r>
           <w:rPr>
             <w:rStyle w:val="Hyperlink"/>
@@ -1573,7 +1703,6 @@
             <w:noProof/>
             <w:sz w:val="22"/>
             <w:szCs w:val="22"/>
-            <w:lang w:eastAsia="en-US"/>
           </w:rPr>
           <w:tab/>
         </w:r>
@@ -1603,7 +1732,7 @@
             <w:noProof/>
             <w:webHidden/>
           </w:rPr>
-          <w:instrText xml:space="preserve"> PAGEREF _Toc196376620 \h </w:instrText>
+          <w:instrText xml:space="preserve"> PAGEREF _Toc237520933 \h </w:instrText>
         </w:r>
         <w:r>
           <w:rPr>
@@ -1646,9 +1775,10 @@
           <w:noProof/>
           <w:sz w:val="22"/>
           <w:szCs w:val="22"/>
+          <w:lang w:eastAsia="zh-CN"/>
         </w:rPr>
       </w:pPr>
-      <w:hyperlink w:anchor="_Toc196376621" w:history="1">
+      <w:hyperlink w:anchor="_Toc237520934" w:history="1">
         <w:r>
           <w:rPr>
             <w:rStyle w:val="Hyperlink"/>
@@ -1663,6 +1793,7 @@
             <w:noProof/>
             <w:sz w:val="22"/>
             <w:szCs w:val="22"/>
+            <w:lang w:eastAsia="zh-CN"/>
           </w:rPr>
           <w:tab/>
         </w:r>
@@ -1693,7 +1824,7 @@
             <w:noProof/>
             <w:webHidden/>
           </w:rPr>
-          <w:instrText xml:space="preserve"> PAGEREF _Toc196376621 \h </w:instrText>
+          <w:instrText xml:space="preserve"> PAGEREF _Toc237520934 \h </w:instrText>
         </w:r>
         <w:r>
           <w:rPr>
@@ -1736,9 +1867,10 @@
           <w:noProof/>
           <w:sz w:val="22"/>
           <w:szCs w:val="22"/>
+          <w:lang w:eastAsia="zh-CN"/>
         </w:rPr>
       </w:pPr>
-      <w:hyperlink w:anchor="_Toc196376622" w:history="1">
+      <w:hyperlink w:anchor="_Toc237520935" w:history="1">
         <w:r>
           <w:rPr>
             <w:rStyle w:val="Hyperlink"/>
@@ -1753,6 +1885,7 @@
             <w:noProof/>
             <w:sz w:val="22"/>
             <w:szCs w:val="22"/>
+            <w:lang w:eastAsia="zh-CN"/>
           </w:rPr>
           <w:tab/>
         </w:r>
@@ -1783,7 +1916,7 @@
             <w:noProof/>
             <w:webHidden/>
           </w:rPr>
-          <w:instrText xml:space="preserve"> PAGEREF _Toc196376622 \h </w:instrText>
+          <w:instrText xml:space="preserve"> PAGEREF _Toc237520935 \h </w:instrText>
         </w:r>
         <w:r>
           <w:rPr>
@@ -1826,9 +1959,10 @@
           <w:noProof/>
           <w:sz w:val="22"/>
           <w:szCs w:val="22"/>
+          <w:lang w:eastAsia="zh-CN"/>
         </w:rPr>
       </w:pPr>
-      <w:hyperlink w:anchor="_Toc196376623" w:history="1">
+      <w:hyperlink w:anchor="_Toc237520936" w:history="1">
         <w:r>
           <w:rPr>
             <w:rStyle w:val="Hyperlink"/>
@@ -1843,6 +1977,7 @@
             <w:noProof/>
             <w:sz w:val="22"/>
             <w:szCs w:val="22"/>
+            <w:lang w:eastAsia="zh-CN"/>
           </w:rPr>
           <w:tab/>
         </w:r>
@@ -1873,7 +2008,7 @@
             <w:noProof/>
             <w:webHidden/>
           </w:rPr>
-          <w:instrText xml:space="preserve"> PAGEREF _Toc196376623 \h </w:instrText>
+          <w:instrText xml:space="preserve"> PAGEREF _Toc237520936 \h </w:instrText>
         </w:r>
         <w:r>
           <w:rPr>
@@ -1916,10 +2051,9 @@
           <w:noProof/>
           <w:sz w:val="22"/>
           <w:szCs w:val="22"/>
-          <w:lang w:eastAsia="en-US"/>
         </w:rPr>
       </w:pPr>
-      <w:hyperlink w:anchor="_Toc196376624" w:history="1">
+      <w:hyperlink w:anchor="_Toc237520937" w:history="1">
         <w:r>
           <w:rPr>
             <w:rStyle w:val="Hyperlink"/>
@@ -1940,7 +2074,6 @@
             <w:noProof/>
             <w:sz w:val="22"/>
             <w:szCs w:val="22"/>
-            <w:lang w:eastAsia="en-US"/>
           </w:rPr>
           <w:tab/>
         </w:r>
@@ -1957,7 +2090,7 @@
             <w:rStyle w:val="Hyperlink"/>
             <w:noProof/>
           </w:rPr>
-          <w:t>Finding styles</w:t>
+          <w:t>3.3.1Finding styles</w:t>
         </w:r>
         <w:r>
           <w:rPr>
@@ -1978,7 +2111,7 @@
             <w:noProof/>
             <w:webHidden/>
           </w:rPr>
-          <w:instrText xml:space="preserve"> PAGEREF _Toc196376624 \h </w:instrText>
+          <w:instrText xml:space="preserve"> PAGEREF _Toc237520937 \h </w:instrText>
         </w:r>
         <w:r>
           <w:rPr>
@@ -1998,7 +2131,7 @@
             <w:noProof/>
             <w:webHidden/>
           </w:rPr>
-          <w:t>15</w:t>
+          <w:t>16</w:t>
         </w:r>
         <w:r>
           <w:rPr>
@@ -2021,10 +2154,9 @@
           <w:noProof/>
           <w:sz w:val="22"/>
           <w:szCs w:val="22"/>
-          <w:lang w:eastAsia="en-US"/>
         </w:rPr>
       </w:pPr>
-      <w:hyperlink w:anchor="_Toc196376625" w:history="1">
+      <w:hyperlink w:anchor="_Toc237520938" w:history="1">
         <w:r>
           <w:rPr>
             <w:rStyle w:val="Hyperlink"/>
@@ -2045,7 +2177,6 @@
             <w:noProof/>
             <w:sz w:val="22"/>
             <w:szCs w:val="22"/>
-            <w:lang w:eastAsia="en-US"/>
           </w:rPr>
           <w:tab/>
         </w:r>
@@ -2075,7 +2206,7 @@
             <w:noProof/>
             <w:webHidden/>
           </w:rPr>
-          <w:instrText xml:space="preserve"> PAGEREF _Toc196376625 \h </w:instrText>
+          <w:instrText xml:space="preserve"> PAGEREF _Toc237520938 \h </w:instrText>
         </w:r>
         <w:r>
           <w:rPr>
@@ -2118,10 +2249,9 @@
           <w:noProof/>
           <w:sz w:val="22"/>
           <w:szCs w:val="22"/>
-          <w:lang w:eastAsia="en-US"/>
         </w:rPr>
       </w:pPr>
-      <w:hyperlink w:anchor="_Toc196376626" w:history="1">
+      <w:hyperlink w:anchor="_Toc237520939" w:history="1">
         <w:r>
           <w:rPr>
             <w:rStyle w:val="Hyperlink"/>
@@ -2142,7 +2272,6 @@
             <w:noProof/>
             <w:sz w:val="22"/>
             <w:szCs w:val="22"/>
-            <w:lang w:eastAsia="en-US"/>
           </w:rPr>
           <w:tab/>
         </w:r>
@@ -2172,7 +2301,7 @@
             <w:noProof/>
             <w:webHidden/>
           </w:rPr>
-          <w:instrText xml:space="preserve"> PAGEREF _Toc196376626 \h </w:instrText>
+          <w:instrText xml:space="preserve"> PAGEREF _Toc237520939 \h </w:instrText>
         </w:r>
         <w:r>
           <w:rPr>
@@ -2215,10 +2344,9 @@
           <w:noProof/>
           <w:sz w:val="22"/>
           <w:szCs w:val="22"/>
-          <w:lang w:eastAsia="en-US"/>
         </w:rPr>
       </w:pPr>
-      <w:hyperlink w:anchor="_Toc196376627" w:history="1">
+      <w:hyperlink w:anchor="_Toc237520940" w:history="1">
         <w:r>
           <w:rPr>
             <w:rStyle w:val="Hyperlink"/>
@@ -2239,7 +2367,6 @@
             <w:noProof/>
             <w:sz w:val="22"/>
             <w:szCs w:val="22"/>
-            <w:lang w:eastAsia="en-US"/>
           </w:rPr>
           <w:tab/>
         </w:r>
@@ -2269,7 +2396,7 @@
             <w:noProof/>
             <w:webHidden/>
           </w:rPr>
-          <w:instrText xml:space="preserve"> PAGEREF _Toc196376627 \h </w:instrText>
+          <w:instrText xml:space="preserve"> PAGEREF _Toc237520940 \h </w:instrText>
         </w:r>
         <w:r>
           <w:rPr>
@@ -2312,10 +2439,9 @@
           <w:noProof/>
           <w:sz w:val="22"/>
           <w:szCs w:val="22"/>
-          <w:lang w:eastAsia="en-US"/>
         </w:rPr>
       </w:pPr>
-      <w:hyperlink w:anchor="_Toc196376628" w:history="1">
+      <w:hyperlink w:anchor="_Toc237520941" w:history="1">
         <w:r>
           <w:rPr>
             <w:rStyle w:val="Hyperlink"/>
@@ -2336,7 +2462,6 @@
             <w:noProof/>
             <w:sz w:val="22"/>
             <w:szCs w:val="22"/>
-            <w:lang w:eastAsia="en-US"/>
           </w:rPr>
           <w:tab/>
         </w:r>
@@ -2366,7 +2491,7 @@
             <w:noProof/>
             <w:webHidden/>
           </w:rPr>
-          <w:instrText xml:space="preserve"> PAGEREF _Toc196376628 \h </w:instrText>
+          <w:instrText xml:space="preserve"> PAGEREF _Toc237520941 \h </w:instrText>
         </w:r>
         <w:r>
           <w:rPr>
@@ -2409,9 +2534,10 @@
           <w:noProof/>
           <w:sz w:val="22"/>
           <w:szCs w:val="22"/>
+          <w:lang w:eastAsia="zh-CN"/>
         </w:rPr>
       </w:pPr>
-      <w:hyperlink w:anchor="_Toc196376629" w:history="1">
+      <w:hyperlink w:anchor="_Toc237520942" w:history="1">
         <w:r>
           <w:rPr>
             <w:rStyle w:val="Hyperlink"/>
@@ -2426,6 +2552,7 @@
             <w:noProof/>
             <w:sz w:val="22"/>
             <w:szCs w:val="22"/>
+            <w:lang w:eastAsia="zh-CN"/>
           </w:rPr>
           <w:tab/>
         </w:r>
@@ -2456,7 +2583,7 @@
             <w:noProof/>
             <w:webHidden/>
           </w:rPr>
-          <w:instrText xml:space="preserve"> PAGEREF _Toc196376629 \h </w:instrText>
+          <w:instrText xml:space="preserve"> PAGEREF _Toc237520942 \h </w:instrText>
         </w:r>
         <w:r>
           <w:rPr>
@@ -2499,9 +2626,10 @@
           <w:noProof/>
           <w:sz w:val="22"/>
           <w:szCs w:val="22"/>
+          <w:lang w:eastAsia="zh-CN"/>
         </w:rPr>
       </w:pPr>
-      <w:hyperlink w:anchor="_Toc196376630" w:history="1">
+      <w:hyperlink w:anchor="_Toc237520943" w:history="1">
         <w:r>
           <w:rPr>
             <w:rStyle w:val="Hyperlink"/>
@@ -2516,6 +2644,7 @@
             <w:noProof/>
             <w:sz w:val="22"/>
             <w:szCs w:val="22"/>
+            <w:lang w:eastAsia="zh-CN"/>
           </w:rPr>
           <w:tab/>
         </w:r>
@@ -2546,7 +2675,7 @@
             <w:noProof/>
             <w:webHidden/>
           </w:rPr>
-          <w:instrText xml:space="preserve"> PAGEREF _Toc196376630 \h </w:instrText>
+          <w:instrText xml:space="preserve"> PAGEREF _Toc237520943 \h </w:instrText>
         </w:r>
         <w:r>
           <w:rPr>
@@ -2589,10 +2718,9 @@
           <w:noProof/>
           <w:sz w:val="22"/>
           <w:szCs w:val="22"/>
-          <w:lang w:eastAsia="en-US"/>
         </w:rPr>
       </w:pPr>
-      <w:hyperlink w:anchor="_Toc196376631" w:history="1">
+      <w:hyperlink w:anchor="_Toc237520944" w:history="1">
         <w:r>
           <w:rPr>
             <w:rStyle w:val="Hyperlink"/>
@@ -2613,7 +2741,6 @@
             <w:noProof/>
             <w:sz w:val="22"/>
             <w:szCs w:val="22"/>
-            <w:lang w:eastAsia="en-US"/>
           </w:rPr>
           <w:tab/>
         </w:r>
@@ -2643,7 +2770,7 @@
             <w:noProof/>
             <w:webHidden/>
           </w:rPr>
-          <w:instrText xml:space="preserve"> PAGEREF _Toc196376631 \h </w:instrText>
+          <w:instrText xml:space="preserve"> PAGEREF _Toc237520944 \h </w:instrText>
         </w:r>
         <w:r>
           <w:rPr>
@@ -2686,9 +2813,10 @@
           <w:noProof/>
           <w:sz w:val="22"/>
           <w:szCs w:val="22"/>
+          <w:lang w:eastAsia="zh-CN"/>
         </w:rPr>
       </w:pPr>
-      <w:hyperlink w:anchor="_Toc196376632" w:history="1">
+      <w:hyperlink w:anchor="_Toc237520945" w:history="1">
         <w:r>
           <w:rPr>
             <w:rStyle w:val="Hyperlink"/>
@@ -2703,6 +2831,7 @@
             <w:noProof/>
             <w:sz w:val="22"/>
             <w:szCs w:val="22"/>
+            <w:lang w:eastAsia="zh-CN"/>
           </w:rPr>
           <w:tab/>
         </w:r>
@@ -2733,7 +2862,7 @@
             <w:noProof/>
             <w:webHidden/>
           </w:rPr>
-          <w:instrText xml:space="preserve"> PAGEREF _Toc196376632 \h </w:instrText>
+          <w:instrText xml:space="preserve"> PAGEREF _Toc237520945 \h </w:instrText>
         </w:r>
         <w:r>
           <w:rPr>
@@ -2776,10 +2905,9 @@
           <w:noProof/>
           <w:sz w:val="22"/>
           <w:szCs w:val="22"/>
-          <w:lang w:eastAsia="en-US"/>
         </w:rPr>
       </w:pPr>
-      <w:hyperlink w:anchor="_Toc196376633" w:history="1">
+      <w:hyperlink w:anchor="_Toc237520946" w:history="1">
         <w:r>
           <w:rPr>
             <w:rStyle w:val="Hyperlink"/>
@@ -2793,7 +2921,6 @@
             <w:noProof/>
             <w:sz w:val="22"/>
             <w:szCs w:val="22"/>
-            <w:lang w:eastAsia="en-US"/>
           </w:rPr>
           <w:tab/>
         </w:r>
@@ -2823,7 +2950,7 @@
             <w:noProof/>
             <w:webHidden/>
           </w:rPr>
-          <w:instrText xml:space="preserve"> PAGEREF _Toc196376633 \h </w:instrText>
+          <w:instrText xml:space="preserve"> PAGEREF _Toc237520946 \h </w:instrText>
         </w:r>
         <w:r>
           <w:rPr>
@@ -2866,9 +2993,10 @@
           <w:noProof/>
           <w:sz w:val="22"/>
           <w:szCs w:val="22"/>
+          <w:lang w:eastAsia="zh-CN"/>
         </w:rPr>
       </w:pPr>
-      <w:hyperlink w:anchor="_Toc196376634" w:history="1">
+      <w:hyperlink w:anchor="_Toc237520947" w:history="1">
         <w:r>
           <w:rPr>
             <w:rStyle w:val="Hyperlink"/>
@@ -2883,6 +3011,7 @@
             <w:noProof/>
             <w:sz w:val="22"/>
             <w:szCs w:val="22"/>
+            <w:lang w:eastAsia="zh-CN"/>
           </w:rPr>
           <w:tab/>
         </w:r>
@@ -2913,7 +3042,7 @@
             <w:noProof/>
             <w:webHidden/>
           </w:rPr>
-          <w:instrText xml:space="preserve"> PAGEREF _Toc196376634 \h </w:instrText>
+          <w:instrText xml:space="preserve"> PAGEREF _Toc237520947 \h </w:instrText>
         </w:r>
         <w:r>
           <w:rPr>
@@ -2956,9 +3085,10 @@
           <w:noProof/>
           <w:sz w:val="22"/>
           <w:szCs w:val="22"/>
+          <w:lang w:eastAsia="zh-CN"/>
         </w:rPr>
       </w:pPr>
-      <w:hyperlink w:anchor="_Toc196376635" w:history="1">
+      <w:hyperlink w:anchor="_Toc237520948" w:history="1">
         <w:r>
           <w:rPr>
             <w:rStyle w:val="Hyperlink"/>
@@ -2973,6 +3103,7 @@
             <w:noProof/>
             <w:sz w:val="22"/>
             <w:szCs w:val="22"/>
+            <w:lang w:eastAsia="zh-CN"/>
           </w:rPr>
           <w:tab/>
         </w:r>
@@ -3003,7 +3134,7 @@
             <w:noProof/>
             <w:webHidden/>
           </w:rPr>
-          <w:instrText xml:space="preserve"> PAGEREF _Toc196376635 \h </w:instrText>
+          <w:instrText xml:space="preserve"> PAGEREF _Toc237520948 \h </w:instrText>
         </w:r>
         <w:r>
           <w:rPr>
@@ -3023,7 +3154,7 @@
             <w:noProof/>
             <w:webHidden/>
           </w:rPr>
-          <w:t>23</w:t>
+          <w:t>24</w:t>
         </w:r>
         <w:r>
           <w:rPr>
@@ -3046,10 +3177,9 @@
           <w:noProof/>
           <w:sz w:val="22"/>
           <w:szCs w:val="22"/>
-          <w:lang w:eastAsia="en-US"/>
         </w:rPr>
       </w:pPr>
-      <w:hyperlink w:anchor="_Toc196376636" w:history="1">
+      <w:hyperlink w:anchor="_Toc237520949" w:history="1">
         <w:r>
           <w:rPr>
             <w:rStyle w:val="Hyperlink"/>
@@ -3070,7 +3200,6 @@
             <w:noProof/>
             <w:sz w:val="22"/>
             <w:szCs w:val="22"/>
-            <w:lang w:eastAsia="en-US"/>
           </w:rPr>
           <w:tab/>
         </w:r>
@@ -3100,7 +3229,7 @@
             <w:noProof/>
             <w:webHidden/>
           </w:rPr>
-          <w:instrText xml:space="preserve"> PAGEREF _Toc196376636 \h </w:instrText>
+          <w:instrText xml:space="preserve"> PAGEREF _Toc237520949 \h </w:instrText>
         </w:r>
         <w:r>
           <w:rPr>
@@ -3120,7 +3249,7 @@
             <w:noProof/>
             <w:webHidden/>
           </w:rPr>
-          <w:t>23</w:t>
+          <w:t>24</w:t>
         </w:r>
         <w:r>
           <w:rPr>
@@ -3143,10 +3272,9 @@
           <w:noProof/>
           <w:sz w:val="22"/>
           <w:szCs w:val="22"/>
-          <w:lang w:eastAsia="en-US"/>
         </w:rPr>
       </w:pPr>
-      <w:hyperlink w:anchor="_Toc196376637" w:history="1">
+      <w:hyperlink w:anchor="_Toc237520950" w:history="1">
         <w:r>
           <w:rPr>
             <w:rStyle w:val="Hyperlink"/>
@@ -3167,7 +3295,6 @@
             <w:noProof/>
             <w:sz w:val="22"/>
             <w:szCs w:val="22"/>
-            <w:lang w:eastAsia="en-US"/>
           </w:rPr>
           <w:tab/>
         </w:r>
@@ -3197,7 +3324,7 @@
             <w:noProof/>
             <w:webHidden/>
           </w:rPr>
-          <w:instrText xml:space="preserve"> PAGEREF _Toc196376637 \h </w:instrText>
+          <w:instrText xml:space="preserve"> PAGEREF _Toc237520950 \h </w:instrText>
         </w:r>
         <w:r>
           <w:rPr>
@@ -3217,7 +3344,7 @@
             <w:noProof/>
             <w:webHidden/>
           </w:rPr>
-          <w:t>23</w:t>
+          <w:t>24</w:t>
         </w:r>
         <w:r>
           <w:rPr>
@@ -3240,9 +3367,10 @@
           <w:noProof/>
           <w:sz w:val="22"/>
           <w:szCs w:val="22"/>
+          <w:lang w:eastAsia="zh-CN"/>
         </w:rPr>
       </w:pPr>
-      <w:hyperlink w:anchor="_Toc196376638" w:history="1">
+      <w:hyperlink w:anchor="_Toc237520951" w:history="1">
         <w:r>
           <w:rPr>
             <w:rStyle w:val="Hyperlink"/>
@@ -3257,6 +3385,7 @@
             <w:noProof/>
             <w:sz w:val="22"/>
             <w:szCs w:val="22"/>
+            <w:lang w:eastAsia="zh-CN"/>
           </w:rPr>
           <w:tab/>
         </w:r>
@@ -3287,7 +3416,7 @@
             <w:noProof/>
             <w:webHidden/>
           </w:rPr>
-          <w:instrText xml:space="preserve"> PAGEREF _Toc196376638 \h </w:instrText>
+          <w:instrText xml:space="preserve"> PAGEREF _Toc237520951 \h </w:instrText>
         </w:r>
         <w:r>
           <w:rPr>
@@ -3330,9 +3459,10 @@
           <w:noProof/>
           <w:sz w:val="22"/>
           <w:szCs w:val="22"/>
+          <w:lang w:eastAsia="zh-CN"/>
         </w:rPr>
       </w:pPr>
-      <w:hyperlink w:anchor="_Toc196376639" w:history="1">
+      <w:hyperlink w:anchor="_Toc237520952" w:history="1">
         <w:r>
           <w:rPr>
             <w:rStyle w:val="Hyperlink"/>
@@ -3347,6 +3477,7 @@
             <w:noProof/>
             <w:sz w:val="22"/>
             <w:szCs w:val="22"/>
+            <w:lang w:eastAsia="zh-CN"/>
           </w:rPr>
           <w:tab/>
         </w:r>
@@ -3377,7 +3508,7 @@
             <w:noProof/>
             <w:webHidden/>
           </w:rPr>
-          <w:instrText xml:space="preserve"> PAGEREF _Toc196376639 \h </w:instrText>
+          <w:instrText xml:space="preserve"> PAGEREF _Toc237520952 \h </w:instrText>
         </w:r>
         <w:r>
           <w:rPr>
@@ -3416,7 +3547,7 @@
         <w:lastRenderedPageBreak/>
         <w:fldChar w:fldCharType="end"/>
       </w:r>
-      <w:bookmarkStart w:id="2" w:name="_Toc196376605"/>
+      <w:bookmarkStart w:id="2" w:name="_Toc237520917"/>
       <w:r>
         <w:t>I</w:t>
       </w:r>
@@ -3620,7 +3751,7 @@
       <w:pPr>
         <w:pStyle w:val="Heading1"/>
       </w:pPr>
-      <w:bookmarkStart w:id="3" w:name="_Toc196376606"/>
+      <w:bookmarkStart w:id="3" w:name="_Toc237520918"/>
       <w:r>
         <w:t>Exporting a dictionary to Word</w:t>
       </w:r>
@@ -3630,7 +3761,7 @@
       <w:pPr>
         <w:pStyle w:val="Heading2"/>
       </w:pPr>
-      <w:bookmarkStart w:id="4" w:name="_Toc196376607"/>
+      <w:bookmarkStart w:id="4" w:name="_Toc237520919"/>
       <w:r>
         <w:t>Preparation in FLEx prior to export</w:t>
       </w:r>
@@ -4054,7 +4185,7 @@
       <w:pPr>
         <w:pStyle w:val="Heading3"/>
       </w:pPr>
-      <w:bookmarkStart w:id="5" w:name="_Toc196376608"/>
+      <w:bookmarkStart w:id="5" w:name="_Toc237520920"/>
       <w:r>
         <w:t xml:space="preserve">Saving list </w:t>
       </w:r>
@@ -4340,7 +4471,7 @@
         <w:pStyle w:val="Heading2"/>
       </w:pPr>
       <w:bookmarkStart w:id="6" w:name="_Ref143614988"/>
-      <w:bookmarkStart w:id="7" w:name="_Toc196376609"/>
+      <w:bookmarkStart w:id="7" w:name="_Toc237520921"/>
       <w:r>
         <w:t>Exporting a dictionary from FLEx to Word</w:t>
       </w:r>
@@ -4413,7 +4544,7 @@
       <w:pPr>
         <w:pStyle w:val="Heading2"/>
       </w:pPr>
-      <w:bookmarkStart w:id="8" w:name="_Toc196376610"/>
+      <w:bookmarkStart w:id="8" w:name="_Toc237520922"/>
       <w:r>
         <w:t>Preparing a Word dictionary for publication</w:t>
       </w:r>
@@ -4617,7 +4748,7 @@
       <w:pPr>
         <w:pStyle w:val="Heading3"/>
       </w:pPr>
-      <w:bookmarkStart w:id="9" w:name="_Toc196376611"/>
+      <w:bookmarkStart w:id="9" w:name="_Toc237520923"/>
       <w:r>
         <w:t>Page</w:t>
       </w:r>
@@ -4704,6 +4835,28 @@
         <w:t>Note</w:t>
       </w:r>
       <w:r>
+        <w:t xml:space="preserve"> when changing the page size, be sure to highlight all of the text using </w:t>
+      </w:r>
+      <w:proofErr w:type="spellStart"/>
+      <w:r>
+        <w:t>Ctrl+A</w:t>
+      </w:r>
+      <w:proofErr w:type="spellEnd"/>
+      <w:r>
+        <w:t xml:space="preserve"> before changing the size.</w:t>
+      </w:r>
+    </w:p>
+    <w:p>
+      <w:pPr>
+        <w:pStyle w:val="BodyText"/>
+      </w:pPr>
+      <w:r>
+        <w:rPr>
+          <w:rStyle w:val="Boldphrase"/>
+        </w:rPr>
+        <w:t>Note</w:t>
+      </w:r>
+      <w:r>
         <w:t xml:space="preserve"> with double-columns, it’s possible to set up paragraph hanging indents that will cause clipping in the second column because the paragraph indent is too wide for the inter-column space. If you encounter this situation, you can adjust column widths and indents in Layout &gt; Columns &gt; More Columns where you can specify size of columns and spacing between columns, or you can decrease the paragraph hanging indent to avoid the problem.</w:t>
       </w:r>
     </w:p>
@@ -4712,7 +4865,7 @@
         <w:pStyle w:val="Heading3"/>
       </w:pPr>
       <w:bookmarkStart w:id="10" w:name="_Ref143267723"/>
-      <w:bookmarkStart w:id="11" w:name="_Toc196376612"/>
+      <w:bookmarkStart w:id="11" w:name="_Toc237520924"/>
       <w:r>
         <w:t>Exported</w:t>
       </w:r>
@@ -4831,7 +4984,11 @@
         <w:t xml:space="preserve">features </w:t>
       </w:r>
       <w:r>
-        <w:t xml:space="preserve">match the normal style, then the </w:t>
+        <w:t xml:space="preserve">match the normal style, </w:t>
+      </w:r>
+      <w:r>
+        <w:lastRenderedPageBreak/>
+        <w:t xml:space="preserve">then the </w:t>
       </w:r>
       <w:proofErr w:type="spellStart"/>
       <w:r>
@@ -4861,11 +5018,7 @@
       </w:r>
       <w:proofErr w:type="spellEnd"/>
       <w:r>
-        <w:t xml:space="preserve"> tag, but some may have a tag, and understanding why may be a </w:t>
-      </w:r>
-      <w:r>
-        <w:lastRenderedPageBreak/>
-        <w:t xml:space="preserve">mystery. Even with </w:t>
+        <w:t xml:space="preserve"> tag, but some may have a tag, and understanding why may be a mystery. Even with </w:t>
       </w:r>
       <w:r>
         <w:t xml:space="preserve">default styles in FLEx, if the main analysis and vernacular writing systems use a different font, the Headword field will normally have a </w:t>
@@ -5202,7 +5355,7 @@
       <w:pPr>
         <w:pStyle w:val="Heading4"/>
       </w:pPr>
-      <w:bookmarkStart w:id="12" w:name="_Toc196376613"/>
+      <w:bookmarkStart w:id="12" w:name="_Toc237520925"/>
       <w:r>
         <w:lastRenderedPageBreak/>
         <w:t>Context s</w:t>
@@ -5653,7 +5806,7 @@
         <w:pStyle w:val="Heading3"/>
       </w:pPr>
       <w:bookmarkStart w:id="13" w:name="_Ref186791558"/>
-      <w:bookmarkStart w:id="14" w:name="_Toc196376614"/>
+      <w:bookmarkStart w:id="14" w:name="_Toc237520926"/>
       <w:r>
         <w:t>Add page headers with guidewords</w:t>
       </w:r>
@@ -5866,6 +6019,20 @@
         <w:t>Headword</w:t>
       </w:r>
       <w:r>
+        <w:t>[</w:t>
+      </w:r>
+      <w:proofErr w:type="spellStart"/>
+      <w:r>
+        <w:t>lang</w:t>
+      </w:r>
+      <w:proofErr w:type="spellEnd"/>
+      <w:r>
+        <w:t>=</w:t>
+      </w:r>
+      <w:r>
+        <w:t>xxx]</w:t>
+      </w:r>
+      <w:r>
         <w:t xml:space="preserve"> for main entrie</w:t>
       </w:r>
       <w:r>
@@ -5905,11 +6072,11 @@
         <w:t>Typically</w:t>
       </w:r>
       <w:r>
-        <w:t xml:space="preserve">, it would be nice to include the last headword from the </w:t>
+        <w:t xml:space="preserve">, it would be nice to include the last headword </w:t>
       </w:r>
       <w:r>
         <w:lastRenderedPageBreak/>
-        <w:t xml:space="preserve">previous page. </w:t>
+        <w:t xml:space="preserve">from the previous page. </w:t>
       </w:r>
       <w:r>
         <w:t xml:space="preserve">Unfortunately, </w:t>
@@ -6256,206 +6423,41 @@
     </w:p>
     <w:p>
       <w:pPr>
-        <w:pStyle w:val="Heading3"/>
-      </w:pPr>
-      <w:bookmarkStart w:id="15" w:name="_Toc196376615"/>
-      <w:bookmarkStart w:id="16" w:name="_Ref176788241"/>
-      <w:r>
-        <w:t xml:space="preserve">How to fix incorrect guidewords on </w:t>
-      </w:r>
-      <w:r>
-        <w:t>some</w:t>
-      </w:r>
-      <w:r>
-        <w:t xml:space="preserve"> pages</w:t>
+        <w:pStyle w:val="Heading4"/>
+      </w:pPr>
+      <w:bookmarkStart w:id="15" w:name="_Toc237520927"/>
+      <w:r>
+        <w:t>Changing Header</w:t>
+      </w:r>
+      <w:r>
+        <w:t xml:space="preserve">s and </w:t>
+      </w:r>
+      <w:r>
+        <w:t>Footers</w:t>
       </w:r>
       <w:bookmarkEnd w:id="15"/>
+      <w:r>
+        <w:t xml:space="preserve"> </w:t>
+      </w:r>
     </w:p>
     <w:p>
       <w:pPr>
         <w:pStyle w:val="BodyText"/>
       </w:pPr>
       <w:r>
-        <w:t>After you have made all of the changes to your document, if you find a few page headers where the guidewords were incorrect, there is a way you can correct this. It would not be wise to make these changes until all other editing is done because you are forcing new page breaks that would be incorrect if you make changes to previous pages that would alter the location of the default page breaks.</w:t>
-      </w:r>
-      <w:r>
-        <w:t xml:space="preserve"> Follow these steps to alter </w:t>
-      </w:r>
-      <w:proofErr w:type="gramStart"/>
-      <w:r>
-        <w:t>one page</w:t>
-      </w:r>
-      <w:proofErr w:type="gramEnd"/>
-      <w:r>
-        <w:t xml:space="preserve"> header without affecting other headers.</w:t>
-      </w:r>
-    </w:p>
-    <w:p>
-      <w:pPr>
-        <w:pStyle w:val="ListNumber"/>
-      </w:pPr>
-      <w:r>
-        <w:t>Place your curser after the last character on the last line of the page before the page header you want to change.</w:t>
-      </w:r>
-    </w:p>
-    <w:p>
-      <w:pPr>
-        <w:pStyle w:val="ListNumber"/>
-      </w:pPr>
-      <w:r>
-        <w:t xml:space="preserve">In the Layout tab, choose Breaks &gt; Next Page. This will </w:t>
-      </w:r>
-      <w:r>
-        <w:t xml:space="preserve">force a page break at this </w:t>
-      </w:r>
-      <w:proofErr w:type="gramStart"/>
-      <w:r>
-        <w:t>point.</w:t>
-      </w:r>
-      <w:r>
-        <w:t>.</w:t>
-      </w:r>
-      <w:proofErr w:type="gramEnd"/>
-    </w:p>
-    <w:p>
-      <w:pPr>
-        <w:pStyle w:val="ListNumber"/>
-      </w:pPr>
-      <w:r>
-        <w:t>Right-click the pager header</w:t>
-      </w:r>
-      <w:r>
-        <w:t xml:space="preserve"> you want to change</w:t>
-      </w:r>
-      <w:r>
-        <w:t xml:space="preserve"> and choose Edit Header.</w:t>
-      </w:r>
-    </w:p>
-    <w:p>
-      <w:pPr>
-        <w:pStyle w:val="ListNumber"/>
-      </w:pPr>
-      <w:r>
-        <w:t>In the Options section of the Design tab under Header &amp; Footer Tools, check the “Different First Page” option.</w:t>
-      </w:r>
-      <w:r>
-        <w:t xml:space="preserve"> This will remove the content of the header you want to change.</w:t>
-      </w:r>
-    </w:p>
-    <w:p>
-      <w:pPr>
-        <w:pStyle w:val="ListNumber"/>
-      </w:pPr>
-      <w:r>
-        <w:t>Add the correct guidewords, page header, etc. for this page header.</w:t>
-      </w:r>
-    </w:p>
-    <w:p>
-      <w:pPr>
-        <w:pStyle w:val="ListNumber"/>
-      </w:pPr>
-      <w:r>
-        <w:t>Click “Close Header and Footer” from the Close section of the toolbar.</w:t>
-      </w:r>
-    </w:p>
-    <w:p>
-      <w:pPr>
-        <w:pStyle w:val="ListNumber"/>
-      </w:pPr>
-      <w:r>
-        <w:t>The remaining pages should continue with the normal page headers.</w:t>
-      </w:r>
-    </w:p>
-    <w:p>
-      <w:pPr>
-        <w:pStyle w:val="BodyText"/>
-      </w:pPr>
-      <w:r>
-        <w:t>If you need to remove an inserted page break, place the curser at the end of the text on the previous page, then press Delete.</w:t>
-      </w:r>
-      <w:r>
-        <w:t xml:space="preserve"> Then assuming you started out without “Different First Page” checked, go to Edit Header and uncheck “Different First Page”.</w:t>
-      </w:r>
-    </w:p>
-    <w:p>
-      <w:pPr>
-        <w:pStyle w:val="Heading3"/>
-      </w:pPr>
-      <w:bookmarkStart w:id="17" w:name="_Ref186791937"/>
-      <w:bookmarkStart w:id="18" w:name="_Toc196376616"/>
-      <w:r>
-        <w:t xml:space="preserve">Convert letter </w:t>
-      </w:r>
-      <w:r>
-        <w:t>headings</w:t>
-      </w:r>
-      <w:r>
-        <w:t xml:space="preserve"> to single column</w:t>
-      </w:r>
-      <w:bookmarkEnd w:id="16"/>
-      <w:bookmarkEnd w:id="17"/>
-      <w:bookmarkEnd w:id="18"/>
-    </w:p>
-    <w:p>
-      <w:pPr>
-        <w:pStyle w:val="BodyText"/>
-      </w:pPr>
-      <w:r>
-        <w:t xml:space="preserve">The FLEx export automatically sets letter headings to single-column using the procedure described here, but knowing how to do it manually may be useful at times. </w:t>
-      </w:r>
-      <w:r>
-        <w:t xml:space="preserve">When using two columns for your dictionary text, it’s usually desirable to have the letter </w:t>
-      </w:r>
-      <w:r>
-        <w:t>headings</w:t>
-      </w:r>
-      <w:r>
-        <w:t xml:space="preserve"> span both columns. Word does not provide a style for doing this as InDesign provides, but there is a solution that works reasonably well that just requires making a </w:t>
-      </w:r>
-      <w:r>
-        <w:t xml:space="preserve">couple </w:t>
-      </w:r>
-      <w:r>
-        <w:t>change</w:t>
-      </w:r>
-      <w:r>
-        <w:t>s</w:t>
-      </w:r>
-      <w:r>
-        <w:t xml:space="preserve"> for each letter </w:t>
-      </w:r>
-      <w:r>
-        <w:t>heading</w:t>
-      </w:r>
-      <w:r>
-        <w:t xml:space="preserve">. </w:t>
-      </w:r>
-      <w:r>
-        <w:t>FLEx</w:t>
-      </w:r>
-      <w:r>
-        <w:t xml:space="preserve"> normally uses the </w:t>
-      </w:r>
-      <w:r>
-        <w:t>Letter Heading</w:t>
-      </w:r>
-      <w:r>
-        <w:t xml:space="preserve"> style for letter </w:t>
-      </w:r>
-      <w:r>
-        <w:t>headings</w:t>
-      </w:r>
-      <w:r>
-        <w:t>. By searching for this style in the Advanced Find dialog</w:t>
-      </w:r>
-      <w:r>
-        <w:t xml:space="preserve"> (see </w:t>
+        <w:t xml:space="preserve">By default, page headers and footers only apply to the current section. In Word dictionaries, letter headings are separate sections, and an additional section is used for all of the entries beginning with that letter. </w:t>
+      </w:r>
+      <w:r>
+        <w:t>A</w:t>
+      </w:r>
+      <w:r>
+        <w:t xml:space="preserve">fter a FLEx export, if you need to change guidewords in the headers (or footers), the changes need to be made to each alphabetical section. There doesn’t seem to be a way to fix guidewords so that they flow through the entire document without first removing all section breaks. This can be done in the advanced Find and Replace dialog by searching for ^b and leaving “replace with” blank. Then set the desired guidewords on left and right pages which will cover the whole document. Finally, set the letter headings back to single column using the instructions in section </w:t>
       </w:r>
       <w:r>
         <w:fldChar w:fldCharType="begin"/>
       </w:r>
       <w:r>
-        <w:instrText xml:space="preserve"> REF _Ref143765791 \r \h </w:instrText>
+        <w:instrText xml:space="preserve"> REF _Ref186791937 \r \h </w:instrText>
       </w:r>
       <w:r>
         <w:fldChar w:fldCharType="separate"/>
@@ -6467,10 +6469,215 @@
         <w:t>‎</w:t>
       </w:r>
       <w:r>
-        <w:t>3.3.1</w:t>
+        <w:t>2.3.5</w:t>
       </w:r>
       <w:r>
         <w:fldChar w:fldCharType="end"/>
+      </w:r>
+      <w:r>
+        <w:t>.</w:t>
+      </w:r>
+      <w:r>
+        <w:t xml:space="preserve"> Note, there is a “Link to Previous” toggle in the header design dialog, but it only links to the letter header paragraph, which doesn’t pass it on up to the previous letter section. There doesn’t seem to be a way to link to the whole document without going back to a single section.</w:t>
+      </w:r>
+    </w:p>
+    <w:p>
+      <w:pPr>
+        <w:pStyle w:val="Heading3"/>
+      </w:pPr>
+      <w:bookmarkStart w:id="16" w:name="_Ref176788241"/>
+      <w:bookmarkStart w:id="17" w:name="_Toc237520928"/>
+      <w:r>
+        <w:t xml:space="preserve">How to fix incorrect guidewords on </w:t>
+      </w:r>
+      <w:r>
+        <w:t>some</w:t>
+      </w:r>
+      <w:r>
+        <w:t xml:space="preserve"> pages</w:t>
+      </w:r>
+      <w:bookmarkEnd w:id="17"/>
+    </w:p>
+    <w:p>
+      <w:pPr>
+        <w:pStyle w:val="BodyText"/>
+      </w:pPr>
+      <w:r>
+        <w:t>After you have made all of the changes to your document, if you find a few page headers where the guidewords were incorrect, there is a way you can correct this. It would not be wise to make these changes until all other editing is done because you are forcing new page breaks that would be incorrect if you make changes to previous pages that would alter the location of the default page breaks.</w:t>
+      </w:r>
+      <w:r>
+        <w:t xml:space="preserve"> Follow these steps to alter </w:t>
+      </w:r>
+      <w:proofErr w:type="gramStart"/>
+      <w:r>
+        <w:t>one page</w:t>
+      </w:r>
+      <w:proofErr w:type="gramEnd"/>
+      <w:r>
+        <w:t xml:space="preserve"> header without affecting other headers.</w:t>
+      </w:r>
+    </w:p>
+    <w:p>
+      <w:pPr>
+        <w:pStyle w:val="ListNumber"/>
+      </w:pPr>
+      <w:r>
+        <w:t>Place your curser after the last character on the last line of the page before the page header you want to change.</w:t>
+      </w:r>
+    </w:p>
+    <w:p>
+      <w:pPr>
+        <w:pStyle w:val="ListNumber"/>
+      </w:pPr>
+      <w:r>
+        <w:t xml:space="preserve">In the Layout tab, choose Breaks &gt; Next Page. This will </w:t>
+      </w:r>
+      <w:r>
+        <w:t xml:space="preserve">force a page break at this </w:t>
+      </w:r>
+      <w:proofErr w:type="gramStart"/>
+      <w:r>
+        <w:t>point.</w:t>
+      </w:r>
+      <w:r>
+        <w:t>.</w:t>
+      </w:r>
+      <w:proofErr w:type="gramEnd"/>
+    </w:p>
+    <w:p>
+      <w:pPr>
+        <w:pStyle w:val="ListNumber"/>
+      </w:pPr>
+      <w:r>
+        <w:t>Right-click the pager header</w:t>
+      </w:r>
+      <w:r>
+        <w:t xml:space="preserve"> you want to change</w:t>
+      </w:r>
+      <w:r>
+        <w:t xml:space="preserve"> and choose Edit Header.</w:t>
+      </w:r>
+    </w:p>
+    <w:p>
+      <w:pPr>
+        <w:pStyle w:val="ListNumber"/>
+      </w:pPr>
+      <w:r>
+        <w:t>In the Options section of the Design tab under Header &amp; Footer Tools, check the “Different First Page” option.</w:t>
+      </w:r>
+      <w:r>
+        <w:t xml:space="preserve"> This will remove the content of the header you want to change.</w:t>
+      </w:r>
+    </w:p>
+    <w:p>
+      <w:pPr>
+        <w:pStyle w:val="ListNumber"/>
+      </w:pPr>
+      <w:r>
+        <w:t>Add the correct guidewords, page header, etc. for this page header.</w:t>
+      </w:r>
+    </w:p>
+    <w:p>
+      <w:pPr>
+        <w:pStyle w:val="ListNumber"/>
+      </w:pPr>
+      <w:r>
+        <w:t>Click “Close Header and Footer” from the Close section of the toolbar.</w:t>
+      </w:r>
+    </w:p>
+    <w:p>
+      <w:pPr>
+        <w:pStyle w:val="ListNumber"/>
+      </w:pPr>
+      <w:r>
+        <w:lastRenderedPageBreak/>
+        <w:t>The remaining pages should continue with the normal page headers.</w:t>
+      </w:r>
+    </w:p>
+    <w:p>
+      <w:pPr>
+        <w:pStyle w:val="BodyText"/>
+      </w:pPr>
+      <w:r>
+        <w:t>If you need to remove an inserted page break, place the curser at the end of the text on the previous page, then press Delete.</w:t>
+      </w:r>
+      <w:r>
+        <w:t xml:space="preserve"> Then assuming you started out without “Different First Page” checked, go to Edit Header and uncheck “Different First Page”.</w:t>
+      </w:r>
+    </w:p>
+    <w:p>
+      <w:pPr>
+        <w:pStyle w:val="Heading3"/>
+      </w:pPr>
+      <w:bookmarkStart w:id="18" w:name="_Ref186791937"/>
+      <w:bookmarkStart w:id="19" w:name="_Toc237520929"/>
+      <w:r>
+        <w:t xml:space="preserve">Convert letter </w:t>
+      </w:r>
+      <w:r>
+        <w:t>headings</w:t>
+      </w:r>
+      <w:r>
+        <w:t xml:space="preserve"> to single column</w:t>
+      </w:r>
+      <w:bookmarkEnd w:id="16"/>
+      <w:bookmarkEnd w:id="18"/>
+      <w:bookmarkEnd w:id="19"/>
+    </w:p>
+    <w:p>
+      <w:pPr>
+        <w:pStyle w:val="BodyText"/>
+      </w:pPr>
+      <w:r>
+        <w:t xml:space="preserve">The FLEx export automatically sets letter headings to single-column using the procedure described here, but knowing how to do it manually may be useful at times. </w:t>
+      </w:r>
+      <w:r>
+        <w:t xml:space="preserve">When using two columns for your dictionary text, it’s usually desirable to have the letter </w:t>
+      </w:r>
+      <w:r>
+        <w:t>headings</w:t>
+      </w:r>
+      <w:r>
+        <w:t xml:space="preserve"> span both columns. Word does not provide a style for doing this as InDesign provides, but there is a solution that works reasonably well that just requires making a </w:t>
+      </w:r>
+      <w:r>
+        <w:t xml:space="preserve">couple </w:t>
+      </w:r>
+      <w:r>
+        <w:t>change</w:t>
+      </w:r>
+      <w:r>
+        <w:t>s</w:t>
+      </w:r>
+      <w:r>
+        <w:t xml:space="preserve"> for each letter </w:t>
+      </w:r>
+      <w:r>
+        <w:t>heading</w:t>
+      </w:r>
+      <w:r>
+        <w:t xml:space="preserve">. </w:t>
+      </w:r>
+      <w:r>
+        <w:t>FLEx</w:t>
+      </w:r>
+      <w:r>
+        <w:t xml:space="preserve"> normally uses the </w:t>
+      </w:r>
+      <w:r>
+        <w:t>Letter Heading</w:t>
+      </w:r>
+      <w:r>
+        <w:t xml:space="preserve"> style for letter </w:t>
+      </w:r>
+      <w:r>
+        <w:t>headings</w:t>
+      </w:r>
+      <w:r>
+        <w:t>. By searching for this style in the Advanced Find dialog</w:t>
+      </w:r>
+      <w:r>
+        <w:t xml:space="preserve"> (see </w:t>
       </w:r>
       <w:r>
         <w:fldChar w:fldCharType="begin"/>
@@ -6494,6 +6701,27 @@
         <w:fldChar w:fldCharType="end"/>
       </w:r>
       <w:r>
+        <w:fldChar w:fldCharType="begin"/>
+      </w:r>
+      <w:r>
+        <w:instrText xml:space="preserve"> REF _Ref143765791 \r \h </w:instrText>
+      </w:r>
+      <w:r>
+        <w:fldChar w:fldCharType="separate"/>
+      </w:r>
+      <w:r>
+        <w:rPr>
+          <w:cs/>
+        </w:rPr>
+        <w:t>‎</w:t>
+      </w:r>
+      <w:r>
+        <w:t>3.3.1</w:t>
+      </w:r>
+      <w:r>
+        <w:fldChar w:fldCharType="end"/>
+      </w:r>
+      <w:r>
         <w:t>)</w:t>
       </w:r>
       <w:r>
@@ -6514,7 +6742,6 @@
         <w:pStyle w:val="BodyText"/>
       </w:pPr>
       <w:r>
-        <w:lastRenderedPageBreak/>
         <w:t xml:space="preserve">When the letter </w:t>
       </w:r>
       <w:r>
@@ -6708,12 +6935,12 @@
       <w:pPr>
         <w:pStyle w:val="Heading3"/>
       </w:pPr>
-      <w:bookmarkStart w:id="19" w:name="_Toc196376617"/>
       <w:bookmarkStart w:id="20" w:name="_Ref143764487"/>
+      <w:bookmarkStart w:id="21" w:name="_Toc237520930"/>
       <w:r>
         <w:t>Pictures in Word</w:t>
       </w:r>
-      <w:bookmarkEnd w:id="19"/>
+      <w:bookmarkEnd w:id="21"/>
     </w:p>
     <w:p>
       <w:pPr>
@@ -6859,6 +7086,7 @@
         <w:rPr>
           <w:noProof/>
         </w:rPr>
+        <w:lastRenderedPageBreak/>
         <w:drawing>
           <wp:inline distT="0" distB="0" distL="0" distR="0" wp14:anchorId="0C513380" wp14:editId="22317FFB">
             <wp:extent cx="1095528" cy="924054"/>
@@ -6959,7 +7187,6 @@
         <w:rPr>
           <w:noProof/>
         </w:rPr>
-        <w:lastRenderedPageBreak/>
         <w:drawing>
           <wp:inline distT="0" distB="0" distL="0" distR="0" wp14:anchorId="04B5FFF8" wp14:editId="46009866">
             <wp:extent cx="1289685" cy="1342595"/>
@@ -7093,12 +7320,12 @@
       <w:pPr>
         <w:pStyle w:val="Heading3"/>
       </w:pPr>
-      <w:bookmarkStart w:id="21" w:name="_Toc196376618"/>
+      <w:bookmarkStart w:id="22" w:name="_Toc237520931"/>
       <w:r>
         <w:t>Editing the internal Word docx file</w:t>
       </w:r>
       <w:bookmarkEnd w:id="20"/>
-      <w:bookmarkEnd w:id="21"/>
+      <w:bookmarkEnd w:id="22"/>
     </w:p>
     <w:p>
       <w:pPr>
@@ -7184,6 +7411,7 @@
         <w:pStyle w:val="BodyText"/>
       </w:pPr>
       <w:r>
+        <w:lastRenderedPageBreak/>
         <w:t xml:space="preserve">It’s usually good to clean up </w:t>
       </w:r>
       <w:r>
@@ -7261,11 +7489,7 @@
         <w:t>Note</w:t>
       </w:r>
       <w:r>
-        <w:t xml:space="preserve">, however, if you are using subentry reversal items, it’s common to have the main items </w:t>
-      </w:r>
-      <w:r>
-        <w:lastRenderedPageBreak/>
-        <w:t xml:space="preserve">without references. These should not be deleted! </w:t>
+        <w:t xml:space="preserve">, however, if you are using subentry reversal items, it’s common to have the main items without references. These should not be deleted! </w:t>
       </w:r>
       <w:r>
         <w:t xml:space="preserve">When done, clear the filter. This process needs to be done </w:t>
@@ -7317,14 +7541,14 @@
       <w:pPr>
         <w:pStyle w:val="Heading3"/>
       </w:pPr>
-      <w:bookmarkStart w:id="22" w:name="_Toc196376619"/>
+      <w:bookmarkStart w:id="23" w:name="_Toc237520932"/>
       <w:r>
         <w:t>Dictionary f</w:t>
       </w:r>
       <w:r>
         <w:t>ront matter and back matter</w:t>
       </w:r>
-      <w:bookmarkEnd w:id="22"/>
+      <w:bookmarkEnd w:id="23"/>
     </w:p>
     <w:p>
       <w:pPr>
@@ -7338,28 +7562,28 @@
       <w:pPr>
         <w:pStyle w:val="Heading1"/>
       </w:pPr>
-      <w:bookmarkStart w:id="23" w:name="_Toc196376620"/>
+      <w:bookmarkStart w:id="24" w:name="_Toc237520933"/>
       <w:r>
         <w:t>Useful features in Word</w:t>
       </w:r>
-      <w:bookmarkEnd w:id="23"/>
+      <w:bookmarkEnd w:id="24"/>
     </w:p>
     <w:p>
       <w:pPr>
         <w:pStyle w:val="Heading2"/>
       </w:pPr>
-      <w:bookmarkStart w:id="24" w:name="_Ref143252041"/>
-      <w:bookmarkStart w:id="25" w:name="_Ref143252047"/>
-      <w:bookmarkStart w:id="26" w:name="_Toc196376621"/>
+      <w:bookmarkStart w:id="25" w:name="_Ref143252041"/>
+      <w:bookmarkStart w:id="26" w:name="_Ref143252047"/>
+      <w:bookmarkStart w:id="27" w:name="_Toc237520934"/>
       <w:r>
         <w:t xml:space="preserve">Basics of </w:t>
       </w:r>
       <w:r>
         <w:t>Styles in Word</w:t>
       </w:r>
-      <w:bookmarkEnd w:id="24"/>
       <w:bookmarkEnd w:id="25"/>
       <w:bookmarkEnd w:id="26"/>
+      <w:bookmarkEnd w:id="27"/>
     </w:p>
     <w:p>
       <w:pPr>
@@ -7449,7 +7673,11 @@
         <w:t xml:space="preserve"> &gt; </w:t>
       </w:r>
       <w:r>
-        <w:t>Display. With paragraph marks showing, you can select just the paragraph mark, and then the stylesheet will select that paragraph style.</w:t>
+        <w:t xml:space="preserve">Display. </w:t>
+      </w:r>
+      <w:r>
+        <w:lastRenderedPageBreak/>
+        <w:t>With paragraph marks showing, you can select just the paragraph mark, and then the stylesheet will select that paragraph style.</w:t>
       </w:r>
     </w:p>
     <w:p>
@@ -7477,11 +7705,7 @@
         <w:t xml:space="preserve">Alternately, you can move the mouse to the right of the style in the stylesheet and click the triangle menu button. </w:t>
       </w:r>
       <w:r>
-        <w:t xml:space="preserve">This brings up the Modify Style dialog where you can change the name and basic characteristics </w:t>
-      </w:r>
-      <w:r>
-        <w:lastRenderedPageBreak/>
-        <w:t>of the style. For more complete cont</w:t>
+        <w:t>This brings up the Modify Style dialog where you can change the name and basic characteristics of the style. For more complete cont</w:t>
       </w:r>
       <w:r>
         <w:t>r</w:t>
@@ -7531,11 +7755,11 @@
       <w:pPr>
         <w:pStyle w:val="Heading2"/>
       </w:pPr>
-      <w:bookmarkStart w:id="27" w:name="_Toc196376622"/>
+      <w:bookmarkStart w:id="28" w:name="_Toc237520935"/>
       <w:r>
         <w:t>Preventing styles from changing: dynamic updating</w:t>
       </w:r>
-      <w:bookmarkEnd w:id="27"/>
+      <w:bookmarkEnd w:id="28"/>
     </w:p>
     <w:p>
       <w:pPr>
@@ -7663,13 +7887,13 @@
       <w:pPr>
         <w:pStyle w:val="Heading2"/>
       </w:pPr>
-      <w:bookmarkStart w:id="28" w:name="_Ref143252360"/>
-      <w:bookmarkStart w:id="29" w:name="_Toc196376623"/>
+      <w:bookmarkStart w:id="29" w:name="_Ref143252360"/>
+      <w:bookmarkStart w:id="30" w:name="_Toc237520936"/>
       <w:r>
         <w:t>Advanced Find and Replace</w:t>
       </w:r>
-      <w:bookmarkEnd w:id="28"/>
       <w:bookmarkEnd w:id="29"/>
+      <w:bookmarkEnd w:id="30"/>
     </w:p>
     <w:p>
       <w:pPr>
@@ -7743,13 +7967,14 @@
         <w:pStyle w:val="BodyText"/>
       </w:pPr>
       <w:r>
+        <w:lastRenderedPageBreak/>
         <w:t>Once in the Advanced Find and Replace dialog, there are 3 tabs: Find, Replace, and Go To. The default view shows minimal capabilities, but a More button opens up many more features.</w:t>
       </w:r>
       <w:r>
         <w:t xml:space="preserve"> The rest of this discussion assumes the full features are available.</w:t>
       </w:r>
     </w:p>
-    <w:bookmarkStart w:id="30" w:name="_Ref143765791"/>
+    <w:bookmarkStart w:id="31" w:name="_Ref143765791"/>
     <w:p>
       <w:pPr>
         <w:pStyle w:val="Heading3"/>
@@ -7763,7 +7988,7 @@
       <w:r>
         <w:fldChar w:fldCharType="separate"/>
       </w:r>
-      <w:bookmarkStart w:id="31" w:name="_Toc196376624"/>
+      <w:bookmarkStart w:id="32" w:name="_Toc237520937"/>
       <w:r>
         <w:rPr>
           <w:cs/>
@@ -7779,8 +8004,8 @@
       <w:r>
         <w:t>Finding styles</w:t>
       </w:r>
-      <w:bookmarkEnd w:id="30"/>
       <w:bookmarkEnd w:id="31"/>
+      <w:bookmarkEnd w:id="32"/>
     </w:p>
     <w:p>
       <w:pPr>
@@ -7842,14 +8067,13 @@
       <w:pPr>
         <w:pStyle w:val="Heading3"/>
       </w:pPr>
-      <w:bookmarkStart w:id="32" w:name="_Ref143765894"/>
-      <w:bookmarkStart w:id="33" w:name="_Toc196376625"/>
-      <w:r>
-        <w:lastRenderedPageBreak/>
+      <w:bookmarkStart w:id="33" w:name="_Ref143765894"/>
+      <w:bookmarkStart w:id="34" w:name="_Toc237520938"/>
+      <w:r>
         <w:t>Replacing styles</w:t>
       </w:r>
-      <w:bookmarkEnd w:id="32"/>
       <w:bookmarkEnd w:id="33"/>
+      <w:bookmarkEnd w:id="34"/>
     </w:p>
     <w:p>
       <w:pPr>
@@ -7932,11 +8156,11 @@
       <w:pPr>
         <w:pStyle w:val="Heading3"/>
       </w:pPr>
-      <w:bookmarkStart w:id="34" w:name="_Toc196376626"/>
+      <w:bookmarkStart w:id="35" w:name="_Toc237520939"/>
       <w:r>
         <w:t>Special codes</w:t>
       </w:r>
-      <w:bookmarkEnd w:id="34"/>
+      <w:bookmarkEnd w:id="35"/>
     </w:p>
     <w:p>
       <w:pPr>
@@ -8602,6 +8826,7 @@
                 <w:b/>
                 <w:bCs/>
               </w:rPr>
+              <w:lastRenderedPageBreak/>
               <w:t>^g</w:t>
             </w:r>
           </w:p>
@@ -9239,7 +9464,6 @@
                 <w:b/>
                 <w:bCs/>
               </w:rPr>
-              <w:lastRenderedPageBreak/>
               <w:t>^y</w:t>
             </w:r>
           </w:p>
@@ -9478,11 +9702,11 @@
       <w:pPr>
         <w:pStyle w:val="Heading3"/>
       </w:pPr>
-      <w:bookmarkStart w:id="35" w:name="_Toc196376627"/>
+      <w:bookmarkStart w:id="36" w:name="_Toc237520940"/>
       <w:r>
         <w:t>Wild cards</w:t>
       </w:r>
-      <w:bookmarkEnd w:id="35"/>
+      <w:bookmarkEnd w:id="36"/>
     </w:p>
     <w:p>
       <w:pPr>
@@ -10209,6 +10433,7 @@
                 <w:b/>
                 <w:bCs/>
               </w:rPr>
+              <w:lastRenderedPageBreak/>
               <w:t>^+</w:t>
             </w:r>
           </w:p>
@@ -10663,7 +10888,6 @@
                 <w:b/>
                 <w:bCs/>
               </w:rPr>
-              <w:lastRenderedPageBreak/>
               <w:t>^</w:t>
             </w:r>
             <w:r>
@@ -11761,7 +11985,11 @@
         <w:t>([A-z]@)</w:t>
       </w:r>
       <w:r>
-        <w:t xml:space="preserve"> followed by a space then a second expression of one or more upper or lowercase letters </w:t>
+        <w:t xml:space="preserve"> followed by a space then a second expression of one or more upper or lowercase </w:t>
+      </w:r>
+      <w:r>
+        <w:lastRenderedPageBreak/>
+        <w:t xml:space="preserve">letters </w:t>
       </w:r>
       <w:r>
         <w:rPr>
@@ -11915,14 +12143,13 @@
       <w:pPr>
         <w:pStyle w:val="Heading3"/>
       </w:pPr>
-      <w:bookmarkStart w:id="36" w:name="_Ref143765840"/>
-      <w:bookmarkStart w:id="37" w:name="_Toc196376628"/>
-      <w:r>
-        <w:lastRenderedPageBreak/>
+      <w:bookmarkStart w:id="37" w:name="_Ref143765840"/>
+      <w:bookmarkStart w:id="38" w:name="_Toc237520941"/>
+      <w:r>
         <w:t>Adding text before or after a style</w:t>
       </w:r>
-      <w:bookmarkEnd w:id="36"/>
       <w:bookmarkEnd w:id="37"/>
+      <w:bookmarkEnd w:id="38"/>
     </w:p>
     <w:p>
       <w:pPr>
@@ -11937,14 +12164,14 @@
       <w:r>
         <w:t xml:space="preserve">Example </w:t>
       </w:r>
-      <w:bookmarkStart w:id="38" w:name="_Hlk181692217"/>
+      <w:bookmarkStart w:id="39" w:name="_Hlk181692217"/>
       <w:r>
         <w:t>Sentenc</w:t>
       </w:r>
       <w:r>
         <w:t>e</w:t>
       </w:r>
-      <w:bookmarkEnd w:id="38"/>
+      <w:bookmarkEnd w:id="39"/>
       <w:r>
         <w:t xml:space="preserve"> </w:t>
       </w:r>
@@ -12211,13 +12438,13 @@
       <w:pPr>
         <w:pStyle w:val="Heading2"/>
       </w:pPr>
-      <w:bookmarkStart w:id="39" w:name="_Ref143785624"/>
-      <w:bookmarkStart w:id="40" w:name="_Toc196376629"/>
+      <w:bookmarkStart w:id="40" w:name="_Ref143785624"/>
+      <w:bookmarkStart w:id="41" w:name="_Toc237520942"/>
       <w:r>
         <w:t>Removing unused styles in Word</w:t>
       </w:r>
-      <w:bookmarkEnd w:id="39"/>
       <w:bookmarkEnd w:id="40"/>
+      <w:bookmarkEnd w:id="41"/>
     </w:p>
     <w:p>
       <w:pPr>
@@ -12227,7 +12454,11 @@
         <w:t>The FLEx Word export does not add new styles unless they are used somewhere in the data. But if you ever want</w:t>
       </w:r>
       <w:r>
-        <w:t xml:space="preserve"> to get rid of unused styles, there is a macro available that will do this. However, before doing this, you should be careful that you no longer need the unused styles. Of course, you can always add new styles if needed. </w:t>
+        <w:t xml:space="preserve"> to get rid of unused styles, there is a macro available that will do this. However, </w:t>
+      </w:r>
+      <w:r>
+        <w:lastRenderedPageBreak/>
+        <w:t xml:space="preserve">before doing this, you should be careful that you no longer need the unused styles. Of course, you can always add new styles if needed. </w:t>
       </w:r>
       <w:r>
         <w:t xml:space="preserve">See section </w:t>
@@ -12372,9 +12603,6 @@
       </w:r>
       <w:r>
         <w:br/>
-      </w:r>
-      <w:r>
-        <w:lastRenderedPageBreak/>
         <w:t xml:space="preserve">                If .Found = False Then </w:t>
       </w:r>
       <w:proofErr w:type="spellStart"/>
@@ -12408,16 +12636,16 @@
       <w:pPr>
         <w:pStyle w:val="Heading2"/>
       </w:pPr>
-      <w:bookmarkStart w:id="41" w:name="_Ref144458109"/>
-      <w:bookmarkStart w:id="42" w:name="_Toc196376630"/>
+      <w:bookmarkStart w:id="42" w:name="_Ref144458109"/>
+      <w:bookmarkStart w:id="43" w:name="_Toc237520943"/>
       <w:r>
         <w:t>Word</w:t>
       </w:r>
-      <w:bookmarkEnd w:id="41"/>
+      <w:bookmarkEnd w:id="42"/>
       <w:r>
         <w:t xml:space="preserve"> macros</w:t>
       </w:r>
-      <w:bookmarkEnd w:id="42"/>
+      <w:bookmarkEnd w:id="43"/>
     </w:p>
     <w:p>
       <w:pPr>
@@ -12555,15 +12783,15 @@
       <w:pPr>
         <w:pStyle w:val="Heading3"/>
       </w:pPr>
-      <w:bookmarkStart w:id="43" w:name="_Ref181708018"/>
-      <w:bookmarkStart w:id="44" w:name="_Ref181711580"/>
-      <w:bookmarkStart w:id="45" w:name="_Toc196376631"/>
+      <w:bookmarkStart w:id="44" w:name="_Ref181708018"/>
+      <w:bookmarkStart w:id="45" w:name="_Ref181711580"/>
+      <w:bookmarkStart w:id="46" w:name="_Toc237520944"/>
       <w:r>
         <w:t>Example recording a macro and running it through your document</w:t>
       </w:r>
-      <w:bookmarkEnd w:id="43"/>
       <w:bookmarkEnd w:id="44"/>
       <w:bookmarkEnd w:id="45"/>
+      <w:bookmarkEnd w:id="46"/>
     </w:p>
     <w:p>
       <w:pPr>
@@ -12595,7 +12823,7 @@
       <w:pPr>
         <w:pStyle w:val="Example"/>
       </w:pPr>
-      <w:bookmarkStart w:id="46" w:name="_Hlk181704538"/>
+      <w:bookmarkStart w:id="47" w:name="_Hlk181704538"/>
       <w:r>
         <w:t>This is a story with [</w:t>
       </w:r>
@@ -12635,7 +12863,7 @@
       <w:r>
         <w:t>] are not part of the Emphasis style.</w:t>
       </w:r>
-      <w:bookmarkEnd w:id="46"/>
+      <w:bookmarkEnd w:id="47"/>
     </w:p>
     <w:p>
       <w:pPr>
@@ -12657,7 +12885,11 @@
         <w:t>instance</w:t>
       </w:r>
       <w:r>
-        <w:t>. This can be recorded as a macro, and then with a couple edits, it can be modified to go through the file repeating those changes.</w:t>
+        <w:t xml:space="preserve">. This can be recorded as a </w:t>
+      </w:r>
+      <w:r>
+        <w:lastRenderedPageBreak/>
+        <w:t>macro, and then with a couple edits, it can be modified to go through the file repeating those changes.</w:t>
       </w:r>
     </w:p>
     <w:p>
@@ -12746,7 +12978,6 @@
         <w:pStyle w:val="BodyText"/>
       </w:pPr>
       <w:r>
-        <w:lastRenderedPageBreak/>
         <w:t>After</w:t>
       </w:r>
       <w:r>
@@ -13271,6 +13502,7 @@
         <w:br/>
       </w:r>
       <w:r>
+        <w:lastRenderedPageBreak/>
         <w:t xml:space="preserve">    </w:t>
       </w:r>
       <w:proofErr w:type="spellStart"/>
@@ -13426,11 +13658,7 @@
         <w:t xml:space="preserve">Before executing this macro, make sure the Advanced Find dialog is set to search for the Emphasis style. Assuming your file still has the first occurrence changed from recording the macro, place your cursor after that occurrence, then use </w:t>
       </w:r>
       <w:r>
-        <w:t xml:space="preserve">View &gt; Macros &gt; View Macros, and </w:t>
-      </w:r>
-      <w:r>
-        <w:lastRenderedPageBreak/>
-        <w:t xml:space="preserve">click </w:t>
+        <w:t xml:space="preserve">View &gt; Macros &gt; View Macros, and click </w:t>
       </w:r>
       <w:proofErr w:type="spellStart"/>
       <w:r>
@@ -13445,13 +13673,13 @@
       <w:pPr>
         <w:pStyle w:val="Heading2"/>
       </w:pPr>
-      <w:bookmarkStart w:id="47" w:name="_Ref143767417"/>
-      <w:bookmarkStart w:id="48" w:name="_Toc196376632"/>
+      <w:bookmarkStart w:id="48" w:name="_Ref143767417"/>
+      <w:bookmarkStart w:id="49" w:name="_Toc237520945"/>
       <w:r>
         <w:t>Editing the internal Word docx file</w:t>
       </w:r>
-      <w:bookmarkEnd w:id="47"/>
       <w:bookmarkEnd w:id="48"/>
+      <w:bookmarkEnd w:id="49"/>
     </w:p>
     <w:p>
       <w:pPr>
@@ -13519,11 +13747,11 @@
       <w:pPr>
         <w:pStyle w:val="Heading1"/>
       </w:pPr>
-      <w:bookmarkStart w:id="49" w:name="_Toc196376633"/>
+      <w:bookmarkStart w:id="50" w:name="_Toc237520946"/>
       <w:r>
         <w:t>Bidirectional dictionaries in Word</w:t>
       </w:r>
-      <w:bookmarkEnd w:id="49"/>
+      <w:bookmarkEnd w:id="50"/>
     </w:p>
     <w:p>
       <w:pPr>
@@ -13621,6 +13849,7 @@
         <w:rPr>
           <w:noProof/>
         </w:rPr>
+        <w:lastRenderedPageBreak/>
         <w:drawing>
           <wp:inline distT="0" distB="0" distL="0" distR="0" wp14:anchorId="0E932A51" wp14:editId="3ECB171B">
             <wp:extent cx="3524742" cy="2514951"/>
@@ -13693,51 +13922,210 @@
       <w:pPr>
         <w:pStyle w:val="Heading2"/>
       </w:pPr>
-      <w:bookmarkStart w:id="50" w:name="_Ref143851345"/>
-      <w:bookmarkStart w:id="51" w:name="_Toc196376634"/>
+      <w:bookmarkStart w:id="51" w:name="_Ref143851345"/>
+      <w:bookmarkStart w:id="52" w:name="_Toc237520947"/>
+      <w:r>
+        <w:t>Enabling right-to-left publications in Word</w:t>
+      </w:r>
+      <w:bookmarkEnd w:id="51"/>
+      <w:bookmarkEnd w:id="52"/>
+    </w:p>
+    <w:p>
+      <w:pPr>
+        <w:pStyle w:val="BodyText"/>
+      </w:pPr>
+      <w:r>
+        <w:t xml:space="preserve">Word does a </w:t>
+      </w:r>
+      <w:r>
+        <w:t xml:space="preserve">reasonably </w:t>
+      </w:r>
+      <w:r>
+        <w:t xml:space="preserve">good job of handling right-to-left publications </w:t>
+      </w:r>
+      <w:r>
+        <w:t>with page numbers, headers, and columns all flowing RTL instead of LTR. However,</w:t>
+      </w:r>
+      <w:r>
+        <w:t xml:space="preserve"> it’s not </w:t>
+      </w:r>
+      <w:r>
+        <w:t xml:space="preserve">at all </w:t>
+      </w:r>
+      <w:r>
+        <w:t xml:space="preserve">obvious how </w:t>
+      </w:r>
+      <w:r>
+        <w:t>you can get Word to work this way.</w:t>
+      </w:r>
+      <w:r>
+        <w:t xml:space="preserve"> </w:t>
+      </w:r>
+      <w:r>
+        <w:t xml:space="preserve">It turns out, that Word provides some extra options if you have a right-to-left language installed in </w:t>
+      </w:r>
+      <w:r>
+        <w:t>Office</w:t>
+      </w:r>
+      <w:r>
+        <w:t>.</w:t>
+      </w:r>
+    </w:p>
+    <w:p>
+      <w:pPr>
+        <w:pStyle w:val="BodyText"/>
+      </w:pPr>
+      <w:r>
+        <w:t xml:space="preserve">These instructions are for Office 2019 on Windows 11, so may vary somewhat with other versions. </w:t>
+      </w:r>
+      <w:r>
+        <w:t xml:space="preserve">To install the language, </w:t>
+      </w:r>
+      <w:r>
+        <w:t>before opening</w:t>
+      </w:r>
+      <w:r>
+        <w:t xml:space="preserve"> Word, use the Windows start icon to find Microsoft Office Tools, and under that, open Office Language Preferences. In this program, you need to have at least one RTL language installed as an Editing Language. If you do not have one, and </w:t>
+      </w:r>
+      <w:r>
+        <w:t xml:space="preserve">you </w:t>
+      </w:r>
+      <w:r>
+        <w:t xml:space="preserve">do not </w:t>
+      </w:r>
+      <w:proofErr w:type="gramStart"/>
+      <w:r>
+        <w:t>have a preference for</w:t>
+      </w:r>
+      <w:proofErr w:type="gramEnd"/>
+      <w:r>
+        <w:t xml:space="preserve"> which </w:t>
+      </w:r>
+      <w:r>
+        <w:t xml:space="preserve">RTL </w:t>
+      </w:r>
+      <w:r>
+        <w:t>language to install, in the “Add additional editing languages” chooser, select Arabic (Saudi Arabia) and</w:t>
+      </w:r>
+      <w:r>
+        <w:t xml:space="preserve"> then click Add. At this point it won’t be enabled, so click the </w:t>
+      </w:r>
+      <w:r>
+        <w:t>“</w:t>
+      </w:r>
+      <w:r>
+        <w:t>Not enabled</w:t>
+      </w:r>
+      <w:r>
+        <w:t>”</w:t>
+      </w:r>
+      <w:r>
+        <w:t xml:space="preserve"> link. This will take you to the Windows Language &amp; region dialog where you will need to click “Add a language”</w:t>
+      </w:r>
+      <w:r>
+        <w:t xml:space="preserve">. After selecting the language in the list, click Next, and select the Language pack option. Be careful not to check “Set as my Windows display language”. </w:t>
+      </w:r>
+      <w:r>
+        <w:t>Click Install to install the language pack.</w:t>
+      </w:r>
+      <w:r>
+        <w:t xml:space="preserve"> </w:t>
+      </w:r>
+      <w:r>
+        <w:t>You do not need to install the other options such as speech recognition and proofing options. You can then click OK to c</w:t>
+      </w:r>
+      <w:r>
+        <w:t>l</w:t>
+      </w:r>
+      <w:r>
+        <w:t>ose the Office Language Preferences dialog. Now Word will have options to produce RTL books.</w:t>
+      </w:r>
+    </w:p>
+    <w:p>
+      <w:pPr>
+        <w:pStyle w:val="BodyText"/>
+      </w:pPr>
+      <w:r>
+        <w:t>For RTL book layout, go to File</w:t>
+      </w:r>
+      <w:r>
+        <w:t xml:space="preserve"> &gt; </w:t>
+      </w:r>
+      <w:r>
+        <w:t>Options</w:t>
+      </w:r>
+      <w:r>
+        <w:t xml:space="preserve"> &gt; </w:t>
+      </w:r>
+      <w:r>
+        <w:t xml:space="preserve">Advanced, there are some new features under Editing Options, and Show Document Content. Under Show Document Content, Set Document View to Right-to-left. At this point Word will </w:t>
+      </w:r>
+      <w:r>
+        <w:t>properly</w:t>
+      </w:r>
+      <w:r>
+        <w:t xml:space="preserve"> lay out books in RTL mode. Unfortunately, this is a global Word setting, so if you have a mix of LTR and RTL documents, you’ll have to change this each time you switch to another </w:t>
+      </w:r>
+      <w:r>
+        <w:t>direction.</w:t>
+      </w:r>
+    </w:p>
+    <w:p>
+      <w:pPr>
+        <w:pStyle w:val="Heading2"/>
+      </w:pPr>
+      <w:bookmarkStart w:id="53" w:name="_Toc237520948"/>
       <w:r>
         <w:lastRenderedPageBreak/>
-        <w:t>Enabling right-to-left publications in Word</w:t>
-      </w:r>
-      <w:bookmarkEnd w:id="50"/>
-      <w:bookmarkEnd w:id="51"/>
+        <w:t xml:space="preserve">Basic </w:t>
+      </w:r>
+      <w:r>
+        <w:t xml:space="preserve">RTL </w:t>
+      </w:r>
+      <w:r>
+        <w:t>layout in FLEx and Word</w:t>
+      </w:r>
+      <w:bookmarkEnd w:id="53"/>
     </w:p>
     <w:p>
       <w:pPr>
         <w:pStyle w:val="BodyText"/>
       </w:pPr>
       <w:r>
-        <w:t xml:space="preserve">Word does a </w:t>
-      </w:r>
-      <w:r>
-        <w:t xml:space="preserve">reasonably </w:t>
-      </w:r>
-      <w:r>
-        <w:t xml:space="preserve">good job of handling right-to-left publications </w:t>
-      </w:r>
-      <w:r>
-        <w:t>with page numbers, headers, and columns all flowing RTL instead of LTR. However,</w:t>
-      </w:r>
-      <w:r>
-        <w:t xml:space="preserve"> it’s not </w:t>
-      </w:r>
-      <w:r>
-        <w:t xml:space="preserve">at all </w:t>
-      </w:r>
-      <w:r>
-        <w:t xml:space="preserve">obvious how </w:t>
-      </w:r>
-      <w:r>
-        <w:t>you can get Word to work this way.</w:t>
-      </w:r>
-      <w:r>
-        <w:t xml:space="preserve"> </w:t>
-      </w:r>
-      <w:r>
-        <w:t xml:space="preserve">It turns out, that Word provides some extra options if you have a right-to-left language installed in </w:t>
-      </w:r>
-      <w:r>
-        <w:t>Office</w:t>
+        <w:t xml:space="preserve">When the primary language in a publication is </w:t>
+      </w:r>
+      <w:r>
+        <w:t>right-to-left</w:t>
+      </w:r>
+      <w:r>
+        <w:t>, here are some hints on how to set up the language and configuration to handle this.</w:t>
+      </w:r>
+    </w:p>
+    <w:p>
+      <w:pPr>
+        <w:pStyle w:val="Heading3"/>
+      </w:pPr>
+      <w:bookmarkStart w:id="54" w:name="_Toc237520949"/>
+      <w:r>
+        <w:t>Settings in FLEx</w:t>
+      </w:r>
+      <w:bookmarkEnd w:id="54"/>
+    </w:p>
+    <w:p>
+      <w:pPr>
+        <w:pStyle w:val="BodyText"/>
+      </w:pPr>
+      <w:r>
+        <w:t>These are the basic settings you need in FLEx for a</w:t>
+      </w:r>
+      <w:r>
+        <w:t>n</w:t>
+      </w:r>
+      <w:r>
+        <w:t xml:space="preserve"> RTL </w:t>
+      </w:r>
+      <w:r>
+        <w:t>publication</w:t>
       </w:r>
       <w:r>
         <w:t>.</w:t>
@@ -13745,223 +14133,64 @@
     </w:p>
     <w:p>
       <w:pPr>
-        <w:pStyle w:val="BodyText"/>
-      </w:pPr>
-      <w:r>
-        <w:t xml:space="preserve">These instructions are for Office 2019 on Windows 11, so may vary somewhat with other versions. </w:t>
-      </w:r>
-      <w:r>
-        <w:t xml:space="preserve">To install the language, </w:t>
-      </w:r>
-      <w:r>
-        <w:t>before opening</w:t>
-      </w:r>
-      <w:r>
-        <w:t xml:space="preserve"> Word, use the Windows start icon to find Microsoft Office Tools, and under that, open Office Language Preferences. In this program, you need to have at least one RTL language installed as an Editing Language. If you do not have one, and </w:t>
-      </w:r>
-      <w:r>
-        <w:t xml:space="preserve">you </w:t>
-      </w:r>
-      <w:r>
-        <w:t xml:space="preserve">do not </w:t>
-      </w:r>
-      <w:proofErr w:type="gramStart"/>
-      <w:r>
-        <w:t>have a preference for</w:t>
-      </w:r>
-      <w:proofErr w:type="gramEnd"/>
-      <w:r>
-        <w:t xml:space="preserve"> which </w:t>
-      </w:r>
-      <w:r>
-        <w:t xml:space="preserve">RTL </w:t>
-      </w:r>
-      <w:r>
-        <w:t>language to install, in the “Add additional editing languages” chooser, select Arabic (Saudi Arabia) and</w:t>
-      </w:r>
-      <w:r>
-        <w:t xml:space="preserve"> then click Add. At this point it won’t be enabled, so click the </w:t>
-      </w:r>
-      <w:r>
-        <w:t>“</w:t>
-      </w:r>
-      <w:r>
-        <w:t>Not enabled</w:t>
-      </w:r>
-      <w:r>
-        <w:t>”</w:t>
-      </w:r>
-      <w:r>
-        <w:t xml:space="preserve"> link. This will take you to the Windows Language &amp; region dialog where you will need to click “Add a language”</w:t>
-      </w:r>
-      <w:r>
-        <w:t xml:space="preserve">. After selecting the language in the list, click Next, and select the Language pack option. Be careful not to check “Set as my Windows display language”. </w:t>
-      </w:r>
-      <w:r>
-        <w:t>Click Install to install the language pack.</w:t>
-      </w:r>
-      <w:r>
-        <w:t xml:space="preserve"> </w:t>
-      </w:r>
-      <w:r>
-        <w:t>You do not need to install the other options such as speech recognition and proofing options. You can then click OK to c</w:t>
-      </w:r>
-      <w:r>
-        <w:t>l</w:t>
-      </w:r>
-      <w:r>
-        <w:t>ose the Office Language Preferences dialog. Now Word will have options to produce RTL books.</w:t>
-      </w:r>
-    </w:p>
-    <w:p>
-      <w:pPr>
-        <w:pStyle w:val="BodyText"/>
-      </w:pPr>
-      <w:r>
-        <w:t>For RTL book layout, go to File</w:t>
+        <w:pStyle w:val="ListBullet"/>
+      </w:pPr>
+      <w:r>
+        <w:t>In Format</w:t>
       </w:r>
       <w:r>
         <w:t xml:space="preserve"> &gt; </w:t>
       </w:r>
       <w:r>
-        <w:t>Options</w:t>
+        <w:t>Set up Vernacular Writing System, make sure “Right-to-left” is checked in the General tab.</w:t>
+      </w:r>
+    </w:p>
+    <w:p>
+      <w:pPr>
+        <w:pStyle w:val="ListBullet"/>
+      </w:pPr>
+      <w:r>
+        <w:t>In Format</w:t>
       </w:r>
       <w:r>
         <w:t xml:space="preserve"> &gt; </w:t>
       </w:r>
       <w:r>
-        <w:t xml:space="preserve">Advanced, there are some new features under Editing Options, and Show Document Content. Under Show Document Content, Set Document View to Right-to-left. At this point Word will </w:t>
-      </w:r>
-      <w:r>
-        <w:t>properly</w:t>
-      </w:r>
-      <w:r>
-        <w:t xml:space="preserve"> lay out books in RTL mode. Unfortunately, this is a global Word setting, so if you have a mix of LTR and RTL documents, you’ll have to change this each time you switch to another </w:t>
-      </w:r>
-      <w:r>
-        <w:t>direction.</w:t>
-      </w:r>
-    </w:p>
-    <w:p>
-      <w:pPr>
-        <w:pStyle w:val="Heading2"/>
-      </w:pPr>
-      <w:bookmarkStart w:id="52" w:name="_Toc196376635"/>
-      <w:r>
-        <w:t xml:space="preserve">Basic </w:t>
-      </w:r>
-      <w:r>
-        <w:t xml:space="preserve">RTL </w:t>
-      </w:r>
-      <w:r>
-        <w:t>layout in FLEx and Word</w:t>
-      </w:r>
-      <w:bookmarkEnd w:id="52"/>
-    </w:p>
-    <w:p>
-      <w:pPr>
-        <w:pStyle w:val="BodyText"/>
-      </w:pPr>
-      <w:r>
-        <w:t xml:space="preserve">When the primary language in a publication is </w:t>
-      </w:r>
-      <w:r>
-        <w:t>right-to-left</w:t>
-      </w:r>
-      <w:r>
-        <w:t>, here are some hints on how to set up the language and configuration to handle this.</w:t>
+        <w:t>Styles</w:t>
+      </w:r>
+      <w:r>
+        <w:t xml:space="preserve"> &gt; </w:t>
+      </w:r>
+      <w:r>
+        <w:t>Normal</w:t>
+      </w:r>
+      <w:r>
+        <w:t xml:space="preserve"> &gt; </w:t>
+      </w:r>
+      <w:r>
+        <w:t xml:space="preserve">Paragraph, set Direction to Right-To-Left, and set Alignment to </w:t>
+      </w:r>
+      <w:r>
+        <w:t>Leading</w:t>
+      </w:r>
+      <w:r>
+        <w:t>.</w:t>
+      </w:r>
+      <w:r>
+        <w:t xml:space="preserve"> Note, </w:t>
+      </w:r>
+      <w:r>
+        <w:t>r</w:t>
+      </w:r>
+      <w:r>
+        <w:t>ight alignment will not work well when exporting to Word.</w:t>
       </w:r>
     </w:p>
     <w:p>
       <w:pPr>
         <w:pStyle w:val="Heading3"/>
       </w:pPr>
-      <w:bookmarkStart w:id="53" w:name="_Toc196376636"/>
-      <w:r>
-        <w:t>Settings in FLEx</w:t>
-      </w:r>
-      <w:bookmarkEnd w:id="53"/>
-    </w:p>
-    <w:p>
-      <w:pPr>
-        <w:pStyle w:val="BodyText"/>
-      </w:pPr>
-      <w:r>
-        <w:t>These are the basic settings you need in FLEx for a</w:t>
-      </w:r>
-      <w:r>
-        <w:t>n</w:t>
-      </w:r>
-      <w:r>
-        <w:t xml:space="preserve"> RTL </w:t>
-      </w:r>
-      <w:r>
-        <w:t>publication</w:t>
-      </w:r>
-      <w:r>
-        <w:t>.</w:t>
-      </w:r>
-    </w:p>
-    <w:p>
-      <w:pPr>
-        <w:pStyle w:val="ListBullet"/>
-      </w:pPr>
-      <w:r>
-        <w:t>In Format</w:t>
-      </w:r>
-      <w:r>
-        <w:t xml:space="preserve"> &gt; </w:t>
-      </w:r>
-      <w:r>
-        <w:t>Set up Vernacular Writing System, make sure “Right-to-left” is checked in the General tab.</w:t>
-      </w:r>
-    </w:p>
-    <w:p>
-      <w:pPr>
-        <w:pStyle w:val="ListBullet"/>
-      </w:pPr>
-      <w:r>
-        <w:t>In Format</w:t>
-      </w:r>
-      <w:r>
-        <w:t xml:space="preserve"> &gt; </w:t>
-      </w:r>
-      <w:r>
-        <w:t>Styles</w:t>
-      </w:r>
-      <w:r>
-        <w:t xml:space="preserve"> &gt; </w:t>
-      </w:r>
-      <w:r>
-        <w:t>Normal</w:t>
-      </w:r>
-      <w:r>
-        <w:t xml:space="preserve"> &gt; </w:t>
-      </w:r>
-      <w:r>
-        <w:t xml:space="preserve">Paragraph, set Direction to Right-To-Left, and set Alignment to </w:t>
-      </w:r>
-      <w:r>
-        <w:t>Leading</w:t>
-      </w:r>
-      <w:r>
-        <w:t>.</w:t>
-      </w:r>
-      <w:r>
-        <w:t xml:space="preserve"> Note, </w:t>
-      </w:r>
-      <w:r>
-        <w:t>r</w:t>
-      </w:r>
-      <w:r>
-        <w:t>ight alignment will not work well when exporting to Word.</w:t>
-      </w:r>
-    </w:p>
-    <w:p>
-      <w:pPr>
-        <w:pStyle w:val="Heading3"/>
-      </w:pPr>
-      <w:bookmarkStart w:id="54" w:name="_Toc196376637"/>
+      <w:bookmarkStart w:id="55" w:name="_Toc237520950"/>
       <w:r>
         <w:t>Setting</w:t>
       </w:r>
@@ -13971,7 +14200,7 @@
       <w:r>
         <w:t xml:space="preserve"> in Word</w:t>
       </w:r>
-      <w:bookmarkEnd w:id="54"/>
+      <w:bookmarkEnd w:id="55"/>
     </w:p>
     <w:p>
       <w:pPr>
@@ -14069,11 +14298,7 @@
         <w:t>.</w:t>
       </w:r>
       <w:r>
-        <w:t xml:space="preserve"> This is critical for </w:t>
-      </w:r>
-      <w:r>
-        <w:lastRenderedPageBreak/>
-        <w:t>RTL documents so that the first column on the page is on the right side.</w:t>
+        <w:t xml:space="preserve"> This is critical for RTL documents so that the first column on the page is on the right side.</w:t>
       </w:r>
       <w:r>
         <w:t xml:space="preserve"> FLEx sets this automatically during export of RTL documents, so this step is not necessary for Word exports.</w:t>
@@ -14091,16 +14316,16 @@
       <w:pPr>
         <w:pStyle w:val="Heading2"/>
       </w:pPr>
-      <w:bookmarkStart w:id="55" w:name="_Ref143870637"/>
-      <w:bookmarkStart w:id="56" w:name="_Toc196376638"/>
+      <w:bookmarkStart w:id="56" w:name="_Ref143870637"/>
+      <w:bookmarkStart w:id="57" w:name="_Toc237520951"/>
       <w:r>
         <w:t xml:space="preserve">Bidirectional </w:t>
       </w:r>
       <w:r>
         <w:t>algorithm</w:t>
       </w:r>
-      <w:bookmarkEnd w:id="55"/>
       <w:bookmarkEnd w:id="56"/>
+      <w:bookmarkEnd w:id="57"/>
     </w:p>
     <w:p>
       <w:pPr>
@@ -14225,6 +14450,7 @@
         <w:rPr>
           <w:noProof/>
         </w:rPr>
+        <w:lastRenderedPageBreak/>
         <w:drawing>
           <wp:inline distT="0" distB="0" distL="0" distR="0" wp14:anchorId="5E8DD001" wp14:editId="0171AB55">
             <wp:extent cx="4782217" cy="790685"/>
@@ -14355,7 +14581,6 @@
         <w:rPr>
           <w:noProof/>
         </w:rPr>
-        <w:lastRenderedPageBreak/>
         <w:t xml:space="preserve"> </w:t>
       </w:r>
       <w:r>
@@ -14780,6 +15005,7 @@
               <w:pStyle w:val="BodyText"/>
             </w:pPr>
             <w:r>
+              <w:lastRenderedPageBreak/>
               <w:t>RLE</w:t>
             </w:r>
           </w:p>
@@ -15113,7 +15339,6 @@
               <w:pStyle w:val="BodyText"/>
             </w:pPr>
             <w:r>
-              <w:lastRenderedPageBreak/>
               <w:t>FSI</w:t>
             </w:r>
           </w:p>
@@ -15280,18 +15505,18 @@
       <w:pPr>
         <w:pStyle w:val="Heading2"/>
       </w:pPr>
-      <w:bookmarkStart w:id="58" w:name="_Ref143865236"/>
-      <w:bookmarkStart w:id="59" w:name="_Ref144371733"/>
-      <w:bookmarkStart w:id="60" w:name="_Toc196376639"/>
+      <w:bookmarkStart w:id="59" w:name="_Ref143865236"/>
+      <w:bookmarkStart w:id="60" w:name="_Ref144371733"/>
+      <w:bookmarkStart w:id="61" w:name="_Toc237520952"/>
       <w:r>
         <w:t xml:space="preserve">Formatting </w:t>
       </w:r>
-      <w:bookmarkEnd w:id="58"/>
+      <w:bookmarkEnd w:id="59"/>
       <w:r>
         <w:t>bidirectional entries in FLEx</w:t>
       </w:r>
-      <w:bookmarkEnd w:id="59"/>
       <w:bookmarkEnd w:id="60"/>
+      <w:bookmarkEnd w:id="61"/>
     </w:p>
     <w:p>
       <w:pPr>
@@ -15399,7 +15624,11 @@
         <w:t xml:space="preserve">. </w:t>
       </w:r>
       <w:r>
-        <w:t xml:space="preserve">To enter the codes, enclose the abbreviation from the chart in square brackets. For example, the </w:t>
+        <w:t xml:space="preserve">To enter the codes, enclose </w:t>
+      </w:r>
+      <w:r>
+        <w:lastRenderedPageBreak/>
+        <w:t xml:space="preserve">the abbreviation from the chart in square brackets. For example, the </w:t>
       </w:r>
       <w:r>
         <w:t>RLE code would be entered in the configuration as [RLE].</w:t>
@@ -15606,11 +15835,7 @@
         <w:t>s</w:t>
       </w:r>
       <w:r>
-        <w:t xml:space="preserve"> out the pieces going right-to-left, we have the headword, then the open square bracket, the pronunciation, the closing square bracket, the </w:t>
-      </w:r>
-      <w:r>
-        <w:lastRenderedPageBreak/>
-        <w:t xml:space="preserve">category, the period, and then the definition. We could get the desired output by putting </w:t>
+        <w:t xml:space="preserve"> out the pieces going right-to-left, we have the headword, then the open square bracket, the pronunciation, the closing square bracket, the category, the period, and then the definition. We could get the desired output by putting </w:t>
       </w:r>
       <w:r>
         <w:t>the period in Before text and putting in backward square brackets in the Before and After. But this is technically not correct, and will cause other problems along the way.</w:t>
@@ -15999,7 +16224,7 @@
       <w:r>
         <w:br/>
       </w:r>
-      <w:bookmarkStart w:id="61" w:name="_Hlk181688468"/>
+      <w:bookmarkStart w:id="62" w:name="_Hlk181688468"/>
       <w:r>
         <w:t>Lexeme Form (IPA): Before</w:t>
       </w:r>
@@ -16030,7 +16255,7 @@
       <w:r>
         <w:t>∙</w:t>
       </w:r>
-      <w:bookmarkEnd w:id="61"/>
+      <w:bookmarkEnd w:id="62"/>
     </w:p>
     <w:p>
       <w:pPr>
@@ -16085,6 +16310,7 @@
         <w:pStyle w:val="BodyText"/>
       </w:pPr>
       <w:r>
+        <w:lastRenderedPageBreak/>
         <w:t xml:space="preserve">Word: </w:t>
       </w:r>
       <w:r>
@@ -16300,11 +16526,7 @@
         <w:t xml:space="preserve"> </w:t>
       </w:r>
       <w:r>
-        <w:t xml:space="preserve">that will likely be encountered when configuring Bidi dictionaries in FLEx, and some specific challenges when using Word. Any time you add Before and After fields, there is a good possibility you will need to use some </w:t>
-      </w:r>
-      <w:r>
-        <w:lastRenderedPageBreak/>
-        <w:t xml:space="preserve">of the </w:t>
+        <w:t xml:space="preserve">that will likely be encountered when configuring Bidi dictionaries in FLEx, and some specific challenges when using Word. Any time you add Before and After fields, there is a good possibility you will need to use some of the </w:t>
       </w:r>
       <w:r>
         <w:t>B</w:t>
@@ -16561,7 +16783,7 @@
       <w:rPr>
         <w:noProof/>
       </w:rPr>
-      <w:t>2/9/2026</w:t>
+      <w:t>8/11/2026</w:t>
     </w:r>
     <w:r>
       <w:fldChar w:fldCharType="end"/>
@@ -16608,7 +16830,7 @@
         <w:rStyle w:val="PageNumber"/>
         <w:noProof/>
       </w:rPr>
-      <w:t>2/9/2026</w:t>
+      <w:t>8/11/2026</w:t>
     </w:r>
     <w:r>
       <w:rPr>
@@ -16709,7 +16931,7 @@
       <w:r>
         <w:t xml:space="preserve"> Unicode Bidirectional Algorithm </w:t>
       </w:r>
-      <w:bookmarkStart w:id="57" w:name="_Hlk143862095"/>
+      <w:bookmarkStart w:id="58" w:name="_Hlk143862095"/>
       <w:r>
         <w:fldChar w:fldCharType="begin"/>
       </w:r>
@@ -16725,7 +16947,7 @@
         </w:rPr>
         <w:t>https://unicode.org/reports/tr9</w:t>
       </w:r>
-      <w:bookmarkEnd w:id="57"/>
+      <w:bookmarkEnd w:id="58"/>
       <w:r>
         <w:fldChar w:fldCharType="end"/>
       </w:r>
@@ -17298,7 +17520,7 @@
   <w:abstractNum w:abstractNumId="12" w15:restartNumberingAfterBreak="0">
     <w:nsid w:val="13D44E11"/>
     <w:multiLevelType w:val="multilevel"/>
-    <w:tmpl w:val="ACF244D0"/>
+    <w:tmpl w:val="2F866E6C"/>
     <w:lvl w:ilvl="0">
       <w:start w:val="1"/>
       <w:numFmt w:val="decimal"/>
@@ -19114,7 +19336,7 @@
     <w:basedOn w:val="Normal"/>
     <w:next w:val="Normal"/>
     <w:qFormat/>
-    <w:rsid w:val="009A0E02"/>
+    <w:rsid w:val="00287C5D"/>
     <w:pPr>
       <w:keepNext/>
       <w:numPr>
@@ -19128,7 +19350,7 @@
       <w:rFonts w:ascii="Arial" w:hAnsi="Arial"/>
       <w:b/>
       <w:bCs/>
-      <w:i/>
+      <w:sz w:val="26"/>
       <w:szCs w:val="28"/>
     </w:rPr>
   </w:style>
@@ -19232,7 +19454,6 @@
   <w:style w:type="character" w:default="1" w:styleId="DefaultParagraphFont">
     <w:name w:val="Default Paragraph Font"/>
     <w:uiPriority w:val="1"/>
-    <w:semiHidden/>
     <w:unhideWhenUsed/>
   </w:style>
   <w:style w:type="table" w:default="1" w:styleId="TableNormal">
@@ -20087,7 +20308,7 @@
 </file>
 
 <file path=customXml/itemProps1.xml><?xml version="1.0" encoding="utf-8"?>
-<ds:datastoreItem xmlns:ds="http://schemas.openxmlformats.org/officeDocument/2006/customXml" ds:itemID="{3370B469-71A8-43CE-8B33-87E32034176E}">
+<ds:datastoreItem xmlns:ds="http://schemas.openxmlformats.org/officeDocument/2006/customXml" ds:itemID="{DBD81839-92BC-4257-A3A4-63921218E229}">
   <ds:schemaRefs>
     <ds:schemaRef ds:uri="http://schemas.openxmlformats.org/officeDocument/2006/bibliography"/>
   </ds:schemaRefs>

</xml_diff>